<commit_message>
Modelo fundacional genérico en Bedrock, con Claude como una de las opciones
</commit_message>
<xml_diff>
--- a/docs/entregable/HACOM-Reto-AI-Engineer.docx
+++ b/docs/entregable/HACOM-Reto-AI-Engineer.docx
@@ -42,7 +42,7 @@
           <w:sz w:val="24"/>
           <w:szCs w:val="24"/>
         </w:rPr>
-        <w:id w:val="1857075512"/>
+        <w:id w:val="41489058"/>
         <w:docPartObj>
           <w:docPartGallery w:val="Table of Contents"/>
           <w:docPartUnique/>
@@ -77,7 +77,7 @@
           <w:r>
             <w:fldChar w:fldCharType="separate"/>
           </w:r>
-          <w:hyperlink w:anchor="_Toc243384191" w:history="1">
+          <w:hyperlink w:anchor="_Toc243385031" w:history="1">
             <w:r>
               <w:rPr>
                 <w:rStyle w:val="Hyperlink"/>
@@ -104,7 +104,7 @@
                 <w:noProof/>
                 <w:webHidden/>
               </w:rPr>
-              <w:instrText xml:space="preserve"> PAGEREF _Toc243384191 \h </w:instrText>
+              <w:instrText xml:space="preserve"> PAGEREF _Toc243385031 \h </w:instrText>
             </w:r>
             <w:r>
               <w:rPr>
@@ -145,7 +145,7 @@
               <w:noProof/>
             </w:rPr>
           </w:pPr>
-          <w:hyperlink w:anchor="_Toc243384192" w:history="1">
+          <w:hyperlink w:anchor="_Toc243385032" w:history="1">
             <w:r>
               <w:rPr>
                 <w:rStyle w:val="Hyperlink"/>
@@ -172,7 +172,7 @@
                 <w:noProof/>
                 <w:webHidden/>
               </w:rPr>
-              <w:instrText xml:space="preserve"> PAGEREF _Toc243384192 \h </w:instrText>
+              <w:instrText xml:space="preserve"> PAGEREF _Toc243385032 \h </w:instrText>
             </w:r>
             <w:r>
               <w:rPr>
@@ -213,7 +213,7 @@
               <w:noProof/>
             </w:rPr>
           </w:pPr>
-          <w:hyperlink w:anchor="_Toc243384193" w:history="1">
+          <w:hyperlink w:anchor="_Toc243385033" w:history="1">
             <w:r>
               <w:rPr>
                 <w:rStyle w:val="Hyperlink"/>
@@ -240,7 +240,7 @@
                 <w:noProof/>
                 <w:webHidden/>
               </w:rPr>
-              <w:instrText xml:space="preserve"> PAGEREF _Toc243384193 \h </w:instrText>
+              <w:instrText xml:space="preserve"> PAGEREF _Toc243385033 \h </w:instrText>
             </w:r>
             <w:r>
               <w:rPr>
@@ -281,7 +281,7 @@
               <w:noProof/>
             </w:rPr>
           </w:pPr>
-          <w:hyperlink w:anchor="_Toc243384194" w:history="1">
+          <w:hyperlink w:anchor="_Toc243385034" w:history="1">
             <w:r>
               <w:rPr>
                 <w:rStyle w:val="Hyperlink"/>
@@ -308,7 +308,7 @@
                 <w:noProof/>
                 <w:webHidden/>
               </w:rPr>
-              <w:instrText xml:space="preserve"> PAGEREF _Toc243384194 \h </w:instrText>
+              <w:instrText xml:space="preserve"> PAGEREF _Toc243385034 \h </w:instrText>
             </w:r>
             <w:r>
               <w:rPr>
@@ -349,7 +349,7 @@
               <w:noProof/>
             </w:rPr>
           </w:pPr>
-          <w:hyperlink w:anchor="_Toc243384195" w:history="1">
+          <w:hyperlink w:anchor="_Toc243385035" w:history="1">
             <w:r>
               <w:rPr>
                 <w:rStyle w:val="Hyperlink"/>
@@ -376,7 +376,7 @@
                 <w:noProof/>
                 <w:webHidden/>
               </w:rPr>
-              <w:instrText xml:space="preserve"> PAGEREF _Toc243384195 \h </w:instrText>
+              <w:instrText xml:space="preserve"> PAGEREF _Toc243385035 \h </w:instrText>
             </w:r>
             <w:r>
               <w:rPr>
@@ -417,7 +417,7 @@
               <w:noProof/>
             </w:rPr>
           </w:pPr>
-          <w:hyperlink w:anchor="_Toc243384196" w:history="1">
+          <w:hyperlink w:anchor="_Toc243385036" w:history="1">
             <w:r>
               <w:rPr>
                 <w:rStyle w:val="Hyperlink"/>
@@ -444,7 +444,7 @@
                 <w:noProof/>
                 <w:webHidden/>
               </w:rPr>
-              <w:instrText xml:space="preserve"> PAGEREF _Toc243384196 \h </w:instrText>
+              <w:instrText xml:space="preserve"> PAGEREF _Toc243385036 \h </w:instrText>
             </w:r>
             <w:r>
               <w:rPr>
@@ -485,7 +485,7 @@
               <w:noProof/>
             </w:rPr>
           </w:pPr>
-          <w:hyperlink w:anchor="_Toc243384197" w:history="1">
+          <w:hyperlink w:anchor="_Toc243385037" w:history="1">
             <w:r>
               <w:rPr>
                 <w:rStyle w:val="Hyperlink"/>
@@ -512,7 +512,7 @@
                 <w:noProof/>
                 <w:webHidden/>
               </w:rPr>
-              <w:instrText xml:space="preserve"> PAGEREF _Toc243384197 \h </w:instrText>
+              <w:instrText xml:space="preserve"> PAGEREF _Toc243385037 \h </w:instrText>
             </w:r>
             <w:r>
               <w:rPr>
@@ -553,7 +553,7 @@
               <w:noProof/>
             </w:rPr>
           </w:pPr>
-          <w:hyperlink w:anchor="_Toc243384198" w:history="1">
+          <w:hyperlink w:anchor="_Toc243385038" w:history="1">
             <w:r>
               <w:rPr>
                 <w:rStyle w:val="Hyperlink"/>
@@ -580,7 +580,7 @@
                 <w:noProof/>
                 <w:webHidden/>
               </w:rPr>
-              <w:instrText xml:space="preserve"> PAGEREF _Toc243384198 \h </w:instrText>
+              <w:instrText xml:space="preserve"> PAGEREF _Toc243385038 \h </w:instrText>
             </w:r>
             <w:r>
               <w:rPr>
@@ -621,7 +621,7 @@
               <w:noProof/>
             </w:rPr>
           </w:pPr>
-          <w:hyperlink w:anchor="_Toc243384199" w:history="1">
+          <w:hyperlink w:anchor="_Toc243385039" w:history="1">
             <w:r>
               <w:rPr>
                 <w:rStyle w:val="Hyperlink"/>
@@ -648,7 +648,7 @@
                 <w:noProof/>
                 <w:webHidden/>
               </w:rPr>
-              <w:instrText xml:space="preserve"> PAGEREF _Toc243384199 \h </w:instrText>
+              <w:instrText xml:space="preserve"> PAGEREF _Toc243385039 \h </w:instrText>
             </w:r>
             <w:r>
               <w:rPr>
@@ -689,7 +689,7 @@
               <w:noProof/>
             </w:rPr>
           </w:pPr>
-          <w:hyperlink w:anchor="_Toc243384200" w:history="1">
+          <w:hyperlink w:anchor="_Toc243385040" w:history="1">
             <w:r>
               <w:rPr>
                 <w:rStyle w:val="Hyperlink"/>
@@ -716,7 +716,7 @@
                 <w:noProof/>
                 <w:webHidden/>
               </w:rPr>
-              <w:instrText xml:space="preserve"> PAGEREF _Toc243384200 \h </w:instrText>
+              <w:instrText xml:space="preserve"> PAGEREF _Toc243385040 \h </w:instrText>
             </w:r>
             <w:r>
               <w:rPr>
@@ -757,7 +757,7 @@
               <w:noProof/>
             </w:rPr>
           </w:pPr>
-          <w:hyperlink w:anchor="_Toc243384201" w:history="1">
+          <w:hyperlink w:anchor="_Toc243385041" w:history="1">
             <w:r>
               <w:rPr>
                 <w:rStyle w:val="Hyperlink"/>
@@ -784,7 +784,7 @@
                 <w:noProof/>
                 <w:webHidden/>
               </w:rPr>
-              <w:instrText xml:space="preserve"> PAGEREF _Toc243384201 \h </w:instrText>
+              <w:instrText xml:space="preserve"> PAGEREF _Toc243385041 \h </w:instrText>
             </w:r>
             <w:r>
               <w:rPr>
@@ -825,7 +825,7 @@
               <w:noProof/>
             </w:rPr>
           </w:pPr>
-          <w:hyperlink w:anchor="_Toc243384202" w:history="1">
+          <w:hyperlink w:anchor="_Toc243385042" w:history="1">
             <w:r>
               <w:rPr>
                 <w:rStyle w:val="Hyperlink"/>
@@ -852,7 +852,7 @@
                 <w:noProof/>
                 <w:webHidden/>
               </w:rPr>
-              <w:instrText xml:space="preserve"> PAGEREF _Toc243384202 \h </w:instrText>
+              <w:instrText xml:space="preserve"> PAGEREF _Toc243385042 \h </w:instrText>
             </w:r>
             <w:r>
               <w:rPr>
@@ -872,7 +872,7 @@
                 <w:noProof/>
                 <w:webHidden/>
               </w:rPr>
-              <w:t>8</w:t>
+              <w:t>9</w:t>
             </w:r>
             <w:r>
               <w:rPr>
@@ -893,7 +893,7 @@
               <w:noProof/>
             </w:rPr>
           </w:pPr>
-          <w:hyperlink w:anchor="_Toc243384203" w:history="1">
+          <w:hyperlink w:anchor="_Toc243385043" w:history="1">
             <w:r>
               <w:rPr>
                 <w:rStyle w:val="Hyperlink"/>
@@ -920,7 +920,7 @@
                 <w:noProof/>
                 <w:webHidden/>
               </w:rPr>
-              <w:instrText xml:space="preserve"> PAGEREF _Toc243384203 \h </w:instrText>
+              <w:instrText xml:space="preserve"> PAGEREF _Toc243385043 \h </w:instrText>
             </w:r>
             <w:r>
               <w:rPr>
@@ -940,7 +940,7 @@
                 <w:noProof/>
                 <w:webHidden/>
               </w:rPr>
-              <w:t>9</w:t>
+              <w:t>10</w:t>
             </w:r>
             <w:r>
               <w:rPr>
@@ -961,7 +961,7 @@
               <w:noProof/>
             </w:rPr>
           </w:pPr>
-          <w:hyperlink w:anchor="_Toc243384204" w:history="1">
+          <w:hyperlink w:anchor="_Toc243385044" w:history="1">
             <w:r>
               <w:rPr>
                 <w:rStyle w:val="Hyperlink"/>
@@ -988,7 +988,7 @@
                 <w:noProof/>
                 <w:webHidden/>
               </w:rPr>
-              <w:instrText xml:space="preserve"> PAGEREF _Toc243384204 \h </w:instrText>
+              <w:instrText xml:space="preserve"> PAGEREF _Toc243385044 \h </w:instrText>
             </w:r>
             <w:r>
               <w:rPr>
@@ -1008,7 +1008,7 @@
                 <w:noProof/>
                 <w:webHidden/>
               </w:rPr>
-              <w:t>9</w:t>
+              <w:t>10</w:t>
             </w:r>
             <w:r>
               <w:rPr>
@@ -1029,7 +1029,7 @@
               <w:noProof/>
             </w:rPr>
           </w:pPr>
-          <w:hyperlink w:anchor="_Toc243384205" w:history="1">
+          <w:hyperlink w:anchor="_Toc243385045" w:history="1">
             <w:r>
               <w:rPr>
                 <w:rStyle w:val="Hyperlink"/>
@@ -1056,7 +1056,7 @@
                 <w:noProof/>
                 <w:webHidden/>
               </w:rPr>
-              <w:instrText xml:space="preserve"> PAGEREF _Toc243384205 \h </w:instrText>
+              <w:instrText xml:space="preserve"> PAGEREF _Toc243385045 \h </w:instrText>
             </w:r>
             <w:r>
               <w:rPr>
@@ -1097,7 +1097,7 @@
               <w:noProof/>
             </w:rPr>
           </w:pPr>
-          <w:hyperlink w:anchor="_Toc243384206" w:history="1">
+          <w:hyperlink w:anchor="_Toc243385046" w:history="1">
             <w:r>
               <w:rPr>
                 <w:rStyle w:val="Hyperlink"/>
@@ -1124,7 +1124,7 @@
                 <w:noProof/>
                 <w:webHidden/>
               </w:rPr>
-              <w:instrText xml:space="preserve"> PAGEREF _Toc243384206 \h </w:instrText>
+              <w:instrText xml:space="preserve"> PAGEREF _Toc243385046 \h </w:instrText>
             </w:r>
             <w:r>
               <w:rPr>
@@ -1165,7 +1165,7 @@
               <w:noProof/>
             </w:rPr>
           </w:pPr>
-          <w:hyperlink w:anchor="_Toc243384207" w:history="1">
+          <w:hyperlink w:anchor="_Toc243385047" w:history="1">
             <w:r>
               <w:rPr>
                 <w:rStyle w:val="Hyperlink"/>
@@ -1192,7 +1192,7 @@
                 <w:noProof/>
                 <w:webHidden/>
               </w:rPr>
-              <w:instrText xml:space="preserve"> PAGEREF _Toc243384207 \h </w:instrText>
+              <w:instrText xml:space="preserve"> PAGEREF _Toc243385047 \h </w:instrText>
             </w:r>
             <w:r>
               <w:rPr>
@@ -1233,7 +1233,7 @@
               <w:noProof/>
             </w:rPr>
           </w:pPr>
-          <w:hyperlink w:anchor="_Toc243384208" w:history="1">
+          <w:hyperlink w:anchor="_Toc243385048" w:history="1">
             <w:r>
               <w:rPr>
                 <w:rStyle w:val="Hyperlink"/>
@@ -1260,7 +1260,7 @@
                 <w:noProof/>
                 <w:webHidden/>
               </w:rPr>
-              <w:instrText xml:space="preserve"> PAGEREF _Toc243384208 \h </w:instrText>
+              <w:instrText xml:space="preserve"> PAGEREF _Toc243385048 \h </w:instrText>
             </w:r>
             <w:r>
               <w:rPr>
@@ -1301,7 +1301,7 @@
               <w:noProof/>
             </w:rPr>
           </w:pPr>
-          <w:hyperlink w:anchor="_Toc243384209" w:history="1">
+          <w:hyperlink w:anchor="_Toc243385049" w:history="1">
             <w:r>
               <w:rPr>
                 <w:rStyle w:val="Hyperlink"/>
@@ -1328,7 +1328,7 @@
                 <w:noProof/>
                 <w:webHidden/>
               </w:rPr>
-              <w:instrText xml:space="preserve"> PAGEREF _Toc243384209 \h </w:instrText>
+              <w:instrText xml:space="preserve"> PAGEREF _Toc243385049 \h </w:instrText>
             </w:r>
             <w:r>
               <w:rPr>
@@ -1369,7 +1369,7 @@
               <w:noProof/>
             </w:rPr>
           </w:pPr>
-          <w:hyperlink w:anchor="_Toc243384210" w:history="1">
+          <w:hyperlink w:anchor="_Toc243385050" w:history="1">
             <w:r>
               <w:rPr>
                 <w:rStyle w:val="Hyperlink"/>
@@ -1396,7 +1396,7 @@
                 <w:noProof/>
                 <w:webHidden/>
               </w:rPr>
-              <w:instrText xml:space="preserve"> PAGEREF _Toc243384210 \h </w:instrText>
+              <w:instrText xml:space="preserve"> PAGEREF _Toc243385050 \h </w:instrText>
             </w:r>
             <w:r>
               <w:rPr>
@@ -1437,7 +1437,7 @@
               <w:noProof/>
             </w:rPr>
           </w:pPr>
-          <w:hyperlink w:anchor="_Toc243384211" w:history="1">
+          <w:hyperlink w:anchor="_Toc243385051" w:history="1">
             <w:r>
               <w:rPr>
                 <w:rStyle w:val="Hyperlink"/>
@@ -1464,7 +1464,7 @@
                 <w:noProof/>
                 <w:webHidden/>
               </w:rPr>
-              <w:instrText xml:space="preserve"> PAGEREF _Toc243384211 \h </w:instrText>
+              <w:instrText xml:space="preserve"> PAGEREF _Toc243385051 \h </w:instrText>
             </w:r>
             <w:r>
               <w:rPr>
@@ -1505,7 +1505,7 @@
               <w:noProof/>
             </w:rPr>
           </w:pPr>
-          <w:hyperlink w:anchor="_Toc243384212" w:history="1">
+          <w:hyperlink w:anchor="_Toc243385052" w:history="1">
             <w:r>
               <w:rPr>
                 <w:rStyle w:val="Hyperlink"/>
@@ -1532,7 +1532,7 @@
                 <w:noProof/>
                 <w:webHidden/>
               </w:rPr>
-              <w:instrText xml:space="preserve"> PAGEREF _Toc243384212 \h </w:instrText>
+              <w:instrText xml:space="preserve"> PAGEREF _Toc243385052 \h </w:instrText>
             </w:r>
             <w:r>
               <w:rPr>
@@ -1573,7 +1573,7 @@
               <w:noProof/>
             </w:rPr>
           </w:pPr>
-          <w:hyperlink w:anchor="_Toc243384213" w:history="1">
+          <w:hyperlink w:anchor="_Toc243385053" w:history="1">
             <w:r>
               <w:rPr>
                 <w:rStyle w:val="Hyperlink"/>
@@ -1600,7 +1600,7 @@
                 <w:noProof/>
                 <w:webHidden/>
               </w:rPr>
-              <w:instrText xml:space="preserve"> PAGEREF _Toc243384213 \h </w:instrText>
+              <w:instrText xml:space="preserve"> PAGEREF _Toc243385053 \h </w:instrText>
             </w:r>
             <w:r>
               <w:rPr>
@@ -1641,7 +1641,7 @@
               <w:noProof/>
             </w:rPr>
           </w:pPr>
-          <w:hyperlink w:anchor="_Toc243384214" w:history="1">
+          <w:hyperlink w:anchor="_Toc243385054" w:history="1">
             <w:r>
               <w:rPr>
                 <w:rStyle w:val="Hyperlink"/>
@@ -1668,7 +1668,7 @@
                 <w:noProof/>
                 <w:webHidden/>
               </w:rPr>
-              <w:instrText xml:space="preserve"> PAGEREF _Toc243384214 \h </w:instrText>
+              <w:instrText xml:space="preserve"> PAGEREF _Toc243385054 \h </w:instrText>
             </w:r>
             <w:r>
               <w:rPr>
@@ -1688,7 +1688,7 @@
                 <w:noProof/>
                 <w:webHidden/>
               </w:rPr>
-              <w:t>12</w:t>
+              <w:t>13</w:t>
             </w:r>
             <w:r>
               <w:rPr>
@@ -1709,7 +1709,7 @@
               <w:noProof/>
             </w:rPr>
           </w:pPr>
-          <w:hyperlink w:anchor="_Toc243384215" w:history="1">
+          <w:hyperlink w:anchor="_Toc243385055" w:history="1">
             <w:r>
               <w:rPr>
                 <w:rStyle w:val="Hyperlink"/>
@@ -1736,7 +1736,7 @@
                 <w:noProof/>
                 <w:webHidden/>
               </w:rPr>
-              <w:instrText xml:space="preserve"> PAGEREF _Toc243384215 \h </w:instrText>
+              <w:instrText xml:space="preserve"> PAGEREF _Toc243385055 \h </w:instrText>
             </w:r>
             <w:r>
               <w:rPr>
@@ -1779,7 +1779,7 @@
         <w:pStyle w:val="Ttulo1"/>
       </w:pPr>
       <w:bookmarkStart w:id="0" w:name="_56df7a16a9fe64f9452cb7ca4525fc3d95a27de"/>
-      <w:bookmarkStart w:id="1" w:name="_Toc243384191"/>
+      <w:bookmarkStart w:id="1" w:name="_Toc243385031"/>
       <w:r>
         <w:lastRenderedPageBreak/>
         <w:t>1. Resumen ejecutivo</w:t>
@@ -1935,7 +1935,7 @@
         <w:pStyle w:val="Ttulo2"/>
       </w:pPr>
       <w:bookmarkStart w:id="2" w:name="_términos"/>
-      <w:bookmarkStart w:id="3" w:name="_Toc243384192"/>
+      <w:bookmarkStart w:id="3" w:name="_Toc243385032"/>
       <w:r>
         <w:t>Términos</w:t>
       </w:r>
@@ -2292,7 +2292,7 @@
         <w:pStyle w:val="Ttulo1"/>
       </w:pPr>
       <w:bookmarkStart w:id="4" w:name="_supuestos"/>
-      <w:bookmarkStart w:id="5" w:name="_Toc243384193"/>
+      <w:bookmarkStart w:id="5" w:name="_Toc243385033"/>
       <w:r>
         <w:t>2. Supuestos</w:t>
       </w:r>
@@ -2878,7 +2878,7 @@
         <w:pStyle w:val="Ttulo1"/>
       </w:pPr>
       <w:bookmarkStart w:id="6" w:name="_531a22751b42dbc4314ac29de4d0b14085fbf94"/>
-      <w:bookmarkStart w:id="7" w:name="_Toc243384194"/>
+      <w:bookmarkStart w:id="7" w:name="_Toc243385034"/>
       <w:r>
         <w:t>3. Matriz de decisiones de automatización</w:t>
       </w:r>
@@ -4127,7 +4127,7 @@
         <w:pStyle w:val="Ttulo2"/>
       </w:pPr>
       <w:bookmarkStart w:id="8" w:name="_cc537778eb01bdc76d0f5f2669747e78821567e"/>
-      <w:bookmarkStart w:id="9" w:name="_Toc243384195"/>
+      <w:bookmarkStart w:id="9" w:name="_Toc243385035"/>
       <w:r>
         <w:t>Señales de escalamiento al Operador NOC</w:t>
       </w:r>
@@ -4697,7 +4697,7 @@
         <w:pStyle w:val="Ttulo1"/>
       </w:pPr>
       <w:bookmarkStart w:id="10" w:name="_856108c0b7ef2b2986130cc133917d17543cf90"/>
-      <w:bookmarkStart w:id="11" w:name="_Toc243384196"/>
+      <w:bookmarkStart w:id="11" w:name="_Toc243385036"/>
       <w:r>
         <w:t>4. Arquitectura conceptual / lógica</w:t>
       </w:r>
@@ -4713,7 +4713,7 @@
           <w:noProof/>
         </w:rPr>
         <w:drawing>
-          <wp:inline distT="0" distB="0" distL="0" distR="0" wp14:anchorId="23FF62F2" wp14:editId="17839B48">
+          <wp:inline distT="0" distB="0" distL="0" distR="0" wp14:anchorId="7779DAEC" wp14:editId="18D0842D">
             <wp:extent cx="5334000" cy="2549217"/>
             <wp:effectExtent l="0" t="0" r="0" b="0"/>
             <wp:docPr id="16" name="Picture" descr="Arquitectura lógica"/>
@@ -4778,7 +4778,7 @@
         <w:pStyle w:val="Ttulo2"/>
       </w:pPr>
       <w:bookmarkStart w:id="12" w:name="_e0af0e1b985d8e69940266f243ca259d425efb7"/>
-      <w:bookmarkStart w:id="13" w:name="_Toc243384197"/>
+      <w:bookmarkStart w:id="13" w:name="_Toc243385037"/>
       <w:r>
         <w:lastRenderedPageBreak/>
         <w:t>4.1 Componentes, datos y límites de acceso</w:t>
@@ -5953,7 +5953,7 @@
         <w:pStyle w:val="Ttulo2"/>
       </w:pPr>
       <w:bookmarkStart w:id="14" w:name="_memoria"/>
-      <w:bookmarkStart w:id="15" w:name="_Toc243384198"/>
+      <w:bookmarkStart w:id="15" w:name="_Toc243385038"/>
       <w:r>
         <w:t>4.2 Memoria</w:t>
       </w:r>
@@ -6346,7 +6346,7 @@
         <w:pStyle w:val="Ttulo2"/>
       </w:pPr>
       <w:bookmarkStart w:id="16" w:name="_da292b2665567be05c609dc3d76a9de4a1c3405"/>
-      <w:bookmarkStart w:id="17" w:name="_Toc243384199"/>
+      <w:bookmarkStart w:id="17" w:name="_Toc243385039"/>
       <w:r>
         <w:lastRenderedPageBreak/>
         <w:t>4.3 Estados, fallos y escalamiento del workflow</w:t>
@@ -6363,7 +6363,7 @@
           <w:noProof/>
         </w:rPr>
         <w:drawing>
-          <wp:inline distT="0" distB="0" distL="0" distR="0" wp14:anchorId="2EE8E9EE" wp14:editId="386321F5">
+          <wp:inline distT="0" distB="0" distL="0" distR="0" wp14:anchorId="126B7051" wp14:editId="3EC08F38">
             <wp:extent cx="5334000" cy="469446"/>
             <wp:effectExtent l="0" t="0" r="0" b="0"/>
             <wp:docPr id="22" name="Picture" descr="Estados del workflow"/>
@@ -6759,7 +6759,7 @@
         <w:pStyle w:val="Ttulo2"/>
       </w:pPr>
       <w:bookmarkStart w:id="18" w:name="_860fae0d546a8198f589a398b85690e59be0668"/>
-      <w:bookmarkStart w:id="19" w:name="_Toc243384200"/>
+      <w:bookmarkStart w:id="19" w:name="_Toc243385040"/>
       <w:r>
         <w:t>4.4 El agente de investigación</w:t>
       </w:r>
@@ -6957,7 +6957,7 @@
         <w:pStyle w:val="Ttulo1"/>
       </w:pPr>
       <w:bookmarkStart w:id="20" w:name="_1cf5811360d8bd240f5b6ff78ee18f92c7c09f4"/>
-      <w:bookmarkStart w:id="21" w:name="_Toc243384201"/>
+      <w:bookmarkStart w:id="21" w:name="_Toc243385041"/>
       <w:r>
         <w:lastRenderedPageBreak/>
         <w:t>5. Arquitectura física (AWS, híbrida)</w:t>
@@ -6974,7 +6974,7 @@
           <w:noProof/>
         </w:rPr>
         <w:drawing>
-          <wp:inline distT="0" distB="0" distL="0" distR="0" wp14:anchorId="4E1A8D51" wp14:editId="6BAC4A0B">
+          <wp:inline distT="0" distB="0" distL="0" distR="0" wp14:anchorId="7C432F3B" wp14:editId="3877ED1C">
             <wp:extent cx="5334000" cy="4907203"/>
             <wp:effectExtent l="0" t="0" r="0" b="0"/>
             <wp:docPr id="27" name="Picture" descr="Arquitectura física"/>
@@ -7880,33 +7880,39 @@
               <w:rPr>
                 <w:sz w:val="18"/>
               </w:rPr>
-              <w:t xml:space="preserve">: un modelo Claude de nivel pequeño (extracción) y uno de nivel medio (agente y resumen), </w:t>
-            </w:r>
-            <w:r>
-              <w:rPr>
-                <w:sz w:val="18"/>
-              </w:rPr>
-              <w:t>con versión fijada</w:t>
-            </w:r>
-          </w:p>
-        </w:tc>
-        <w:tc>
-          <w:tcPr>
-            <w:tcW w:w="1250" w:type="pct"/>
-            <w:shd w:val="clear" w:color="auto" w:fill="auto"/>
-          </w:tcPr>
-          <w:p>
-            <w:pPr>
-              <w:pStyle w:val="Compact"/>
-              <w:rPr>
-                <w:sz w:val="18"/>
-              </w:rPr>
-            </w:pPr>
-            <w:r>
-              <w:rPr>
-                <w:sz w:val="18"/>
-              </w:rPr>
-              <w:t>Modelos gestionados en región, sin uso de datos para entrenamiento, sin GPU que operar. Dos niveles para optimizar costo.</w:t>
+              <w:t>: un modelo fundacional de nivel pequeño (extracción) y uno de nivel medio (agente y resum</w:t>
+            </w:r>
+            <w:r>
+              <w:rPr>
+                <w:sz w:val="18"/>
+              </w:rPr>
+              <w:t>en), con versión fijada. Opciones en Bedrock: Anthropic Claude, Amazon Nova, Meta Llama o Mistral; la elección final se hace con el golden set de §7 (calidad en español, tool use, costo y latencia).</w:t>
+            </w:r>
+          </w:p>
+        </w:tc>
+        <w:tc>
+          <w:tcPr>
+            <w:tcW w:w="1250" w:type="pct"/>
+            <w:shd w:val="clear" w:color="auto" w:fill="auto"/>
+          </w:tcPr>
+          <w:p>
+            <w:pPr>
+              <w:pStyle w:val="Compact"/>
+              <w:rPr>
+                <w:sz w:val="18"/>
+              </w:rPr>
+            </w:pPr>
+            <w:r>
+              <w:rPr>
+                <w:sz w:val="18"/>
+              </w:rPr>
+              <w:t>Modelos gestionados en región, sin uso de datos para entr</w:t>
+            </w:r>
+            <w:r>
+              <w:rPr>
+                <w:sz w:val="18"/>
+              </w:rPr>
+              <w:t>enamiento, sin GPU que operar. Dos niveles para optimizar costo. La Converse API es común a todos los modelos, así que cambiar de modelo no cambia el código.</w:t>
             </w:r>
           </w:p>
         </w:tc>
@@ -8760,8 +8766,9 @@
         <w:pStyle w:val="Ttulo1"/>
       </w:pPr>
       <w:bookmarkStart w:id="22" w:name="_1dc88d82289d67e1ea4472534f9f223778a3ba7"/>
-      <w:bookmarkStart w:id="23" w:name="_Toc243384202"/>
-      <w:r>
+      <w:bookmarkStart w:id="23" w:name="_Toc243385042"/>
+      <w:r>
+        <w:lastRenderedPageBreak/>
         <w:t>6. Seguridad: matriz de riesgos y controles</w:t>
       </w:r>
       <w:bookmarkEnd w:id="22"/>
@@ -8940,7 +8947,6 @@
                 <w:bCs/>
                 <w:sz w:val="18"/>
               </w:rPr>
-              <w:lastRenderedPageBreak/>
               <w:t>LLM01 Prompt injection</w:t>
             </w:r>
             <w:r>
@@ -10091,8 +10097,9 @@
         <w:pStyle w:val="Ttulo1"/>
       </w:pPr>
       <w:bookmarkStart w:id="24" w:name="_21008488f39fee772d9a18573a0731f090415fd"/>
-      <w:bookmarkStart w:id="25" w:name="_Toc243384203"/>
-      <w:r>
+      <w:bookmarkStart w:id="25" w:name="_Toc243385043"/>
+      <w:r>
+        <w:lastRenderedPageBreak/>
         <w:t>7. Estrategia de evaluación de la IA generativa</w:t>
       </w:r>
       <w:bookmarkEnd w:id="24"/>
@@ -10103,7 +10110,7 @@
         <w:pStyle w:val="Ttulo2"/>
       </w:pPr>
       <w:bookmarkStart w:id="26" w:name="_69e1ab2a0c519af57549dc9feeb84d7cb8ee371"/>
-      <w:bookmarkStart w:id="27" w:name="_Toc243384204"/>
+      <w:bookmarkStart w:id="27" w:name="_Toc243385044"/>
       <w:r>
         <w:t>7.1 Qué se evalúa</w:t>
       </w:r>
@@ -10327,7 +10334,6 @@
               <w:rPr>
                 <w:sz w:val="18"/>
               </w:rPr>
-              <w:lastRenderedPageBreak/>
               <w:t>Resumen (paso 7)</w:t>
             </w:r>
           </w:p>
@@ -10407,7 +10413,7 @@
         <w:pStyle w:val="Ttulo2"/>
       </w:pPr>
       <w:bookmarkStart w:id="28" w:name="_dd7ef81fdfe106eb5acc19d59b803376463f8ad"/>
-      <w:bookmarkStart w:id="29" w:name="_Toc243384205"/>
+      <w:bookmarkStart w:id="29" w:name="_Toc243385045"/>
       <w:r>
         <w:t>7.2 Tres capas</w:t>
       </w:r>
@@ -11266,6 +11272,7 @@
           <w:b/>
           <w:bCs/>
         </w:rPr>
+        <w:lastRenderedPageBreak/>
         <w:t>Capa 3: online</w:t>
       </w:r>
       <w:r>
@@ -11539,7 +11546,6 @@
               <w:rPr>
                 <w:sz w:val="18"/>
               </w:rPr>
-              <w:lastRenderedPageBreak/>
               <w:t>Tasa de escalamiento por código (E1–E7)</w:t>
             </w:r>
           </w:p>
@@ -11621,7 +11627,7 @@
         <w:pStyle w:val="Ttulo2"/>
       </w:pPr>
       <w:bookmarkStart w:id="30" w:name="_2d9f01ff85dd9820987480cab79557db403aeac"/>
-      <w:bookmarkStart w:id="31" w:name="_Toc243384206"/>
+      <w:bookmarkStart w:id="31" w:name="_Toc243385046"/>
       <w:r>
         <w:t>7.3 Despliegue gradual</w:t>
       </w:r>
@@ -11696,7 +11702,7 @@
         <w:pStyle w:val="Ttulo1"/>
       </w:pPr>
       <w:bookmarkStart w:id="32" w:name="_d8727e752cb31365f46bcadbe991ef572676e19"/>
-      <w:bookmarkStart w:id="33" w:name="_Toc243384207"/>
+      <w:bookmarkStart w:id="33" w:name="_Toc243385047"/>
       <w:r>
         <w:t>8. Operación y limitaciones</w:t>
       </w:r>
@@ -11708,7 +11714,7 @@
         <w:pStyle w:val="Ttulo2"/>
       </w:pPr>
       <w:bookmarkStart w:id="34" w:name="_37ea2f043d1ca71eac9f00ba764ac933ea83f2c"/>
-      <w:bookmarkStart w:id="35" w:name="_Toc243384208"/>
+      <w:bookmarkStart w:id="35" w:name="_Toc243385048"/>
       <w:r>
         <w:t>8.1 Latencia y costo (estimación)</w:t>
       </w:r>
@@ -12174,7 +12180,7 @@
         <w:pStyle w:val="Ttulo2"/>
       </w:pPr>
       <w:bookmarkStart w:id="36" w:name="_observabilidad"/>
-      <w:bookmarkStart w:id="37" w:name="_Toc243384209"/>
+      <w:bookmarkStart w:id="37" w:name="_Toc243385049"/>
       <w:r>
         <w:t>8.</w:t>
       </w:r>
@@ -12216,6 +12222,7 @@
           <w:b/>
           <w:bCs/>
         </w:rPr>
+        <w:lastRenderedPageBreak/>
         <w:t>Por invocación LLM</w:t>
       </w:r>
       <w:r>
@@ -12249,9 +12256,8 @@
         <w:pStyle w:val="Ttulo2"/>
       </w:pPr>
       <w:bookmarkStart w:id="38" w:name="_resiliencia"/>
-      <w:bookmarkStart w:id="39" w:name="_Toc243384210"/>
-      <w:r>
-        <w:lastRenderedPageBreak/>
+      <w:bookmarkStart w:id="39" w:name="_Toc243385050"/>
+      <w:r>
         <w:t>8.3 Resiliencia</w:t>
       </w:r>
       <w:bookmarkEnd w:id="38"/>
@@ -12273,7 +12279,7 @@
         <w:pStyle w:val="Ttulo2"/>
       </w:pPr>
       <w:bookmarkStart w:id="40" w:name="_e475abed30fa52e794d704ef2cf4919481e087c"/>
-      <w:bookmarkStart w:id="41" w:name="_Toc243384211"/>
+      <w:bookmarkStart w:id="41" w:name="_Toc243385051"/>
       <w:r>
         <w:t>8.4 Supervisión humana</w:t>
       </w:r>
@@ -12324,7 +12330,7 @@
         <w:pStyle w:val="Ttulo2"/>
       </w:pPr>
       <w:bookmarkStart w:id="42" w:name="_71f77f8eab6ad684eb9de56f8b1bbd750ae9343"/>
-      <w:bookmarkStart w:id="43" w:name="_Toc243384212"/>
+      <w:bookmarkStart w:id="43" w:name="_Toc243385052"/>
       <w:r>
         <w:t>8.5 Riesgos residuales</w:t>
       </w:r>
@@ -12444,7 +12450,7 @@
         <w:pStyle w:val="Ttulo2"/>
       </w:pPr>
       <w:bookmarkStart w:id="44" w:name="_2a051840def5bc2000b770f663cf6617893998a"/>
-      <w:bookmarkStart w:id="45" w:name="_Toc243384213"/>
+      <w:bookmarkStart w:id="45" w:name="_Toc243385053"/>
       <w:r>
         <w:t>8.6 Pendientes antes de producción</w:t>
       </w:r>
@@ -12546,8 +12552,9 @@
         <w:pStyle w:val="Ttulo1"/>
       </w:pPr>
       <w:bookmarkStart w:id="46" w:name="_a5ed2b4bf0fb80322b8db7f52b6310c044129d6"/>
-      <w:bookmarkStart w:id="47" w:name="_Toc243384214"/>
-      <w:r>
+      <w:bookmarkStart w:id="47" w:name="_Toc243385054"/>
+      <w:r>
+        <w:lastRenderedPageBreak/>
         <w:t>9. Decisiones técnicas principales</w:t>
       </w:r>
       <w:bookmarkEnd w:id="46"/>
@@ -12728,7 +12735,6 @@
               <w:rPr>
                 <w:sz w:val="18"/>
               </w:rPr>
-              <w:lastRenderedPageBreak/>
               <w:t>0003</w:t>
             </w:r>
           </w:p>
@@ -12771,7 +12777,7 @@
         <w:pStyle w:val="Ttulo1"/>
       </w:pPr>
       <w:bookmarkStart w:id="48" w:name="_923eadbdcfb4798034273fd952db44a0abe1d4f"/>
-      <w:bookmarkStart w:id="49" w:name="_Toc243384215"/>
+      <w:bookmarkStart w:id="49" w:name="_Toc243385055"/>
       <w:r>
         <w:t>Anexo A. Prototipo</w:t>
       </w:r>
@@ -13182,7 +13188,7 @@
   <w:abstractNum w:abstractNumId="0" w15:restartNumberingAfterBreak="0">
     <w:nsid w:val="0000A990"/>
     <w:multiLevelType w:val="multilevel"/>
-    <w:tmpl w:val="AC420C98"/>
+    <w:tmpl w:val="09DA663C"/>
     <w:lvl w:ilvl="0">
       <w:numFmt w:val="bullet"/>
       <w:lvlText w:val=" "/>
@@ -13259,7 +13265,7 @@
   <w:abstractNum w:abstractNumId="1" w15:restartNumberingAfterBreak="0">
     <w:nsid w:val="0000A991"/>
     <w:multiLevelType w:val="multilevel"/>
-    <w:tmpl w:val="90B4B0D0"/>
+    <w:tmpl w:val="A6B6078A"/>
     <w:lvl w:ilvl="0">
       <w:numFmt w:val="bullet"/>
       <w:lvlText w:val=""/>
@@ -13363,7 +13369,7 @@
   <w:abstractNum w:abstractNumId="2" w15:restartNumberingAfterBreak="0">
     <w:nsid w:val="00A99411"/>
     <w:multiLevelType w:val="multilevel"/>
-    <w:tmpl w:val="D1F891B4"/>
+    <w:tmpl w:val="9E662F28"/>
     <w:lvl w:ilvl="0">
       <w:start w:val="1"/>
       <w:numFmt w:val="decimal"/>
@@ -14832,7 +14838,7 @@
     <w:autoRedefine/>
     <w:uiPriority w:val="39"/>
     <w:unhideWhenUsed/>
-    <w:rsid w:val="00384082"/>
+    <w:rsid w:val="00C0608A"/>
     <w:pPr>
       <w:spacing w:after="100"/>
     </w:pPr>
@@ -14844,7 +14850,7 @@
     <w:autoRedefine/>
     <w:uiPriority w:val="39"/>
     <w:unhideWhenUsed/>
-    <w:rsid w:val="00384082"/>
+    <w:rsid w:val="00C0608A"/>
     <w:pPr>
       <w:spacing w:after="100"/>
       <w:ind w:left="240"/>

</xml_diff>

<commit_message>
Valida la entrega con revisión experta y aplica sus ajustes
- Ruteo y derivación antes de la investigación: la Incidencia se deriva en segundos sin esperar a la IA
- Cualquier error del validador retiene el resumen (incluidas acciones de cambio sin autorización o disfrazadas)
- Route 53 Resolver con endpoints inbound y outbound
- Estados: tras E1 la Incidencia vuelve a validarse cuando el operador completa los datos
- Precisiones de redacción en S5 y tiempos de derivación
- Evaluación: nuevo campo publica_resumen en los 18 casos
</commit_message>
<xml_diff>
--- a/docs/entregable/HACOM-Reto-AI-Engineer.docx
+++ b/docs/entregable/HACOM-Reto-AI-Engineer.docx
@@ -42,7 +42,7 @@
           <w:sz w:val="24"/>
           <w:szCs w:val="24"/>
         </w:rPr>
-        <w:id w:val="-320189743"/>
+        <w:id w:val="660660257"/>
         <w:docPartObj>
           <w:docPartGallery w:val="Table of Contents"/>
           <w:docPartUnique/>
@@ -77,7 +77,7 @@
           <w:r>
             <w:fldChar w:fldCharType="separate"/>
           </w:r>
-          <w:hyperlink w:anchor="_Toc243386725" w:history="1">
+          <w:hyperlink w:anchor="_Toc243387702" w:history="1">
             <w:r>
               <w:rPr>
                 <w:rStyle w:val="Hyperlink"/>
@@ -104,7 +104,7 @@
                 <w:noProof/>
                 <w:webHidden/>
               </w:rPr>
-              <w:instrText xml:space="preserve"> PAGEREF _Toc243386725 \h </w:instrText>
+              <w:instrText xml:space="preserve"> PAGEREF _Toc243387702 \h </w:instrText>
             </w:r>
             <w:r>
               <w:rPr>
@@ -145,7 +145,7 @@
               <w:noProof/>
             </w:rPr>
           </w:pPr>
-          <w:hyperlink w:anchor="_Toc243386726" w:history="1">
+          <w:hyperlink w:anchor="_Toc243387703" w:history="1">
             <w:r>
               <w:rPr>
                 <w:rStyle w:val="Hyperlink"/>
@@ -172,7 +172,7 @@
                 <w:noProof/>
                 <w:webHidden/>
               </w:rPr>
-              <w:instrText xml:space="preserve"> PAGEREF _Toc243386726 \h </w:instrText>
+              <w:instrText xml:space="preserve"> PAGEREF _Toc243387703 \h </w:instrText>
             </w:r>
             <w:r>
               <w:rPr>
@@ -213,7 +213,7 @@
               <w:noProof/>
             </w:rPr>
           </w:pPr>
-          <w:hyperlink w:anchor="_Toc243386727" w:history="1">
+          <w:hyperlink w:anchor="_Toc243387704" w:history="1">
             <w:r>
               <w:rPr>
                 <w:rStyle w:val="Hyperlink"/>
@@ -240,7 +240,7 @@
                 <w:noProof/>
                 <w:webHidden/>
               </w:rPr>
-              <w:instrText xml:space="preserve"> PAGEREF _Toc243386727 \h </w:instrText>
+              <w:instrText xml:space="preserve"> PAGEREF _Toc243387704 \h </w:instrText>
             </w:r>
             <w:r>
               <w:rPr>
@@ -281,7 +281,7 @@
               <w:noProof/>
             </w:rPr>
           </w:pPr>
-          <w:hyperlink w:anchor="_Toc243386728" w:history="1">
+          <w:hyperlink w:anchor="_Toc243387705" w:history="1">
             <w:r>
               <w:rPr>
                 <w:rStyle w:val="Hyperlink"/>
@@ -308,7 +308,7 @@
                 <w:noProof/>
                 <w:webHidden/>
               </w:rPr>
-              <w:instrText xml:space="preserve"> PAGEREF _Toc243386728 \h </w:instrText>
+              <w:instrText xml:space="preserve"> PAGEREF _Toc243387705 \h </w:instrText>
             </w:r>
             <w:r>
               <w:rPr>
@@ -349,7 +349,7 @@
               <w:noProof/>
             </w:rPr>
           </w:pPr>
-          <w:hyperlink w:anchor="_Toc243386729" w:history="1">
+          <w:hyperlink w:anchor="_Toc243387706" w:history="1">
             <w:r>
               <w:rPr>
                 <w:rStyle w:val="Hyperlink"/>
@@ -376,7 +376,7 @@
                 <w:noProof/>
                 <w:webHidden/>
               </w:rPr>
-              <w:instrText xml:space="preserve"> PAGEREF _Toc243386729 \h </w:instrText>
+              <w:instrText xml:space="preserve"> PAGEREF _Toc243387706 \h </w:instrText>
             </w:r>
             <w:r>
               <w:rPr>
@@ -417,7 +417,7 @@
               <w:noProof/>
             </w:rPr>
           </w:pPr>
-          <w:hyperlink w:anchor="_Toc243386730" w:history="1">
+          <w:hyperlink w:anchor="_Toc243387707" w:history="1">
             <w:r>
               <w:rPr>
                 <w:rStyle w:val="Hyperlink"/>
@@ -444,7 +444,7 @@
                 <w:noProof/>
                 <w:webHidden/>
               </w:rPr>
-              <w:instrText xml:space="preserve"> PAGEREF _Toc243386730 \h </w:instrText>
+              <w:instrText xml:space="preserve"> PAGEREF _Toc243387707 \h </w:instrText>
             </w:r>
             <w:r>
               <w:rPr>
@@ -485,7 +485,7 @@
               <w:noProof/>
             </w:rPr>
           </w:pPr>
-          <w:hyperlink w:anchor="_Toc243386731" w:history="1">
+          <w:hyperlink w:anchor="_Toc243387708" w:history="1">
             <w:r>
               <w:rPr>
                 <w:rStyle w:val="Hyperlink"/>
@@ -512,7 +512,7 @@
                 <w:noProof/>
                 <w:webHidden/>
               </w:rPr>
-              <w:instrText xml:space="preserve"> PAGEREF _Toc243386731 \h </w:instrText>
+              <w:instrText xml:space="preserve"> PAGEREF _Toc243387708 \h </w:instrText>
             </w:r>
             <w:r>
               <w:rPr>
@@ -553,7 +553,7 @@
               <w:noProof/>
             </w:rPr>
           </w:pPr>
-          <w:hyperlink w:anchor="_Toc243386732" w:history="1">
+          <w:hyperlink w:anchor="_Toc243387709" w:history="1">
             <w:r>
               <w:rPr>
                 <w:rStyle w:val="Hyperlink"/>
@@ -580,7 +580,7 @@
                 <w:noProof/>
                 <w:webHidden/>
               </w:rPr>
-              <w:instrText xml:space="preserve"> PAGEREF _Toc243386732 \h </w:instrText>
+              <w:instrText xml:space="preserve"> PAGEREF _Toc243387709 \h </w:instrText>
             </w:r>
             <w:r>
               <w:rPr>
@@ -621,7 +621,7 @@
               <w:noProof/>
             </w:rPr>
           </w:pPr>
-          <w:hyperlink w:anchor="_Toc243386733" w:history="1">
+          <w:hyperlink w:anchor="_Toc243387710" w:history="1">
             <w:r>
               <w:rPr>
                 <w:rStyle w:val="Hyperlink"/>
@@ -648,7 +648,7 @@
                 <w:noProof/>
                 <w:webHidden/>
               </w:rPr>
-              <w:instrText xml:space="preserve"> PAGEREF _Toc243386733 \h </w:instrText>
+              <w:instrText xml:space="preserve"> PAGEREF _Toc243387710 \h </w:instrText>
             </w:r>
             <w:r>
               <w:rPr>
@@ -689,7 +689,7 @@
               <w:noProof/>
             </w:rPr>
           </w:pPr>
-          <w:hyperlink w:anchor="_Toc243386734" w:history="1">
+          <w:hyperlink w:anchor="_Toc243387711" w:history="1">
             <w:r>
               <w:rPr>
                 <w:rStyle w:val="Hyperlink"/>
@@ -716,7 +716,7 @@
                 <w:noProof/>
                 <w:webHidden/>
               </w:rPr>
-              <w:instrText xml:space="preserve"> PAGEREF _Toc243386734 \h </w:instrText>
+              <w:instrText xml:space="preserve"> PAGEREF _Toc243387711 \h </w:instrText>
             </w:r>
             <w:r>
               <w:rPr>
@@ -757,7 +757,7 @@
               <w:noProof/>
             </w:rPr>
           </w:pPr>
-          <w:hyperlink w:anchor="_Toc243386735" w:history="1">
+          <w:hyperlink w:anchor="_Toc243387712" w:history="1">
             <w:r>
               <w:rPr>
                 <w:rStyle w:val="Hyperlink"/>
@@ -784,7 +784,7 @@
                 <w:noProof/>
                 <w:webHidden/>
               </w:rPr>
-              <w:instrText xml:space="preserve"> PAGEREF _Toc243386735 \h </w:instrText>
+              <w:instrText xml:space="preserve"> PAGEREF _Toc243387712 \h </w:instrText>
             </w:r>
             <w:r>
               <w:rPr>
@@ -825,7 +825,7 @@
               <w:noProof/>
             </w:rPr>
           </w:pPr>
-          <w:hyperlink w:anchor="_Toc243386736" w:history="1">
+          <w:hyperlink w:anchor="_Toc243387713" w:history="1">
             <w:r>
               <w:rPr>
                 <w:rStyle w:val="Hyperlink"/>
@@ -852,7 +852,7 @@
                 <w:noProof/>
                 <w:webHidden/>
               </w:rPr>
-              <w:instrText xml:space="preserve"> PAGEREF _Toc243386736 \h </w:instrText>
+              <w:instrText xml:space="preserve"> PAGEREF _Toc243387713 \h </w:instrText>
             </w:r>
             <w:r>
               <w:rPr>
@@ -893,7 +893,7 @@
               <w:noProof/>
             </w:rPr>
           </w:pPr>
-          <w:hyperlink w:anchor="_Toc243386737" w:history="1">
+          <w:hyperlink w:anchor="_Toc243387714" w:history="1">
             <w:r>
               <w:rPr>
                 <w:rStyle w:val="Hyperlink"/>
@@ -920,7 +920,7 @@
                 <w:noProof/>
                 <w:webHidden/>
               </w:rPr>
-              <w:instrText xml:space="preserve"> PAGEREF _Toc243386737 \h </w:instrText>
+              <w:instrText xml:space="preserve"> PAGEREF _Toc243387714 \h </w:instrText>
             </w:r>
             <w:r>
               <w:rPr>
@@ -961,7 +961,7 @@
               <w:noProof/>
             </w:rPr>
           </w:pPr>
-          <w:hyperlink w:anchor="_Toc243386738" w:history="1">
+          <w:hyperlink w:anchor="_Toc243387715" w:history="1">
             <w:r>
               <w:rPr>
                 <w:rStyle w:val="Hyperlink"/>
@@ -988,7 +988,7 @@
                 <w:noProof/>
                 <w:webHidden/>
               </w:rPr>
-              <w:instrText xml:space="preserve"> PAGEREF _Toc243386738 \h </w:instrText>
+              <w:instrText xml:space="preserve"> PAGEREF _Toc243387715 \h </w:instrText>
             </w:r>
             <w:r>
               <w:rPr>
@@ -1029,7 +1029,7 @@
               <w:noProof/>
             </w:rPr>
           </w:pPr>
-          <w:hyperlink w:anchor="_Toc243386739" w:history="1">
+          <w:hyperlink w:anchor="_Toc243387716" w:history="1">
             <w:r>
               <w:rPr>
                 <w:rStyle w:val="Hyperlink"/>
@@ -1056,7 +1056,7 @@
                 <w:noProof/>
                 <w:webHidden/>
               </w:rPr>
-              <w:instrText xml:space="preserve"> PAGEREF _Toc243386739 \h </w:instrText>
+              <w:instrText xml:space="preserve"> PAGEREF _Toc243387716 \h </w:instrText>
             </w:r>
             <w:r>
               <w:rPr>
@@ -1097,7 +1097,7 @@
               <w:noProof/>
             </w:rPr>
           </w:pPr>
-          <w:hyperlink w:anchor="_Toc243386740" w:history="1">
+          <w:hyperlink w:anchor="_Toc243387717" w:history="1">
             <w:r>
               <w:rPr>
                 <w:rStyle w:val="Hyperlink"/>
@@ -1124,7 +1124,7 @@
                 <w:noProof/>
                 <w:webHidden/>
               </w:rPr>
-              <w:instrText xml:space="preserve"> PAGEREF _Toc243386740 \h </w:instrText>
+              <w:instrText xml:space="preserve"> PAGEREF _Toc243387717 \h </w:instrText>
             </w:r>
             <w:r>
               <w:rPr>
@@ -1165,7 +1165,7 @@
               <w:noProof/>
             </w:rPr>
           </w:pPr>
-          <w:hyperlink w:anchor="_Toc243386741" w:history="1">
+          <w:hyperlink w:anchor="_Toc243387718" w:history="1">
             <w:r>
               <w:rPr>
                 <w:rStyle w:val="Hyperlink"/>
@@ -1192,7 +1192,7 @@
                 <w:noProof/>
                 <w:webHidden/>
               </w:rPr>
-              <w:instrText xml:space="preserve"> PAGEREF _Toc243386741 \h </w:instrText>
+              <w:instrText xml:space="preserve"> PAGEREF _Toc243387718 \h </w:instrText>
             </w:r>
             <w:r>
               <w:rPr>
@@ -1233,7 +1233,7 @@
               <w:noProof/>
             </w:rPr>
           </w:pPr>
-          <w:hyperlink w:anchor="_Toc243386742" w:history="1">
+          <w:hyperlink w:anchor="_Toc243387719" w:history="1">
             <w:r>
               <w:rPr>
                 <w:rStyle w:val="Hyperlink"/>
@@ -1260,7 +1260,7 @@
                 <w:noProof/>
                 <w:webHidden/>
               </w:rPr>
-              <w:instrText xml:space="preserve"> PAGEREF _Toc243386742 \h </w:instrText>
+              <w:instrText xml:space="preserve"> PAGEREF _Toc243387719 \h </w:instrText>
             </w:r>
             <w:r>
               <w:rPr>
@@ -1301,7 +1301,7 @@
               <w:noProof/>
             </w:rPr>
           </w:pPr>
-          <w:hyperlink w:anchor="_Toc243386743" w:history="1">
+          <w:hyperlink w:anchor="_Toc243387720" w:history="1">
             <w:r>
               <w:rPr>
                 <w:rStyle w:val="Hyperlink"/>
@@ -1328,7 +1328,7 @@
                 <w:noProof/>
                 <w:webHidden/>
               </w:rPr>
-              <w:instrText xml:space="preserve"> PAGEREF _Toc243386743 \h </w:instrText>
+              <w:instrText xml:space="preserve"> PAGEREF _Toc243387720 \h </w:instrText>
             </w:r>
             <w:r>
               <w:rPr>
@@ -1369,7 +1369,7 @@
               <w:noProof/>
             </w:rPr>
           </w:pPr>
-          <w:hyperlink w:anchor="_Toc243386744" w:history="1">
+          <w:hyperlink w:anchor="_Toc243387721" w:history="1">
             <w:r>
               <w:rPr>
                 <w:rStyle w:val="Hyperlink"/>
@@ -1396,7 +1396,7 @@
                 <w:noProof/>
                 <w:webHidden/>
               </w:rPr>
-              <w:instrText xml:space="preserve"> PAGEREF _Toc243386744 \h </w:instrText>
+              <w:instrText xml:space="preserve"> PAGEREF _Toc243387721 \h </w:instrText>
             </w:r>
             <w:r>
               <w:rPr>
@@ -1437,7 +1437,7 @@
               <w:noProof/>
             </w:rPr>
           </w:pPr>
-          <w:hyperlink w:anchor="_Toc243386745" w:history="1">
+          <w:hyperlink w:anchor="_Toc243387722" w:history="1">
             <w:r>
               <w:rPr>
                 <w:rStyle w:val="Hyperlink"/>
@@ -1464,7 +1464,7 @@
                 <w:noProof/>
                 <w:webHidden/>
               </w:rPr>
-              <w:instrText xml:space="preserve"> PAGEREF _Toc243386745 \h </w:instrText>
+              <w:instrText xml:space="preserve"> PAGEREF _Toc243387722 \h </w:instrText>
             </w:r>
             <w:r>
               <w:rPr>
@@ -1505,7 +1505,7 @@
               <w:noProof/>
             </w:rPr>
           </w:pPr>
-          <w:hyperlink w:anchor="_Toc243386746" w:history="1">
+          <w:hyperlink w:anchor="_Toc243387723" w:history="1">
             <w:r>
               <w:rPr>
                 <w:rStyle w:val="Hyperlink"/>
@@ -1532,7 +1532,7 @@
                 <w:noProof/>
                 <w:webHidden/>
               </w:rPr>
-              <w:instrText xml:space="preserve"> PAGEREF _Toc243386746 \h </w:instrText>
+              <w:instrText xml:space="preserve"> PAGEREF _Toc243387723 \h </w:instrText>
             </w:r>
             <w:r>
               <w:rPr>
@@ -1573,7 +1573,7 @@
               <w:noProof/>
             </w:rPr>
           </w:pPr>
-          <w:hyperlink w:anchor="_Toc243386747" w:history="1">
+          <w:hyperlink w:anchor="_Toc243387724" w:history="1">
             <w:r>
               <w:rPr>
                 <w:rStyle w:val="Hyperlink"/>
@@ -1600,7 +1600,7 @@
                 <w:noProof/>
                 <w:webHidden/>
               </w:rPr>
-              <w:instrText xml:space="preserve"> PAGEREF _Toc243386747 \h </w:instrText>
+              <w:instrText xml:space="preserve"> PAGEREF _Toc243387724 \h </w:instrText>
             </w:r>
             <w:r>
               <w:rPr>
@@ -1641,7 +1641,7 @@
               <w:noProof/>
             </w:rPr>
           </w:pPr>
-          <w:hyperlink w:anchor="_Toc243386748" w:history="1">
+          <w:hyperlink w:anchor="_Toc243387725" w:history="1">
             <w:r>
               <w:rPr>
                 <w:rStyle w:val="Hyperlink"/>
@@ -1668,7 +1668,7 @@
                 <w:noProof/>
                 <w:webHidden/>
               </w:rPr>
-              <w:instrText xml:space="preserve"> PAGEREF _Toc243386748 \h </w:instrText>
+              <w:instrText xml:space="preserve"> PAGEREF _Toc243387725 \h </w:instrText>
             </w:r>
             <w:r>
               <w:rPr>
@@ -1709,7 +1709,7 @@
               <w:noProof/>
             </w:rPr>
           </w:pPr>
-          <w:hyperlink w:anchor="_Toc243386749" w:history="1">
+          <w:hyperlink w:anchor="_Toc243387726" w:history="1">
             <w:r>
               <w:rPr>
                 <w:rStyle w:val="Hyperlink"/>
@@ -1736,7 +1736,7 @@
                 <w:noProof/>
                 <w:webHidden/>
               </w:rPr>
-              <w:instrText xml:space="preserve"> PAGEREF _Toc243386749 \h </w:instrText>
+              <w:instrText xml:space="preserve"> PAGEREF _Toc243387726 \h </w:instrText>
             </w:r>
             <w:r>
               <w:rPr>
@@ -1756,7 +1756,7 @@
                 <w:noProof/>
                 <w:webHidden/>
               </w:rPr>
-              <w:t>15</w:t>
+              <w:t>16</w:t>
             </w:r>
             <w:r>
               <w:rPr>
@@ -1777,7 +1777,7 @@
               <w:noProof/>
             </w:rPr>
           </w:pPr>
-          <w:hyperlink w:anchor="_Toc243386750" w:history="1">
+          <w:hyperlink w:anchor="_Toc243387727" w:history="1">
             <w:r>
               <w:rPr>
                 <w:rStyle w:val="Hyperlink"/>
@@ -1804,7 +1804,7 @@
                 <w:noProof/>
                 <w:webHidden/>
               </w:rPr>
-              <w:instrText xml:space="preserve"> PAGEREF _Toc243386750 \h </w:instrText>
+              <w:instrText xml:space="preserve"> PAGEREF _Toc243387727 \h </w:instrText>
             </w:r>
             <w:r>
               <w:rPr>
@@ -1848,7 +1848,7 @@
         <w:pStyle w:val="Ttulo1"/>
       </w:pPr>
       <w:bookmarkStart w:id="0" w:name="_56df7a16a9fe64f9452cb7ca4525fc3d95a27de"/>
-      <w:bookmarkStart w:id="1" w:name="_Toc243386725"/>
+      <w:bookmarkStart w:id="1" w:name="_Toc243387702"/>
       <w:r>
         <w:t>1. Resumen ejecutivo</w:t>
       </w:r>
@@ -1971,13 +1971,13 @@
           <w:b/>
           <w:bCs/>
         </w:rPr>
-        <w:t>la derivación solo espera a un humano cuando falta información o el ruteo es ambiguo</w:t>
-      </w:r>
-      <w:r>
-        <w:t>. En el resto de los casos (incluidas las P1) se deriva de inmediato</w:t>
-      </w:r>
-      <w:r>
-        <w:t xml:space="preserve"> y la revisión humana del análisis ocurre en paralelo.</w:t>
+        <w:t>la derivación no espera ni a la IA ni a un humano</w:t>
+      </w:r>
+      <w:r>
+        <w:t>: se hace por regla en cuanto la Incidencia está priorizada (segundos), y el análisis IA se agrega desp</w:t>
+      </w:r>
+      <w:r>
+        <w:t>ués al Ticket maestro como nota interna. Solo espera al Operador NOC cuando falta información o el ruteo es ambiguo. Si el validador encuentra cualquier error en el análisis, el resumen se retiene hasta que el operador lo revise.</w:t>
       </w:r>
     </w:p>
     <w:p>
@@ -1995,10 +1995,13 @@
         <w:t>AWS</w:t>
       </w:r>
       <w:r>
-        <w:t>, en topología híbrida: los sistemas del operador permanecen on-premise y se consultan por Direct Connect. Si la IA falla, la operación se degrada sin detenerse: los pasos deter</w:t>
-      </w:r>
-      <w:r>
-        <w:t>ministas siguen funcionando y la Incidencia se deriva por reglas, marcada “sin análisis IA”.</w:t>
+        <w:t xml:space="preserve">, </w:t>
+      </w:r>
+      <w:r>
+        <w:t>en topología híbrida: los sistemas del operador permanecen on-premise y se consultan por Direct Connect. Si la IA falla, la operación se degrada sin detenerse: los pasos deterministas siguen funcionando y la Incidencia se deriva por reglas, marcada “sin an</w:t>
+      </w:r>
+      <w:r>
+        <w:t>álisis IA”.</w:t>
       </w:r>
     </w:p>
     <w:p>
@@ -2013,10 +2016,10 @@
         <w:t>Qué está implementado y qué no.</w:t>
       </w:r>
       <w:r>
-        <w:t xml:space="preserve"> Este documento es un diseño. El prototipo adjunto contiene los contratos de tools, el esquema de salida, las reglas deterministas y</w:t>
-      </w:r>
-      <w:r>
-        <w:t xml:space="preserve"> 18 casos de evaluación ejecutables. No se desplegó ningún servicio ni se invocó ningún modelo real.</w:t>
+        <w:t xml:space="preserve"> Este documento es un diseño. El prototipo adjunto contiene los contratos de tools, el esquema de salida, las reglas deterministas y 18 casos de evaluación ejecutables. No se desplegó ningún servicio ni se invocó </w:t>
+      </w:r>
+      <w:r>
+        <w:t>ningún modelo real.</w:t>
       </w:r>
     </w:p>
     <w:p>
@@ -2024,7 +2027,7 @@
         <w:pStyle w:val="Ttulo2"/>
       </w:pPr>
       <w:bookmarkStart w:id="2" w:name="_términos"/>
-      <w:bookmarkStart w:id="3" w:name="_Toc243386726"/>
+      <w:bookmarkStart w:id="3" w:name="_Toc243387703"/>
       <w:r>
         <w:t>Términos</w:t>
       </w:r>
@@ -2431,7 +2434,7 @@
         <w:pStyle w:val="Ttulo1"/>
       </w:pPr>
       <w:bookmarkStart w:id="4" w:name="_supuestos"/>
-      <w:bookmarkStart w:id="5" w:name="_Toc243386727"/>
+      <w:bookmarkStart w:id="5" w:name="_Toc243387704"/>
       <w:r>
         <w:lastRenderedPageBreak/>
         <w:t>2. Supuestos</w:t>
@@ -2902,7 +2905,7 @@
               <w:rPr>
                 <w:sz w:val="18"/>
               </w:rPr>
-              <w:t>La evaluación offline empieza con un set más chico más etiquetado en modo sombra.</w:t>
+              <w:t>La evaluación offline empieza con un set más chico, ampliado con etiquetado en modo sombra.</w:t>
             </w:r>
           </w:p>
         </w:tc>
@@ -3132,7 +3135,7 @@
         <w:pStyle w:val="Ttulo1"/>
       </w:pPr>
       <w:bookmarkStart w:id="6" w:name="_531a22751b42dbc4314ac29de4d0b14085fbf94"/>
-      <w:bookmarkStart w:id="7" w:name="_Toc243386728"/>
+      <w:bookmarkStart w:id="7" w:name="_Toc243387705"/>
       <w:r>
         <w:t>3. Matriz de decisiones de automatización</w:t>
       </w:r>
@@ -3182,6 +3185,34 @@
       </w:r>
       <w:r>
         <w:t>, que es la investigación.</w:t>
+      </w:r>
+    </w:p>
+    <w:p>
+      <w:pPr>
+        <w:pStyle w:val="Corpodetexto"/>
+      </w:pPr>
+      <w:r>
+        <w:rPr>
+          <w:b/>
+          <w:bCs/>
+        </w:rPr>
+        <w:t>Orden de ejecución.</w:t>
+      </w:r>
+      <w:r>
+        <w:t xml:space="preserve"> La numeración sigue el enunciado, pero el workflow ejecuta 1 → 2 → 3 → 4 → </w:t>
+      </w:r>
+      <w:r>
+        <w:rPr>
+          <w:b/>
+          <w:bCs/>
+        </w:rPr>
+        <w:t>6</w:t>
+      </w:r>
+      <w:r>
+        <w:t xml:space="preserve"> → 5 → 7 → 8: el ruteo por reglas y la derivación van antes de la investigación porque no dependen de la IA, y así la Incidencia </w:t>
+      </w:r>
+      <w:r>
+        <w:t>llega al Equipo resolutor sin esperar el análisis.</w:t>
       </w:r>
     </w:p>
     <w:tbl>
@@ -3511,13 +3542,13 @@
               <w:rPr>
                 <w:sz w:val="18"/>
               </w:rPr>
-              <w:t xml:space="preserve"> </w:t>
-            </w:r>
-            <w:r>
-              <w:rPr>
-                <w:sz w:val="18"/>
-              </w:rPr>
-              <w:t xml:space="preserve">solo para Tickets en texto libre: extrae equipo/servicio, ubicación y Síntoma con salida estructurada. Luego, </w:t>
+              <w:t xml:space="preserve"> solo para Tickets en texto libre: extrae equipo/servicio, ubic</w:t>
+            </w:r>
+            <w:r>
+              <w:rPr>
+                <w:sz w:val="18"/>
+              </w:rPr>
+              <w:t xml:space="preserve">ación y Síntoma con salida estructurada. Luego, </w:t>
             </w:r>
             <w:r>
               <w:rPr>
@@ -3531,7 +3562,14 @@
               <w:rPr>
                 <w:sz w:val="18"/>
               </w:rPr>
-              <w:t>: campos obligatorios, Síntoma dentro del catálogo, correlación por equipo, ventana de tiempo y topología padre-hijo.</w:t>
+              <w:t xml:space="preserve">: campos </w:t>
+            </w:r>
+            <w:r>
+              <w:rPr>
+                <w:sz w:val="18"/>
+              </w:rPr>
+              <w:lastRenderedPageBreak/>
+              <w:t>obligatorios, Síntoma dentro del catálogo, correlación por equipo, ventana de tiempo y topología padre-hijo.</w:t>
             </w:r>
           </w:p>
         </w:tc>
@@ -3551,13 +3589,21 @@
               <w:rPr>
                 <w:sz w:val="18"/>
               </w:rPr>
-              <w:t>La extracción va prime</w:t>
-            </w:r>
-            <w:r>
-              <w:rPr>
-                <w:sz w:val="18"/>
-              </w:rPr>
-              <w:t>ro porque la validación y el enriquecimiento necesitan esos campos. La deduplicación debe ser reproducible y auditable; la topología explica la mayor parte de la correlación (una caída upstream explica las Alertas downstream).</w:t>
+              <w:lastRenderedPageBreak/>
+              <w:t>La extracción va primero porque la validación y el enriquecimiento necesitan esos ca</w:t>
+            </w:r>
+            <w:r>
+              <w:rPr>
+                <w:sz w:val="18"/>
+              </w:rPr>
+              <w:t xml:space="preserve">mpos. La deduplicación debe ser reproducible </w:t>
+            </w:r>
+            <w:r>
+              <w:rPr>
+                <w:sz w:val="18"/>
+              </w:rPr>
+              <w:lastRenderedPageBreak/>
+              <w:t>y auditable; la topología explica la mayor parte de la correlación (una caída upstream explica las Alertas downstream).</w:t>
             </w:r>
           </w:p>
         </w:tc>
@@ -3577,13 +3623,21 @@
               <w:rPr>
                 <w:sz w:val="18"/>
               </w:rPr>
-              <w:t>LLM para decidir si dos Alert</w:t>
-            </w:r>
-            <w:r>
-              <w:rPr>
-                <w:sz w:val="18"/>
-              </w:rPr>
-              <w:t>as son “la misma”: no determinista y difícil de auditar. Se pueden usar embeddings como señal secundaria en una fase 2, nunca como decisión.</w:t>
+              <w:lastRenderedPageBreak/>
+              <w:t>LLM para decidir si dos Alertas son “la misma”: no determinista y difícil de auditar. Se pu</w:t>
+            </w:r>
+            <w:r>
+              <w:rPr>
+                <w:sz w:val="18"/>
+              </w:rPr>
+              <w:t xml:space="preserve">eden usar </w:t>
+            </w:r>
+            <w:r>
+              <w:rPr>
+                <w:sz w:val="18"/>
+              </w:rPr>
+              <w:lastRenderedPageBreak/>
+              <w:t>embeddings como señal secundaria en una fase 2, nunca como decisión.</w:t>
             </w:r>
           </w:p>
         </w:tc>
@@ -3674,13 +3728,7 @@
               <w:rPr>
                 <w:sz w:val="18"/>
               </w:rPr>
-              <w:t>Son lookups por clave;</w:t>
-            </w:r>
-            <w:r>
-              <w:rPr>
-                <w:sz w:val="18"/>
-              </w:rPr>
-              <w:t xml:space="preserve"> la respuesta correcta es única.</w:t>
+              <w:t>Son lookups por clave; la respuesta correcta es única.</w:t>
             </w:r>
           </w:p>
         </w:tc>
@@ -3700,7 +3748,13 @@
               <w:rPr>
                 <w:sz w:val="18"/>
               </w:rPr>
-              <w:t>Que el agente lo consulte: lento, caro y no garantiza completitud.</w:t>
+              <w:t>Que el agente lo consulte: le</w:t>
+            </w:r>
+            <w:r>
+              <w:rPr>
+                <w:sz w:val="18"/>
+              </w:rPr>
+              <w:t>nto, caro y no garantiza completitud.</w:t>
             </w:r>
           </w:p>
         </w:tc>
@@ -4008,7 +4062,7 @@
               <w:rPr>
                 <w:sz w:val="18"/>
               </w:rPr>
-              <w:t xml:space="preserve"> (tipo de equipo/dominio → Equipo resolutor). Si es ambiguo, la IA sugiere y el Operador NOC decide.</w:t>
+              <w:t xml:space="preserve"> (tipo de equipo/dominio → Equipo resolutor), ejecutada justo después de priorizar; si es unívoca, se deriva de inmediato. Si es ambigua, se espera la sugerencia del agente y decide el Operador NOC.</w:t>
             </w:r>
           </w:p>
         </w:tc>
@@ -4028,7 +4082,13 @@
               <w:rPr>
                 <w:sz w:val="18"/>
               </w:rPr>
-              <w:t>El ruteo erróneo es el principal costo operativo (reasignaciones); la regla es explicable.</w:t>
+              <w:t xml:space="preserve">El ruteo erróneo es </w:t>
+            </w:r>
+            <w:r>
+              <w:rPr>
+                <w:sz w:val="18"/>
+              </w:rPr>
+              <w:t>el principal costo operativo (reasignaciones); la regla es explicable y no necesita esperar a la IA.</w:t>
             </w:r>
           </w:p>
         </w:tc>
@@ -4048,13 +4108,7 @@
               <w:rPr>
                 <w:sz w:val="18"/>
               </w:rPr>
-              <w:t>LLM decide el equipo: sin g</w:t>
-            </w:r>
-            <w:r>
-              <w:rPr>
-                <w:sz w:val="18"/>
-              </w:rPr>
-              <w:t xml:space="preserve">arantía. Se acepta solo como </w:t>
+              <w:t xml:space="preserve">LLM decide el equipo: sin garantía. Se acepta solo como </w:t>
             </w:r>
             <w:r>
               <w:rPr>
@@ -4138,7 +4192,13 @@
               <w:rPr>
                 <w:sz w:val="18"/>
               </w:rPr>
-              <w:t xml:space="preserve"> (una llamada con salida estructurada: hechos, hipótesis, evidencias con cita, acciones sugeridas)</w:t>
+              <w:t xml:space="preserve"> (una llamada con salida estructurada</w:t>
+            </w:r>
+            <w:r>
+              <w:rPr>
+                <w:sz w:val="18"/>
+              </w:rPr>
+              <w:t>: hechos, hipótesis, evidencias con cita, acciones sugeridas)</w:t>
             </w:r>
           </w:p>
         </w:tc>
@@ -4158,13 +4218,7 @@
               <w:rPr>
                 <w:sz w:val="18"/>
               </w:rPr>
-              <w:t>Redactar y sintetizar es la fortaleza del LLM, y la estructura per</w:t>
-            </w:r>
-            <w:r>
-              <w:rPr>
-                <w:sz w:val="18"/>
-              </w:rPr>
-              <w:t>mite validarlo de forma determinista.</w:t>
+              <w:t>Redactar y sintetizar es la fortaleza del LLM, y la estructura permite validarlo de forma determinista.</w:t>
             </w:r>
           </w:p>
         </w:tc>
@@ -4184,7 +4238,13 @@
               <w:rPr>
                 <w:sz w:val="18"/>
               </w:rPr>
-              <w:t>Plantilla fija: no sintetiza la investigación. Agente: innecesario, no hay decisiones que tomar.</w:t>
+              <w:t xml:space="preserve">Plantilla fija: no sintetiza la investigación. Agente: innecesario, no hay decisiones que </w:t>
+            </w:r>
+            <w:r>
+              <w:rPr>
+                <w:sz w:val="18"/>
+              </w:rPr>
+              <w:t>tomar.</w:t>
             </w:r>
           </w:p>
         </w:tc>
@@ -4254,13 +4314,7 @@
               <w:rPr>
                 <w:sz w:val="18"/>
               </w:rPr>
-              <w:t xml:space="preserve"> </w:t>
-            </w:r>
-            <w:r>
-              <w:rPr>
-                <w:sz w:val="18"/>
-              </w:rPr>
-              <w:t xml:space="preserve">(escritura vía API por el workflow; reglas de escalamiento E1–E7) + </w:t>
+              <w:t xml:space="preserve"> (escritura vía API por el workflow; reglas de escalamiento E1–E7) + </w:t>
             </w:r>
             <w:r>
               <w:rPr>
@@ -4308,13 +4362,7 @@
               <w:rPr>
                 <w:sz w:val="18"/>
               </w:rPr>
-              <w:t xml:space="preserve">Que el agente escriba directamente: viola el requisito de no </w:t>
-            </w:r>
-            <w:r>
-              <w:rPr>
-                <w:sz w:val="18"/>
-              </w:rPr>
-              <w:t>actuar sin controles.</w:t>
+              <w:t>Que el agente escriba directamente: viola el requisito de no actuar sin controles.</w:t>
             </w:r>
           </w:p>
         </w:tc>
@@ -4329,7 +4377,14 @@
           <w:b/>
           <w:bCs/>
         </w:rPr>
-        <w:t>Resultado: 1 agente, 2 llamadas LLM puntuales y el resto determinista.</w:t>
+        <w:t>Resultado: 1 agente, 2 llamadas LLM puntuales y el resto determ</w:t>
+      </w:r>
+      <w:r>
+        <w:rPr>
+          <w:b/>
+          <w:bCs/>
+        </w:rPr>
+        <w:t>inista.</w:t>
       </w:r>
     </w:p>
     <w:p>
@@ -4337,7 +4392,7 @@
         <w:pStyle w:val="Ttulo2"/>
       </w:pPr>
       <w:bookmarkStart w:id="8" w:name="_cc537778eb01bdc76d0f5f2669747e78821567e"/>
-      <w:bookmarkStart w:id="9" w:name="_Toc243386729"/>
+      <w:bookmarkStart w:id="9" w:name="_Toc243387706"/>
       <w:r>
         <w:t>Señales de escalamiento al Operador NOC</w:t>
       </w:r>
@@ -4349,10 +4404,7 @@
         <w:pStyle w:val="FirstParagraph"/>
       </w:pPr>
       <w:r>
-        <w:t>Ninguna depende de una “confianza” autodeclarada por el LLM, porque no es una señal fiable. Todas son verificables, y solo</w:t>
-      </w:r>
-      <w:r>
-        <w:t xml:space="preserve"> E1 y E3 impiden derivar:</w:t>
+        <w:t>Ninguna depende de una “confianza” autodeclarada por el LLM, porque no es una señal fiable. Todas son verificables, y solo E1 y E3 impiden derivar:</w:t>
       </w:r>
     </w:p>
     <w:tbl>
@@ -4652,7 +4704,7 @@
               <w:rPr>
                 <w:sz w:val="18"/>
               </w:rPr>
-              <w:t xml:space="preserve">Se deriva por reglas; </w:t>
+              <w:t xml:space="preserve">Ya derivada por regla; </w:t>
             </w:r>
             <w:r>
               <w:rPr>
@@ -4728,7 +4780,13 @@
               <w:rPr>
                 <w:sz w:val="18"/>
               </w:rPr>
-              <w:t xml:space="preserve">Se deriva de inmediato; revisión humana del resumen </w:t>
+              <w:t>Ya derivada por regla; revisión humana del resu</w:t>
+            </w:r>
+            <w:r>
+              <w:rPr>
+                <w:sz w:val="18"/>
+              </w:rPr>
+              <w:t xml:space="preserve">men </w:t>
             </w:r>
             <w:r>
               <w:rPr>
@@ -4866,88 +4924,65 @@
               <w:rPr>
                 <w:sz w:val="18"/>
               </w:rPr>
-              <w:t xml:space="preserve">Revisión </w:t>
-            </w:r>
-            <w:r>
-              <w:rPr>
-                <w:sz w:val="18"/>
-              </w:rPr>
-              <w:t>en paralelo; la acción se deriva a gestión de cambios y nunca se ejecuta.</w:t>
-            </w:r>
-          </w:p>
-        </w:tc>
-      </w:tr>
-      <w:tr>
-        <w:tc>
-          <w:tcPr>
-            <w:tcW w:w="556" w:type="pct"/>
-            <w:shd w:val="clear" w:color="auto" w:fill="auto"/>
-          </w:tcPr>
-          <w:p>
-            <w:pPr>
-              <w:pStyle w:val="Compact"/>
-              <w:rPr>
-                <w:sz w:val="18"/>
-              </w:rPr>
-            </w:pPr>
-            <w:r>
-              <w:rPr>
-                <w:sz w:val="18"/>
-              </w:rPr>
-              <w:t>E7</w:t>
-            </w:r>
-          </w:p>
-        </w:tc>
-        <w:tc>
-          <w:tcPr>
-            <w:tcW w:w="2778" w:type="pct"/>
-            <w:shd w:val="clear" w:color="auto" w:fill="auto"/>
-          </w:tcPr>
-          <w:p>
-            <w:pPr>
-              <w:pStyle w:val="Compact"/>
-              <w:rPr>
-                <w:sz w:val="18"/>
-              </w:rPr>
-            </w:pPr>
-            <w:r>
-              <w:rPr>
-                <w:sz w:val="18"/>
-              </w:rPr>
-              <w:t>IA no disponible</w:t>
-            </w:r>
-          </w:p>
-        </w:tc>
-        <w:tc>
-          <w:tcPr>
-            <w:tcW w:w="1667" w:type="pct"/>
-            <w:shd w:val="clear" w:color="auto" w:fill="auto"/>
-          </w:tcPr>
-          <w:p>
-            <w:pPr>
-              <w:pStyle w:val="Compact"/>
-              <w:rPr>
-                <w:sz w:val="18"/>
-              </w:rPr>
-            </w:pPr>
-            <w:r>
-              <w:rPr>
-                <w:sz w:val="18"/>
-              </w:rPr>
-              <w:t>Marca de degradación; no escala por sí sola.</w:t>
+              <w:t xml:space="preserve">Revisión en paralelo; la acción se deriva a </w:t>
+            </w:r>
+            <w:r>
+              <w:rPr>
+                <w:sz w:val="18"/>
+              </w:rPr>
+              <w:lastRenderedPageBreak/>
+              <w:t xml:space="preserve">gestión de cambios y nunca </w:t>
+            </w:r>
+            <w:r>
+              <w:rPr>
+                <w:sz w:val="18"/>
+              </w:rPr>
+              <w:t xml:space="preserve">se ejecuta. Si la acción no viene marcada como que requiere autorización, o es un cambio clasificado como diagnóstico, </w:t>
+            </w:r>
+            <w:r>
+              <w:rPr>
+                <w:b/>
+                <w:bCs/>
+                <w:sz w:val="18"/>
+              </w:rPr>
+              <w:t>el resumen se retiene</w:t>
+            </w:r>
+            <w:r>
+              <w:rPr>
+                <w:sz w:val="18"/>
+              </w:rPr>
+              <w:t>.</w:t>
             </w:r>
           </w:p>
         </w:tc>
       </w:tr>
     </w:tbl>
+    <w:p>
+      <w:pPr>
+        <w:pStyle w:val="FirstParagraph"/>
+      </w:pPr>
+      <w:r>
+        <w:rPr>
+          <w:b/>
+          <w:bCs/>
+        </w:rPr>
+        <w:lastRenderedPageBreak/>
+        <w:t>Regla de publicación del resumen:</w:t>
+      </w:r>
+      <w:r>
+        <w:t xml:space="preserve"> cualquier error del validador (E2 o E6 con error) retiene el resumen; solo un r</w:t>
+      </w:r>
+      <w:r>
+        <w:t>esumen sin errores se publica como nota interna. | E7 | IA no disponible | Marca de degradación; no escala por sí sola. |</w:t>
+      </w:r>
+    </w:p>
     <w:p>
       <w:pPr>
         <w:pStyle w:val="Ttulo1"/>
       </w:pPr>
       <w:bookmarkStart w:id="10" w:name="_856108c0b7ef2b2986130cc133917d17543cf90"/>
-      <w:bookmarkStart w:id="11" w:name="_Toc243386730"/>
-      <w:r>
-        <w:lastRenderedPageBreak/>
+      <w:bookmarkStart w:id="11" w:name="_Toc243387707"/>
+      <w:r>
         <w:t>4. Arquitectura conceptual / lógica</w:t>
       </w:r>
       <w:bookmarkEnd w:id="10"/>
@@ -4962,8 +4997,8 @@
           <w:noProof/>
         </w:rPr>
         <w:drawing>
-          <wp:inline distT="0" distB="0" distL="0" distR="0" wp14:anchorId="0A11A018" wp14:editId="61377E1A">
-            <wp:extent cx="5334000" cy="2707163"/>
+          <wp:inline distT="0" distB="0" distL="0" distR="0" wp14:anchorId="62543AAF" wp14:editId="545C440F">
+            <wp:extent cx="5334000" cy="2314726"/>
             <wp:effectExtent l="0" t="0" r="0" b="0"/>
             <wp:docPr id="16" name="Picture" descr="Arquitectura lógica"/>
             <wp:cNvGraphicFramePr>
@@ -4987,7 +5022,7 @@
                   <pic:spPr bwMode="auto">
                     <a:xfrm>
                       <a:off x="0" y="0"/>
-                      <a:ext cx="5334000" cy="2707163"/>
+                      <a:ext cx="5334000" cy="2314726"/>
                     </a:xfrm>
                     <a:prstGeom prst="rect">
                       <a:avLst/>
@@ -5027,7 +5062,7 @@
         <w:pStyle w:val="Ttulo2"/>
       </w:pPr>
       <w:bookmarkStart w:id="12" w:name="_e0af0e1b985d8e69940266f243ca259d425efb7"/>
-      <w:bookmarkStart w:id="13" w:name="_Toc243386731"/>
+      <w:bookmarkStart w:id="13" w:name="_Toc243387708"/>
       <w:r>
         <w:t>4.1 Componentes, datos y límites de acceso</w:t>
       </w:r>
@@ -5305,7 +5340,13 @@
               <w:rPr>
                 <w:sz w:val="18"/>
               </w:rPr>
-              <w:t>Estado de la Incidencia</w:t>
+              <w:t>Estado de la Inci</w:t>
+            </w:r>
+            <w:r>
+              <w:rPr>
+                <w:sz w:val="18"/>
+              </w:rPr>
+              <w:t>dencia</w:t>
             </w:r>
           </w:p>
         </w:tc>
@@ -5448,7 +5489,13 @@
               <w:rPr>
                 <w:sz w:val="18"/>
               </w:rPr>
-              <w:t xml:space="preserve"> en origen.</w:t>
+              <w:t xml:space="preserve"> </w:t>
+            </w:r>
+            <w:r>
+              <w:rPr>
+                <w:sz w:val="18"/>
+              </w:rPr>
+              <w:t>en origen.</w:t>
             </w:r>
           </w:p>
         </w:tc>
@@ -5490,13 +5537,7 @@
               <w:rPr>
                 <w:sz w:val="18"/>
               </w:rPr>
-              <w:t>Seudonimizar clientes, contactos e IPs antes de cualquier llamada al modelo; filtrar entrada y s</w:t>
-            </w:r>
-            <w:r>
-              <w:rPr>
-                <w:sz w:val="18"/>
-              </w:rPr>
-              <w:t>alida</w:t>
+              <w:t>Seudonimizar clientes, contactos e IPs antes de cualquier llamada al modelo; filtrar entrada y salida</w:t>
             </w:r>
           </w:p>
         </w:tc>
@@ -5571,46 +5612,60 @@
               <w:rPr>
                 <w:sz w:val="18"/>
               </w:rPr>
-              <w:t>LLM extracción (workflow IA)</w:t>
-            </w:r>
-          </w:p>
-        </w:tc>
-        <w:tc>
-          <w:tcPr>
-            <w:tcW w:w="1250" w:type="pct"/>
-            <w:shd w:val="clear" w:color="auto" w:fill="auto"/>
-          </w:tcPr>
-          <w:p>
-            <w:pPr>
-              <w:pStyle w:val="Compact"/>
-              <w:rPr>
-                <w:sz w:val="18"/>
-              </w:rPr>
-            </w:pPr>
-            <w:r>
-              <w:rPr>
-                <w:sz w:val="18"/>
-              </w:rPr>
-              <w:t>Texto libre del Ticket → equipo/servicio, ubicación y Síntoma</w:t>
-            </w:r>
-          </w:p>
-        </w:tc>
-        <w:tc>
-          <w:tcPr>
-            <w:tcW w:w="1250" w:type="pct"/>
-            <w:shd w:val="clear" w:color="auto" w:fill="auto"/>
-          </w:tcPr>
-          <w:p>
-            <w:pPr>
-              <w:pStyle w:val="Compact"/>
-              <w:rPr>
-                <w:sz w:val="18"/>
-              </w:rPr>
-            </w:pPr>
-            <w:r>
-              <w:rPr>
-                <w:sz w:val="18"/>
-              </w:rPr>
+              <w:t xml:space="preserve">LLM </w:t>
+            </w:r>
+            <w:r>
+              <w:rPr>
+                <w:sz w:val="18"/>
+              </w:rPr>
+              <w:t>extracción (workflow IA)</w:t>
+            </w:r>
+          </w:p>
+        </w:tc>
+        <w:tc>
+          <w:tcPr>
+            <w:tcW w:w="1250" w:type="pct"/>
+            <w:shd w:val="clear" w:color="auto" w:fill="auto"/>
+          </w:tcPr>
+          <w:p>
+            <w:pPr>
+              <w:pStyle w:val="Compact"/>
+              <w:rPr>
+                <w:sz w:val="18"/>
+              </w:rPr>
+            </w:pPr>
+            <w:r>
+              <w:rPr>
+                <w:sz w:val="18"/>
+              </w:rPr>
+              <w:t xml:space="preserve">Texto libre del Ticket → equipo/servicio, ubicación y </w:t>
+            </w:r>
+            <w:r>
+              <w:rPr>
+                <w:sz w:val="18"/>
+              </w:rPr>
+              <w:lastRenderedPageBreak/>
+              <w:t>Síntoma</w:t>
+            </w:r>
+          </w:p>
+        </w:tc>
+        <w:tc>
+          <w:tcPr>
+            <w:tcW w:w="1250" w:type="pct"/>
+            <w:shd w:val="clear" w:color="auto" w:fill="auto"/>
+          </w:tcPr>
+          <w:p>
+            <w:pPr>
+              <w:pStyle w:val="Compact"/>
+              <w:rPr>
+                <w:sz w:val="18"/>
+              </w:rPr>
+            </w:pPr>
+            <w:r>
+              <w:rPr>
+                <w:sz w:val="18"/>
+              </w:rPr>
+              <w:lastRenderedPageBreak/>
               <w:t>JSON con esquema fijo</w:t>
             </w:r>
           </w:p>
@@ -5653,13 +5708,7 @@
               <w:rPr>
                 <w:sz w:val="18"/>
               </w:rPr>
-              <w:t>Agente de invest</w:t>
-            </w:r>
-            <w:r>
-              <w:rPr>
-                <w:sz w:val="18"/>
-              </w:rPr>
-              <w:t>igación</w:t>
+              <w:t>Agente de investigación</w:t>
             </w:r>
           </w:p>
         </w:tc>
@@ -5726,7 +5775,13 @@
               <w:rPr>
                 <w:sz w:val="18"/>
               </w:rPr>
-              <w:t>Solo tools MCP de lectura; ≤8 llamadas, ≤90 s, presupuesto de tokens.</w:t>
+              <w:t>Solo tools MCP de lectura</w:t>
+            </w:r>
+            <w:r>
+              <w:rPr>
+                <w:sz w:val="18"/>
+              </w:rPr>
+              <w:t>; ≤8 llamadas, ≤90 s, presupuesto de tokens.</w:t>
             </w:r>
           </w:p>
         </w:tc>
@@ -5871,48 +5926,33 @@
               <w:rPr>
                 <w:sz w:val="18"/>
               </w:rPr>
-              <w:t xml:space="preserve">Redactar el resumen técnico </w:t>
-            </w:r>
-            <w:r>
-              <w:rPr>
-                <w:sz w:val="18"/>
-              </w:rPr>
-              <w:lastRenderedPageBreak/>
-              <w:t>estructurado</w:t>
-            </w:r>
-          </w:p>
-        </w:tc>
-        <w:tc>
-          <w:tcPr>
-            <w:tcW w:w="1250" w:type="pct"/>
-            <w:shd w:val="clear" w:color="auto" w:fill="auto"/>
-          </w:tcPr>
-          <w:p>
-            <w:pPr>
-              <w:pStyle w:val="Compact"/>
-              <w:rPr>
-                <w:sz w:val="18"/>
-              </w:rPr>
-            </w:pPr>
-            <w:r>
-              <w:rPr>
-                <w:sz w:val="18"/>
-              </w:rPr>
-              <w:lastRenderedPageBreak/>
-              <w:t>Hechos y evidencias → J</w:t>
-            </w:r>
-            <w:r>
-              <w:rPr>
-                <w:sz w:val="18"/>
-              </w:rPr>
-              <w:t xml:space="preserve">SON </w:t>
+              <w:t>Redactar el resumen técnico estructurado</w:t>
+            </w:r>
+          </w:p>
+        </w:tc>
+        <w:tc>
+          <w:tcPr>
+            <w:tcW w:w="1250" w:type="pct"/>
+            <w:shd w:val="clear" w:color="auto" w:fill="auto"/>
+          </w:tcPr>
+          <w:p>
+            <w:pPr>
+              <w:pStyle w:val="Compact"/>
+              <w:rPr>
+                <w:sz w:val="18"/>
+              </w:rPr>
+            </w:pPr>
+            <w:r>
+              <w:rPr>
+                <w:sz w:val="18"/>
+              </w:rPr>
+              <w:t xml:space="preserve">Hechos y evidencias → JSON </w:t>
             </w:r>
             <w:r>
               <w:rPr>
                 <w:rStyle w:val="VerbatimChar"/>
                 <w:sz w:val="18"/>
               </w:rPr>
-              <w:lastRenderedPageBreak/>
               <w:t>ResumenTecnico</w:t>
             </w:r>
           </w:p>
@@ -5933,7 +5973,6 @@
               <w:rPr>
                 <w:sz w:val="18"/>
               </w:rPr>
-              <w:lastRenderedPageBreak/>
               <w:t>Sin tools.</w:t>
             </w:r>
           </w:p>
@@ -6003,7 +6042,13 @@
               <w:rPr>
                 <w:sz w:val="18"/>
               </w:rPr>
-              <w:t xml:space="preserve"> + traza → errores y códigos de escalamiento</w:t>
+              <w:t xml:space="preserve"> + traza → error</w:t>
+            </w:r>
+            <w:r>
+              <w:rPr>
+                <w:sz w:val="18"/>
+              </w:rPr>
+              <w:t>es, códigos de escalamiento y si el resumen se publica o se retiene</w:t>
             </w:r>
           </w:p>
         </w:tc>
@@ -6045,13 +6090,7 @@
               <w:rPr>
                 <w:sz w:val="18"/>
               </w:rPr>
-              <w:t>Memoria de la In</w:t>
-            </w:r>
-            <w:r>
-              <w:rPr>
-                <w:sz w:val="18"/>
-              </w:rPr>
-              <w:t>cidencia</w:t>
+              <w:t>Memoria de la Incidencia</w:t>
             </w:r>
           </w:p>
         </w:tc>
@@ -6167,7 +6206,13 @@
               <w:rPr>
                 <w:sz w:val="18"/>
               </w:rPr>
-              <w:t>Procedimientos versionados e Incidencias cerradas y revisadas</w:t>
+              <w:t>Procedimiento</w:t>
+            </w:r>
+            <w:r>
+              <w:rPr>
+                <w:sz w:val="18"/>
+              </w:rPr>
+              <w:t>s versionados e Incidencias cerradas y revisadas</w:t>
             </w:r>
           </w:p>
         </w:tc>
@@ -6207,13 +6252,7 @@
               <w:rPr>
                 <w:sz w:val="18"/>
               </w:rPr>
-              <w:t>Ingesta controlada;</w:t>
-            </w:r>
-            <w:r>
-              <w:rPr>
-                <w:sz w:val="18"/>
-              </w:rPr>
-              <w:t xml:space="preserve"> el agente no escribe.</w:t>
+              <w:t>Ingesta controlada; el agente no escribe.</w:t>
             </w:r>
           </w:p>
         </w:tc>
@@ -6224,7 +6263,7 @@
         <w:pStyle w:val="Ttulo2"/>
       </w:pPr>
       <w:bookmarkStart w:id="14" w:name="_memoria"/>
-      <w:bookmarkStart w:id="15" w:name="_Toc243386732"/>
+      <w:bookmarkStart w:id="15" w:name="_Toc243387709"/>
       <w:r>
         <w:t>4.2 Memoria</w:t>
       </w:r>
@@ -6516,7 +6555,13 @@
               <w:rPr>
                 <w:sz w:val="18"/>
               </w:rPr>
-              <w:t>Solo el workflow, con salida validada</w:t>
+              <w:t>Solo el work</w:t>
+            </w:r>
+            <w:r>
+              <w:rPr>
+                <w:sz w:val="18"/>
+              </w:rPr>
+              <w:t>flow, con salida validada</w:t>
             </w:r>
           </w:p>
         </w:tc>
@@ -6598,13 +6643,7 @@
               <w:rPr>
                 <w:sz w:val="18"/>
               </w:rPr>
-              <w:t>Proc</w:t>
-            </w:r>
-            <w:r>
-              <w:rPr>
-                <w:sz w:val="18"/>
-              </w:rPr>
-              <w:t>eso de ingesta, nunca el agente</w:t>
+              <w:t>Proceso de ingesta, nunca el agente</w:t>
             </w:r>
           </w:p>
         </w:tc>
@@ -6615,7 +6654,10 @@
         <w:pStyle w:val="FirstParagraph"/>
       </w:pPr>
       <w:r>
-        <w:t>No hay memoria que el agente escriba libremente: eso sería un vector de envenenamiento persistente.</w:t>
+        <w:t>No hay memoria que el agente escriba libremente: eso sería un vector de enven</w:t>
+      </w:r>
+      <w:r>
+        <w:t>enamiento persistente.</w:t>
       </w:r>
     </w:p>
     <w:p>
@@ -6623,7 +6665,7 @@
         <w:pStyle w:val="Ttulo2"/>
       </w:pPr>
       <w:bookmarkStart w:id="16" w:name="_da292b2665567be05c609dc3d76a9de4a1c3405"/>
-      <w:bookmarkStart w:id="17" w:name="_Toc243386733"/>
+      <w:bookmarkStart w:id="17" w:name="_Toc243387710"/>
       <w:r>
         <w:t>4.3 Estados, fallos y escalamiento del workflow</w:t>
       </w:r>
@@ -6639,8 +6681,8 @@
           <w:noProof/>
         </w:rPr>
         <w:drawing>
-          <wp:inline distT="0" distB="0" distL="0" distR="0" wp14:anchorId="28ED8CEE" wp14:editId="3C444600">
-            <wp:extent cx="5334000" cy="435428"/>
+          <wp:inline distT="0" distB="0" distL="0" distR="0" wp14:anchorId="72ABD048" wp14:editId="44625C62">
+            <wp:extent cx="5334000" cy="394607"/>
             <wp:effectExtent l="0" t="0" r="0" b="0"/>
             <wp:docPr id="22" name="Picture" descr="Estados del workflow"/>
             <wp:cNvGraphicFramePr>
@@ -6664,7 +6706,7 @@
                   <pic:spPr bwMode="auto">
                     <a:xfrm>
                       <a:off x="0" y="0"/>
-                      <a:ext cx="5334000" cy="435428"/>
+                      <a:ext cx="5334000" cy="394607"/>
                     </a:xfrm>
                     <a:prstGeom prst="rect">
                       <a:avLst/>
@@ -6844,13 +6886,13 @@
               <w:rPr>
                 <w:sz w:val="18"/>
               </w:rPr>
-              <w:t>Reintento con backoff. Si persiste, pasa a</w:t>
-            </w:r>
-            <w:r>
-              <w:rPr>
-                <w:sz w:val="18"/>
-              </w:rPr>
-              <w:t xml:space="preserve"> SinAnalisisIA (E7): derivación por reglas, o al Operador NOC si el ruteo es ambiguo.</w:t>
+              <w:t>Reintento con backoff. Si persiste, pasa a SinAnalisisIA (E7): de</w:t>
+            </w:r>
+            <w:r>
+              <w:rPr>
+                <w:sz w:val="18"/>
+              </w:rPr>
+              <w:t>rivación por reglas, o al Operador NOC si el ruteo es ambiguo.</w:t>
             </w:r>
           </w:p>
         </w:tc>
@@ -6934,13 +6976,13 @@
               <w:rPr>
                 <w:sz w:val="18"/>
               </w:rPr>
-              <w:t>1 reintento del resumen con los errores del validador como feedback. Si vuel</w:t>
-            </w:r>
-            <w:r>
-              <w:rPr>
-                <w:sz w:val="18"/>
-              </w:rPr>
-              <w:t>ve a fallar, E2.</w:t>
+              <w:t>1 reintento del resumen con los errores del validador como feedback. Si vuelve a fallar, el resumen</w:t>
+            </w:r>
+            <w:r>
+              <w:rPr>
+                <w:sz w:val="18"/>
+              </w:rPr>
+              <w:t xml:space="preserve"> se retiene (E2 o E6). La Incidencia ya fue derivada por regla, así que el fallo no retrasa la atención.</w:t>
             </w:r>
           </w:p>
         </w:tc>
@@ -6995,7 +7037,20 @@
               <w:rPr>
                 <w:sz w:val="18"/>
               </w:rPr>
-              <w:t>), así que dos ejecuciones concurrentes no crean Incidencias duplicadas. Al adjuntar, se recalcula la prioridad de la Incidencia existente.</w:t>
+              <w:t>), así que dos ejecuciones concurrentes</w:t>
+            </w:r>
+            <w:r>
+              <w:rPr>
+                <w:sz w:val="18"/>
+              </w:rPr>
+              <w:t xml:space="preserve"> </w:t>
+            </w:r>
+            <w:r>
+              <w:rPr>
+                <w:sz w:val="18"/>
+              </w:rPr>
+              <w:lastRenderedPageBreak/>
+              <w:t>no crean Incidencias duplicadas. Al adjuntar, se recalcula la prioridad de la Incidencia existente.</w:t>
             </w:r>
           </w:p>
         </w:tc>
@@ -7017,6 +7072,7 @@
               <w:rPr>
                 <w:sz w:val="18"/>
               </w:rPr>
+              <w:lastRenderedPageBreak/>
               <w:t>Operador NOC no responde</w:t>
             </w:r>
           </w:p>
@@ -7059,13 +7115,7 @@
               <w:rPr>
                 <w:sz w:val="18"/>
               </w:rPr>
-              <w:t xml:space="preserve">Mensaje </w:t>
-            </w:r>
-            <w:r>
-              <w:rPr>
-                <w:sz w:val="18"/>
-              </w:rPr>
-              <w:t>malformado</w:t>
+              <w:t>Mensaje malformado</w:t>
             </w:r>
           </w:p>
         </w:tc>
@@ -7096,9 +7146,8 @@
         <w:pStyle w:val="Ttulo2"/>
       </w:pPr>
       <w:bookmarkStart w:id="18" w:name="_860fae0d546a8198f589a398b85690e59be0668"/>
-      <w:bookmarkStart w:id="19" w:name="_Toc243386734"/>
-      <w:r>
-        <w:lastRenderedPageBreak/>
+      <w:bookmarkStart w:id="19" w:name="_Toc243387711"/>
+      <w:r>
         <w:t>4.4 El agente de investigación</w:t>
       </w:r>
       <w:bookmarkEnd w:id="18"/>
@@ -7172,13 +7221,7 @@
         <w:rPr>
           <w:rStyle w:val="VerbatimChar"/>
         </w:rPr>
-        <w:t>get_incident</w:t>
-      </w:r>
-      <w:r>
-        <w:rPr>
-          <w:rStyle w:val="VerbatimChar"/>
-        </w:rPr>
-        <w:t>_timeline</w:t>
+        <w:t>get_incident_timeline</w:t>
       </w:r>
       <w:r>
         <w:t xml:space="preserve">, </w:t>
@@ -7236,7 +7279,7 @@
         <w:t>evidence_id</w:t>
       </w:r>
       <w:r>
-        <w:t>.</w:t>
+        <w:t>. La sugerencia de equipo solo se usa si el ruteo por regla fue ambiguo (E3), y la decide el Operador NOC.</w:t>
       </w:r>
     </w:p>
     <w:p>
@@ -7265,7 +7308,10 @@
         <w:t>dato no confiable</w:t>
       </w:r>
       <w:r>
-        <w:t xml:space="preserve"> en el prompt.</w:t>
+        <w:t xml:space="preserve"> </w:t>
+      </w:r>
+      <w:r>
+        <w:t>en el prompt.</w:t>
       </w:r>
     </w:p>
     <w:p>
@@ -7284,10 +7330,7 @@
         <w:t>No puede</w:t>
       </w:r>
       <w:r>
-        <w:t>: escribir en ningún sistema, ejecutar comandos ni decidir la urgencia, la prioridad o el es</w:t>
-      </w:r>
-      <w:r>
-        <w:t>calamiento.</w:t>
+        <w:t>: escribir en ningún sistema, ejecutar comandos ni decidir la urgencia, la prioridad o el escalamiento.</w:t>
       </w:r>
     </w:p>
     <w:p>
@@ -7295,7 +7338,7 @@
         <w:pStyle w:val="Ttulo1"/>
       </w:pPr>
       <w:bookmarkStart w:id="20" w:name="_1cf5811360d8bd240f5b6ff78ee18f92c7c09f4"/>
-      <w:bookmarkStart w:id="21" w:name="_Toc243386735"/>
+      <w:bookmarkStart w:id="21" w:name="_Toc243387712"/>
       <w:r>
         <w:lastRenderedPageBreak/>
         <w:t>5. Arquitectura física (AWS, híbrida)</w:t>
@@ -7312,7 +7355,7 @@
           <w:noProof/>
         </w:rPr>
         <w:drawing>
-          <wp:inline distT="0" distB="0" distL="0" distR="0" wp14:anchorId="223E490A" wp14:editId="4A84D2B5">
+          <wp:inline distT="0" distB="0" distL="0" distR="0" wp14:anchorId="0C7EE9C1" wp14:editId="7BDA55E5">
             <wp:extent cx="5334000" cy="7221617"/>
             <wp:effectExtent l="0" t="0" r="0" b="0"/>
             <wp:docPr id="27" name="Picture" descr="Arquitectura física"/>
@@ -7508,7 +7551,13 @@
                 <w:sz w:val="18"/>
               </w:rPr>
               <w:lastRenderedPageBreak/>
-              <w:t>Conectividad con el operador</w:t>
+              <w:t xml:space="preserve">Conectividad </w:t>
+            </w:r>
+            <w:r>
+              <w:rPr>
+                <w:sz w:val="18"/>
+              </w:rPr>
+              <w:t>con el operador</w:t>
             </w:r>
           </w:p>
         </w:tc>
@@ -7550,13 +7599,13 @@
               <w:rPr>
                 <w:sz w:val="18"/>
               </w:rPr>
-              <w:t xml:space="preserve"> </w:t>
-            </w:r>
-            <w:r>
-              <w:rPr>
-                <w:sz w:val="18"/>
-              </w:rPr>
-              <w:t>(endpoint inbound) para que on-prem resuelva los nombres privados</w:t>
+              <w:t>: endpoint inbound para que on-prem resuelva los nombres privados de AWS, y endpoint outbound con reglas de reenvío para que los conectores y el MCP resuelvan los nombres de lo</w:t>
+            </w:r>
+            <w:r>
+              <w:rPr>
+                <w:sz w:val="18"/>
+              </w:rPr>
+              <w:t>s sistemas on-prem</w:t>
             </w:r>
           </w:p>
         </w:tc>
@@ -7688,13 +7737,7 @@
               <w:rPr>
                 <w:sz w:val="18"/>
               </w:rPr>
-              <w:t>Absorbe pico</w:t>
-            </w:r>
-            <w:r>
-              <w:rPr>
-                <w:sz w:val="18"/>
-              </w:rPr>
-              <w:t>s 10× (S3), con reintentos y DLQ, sin código de pegamento.</w:t>
+              <w:t>Absorbe picos 10× (S3), con reintentos y DLQ, sin código de pegamento.</w:t>
             </w:r>
           </w:p>
         </w:tc>
@@ -7791,13 +7834,13 @@
               <w:rPr>
                 <w:sz w:val="18"/>
               </w:rPr>
-              <w:t xml:space="preserve"> para HITL (ADR 0001). El historial </w:t>
-            </w:r>
-            <w:r>
-              <w:rPr>
-                <w:sz w:val="18"/>
-              </w:rPr>
-              <w:t>de ejecución se conserva 90 días; la auditoría permanente se escribe en Aurora y S3.</w:t>
+              <w:t xml:space="preserve"> para HITL (ADR 0001). E</w:t>
+            </w:r>
+            <w:r>
+              <w:rPr>
+                <w:sz w:val="18"/>
+              </w:rPr>
+              <w:t>l historial de ejecución se conserva 90 días; la auditoría permanente se escribe en Aurora y S3.</w:t>
             </w:r>
           </w:p>
         </w:tc>
@@ -7907,13 +7950,13 @@
               <w:rPr>
                 <w:sz w:val="18"/>
               </w:rPr>
-              <w:t>Contenedores: innecesario para pasos de se</w:t>
-            </w:r>
-            <w:r>
-              <w:rPr>
-                <w:sz w:val="18"/>
-              </w:rPr>
-              <w:t>gundos.</w:t>
+              <w:t>Contenedores: innecesario para</w:t>
+            </w:r>
+            <w:r>
+              <w:rPr>
+                <w:sz w:val="18"/>
+              </w:rPr>
+              <w:t xml:space="preserve"> pasos de segundos.</w:t>
             </w:r>
           </w:p>
         </w:tc>
@@ -8047,13 +8090,13 @@
               <w:rPr>
                 <w:sz w:val="18"/>
               </w:rPr>
-              <w:t xml:space="preserve"> </w:t>
-            </w:r>
-            <w:r>
-              <w:rPr>
-                <w:sz w:val="18"/>
-              </w:rPr>
-              <w:t>+ Bedrock Converse API (loop propio)</w:t>
+              <w:t xml:space="preserve"> + Bedrock Converse API (loop pr</w:t>
+            </w:r>
+            <w:r>
+              <w:rPr>
+                <w:sz w:val="18"/>
+              </w:rPr>
+              <w:t>opio)</w:t>
             </w:r>
           </w:p>
         </w:tc>
@@ -8093,13 +8136,7 @@
               <w:rPr>
                 <w:sz w:val="18"/>
               </w:rPr>
-              <w:t>ECS Fargate: 30–60 s de arranque por tarea sin beneficio. Bedrock Agents: l</w:t>
-            </w:r>
-            <w:r>
-              <w:rPr>
-                <w:sz w:val="18"/>
-              </w:rPr>
-              <w:t>oop opaco.</w:t>
+              <w:t>ECS Fargate: 30–60 s de arranque por tarea sin beneficio. Bedrock Agents: loop opaco.</w:t>
             </w:r>
           </w:p>
         </w:tc>
@@ -8149,7 +8186,13 @@
               <w:rPr>
                 <w:sz w:val="18"/>
               </w:rPr>
-              <w:t xml:space="preserve"> detrás de un </w:t>
+              <w:t xml:space="preserve"> </w:t>
+            </w:r>
+            <w:r>
+              <w:rPr>
+                <w:sz w:val="18"/>
+              </w:rPr>
+              <w:t xml:space="preserve">detrás de un </w:t>
             </w:r>
             <w:r>
               <w:rPr>
@@ -8239,7 +8282,13 @@
               <w:rPr>
                 <w:sz w:val="18"/>
               </w:rPr>
-              <w:t xml:space="preserve">El Operador NOC aprueba o corrige </w:t>
+              <w:t xml:space="preserve">El Operador NOC </w:t>
+            </w:r>
+            <w:r>
+              <w:rPr>
+                <w:sz w:val="18"/>
+              </w:rPr>
+              <w:t xml:space="preserve">aprueba o corrige </w:t>
             </w:r>
             <w:r>
               <w:rPr>
@@ -8253,39 +8302,33 @@
               <w:rPr>
                 <w:sz w:val="18"/>
               </w:rPr>
-              <w:t>. Su webho</w:t>
-            </w:r>
-            <w:r>
-              <w:rPr>
-                <w:sz w:val="18"/>
-              </w:rPr>
-              <w:t>ok entra por el API Gateway privado y una Lambda verifica, contra la API de tickets, que quien aprobó pertenece al grupo NOC; luego busca el task token en Aurora y reanuda el workflow.</w:t>
-            </w:r>
-          </w:p>
-        </w:tc>
-        <w:tc>
-          <w:tcPr>
-            <w:tcW w:w="1250" w:type="pct"/>
-            <w:shd w:val="clear" w:color="auto" w:fill="auto"/>
-          </w:tcPr>
-          <w:p>
-            <w:pPr>
-              <w:pStyle w:val="Compact"/>
-              <w:rPr>
-                <w:sz w:val="18"/>
-              </w:rPr>
-            </w:pPr>
-            <w:r>
-              <w:rPr>
-                <w:sz w:val="18"/>
-              </w:rPr>
-              <w:t>Sin interfaz nueva: el operador trabaja donde ya trabaja, con su identi</w:t>
-            </w:r>
-            <w:r>
-              <w:rPr>
-                <w:sz w:val="18"/>
-              </w:rPr>
-              <w:t>dad corporativa. El task token nunca sale de AWS.</w:t>
+              <w:t>. Su webhook entra por el API Gateway privado y una Lambda verifica, contra la API de tickets, que quien aprobó pertenece al grupo NOC; luego busca el task token en Aurora y reanuda el workflow.</w:t>
+            </w:r>
+          </w:p>
+        </w:tc>
+        <w:tc>
+          <w:tcPr>
+            <w:tcW w:w="1250" w:type="pct"/>
+            <w:shd w:val="clear" w:color="auto" w:fill="auto"/>
+          </w:tcPr>
+          <w:p>
+            <w:pPr>
+              <w:pStyle w:val="Compact"/>
+              <w:rPr>
+                <w:sz w:val="18"/>
+              </w:rPr>
+            </w:pPr>
+            <w:r>
+              <w:rPr>
+                <w:sz w:val="18"/>
+              </w:rPr>
+              <w:t>Sin interfaz nue</w:t>
+            </w:r>
+            <w:r>
+              <w:rPr>
+                <w:sz w:val="18"/>
+              </w:rPr>
+              <w:t>va: el operador trabaja donde ya trabaja, con su identidad corporativa. El task token nunca sale de AWS.</w:t>
             </w:r>
           </w:p>
         </w:tc>
@@ -8355,39 +8398,39 @@
               <w:rPr>
                 <w:sz w:val="18"/>
               </w:rPr>
-              <w:t xml:space="preserve">: un modelo fundacional de nivel pequeño (extracción) y uno de nivel medio (agente y resumen), con versión fijada. </w:t>
-            </w:r>
-            <w:r>
-              <w:rPr>
-                <w:sz w:val="18"/>
-              </w:rPr>
-              <w:t>Opciones en Bedrock: Anthropic Claude, Amazon Nova, Meta Llama o Mistral; la elección final se hace con el golden set de §7 (calidad en español, tool use, costo y latencia).</w:t>
-            </w:r>
-          </w:p>
-        </w:tc>
-        <w:tc>
-          <w:tcPr>
-            <w:tcW w:w="1250" w:type="pct"/>
-            <w:shd w:val="clear" w:color="auto" w:fill="auto"/>
-          </w:tcPr>
-          <w:p>
-            <w:pPr>
-              <w:pStyle w:val="Compact"/>
-              <w:rPr>
-                <w:sz w:val="18"/>
-              </w:rPr>
-            </w:pPr>
-            <w:r>
-              <w:rPr>
-                <w:sz w:val="18"/>
-              </w:rPr>
-              <w:t xml:space="preserve">Modelos gestionados, sin uso de datos para entrenamiento, sin GPU que operar. Dos </w:t>
-            </w:r>
-            <w:r>
-              <w:rPr>
-                <w:sz w:val="18"/>
-              </w:rPr>
-              <w:t>niveles para optimizar costo. La Converse API es común a todos los modelos, así que cambiar de modelo no cambia el código.</w:t>
+              <w:t xml:space="preserve">: un modelo fundacional de nivel pequeño (extracción) y uno </w:t>
+            </w:r>
+            <w:r>
+              <w:rPr>
+                <w:sz w:val="18"/>
+              </w:rPr>
+              <w:t>de nivel medio (agente y resumen), con versión fijada. Opciones en Bedrock: Anthropic Claude, Amazon Nova, Meta Llama o Mistral; la elección final se hace con el golden set de §7 (calidad en español, tool use, costo y latencia).</w:t>
+            </w:r>
+          </w:p>
+        </w:tc>
+        <w:tc>
+          <w:tcPr>
+            <w:tcW w:w="1250" w:type="pct"/>
+            <w:shd w:val="clear" w:color="auto" w:fill="auto"/>
+          </w:tcPr>
+          <w:p>
+            <w:pPr>
+              <w:pStyle w:val="Compact"/>
+              <w:rPr>
+                <w:sz w:val="18"/>
+              </w:rPr>
+            </w:pPr>
+            <w:r>
+              <w:rPr>
+                <w:sz w:val="18"/>
+              </w:rPr>
+              <w:t>Modelos gestionados, sin us</w:t>
+            </w:r>
+            <w:r>
+              <w:rPr>
+                <w:sz w:val="18"/>
+              </w:rPr>
+              <w:t>o de datos para entrenamiento, sin GPU que operar. Dos niveles para optimizar costo. La Converse API es común a todos los modelos, así que cambiar de modelo no cambia el código.</w:t>
             </w:r>
           </w:p>
         </w:tc>
@@ -8429,7 +8472,14 @@
               <w:rPr>
                 <w:sz w:val="18"/>
               </w:rPr>
-              <w:t>Guardrails</w:t>
+              <w:lastRenderedPageBreak/>
+              <w:t>Guar</w:t>
+            </w:r>
+            <w:r>
+              <w:rPr>
+                <w:sz w:val="18"/>
+              </w:rPr>
+              <w:t>drails</w:t>
             </w:r>
           </w:p>
         </w:tc>
@@ -8513,7 +8563,6 @@
               <w:rPr>
                 <w:sz w:val="18"/>
               </w:rPr>
-              <w:lastRenderedPageBreak/>
               <w:t>RAG</w:t>
             </w:r>
           </w:p>
@@ -8556,13 +8605,13 @@
               <w:rPr>
                 <w:sz w:val="18"/>
               </w:rPr>
-              <w:t>, con embeddings multilingües. Fuentes en S</w:t>
-            </w:r>
-            <w:r>
-              <w:rPr>
-                <w:sz w:val="18"/>
-              </w:rPr>
-              <w:t xml:space="preserve">3: procedimientos sincronizados desde los repos e Incidencias cerradas y revisadas, exportadas desde Aurora. El MCP consulta la KB con </w:t>
+              <w:t xml:space="preserve">, con embeddings </w:t>
+            </w:r>
+            <w:r>
+              <w:rPr>
+                <w:sz w:val="18"/>
+              </w:rPr>
+              <w:t xml:space="preserve">multilingües. Fuentes en S3: procedimientos sincronizados desde los repos e Incidencias cerradas y revisadas, exportadas desde Aurora. El MCP consulta la KB con </w:t>
             </w:r>
             <w:r>
               <w:rPr>
@@ -8595,13 +8644,7 @@
               <w:rPr>
                 <w:sz w:val="18"/>
               </w:rPr>
-              <w:t>Ingesta y chunking gestionados; pgvector reutiliza el mismo Aurora. Embeddings multilingües porque la documenta</w:t>
-            </w:r>
-            <w:r>
-              <w:rPr>
-                <w:sz w:val="18"/>
-              </w:rPr>
-              <w:t>ción está en español.</w:t>
+              <w:t>Ingesta y chunking gestionados; pgvector reutiliza el mismo Aurora. Embeddings multilingües porque la documentación está en español.</w:t>
             </w:r>
           </w:p>
         </w:tc>
@@ -8685,33 +8728,33 @@
               <w:rPr>
                 <w:sz w:val="18"/>
               </w:rPr>
-              <w:t>Memoria de la Incidencia, auditoría, task tokens y vectores en un solo motor relacional.</w:t>
-            </w:r>
-          </w:p>
-        </w:tc>
-        <w:tc>
-          <w:tcPr>
-            <w:tcW w:w="1250" w:type="pct"/>
-            <w:shd w:val="clear" w:color="auto" w:fill="auto"/>
-          </w:tcPr>
-          <w:p>
-            <w:pPr>
-              <w:pStyle w:val="Compact"/>
-              <w:rPr>
-                <w:sz w:val="18"/>
-              </w:rPr>
-            </w:pPr>
-            <w:r>
-              <w:rPr>
-                <w:sz w:val="18"/>
-              </w:rPr>
-              <w:t xml:space="preserve">DynamoDB: consultas de auditoría </w:t>
-            </w:r>
-            <w:r>
-              <w:rPr>
-                <w:sz w:val="18"/>
-              </w:rPr>
-              <w:t>y joins más difíciles.</w:t>
+              <w:t xml:space="preserve">Memoria de </w:t>
+            </w:r>
+            <w:r>
+              <w:rPr>
+                <w:sz w:val="18"/>
+              </w:rPr>
+              <w:t>la Incidencia, auditoría, task tokens y vectores en un solo motor relacional.</w:t>
+            </w:r>
+          </w:p>
+        </w:tc>
+        <w:tc>
+          <w:tcPr>
+            <w:tcW w:w="1250" w:type="pct"/>
+            <w:shd w:val="clear" w:color="auto" w:fill="auto"/>
+          </w:tcPr>
+          <w:p>
+            <w:pPr>
+              <w:pStyle w:val="Compact"/>
+              <w:rPr>
+                <w:sz w:val="18"/>
+              </w:rPr>
+            </w:pPr>
+            <w:r>
+              <w:rPr>
+                <w:sz w:val="18"/>
+              </w:rPr>
+              <w:t>DynamoDB: consultas de auditoría y joins más difíciles.</w:t>
             </w:r>
           </w:p>
         </w:tc>
@@ -8789,7 +8832,13 @@
               <w:rPr>
                 <w:sz w:val="18"/>
               </w:rPr>
-              <w:t>Fuentes del RAG y auditoría inmutable de prompts y respuestas.</w:t>
+              <w:t>Fuentes del RAG y auditoría i</w:t>
+            </w:r>
+            <w:r>
+              <w:rPr>
+                <w:sz w:val="18"/>
+              </w:rPr>
+              <w:t>nmutable de prompts y respuestas.</w:t>
             </w:r>
           </w:p>
         </w:tc>
@@ -8851,13 +8900,7 @@
               <w:rPr>
                 <w:sz w:val="18"/>
               </w:rPr>
-              <w:t>Humanos: aprueban con su identidad en la plataforma de tickets (</w:t>
-            </w:r>
-            <w:r>
-              <w:rPr>
-                <w:sz w:val="18"/>
-              </w:rPr>
-              <w:t xml:space="preserve">federada al IdP del operador). </w:t>
+              <w:t xml:space="preserve">Humanos: aprueban con su identidad en la plataforma de tickets (federada al IdP del operador). </w:t>
             </w:r>
             <w:r>
               <w:rPr>
@@ -8891,7 +8934,13 @@
               <w:rPr>
                 <w:sz w:val="18"/>
               </w:rPr>
-              <w:t>SSO corporativo; mínimo privilegio por servicio.</w:t>
+              <w:t>SSO cor</w:t>
+            </w:r>
+            <w:r>
+              <w:rPr>
+                <w:sz w:val="18"/>
+              </w:rPr>
+              <w:t>porativo; mínimo privilegio por servicio.</w:t>
             </w:r>
           </w:p>
         </w:tc>
@@ -9254,13 +9303,7 @@
               <w:rPr>
                 <w:sz w:val="18"/>
               </w:rPr>
-              <w:t>NAT Gateway: abre una ruta</w:t>
-            </w:r>
-            <w:r>
-              <w:rPr>
-                <w:sz w:val="18"/>
-              </w:rPr>
-              <w:t xml:space="preserve"> de exfiltración.</w:t>
+              <w:t>NAT Gateway: abre una ruta de exfiltración.</w:t>
             </w:r>
           </w:p>
         </w:tc>
@@ -9344,33 +9387,33 @@
               <w:rPr>
                 <w:sz w:val="18"/>
               </w:rPr>
-              <w:t>Nativos y suficientes.</w:t>
-            </w:r>
-          </w:p>
-        </w:tc>
-        <w:tc>
-          <w:tcPr>
-            <w:tcW w:w="1250" w:type="pct"/>
-            <w:shd w:val="clear" w:color="auto" w:fill="auto"/>
-          </w:tcPr>
-          <w:p>
-            <w:pPr>
-              <w:pStyle w:val="Compact"/>
-              <w:rPr>
-                <w:sz w:val="18"/>
-              </w:rPr>
-            </w:pPr>
-            <w:r>
-              <w:rPr>
-                <w:sz w:val="18"/>
-              </w:rPr>
-              <w:t xml:space="preserve">X-Ray, Langfuse o similar: mejora futura si hace falta análisis de trazas o de calidad </w:t>
-            </w:r>
-            <w:r>
-              <w:rPr>
-                <w:sz w:val="18"/>
-              </w:rPr>
-              <w:t>de prompts.</w:t>
+              <w:t>Nativos y sufic</w:t>
+            </w:r>
+            <w:r>
+              <w:rPr>
+                <w:sz w:val="18"/>
+              </w:rPr>
+              <w:t>ientes.</w:t>
+            </w:r>
+          </w:p>
+        </w:tc>
+        <w:tc>
+          <w:tcPr>
+            <w:tcW w:w="1250" w:type="pct"/>
+            <w:shd w:val="clear" w:color="auto" w:fill="auto"/>
+          </w:tcPr>
+          <w:p>
+            <w:pPr>
+              <w:pStyle w:val="Compact"/>
+              <w:rPr>
+                <w:sz w:val="18"/>
+              </w:rPr>
+            </w:pPr>
+            <w:r>
+              <w:rPr>
+                <w:sz w:val="18"/>
+              </w:rPr>
+              <w:t>X-Ray, Langfuse o similar: mejora futura si hace falta análisis de trazas o de calidad de prompts.</w:t>
             </w:r>
           </w:p>
         </w:tc>
@@ -9388,10 +9431,10 @@
         <w:t>Región.</w:t>
       </w:r>
       <w:r>
-        <w:t xml:space="preserve"> La región de referencia es us-east-1, por disponibilidad de modelos en Bedrock. Si el operador exige residencia en Latinoamérica, hay que validar antes de producción la disponibilidad de los modelos y de Knowledge Bases en sa-east-1 o </w:t>
-      </w:r>
-      <w:r>
-        <w:t>mx-central-1, y si requieren perfil de inferencia geográfico (ver S1 y §8.6).</w:t>
+        <w:t xml:space="preserve"> La región de referencia es us-east-1, por disponibilidad de modelos en Bedrock. Si el operador exige residencia en Latinoamérica, hay que va</w:t>
+      </w:r>
+      <w:r>
+        <w:t>lidar antes de producción la disponibilidad de los modelos y de Knowledge Bases en sa-east-1 o mx-central-1, y si requieren perfil de inferencia geográfico (ver S1 y §8.6).</w:t>
       </w:r>
     </w:p>
     <w:p>
@@ -9399,7 +9442,7 @@
         <w:pStyle w:val="Ttulo1"/>
       </w:pPr>
       <w:bookmarkStart w:id="22" w:name="_1dc88d82289d67e1ea4472534f9f223778a3ba7"/>
-      <w:bookmarkStart w:id="23" w:name="_Toc243386736"/>
+      <w:bookmarkStart w:id="23" w:name="_Toc243387713"/>
       <w:r>
         <w:lastRenderedPageBreak/>
         <w:t>6. Seguridad: matriz de riesgos y controles</w:t>
@@ -9419,7 +9462,14 @@
           <w:b/>
           <w:bCs/>
         </w:rPr>
-        <w:t>OWASP Top 10 for LLM Applications (2025)</w:t>
+        <w:t>OWASP Top 10 for LLM Application</w:t>
+      </w:r>
+      <w:r>
+        <w:rPr>
+          <w:b/>
+          <w:bCs/>
+        </w:rPr>
+        <w:t>s (2025)</w:t>
       </w:r>
       <w:r>
         <w:t xml:space="preserve"> más riesgos clásicos de plataforma. Cada control indica </w:t>
@@ -9506,14 +9556,7 @@
                 <w:b/>
                 <w:sz w:val="18"/>
               </w:rPr>
-              <w:t>Escen</w:t>
-            </w:r>
-            <w:r>
-              <w:rPr>
-                <w:b/>
-                <w:sz w:val="18"/>
-              </w:rPr>
-              <w:t>ario</w:t>
+              <w:t>Escenario</w:t>
             </w:r>
           </w:p>
         </w:tc>
@@ -9613,7 +9656,13 @@
               <w:rPr>
                 <w:sz w:val="18"/>
               </w:rPr>
-              <w:t>El texto de un Ticket o de un documento instruye “reinicia el router”, o intenta sesgar el resumen o el ruteo.</w:t>
+              <w:t>El texto de un Ticket o de un documento instruye “reinicia el router”, o intenta sesgar el resume</w:t>
+            </w:r>
+            <w:r>
+              <w:rPr>
+                <w:sz w:val="18"/>
+              </w:rPr>
+              <w:t>n o el ruteo.</w:t>
             </w:r>
           </w:p>
         </w:tc>
@@ -9633,7 +9682,13 @@
               <w:rPr>
                 <w:sz w:val="18"/>
               </w:rPr>
-              <w:t>El agente no tiene tools de escritura (ADR 0003); el contenido externo va delimitado como dato no confiable; Guardrails contra prompt attacks; el ruteo y la prioridad son por reglas; los hechos exigen evidencia de tools, no del texto del Ticket.</w:t>
+              <w:t>El agente no tiene tools de escritura (ADR 0003); el contenido externo va delimitado como dato no confiable; Guardrails contra prompt attacks; el ruteo y la prioridad son por reglas; los hechos exigen evidencia de tools, no del texto del Tick</w:t>
+            </w:r>
+            <w:r>
+              <w:rPr>
+                <w:sz w:val="18"/>
+              </w:rPr>
+              <w:t>et.</w:t>
             </w:r>
           </w:p>
         </w:tc>
@@ -9653,13 +9708,13 @@
               <w:rPr>
                 <w:sz w:val="18"/>
               </w:rPr>
-              <w:t>Red-team p</w:t>
-            </w:r>
-            <w:r>
-              <w:rPr>
-                <w:sz w:val="18"/>
-              </w:rPr>
-              <w:t>eriódico con el modelo real (tasa de bloqueo en la capa 2 de §7). El caso C07 del prototipo verifica solo la última barrera: que el validador bloquee una acción de cambio inducida (la salida del modelo es simulada).</w:t>
+              <w:t>Red-team periódico con el modelo real (tasa de bloqueo en la capa 2 de §7). El caso C07 del prototipo verifica solo la última barrera: que el validador detecte una acción de cambio inducida y retenga el resumen para que no se publique (la salida del modelo</w:t>
+            </w:r>
+            <w:r>
+              <w:rPr>
+                <w:sz w:val="18"/>
+              </w:rPr>
+              <w:t xml:space="preserve"> es simulada).</w:t>
             </w:r>
           </w:p>
         </w:tc>
@@ -9703,13 +9758,7 @@
               <w:rPr>
                 <w:sz w:val="18"/>
               </w:rPr>
-              <w:t>El agente ejecut</w:t>
-            </w:r>
-            <w:r>
-              <w:rPr>
-                <w:sz w:val="18"/>
-              </w:rPr>
-              <w:t>a acciones sobre la red o el ticket.</w:t>
+              <w:t>El agente ejecuta acciones sobre la red o el ticket.</w:t>
             </w:r>
           </w:p>
         </w:tc>
@@ -9768,7 +9817,13 @@
               <w:rPr>
                 <w:sz w:val="18"/>
               </w:rPr>
-              <w:t>. Cuentas on-prem del MCP de solo lectura. Security groups que limitan la salida del agente.</w:t>
+              <w:t>. Cuentas on-prem del MCP de solo lectura. Security g</w:t>
+            </w:r>
+            <w:r>
+              <w:rPr>
+                <w:sz w:val="18"/>
+              </w:rPr>
+              <w:t>roups que limitan la salida del agente.</w:t>
             </w:r>
           </w:p>
         </w:tc>
@@ -9788,13 +9843,7 @@
               <w:rPr>
                 <w:sz w:val="18"/>
               </w:rPr>
-              <w:t xml:space="preserve">Policy-as-code </w:t>
-            </w:r>
-            <w:r>
-              <w:rPr>
-                <w:sz w:val="18"/>
-              </w:rPr>
-              <w:t xml:space="preserve">en CI (cfn-guard o Checkov): el build falla si el rol del agente tiene </w:t>
+              <w:t xml:space="preserve">Policy-as-code en CI (cfn-guard o Checkov): el build falla si el rol del agente tiene </w:t>
             </w:r>
             <w:r>
               <w:rPr>
@@ -9847,7 +9896,13 @@
               <w:rPr>
                 <w:sz w:val="18"/>
               </w:rPr>
-              <w:t>: un intento de escritura con las credenciales del MCP contra cada sistema on-prem debe fallar.</w:t>
+              <w:t>: un intento de escritura con las credenciales del MCP contra cada sistema on-prem debe fall</w:t>
+            </w:r>
+            <w:r>
+              <w:rPr>
+                <w:sz w:val="18"/>
+              </w:rPr>
+              <w:t>ar.</w:t>
             </w:r>
           </w:p>
         </w:tc>
@@ -9891,13 +9946,7 @@
               <w:rPr>
                 <w:sz w:val="18"/>
               </w:rPr>
-              <w:t>Datos de client</w:t>
-            </w:r>
-            <w:r>
-              <w:rPr>
-                <w:sz w:val="18"/>
-              </w:rPr>
-              <w:t>es en prompts, respuestas de tools, logs o respuestas del modelo.</w:t>
+              <w:t>Datos de clientes en prompts, respuestas de tools, logs o respuestas del modelo.</w:t>
             </w:r>
           </w:p>
         </w:tc>
@@ -9917,7 +9966,13 @@
               <w:rPr>
                 <w:sz w:val="18"/>
               </w:rPr>
-              <w:t>Seudonimización previa, también en las respuestas del MCP; Guardrails PII; inferencia en región (S1); VPC endpoints; logs cifrados con KMS; un despliegue por operador (S8).</w:t>
+              <w:t xml:space="preserve">Seudonimización previa, también en las respuestas del MCP; Guardrails PII; inferencia en región (S1); VPC endpoints; logs cifrados con </w:t>
+            </w:r>
+            <w:r>
+              <w:rPr>
+                <w:sz w:val="18"/>
+              </w:rPr>
+              <w:t>KMS; un despliegue por operador (S8).</w:t>
             </w:r>
           </w:p>
         </w:tc>
@@ -9937,13 +9992,7 @@
               <w:rPr>
                 <w:sz w:val="18"/>
               </w:rPr>
-              <w:t>Escaneo periódico</w:t>
-            </w:r>
-            <w:r>
-              <w:rPr>
-                <w:sz w:val="18"/>
-              </w:rPr>
-              <w:t xml:space="preserve"> con Macie del bucket de logs de invocación: cero hallazgos de PII.</w:t>
+              <w:t>Escaneo periódico con Macie del bucket de logs de invocación: cero hallazgos de PII.</w:t>
             </w:r>
           </w:p>
         </w:tc>
@@ -10084,7 +10133,13 @@
               <w:rPr>
                 <w:sz w:val="18"/>
               </w:rPr>
-              <w:t>La salida del LLM se usa sin validar (ruteo, campos, HTML en el ticket).</w:t>
+              <w:t>La sa</w:t>
+            </w:r>
+            <w:r>
+              <w:rPr>
+                <w:sz w:val="18"/>
+              </w:rPr>
+              <w:t>lida del LLM se usa sin validar (ruteo, campos, HTML en el ticket).</w:t>
             </w:r>
           </w:p>
         </w:tc>
@@ -10104,13 +10159,7 @@
               <w:rPr>
                 <w:sz w:val="18"/>
               </w:rPr>
-              <w:t>Validación Pydantic; la salida nunca decide urgencia, prioridad ni SLA; esc</w:t>
-            </w:r>
-            <w:r>
-              <w:rPr>
-                <w:sz w:val="18"/>
-              </w:rPr>
-              <w:t>ape de contenido al escribir en el ticket.</w:t>
+              <w:t>Validación Pydantic; la salida nunca decide urgencia, prioridad ni SLA; escape de contenido al escribir en el ticket.</w:t>
             </w:r>
           </w:p>
         </w:tc>
@@ -10154,7 +10203,15 @@
                 <w:bCs/>
                 <w:sz w:val="18"/>
               </w:rPr>
-              <w:t>LLM04 / LLM08 Envenenamiento de datos o embeddings</w:t>
+              <w:t>LLM04 / LLM08 Envenenamiento de datos o em</w:t>
+            </w:r>
+            <w:r>
+              <w:rPr>
+                <w:b/>
+                <w:bCs/>
+                <w:sz w:val="18"/>
+              </w:rPr>
+              <w:t>beddings</w:t>
             </w:r>
           </w:p>
         </w:tc>
@@ -10208,13 +10265,7 @@
               <w:rPr>
                 <w:sz w:val="18"/>
               </w:rPr>
-              <w:t>; fuentes</w:t>
-            </w:r>
-            <w:r>
-              <w:rPr>
-                <w:sz w:val="18"/>
-              </w:rPr>
-              <w:t xml:space="preserve"> con control de versiones y aprobación; metadato de versión en cada fragmento; índices separados por operador (S8).</w:t>
+              <w:t>; fuentes con control de versiones y aprobación; metadato de versión en cada fragmento; índices separados por operador (S8).</w:t>
             </w:r>
           </w:p>
         </w:tc>
@@ -10278,13 +10329,13 @@
               <w:rPr>
                 <w:sz w:val="18"/>
               </w:rPr>
-              <w:t>Loop del agente, pico</w:t>
-            </w:r>
-            <w:r>
-              <w:rPr>
-                <w:sz w:val="18"/>
-              </w:rPr>
-              <w:t>s o abuso que disparan el costo.</w:t>
+              <w:t>Loop del age</w:t>
+            </w:r>
+            <w:r>
+              <w:rPr>
+                <w:sz w:val="18"/>
+              </w:rPr>
+              <w:t>nte, picos o abuso que disparan el costo.</w:t>
             </w:r>
           </w:p>
         </w:tc>
@@ -10368,13 +10419,13 @@
               <w:rPr>
                 <w:sz w:val="18"/>
               </w:rPr>
-              <w:t>Un cambio de v</w:t>
-            </w:r>
-            <w:r>
-              <w:rPr>
-                <w:sz w:val="18"/>
-              </w:rPr>
-              <w:t>ersión del modelo degrada la calidad sin aviso.</w:t>
+              <w:t>Un ca</w:t>
+            </w:r>
+            <w:r>
+              <w:rPr>
+                <w:sz w:val="18"/>
+              </w:rPr>
+              <w:t>mbio de versión del modelo degrada la calidad sin aviso.</w:t>
             </w:r>
           </w:p>
         </w:tc>
@@ -10458,13 +10509,13 @@
               <w:rPr>
                 <w:sz w:val="18"/>
               </w:rPr>
-              <w:t>Exposición de la lógi</w:t>
-            </w:r>
-            <w:r>
-              <w:rPr>
-                <w:sz w:val="18"/>
-              </w:rPr>
-              <w:t>ca interna.</w:t>
+              <w:t>Exposición d</w:t>
+            </w:r>
+            <w:r>
+              <w:rPr>
+                <w:sz w:val="18"/>
+              </w:rPr>
+              <w:t>e la lógica interna.</w:t>
             </w:r>
           </w:p>
         </w:tc>
@@ -10566,7 +10617,13 @@
               <w:rPr>
                 <w:sz w:val="18"/>
               </w:rPr>
-              <w:t>La Lambda de aprobación verifica el grupo del aprobador contra la plataforma de tickets; el task token nunca sale de AWS; la aprobación queda registrada con la identidad.</w:t>
+              <w:t>La Lambda de aprobación verific</w:t>
+            </w:r>
+            <w:r>
+              <w:rPr>
+                <w:sz w:val="18"/>
+              </w:rPr>
+              <w:t>a el grupo del aprobador contra la plataforma de tickets; el task token nunca sale de AWS; la aprobación queda registrada con la identidad.</w:t>
             </w:r>
           </w:p>
         </w:tc>
@@ -10586,13 +10643,7 @@
               <w:rPr>
                 <w:sz w:val="18"/>
               </w:rPr>
-              <w:t>Test: un webhook con un ap</w:t>
-            </w:r>
-            <w:r>
-              <w:rPr>
-                <w:sz w:val="18"/>
-              </w:rPr>
-              <w:t>robador fuera del grupo NOC no reanuda el workflow; registro en Aurora y CloudTrail.</w:t>
+              <w:t>Test: un webhook con un aprobador fuera del grupo NOC no reanuda el workflow; registro en Aurora y CloudTrail.</w:t>
             </w:r>
           </w:p>
         </w:tc>
@@ -10614,7 +10665,13 @@
               <w:rPr>
                 <w:sz w:val="18"/>
               </w:rPr>
-              <w:t>Credenciales expuestas</w:t>
+              <w:t>Cred</w:t>
+            </w:r>
+            <w:r>
+              <w:rPr>
+                <w:sz w:val="18"/>
+              </w:rPr>
+              <w:t>enciales expuestas</w:t>
             </w:r>
           </w:p>
         </w:tc>
@@ -10674,13 +10731,7 @@
               <w:rPr>
                 <w:sz w:val="18"/>
               </w:rPr>
-              <w:t>Rotación automática verificada; escaneo de secretos</w:t>
-            </w:r>
-            <w:r>
-              <w:rPr>
-                <w:sz w:val="18"/>
-              </w:rPr>
-              <w:t xml:space="preserve"> en el repo.</w:t>
+              <w:t>Rotación automática verificada; escaneo de secretos en el repo.</w:t>
             </w:r>
           </w:p>
         </w:tc>
@@ -10774,7 +10825,7 @@
         <w:pStyle w:val="Ttulo1"/>
       </w:pPr>
       <w:bookmarkStart w:id="24" w:name="_21008488f39fee772d9a18573a0731f090415fd"/>
-      <w:bookmarkStart w:id="25" w:name="_Toc243386737"/>
+      <w:bookmarkStart w:id="25" w:name="_Toc243387714"/>
       <w:r>
         <w:t>7. Estrategia de evaluación de la IA generativa</w:t>
       </w:r>
@@ -10786,12 +10837,9 @@
         <w:pStyle w:val="Ttulo2"/>
       </w:pPr>
       <w:bookmarkStart w:id="26" w:name="_69e1ab2a0c519af57549dc9feeb84d7cb8ee371"/>
-      <w:bookmarkStart w:id="27" w:name="_Toc243386738"/>
-      <w:r>
-        <w:t>7.1 Qué</w:t>
-      </w:r>
-      <w:r>
-        <w:t xml:space="preserve"> se evalúa</w:t>
+      <w:bookmarkStart w:id="27" w:name="_Toc243387715"/>
+      <w:r>
+        <w:t>7.1 Qué se evalúa</w:t>
       </w:r>
       <w:bookmarkEnd w:id="26"/>
       <w:bookmarkEnd w:id="27"/>
@@ -10865,7 +10913,14 @@
                 <w:b/>
                 <w:sz w:val="18"/>
               </w:rPr>
-              <w:t>Qué se mide</w:t>
+              <w:t xml:space="preserve">Qué se </w:t>
+            </w:r>
+            <w:r>
+              <w:rPr>
+                <w:b/>
+                <w:sz w:val="18"/>
+              </w:rPr>
+              <w:t>mide</w:t>
             </w:r>
           </w:p>
         </w:tc>
@@ -11075,7 +11130,13 @@
               <w:rPr>
                 <w:sz w:val="18"/>
               </w:rPr>
-              <w:t>Fidelidad a la evidencia, completitud y utilidad para el Operador NOC.</w:t>
+              <w:t>F</w:t>
+            </w:r>
+            <w:r>
+              <w:rPr>
+                <w:sz w:val="18"/>
+              </w:rPr>
+              <w:t>idelidad a la evidencia, completitud y utilidad para el Operador NOC.</w:t>
             </w:r>
           </w:p>
         </w:tc>
@@ -11128,7 +11189,7 @@
         <w:pStyle w:val="Ttulo2"/>
       </w:pPr>
       <w:bookmarkStart w:id="28" w:name="_dd7ef81fdfe106eb5acc19d59b803376463f8ad"/>
-      <w:bookmarkStart w:id="29" w:name="_Toc243386739"/>
+      <w:bookmarkStart w:id="29" w:name="_Toc243387716"/>
       <w:r>
         <w:t>7.2 Tres capas</w:t>
       </w:r>
@@ -11159,7 +11220,10 @@
         </w:numPr>
       </w:pPr>
       <w:r>
-        <w:t>Validez de esquema, existencia de citas en la traza, hipótesis con evidencia y acciones de cambio marcadas.</w:t>
+        <w:t>Validez de esquema, exi</w:t>
+      </w:r>
+      <w:r>
+        <w:t>stencia de citas en la traza, hipótesis con evidencia y acciones de cambio marcadas.</w:t>
       </w:r>
     </w:p>
     <w:p>
@@ -11171,10 +11235,7 @@
         </w:numPr>
       </w:pPr>
       <w:r>
-        <w:t>Reglas de urgencia, prioridad, SLA, ruteo, escalamiento y derivació</w:t>
-      </w:r>
-      <w:r>
-        <w:t>n con casos tabulados.</w:t>
+        <w:t>Reglas de urgencia, prioridad, SLA, ruteo, escalamiento y derivación con casos tabulados.</w:t>
       </w:r>
     </w:p>
     <w:p>
@@ -11186,7 +11247,10 @@
         </w:numPr>
       </w:pPr>
       <w:r>
-        <w:t>Casos adversariales sobre salidas simuladas: acción de cambio inducida, cita alucinada, acción disfrazada, campos faltantes e IA caída.</w:t>
+        <w:t>Casos adversariales sobre salidas simuladas: acción de cambio inducida, cita aluc</w:t>
+      </w:r>
+      <w:r>
+        <w:t>inada, acción disfrazada, campos faltantes e IA caída.</w:t>
       </w:r>
     </w:p>
     <w:p>
@@ -11214,10 +11278,7 @@
         <w:t>eval_deterministic.py</w:t>
       </w:r>
       <w:r>
-        <w:t>). Las salidas del mode</w:t>
-      </w:r>
-      <w:r>
-        <w:t xml:space="preserve">lo en esos casos son fijas: el prototipo verifica el </w:t>
+        <w:t xml:space="preserve">). Las salidas del modelo en esos casos son fijas: el prototipo verifica el </w:t>
       </w:r>
       <w:r>
         <w:rPr>
@@ -11227,7 +11288,10 @@
         <w:t>validador y las reglas</w:t>
       </w:r>
       <w:r>
-        <w:t>, no la calidad ni la robustez de un modelo real.</w:t>
+        <w:t>, no la calidad ni la robuste</w:t>
+      </w:r>
+      <w:r>
+        <w:t>z de un modelo real.</w:t>
       </w:r>
     </w:p>
     <w:p>
@@ -11257,10 +11321,13 @@
         <w:t>Etiquetado.</w:t>
       </w:r>
       <w:r>
-        <w:t xml:space="preserve"> Ingen</w:t>
-      </w:r>
-      <w:r>
-        <w:t>ieros NOC senior etiquetan cada caso con la causa raíz (de una taxonomía controlada de causas), el Equipo resolutor, la agrupación correcta de Alertas y los documentos relevantes. Un 20% se etiqueta dos veces para medir la concordancia entre etiquetadores.</w:t>
+        <w:t xml:space="preserve"> </w:t>
+      </w:r>
+      <w:r>
+        <w:t>Ingenieros NOC senior etiquetan cada caso con la causa raíz (de una taxonomía controlada de causas), el Equipo resolutor, la agrupación correcta de Alertas y los documentos relevantes. Un 20% se etiqueta dos veces para medir la concordancia entre etiquetad</w:t>
+      </w:r>
+      <w:r>
+        <w:t>ores.</w:t>
       </w:r>
     </w:p>
     <w:tbl>
@@ -11570,7 +11637,13 @@
               <w:rPr>
                 <w:sz w:val="18"/>
               </w:rPr>
-              <w:t>Recall@3 / MRR</w:t>
+              <w:t>Recall</w:t>
+            </w:r>
+            <w:r>
+              <w:rPr>
+                <w:sz w:val="18"/>
+              </w:rPr>
+              <w:t>@3 / MRR</w:t>
             </w:r>
           </w:p>
         </w:tc>
@@ -11742,13 +11815,7 @@
               <w:rPr>
                 <w:sz w:val="18"/>
               </w:rPr>
-              <w:t>Pasos promedio y %</w:t>
-            </w:r>
-            <w:r>
-              <w:rPr>
-                <w:sz w:val="18"/>
-              </w:rPr>
-              <w:t xml:space="preserve"> de E5</w:t>
+              <w:t>Pasos promedio y % de E5</w:t>
             </w:r>
           </w:p>
         </w:tc>
@@ -12035,7 +12102,13 @@
               <w:rPr>
                 <w:sz w:val="18"/>
               </w:rPr>
-              <w:t>Ruteo + sugerencia IA</w:t>
+              <w:t>Ruteo + sugere</w:t>
+            </w:r>
+            <w:r>
+              <w:rPr>
+                <w:sz w:val="18"/>
+              </w:rPr>
+              <w:t>ncia IA</w:t>
             </w:r>
           </w:p>
         </w:tc>
@@ -12168,10 +12241,10 @@
         <w:pStyle w:val="FirstParagraph"/>
       </w:pPr>
       <w:r>
-        <w:t>Cada evaluación se corre varias veces (n ≥ 3) para estimar la varianza. Con 200 casos, un umbral de 0,70 tiene un intervalo de confianza del 95%</w:t>
-      </w:r>
-      <w:r>
-        <w:t xml:space="preserve"> de unos ±6 puntos: el set detecta regresiones grandes, no diferencias finas. Por eso las variantes se comparan con pruebas pareadas sobre los mismos casos, y el set crece con el etiquetado continuo del modo sombra.</w:t>
+        <w:t xml:space="preserve">Cada evaluación se corre varias veces (n ≥ 3) para estimar la varianza. Con 200 casos, un umbral de 0,70 tiene un intervalo de confianza del 95% de unos ±6 puntos: el set detecta regresiones grandes, no diferencias finas. Por eso las variantes se comparan </w:t>
+      </w:r>
+      <w:r>
+        <w:t>con pruebas pareadas sobre los mismos casos, y el set crece con el etiquetado continuo del modo sombra.</w:t>
       </w:r>
     </w:p>
     <w:p>
@@ -12308,7 +12381,13 @@
               <w:rPr>
                 <w:sz w:val="18"/>
               </w:rPr>
-              <w:t>Desde la Alerta hasta la derivación, comparado con la línea base actual.</w:t>
+              <w:t xml:space="preserve">Desde la Alerta hasta la derivación, comparado con la línea base </w:t>
+            </w:r>
+            <w:r>
+              <w:rPr>
+                <w:sz w:val="18"/>
+              </w:rPr>
+              <w:t>actual.</w:t>
             </w:r>
           </w:p>
         </w:tc>
@@ -12498,13 +12577,7 @@
               <w:rPr>
                 <w:sz w:val="18"/>
               </w:rPr>
-              <w:t>Costo y latencia por Incidenc</w:t>
-            </w:r>
-            <w:r>
-              <w:rPr>
-                <w:sz w:val="18"/>
-              </w:rPr>
-              <w:t>ia</w:t>
+              <w:t>Costo y latencia por Incidencia</w:t>
             </w:r>
           </w:p>
         </w:tc>
@@ -12535,7 +12608,10 @@
         <w:pStyle w:val="FirstParagraph"/>
       </w:pPr>
       <w:r>
-        <w:t>Las correcciones del Operador NOC alimentan el golden set (con revisión), lo que cierra el ciclo de mejora.</w:t>
+        <w:t>Las correcciones del Operador NOC alimentan el golden set (con revisión),</w:t>
+      </w:r>
+      <w:r>
+        <w:t xml:space="preserve"> lo que cierra el ciclo de mejora.</w:t>
       </w:r>
     </w:p>
     <w:p>
@@ -12543,7 +12619,7 @@
         <w:pStyle w:val="Ttulo2"/>
       </w:pPr>
       <w:bookmarkStart w:id="30" w:name="_2d9f01ff85dd9820987480cab79557db403aeac"/>
-      <w:bookmarkStart w:id="31" w:name="_Toc243386740"/>
+      <w:bookmarkStart w:id="31" w:name="_Toc243387717"/>
       <w:r>
         <w:t>7.3 Despliegue gradual</w:t>
       </w:r>
@@ -12566,10 +12642,10 @@
         <w:t>Sombra</w:t>
       </w:r>
       <w:r>
-        <w:t xml:space="preserve"> (4–6 semanas): la IA genera el análisis pero no se publica. El Operador NOC trabaja </w:t>
-      </w:r>
-      <w:r>
-        <w:t>como hoy y se comparan resultados. Pasa a la fase 2 si se cumplen los umbrales de la capa 2 sobre datos reales.</w:t>
+        <w:t xml:space="preserve"> (4–6 semanas): la IA genera el análisis pero no se publica. El Operador NOC trabaja como hoy y se comparan resultados. Pasa a la fase 2 si se cumplen los umbrales de la capa 2 sobre datos rea</w:t>
+      </w:r>
+      <w:r>
+        <w:t>les.</w:t>
       </w:r>
     </w:p>
     <w:p>
@@ -12604,14 +12680,7 @@
           <w:b/>
           <w:bCs/>
         </w:rPr>
-        <w:t>Nu</w:t>
-      </w:r>
-      <w:r>
-        <w:rPr>
-          <w:b/>
-          <w:bCs/>
-        </w:rPr>
-        <w:t>nca autónomo</w:t>
+        <w:t>Nunca autónomo</w:t>
       </w:r>
       <w:r>
         <w:t xml:space="preserve"> para acciones sobre la red: siempre pasan por la gestión de cambios del operador.</w:t>
@@ -12622,10 +12691,13 @@
         <w:pStyle w:val="Ttulo1"/>
       </w:pPr>
       <w:bookmarkStart w:id="32" w:name="_d8727e752cb31365f46bcadbe991ef572676e19"/>
-      <w:bookmarkStart w:id="33" w:name="_Toc243386741"/>
+      <w:bookmarkStart w:id="33" w:name="_Toc243387718"/>
       <w:r>
         <w:lastRenderedPageBreak/>
-        <w:t>8. Operación y limitaciones</w:t>
+        <w:t>8. Operación</w:t>
+      </w:r>
+      <w:r>
+        <w:t xml:space="preserve"> y limitaciones</w:t>
       </w:r>
       <w:bookmarkEnd w:id="32"/>
       <w:bookmarkEnd w:id="33"/>
@@ -12635,7 +12707,7 @@
         <w:pStyle w:val="Ttulo2"/>
       </w:pPr>
       <w:bookmarkStart w:id="34" w:name="_37ea2f043d1ca71eac9f00ba764ac933ea83f2c"/>
-      <w:bookmarkStart w:id="35" w:name="_Toc243386742"/>
+      <w:bookmarkStart w:id="35" w:name="_Toc243387719"/>
       <w:r>
         <w:t>8.1 Latencia y costo (estimación)</w:t>
       </w:r>
@@ -12881,9 +12953,17 @@
             </w:pPr>
             <w:r>
               <w:rPr>
-                <w:sz w:val="18"/>
-              </w:rPr>
-              <w:t>Agente (modelo medio, ≤8 tools)</w:t>
+                <w:b/>
+                <w:bCs/>
+                <w:sz w:val="18"/>
+              </w:rPr>
+              <w:t>Hasta la derivación</w:t>
+            </w:r>
+            <w:r>
+              <w:rPr>
+                <w:sz w:val="18"/>
+              </w:rPr>
+              <w:t xml:space="preserve"> (ruteo unívoco)</w:t>
             </w:r>
           </w:p>
         </w:tc>
@@ -12901,9 +12981,11 @@
             </w:pPr>
             <w:r>
               <w:rPr>
-                <w:sz w:val="18"/>
-              </w:rPr>
-              <w:t>30–90 s</w:t>
+                <w:b/>
+                <w:bCs/>
+                <w:sz w:val="18"/>
+              </w:rPr>
+              <w:t>&lt; 10 s</w:t>
             </w:r>
           </w:p>
         </w:tc>
@@ -12919,12 +13001,6 @@
                 <w:sz w:val="18"/>
               </w:rPr>
             </w:pPr>
-            <w:r>
-              <w:rPr>
-                <w:sz w:val="18"/>
-              </w:rPr>
-              <w:t>~30k entrada / 2k salida (acumulado)</w:t>
-            </w:r>
           </w:p>
         </w:tc>
       </w:tr>
@@ -12945,7 +13021,7 @@
               <w:rPr>
                 <w:sz w:val="18"/>
               </w:rPr>
-              <w:t>Resumen (modelo medio)</w:t>
+              <w:t>Agente (modelo medio, ≤8 tools)</w:t>
             </w:r>
           </w:p>
         </w:tc>
@@ -12965,7 +13041,7 @@
               <w:rPr>
                 <w:sz w:val="18"/>
               </w:rPr>
-              <w:t>5–10 s</w:t>
+              <w:t>30–90 s</w:t>
             </w:r>
           </w:p>
         </w:tc>
@@ -12985,7 +13061,7 @@
               <w:rPr>
                 <w:sz w:val="18"/>
               </w:rPr>
-              <w:t>~8k entrada / 1k salida</w:t>
+              <w:t>~30k entrada / 2k salida (acumulado)</w:t>
             </w:r>
           </w:p>
         </w:tc>
@@ -13005,11 +13081,73 @@
             </w:pPr>
             <w:r>
               <w:rPr>
+                <w:sz w:val="18"/>
+              </w:rPr>
+              <w:t>Resumen (modelo medio)</w:t>
+            </w:r>
+          </w:p>
+        </w:tc>
+        <w:tc>
+          <w:tcPr>
+            <w:tcW w:w="1667" w:type="pct"/>
+            <w:shd w:val="clear" w:color="auto" w:fill="auto"/>
+          </w:tcPr>
+          <w:p>
+            <w:pPr>
+              <w:pStyle w:val="Compact"/>
+              <w:rPr>
+                <w:sz w:val="18"/>
+              </w:rPr>
+            </w:pPr>
+            <w:r>
+              <w:rPr>
+                <w:sz w:val="18"/>
+              </w:rPr>
+              <w:t>5–10 s</w:t>
+            </w:r>
+          </w:p>
+        </w:tc>
+        <w:tc>
+          <w:tcPr>
+            <w:tcW w:w="1667" w:type="pct"/>
+            <w:shd w:val="clear" w:color="auto" w:fill="auto"/>
+          </w:tcPr>
+          <w:p>
+            <w:pPr>
+              <w:pStyle w:val="Compact"/>
+              <w:rPr>
+                <w:sz w:val="18"/>
+              </w:rPr>
+            </w:pPr>
+            <w:r>
+              <w:rPr>
+                <w:sz w:val="18"/>
+              </w:rPr>
+              <w:t>~8k entrada / 1k salida</w:t>
+            </w:r>
+          </w:p>
+        </w:tc>
+      </w:tr>
+      <w:tr>
+        <w:tc>
+          <w:tcPr>
+            <w:tcW w:w="1667" w:type="pct"/>
+            <w:shd w:val="clear" w:color="auto" w:fill="auto"/>
+          </w:tcPr>
+          <w:p>
+            <w:pPr>
+              <w:pStyle w:val="Compact"/>
+              <w:rPr>
+                <w:sz w:val="18"/>
+              </w:rPr>
+            </w:pPr>
+            <w:r>
+              <w:rPr>
                 <w:b/>
                 <w:bCs/>
                 <w:sz w:val="18"/>
               </w:rPr>
-              <w:t>Total hasta el resumen</w:t>
+              <w:t>Hasta el resumen en el ticket</w:t>
             </w:r>
           </w:p>
         </w:tc>
@@ -13104,7 +13242,7 @@
         <w:pStyle w:val="Ttulo2"/>
       </w:pPr>
       <w:bookmarkStart w:id="36" w:name="_observabilidad"/>
-      <w:bookmarkStart w:id="37" w:name="_Toc243386743"/>
+      <w:bookmarkStart w:id="37" w:name="_Toc243387720"/>
       <w:r>
         <w:t>8.2 Observabilidad</w:t>
       </w:r>
@@ -13176,7 +13314,7 @@
         <w:pStyle w:val="Ttulo2"/>
       </w:pPr>
       <w:bookmarkStart w:id="38" w:name="_resiliencia"/>
-      <w:bookmarkStart w:id="39" w:name="_Toc243386744"/>
+      <w:bookmarkStart w:id="39" w:name="_Toc243387721"/>
       <w:r>
         <w:t>8.3 Resiliencia</w:t>
       </w:r>
@@ -13199,7 +13337,7 @@
         <w:pStyle w:val="Ttulo2"/>
       </w:pPr>
       <w:bookmarkStart w:id="40" w:name="_e475abed30fa52e794d704ef2cf4919481e087c"/>
-      <w:bookmarkStart w:id="41" w:name="_Toc243386745"/>
+      <w:bookmarkStart w:id="41" w:name="_Toc243387722"/>
       <w:r>
         <w:t>8.4 Supervisión humana</w:t>
       </w:r>
@@ -13215,7 +13353,10 @@
         </w:numPr>
       </w:pPr>
       <w:r>
-        <w:t>El Operador NOC decide en E1 y E3 (bloquean la derivación) y revisa en paralelo E2, E4, E5 y E6.</w:t>
+        <w:t xml:space="preserve">El Operador NOC decide en E1 y E3 (bloquean la derivación) y revisa en paralelo E2, E4, E5 y E6. Todo resumen </w:t>
+      </w:r>
+      <w:r>
+        <w:t>con errores del validador queda retenido hasta su revisión.</w:t>
       </w:r>
     </w:p>
     <w:p>
@@ -13227,10 +13368,7 @@
         </w:numPr>
       </w:pPr>
       <w:r>
-        <w:t>Toda sugerenc</w:t>
-      </w:r>
-      <w:r>
-        <w:t>ia de ruteo hecha por IA requiere decisión humana.</w:t>
+        <w:t>Toda sugerencia de ruteo hecha por IA requiere decisión humana.</w:t>
       </w:r>
     </w:p>
     <w:p>
@@ -13254,7 +13392,10 @@
         </w:numPr>
       </w:pPr>
       <w:r>
-        <w:t>Las correcciones del operador quedan registradas y alimentan la evaluación.</w:t>
+        <w:t>Las correcciones del operador quedan registradas y ali</w:t>
+      </w:r>
+      <w:r>
+        <w:t>mentan la evaluación.</w:t>
       </w:r>
     </w:p>
     <w:p>
@@ -13262,7 +13403,7 @@
         <w:pStyle w:val="Ttulo2"/>
       </w:pPr>
       <w:bookmarkStart w:id="42" w:name="_71f77f8eab6ad684eb9de56f8b1bbd750ae9343"/>
-      <w:bookmarkStart w:id="43" w:name="_Toc243386746"/>
+      <w:bookmarkStart w:id="43" w:name="_Toc243387723"/>
       <w:r>
         <w:t>8.5 Riesgos residuales</w:t>
       </w:r>
@@ -13285,10 +13426,7 @@
         <w:t>Correlación imperfecta</w:t>
       </w:r>
       <w:r>
-        <w:t>: Inci</w:t>
-      </w:r>
-      <w:r>
-        <w:t>dencias sin relación topológica conocida pueden quedar separadas. Se mide con precisión/recall por pares y se mitiga con revisión del operador.</w:t>
+        <w:t>: Incidencias sin relación topológica conocida pueden quedar separadas. Se mide con precisión/recall por pares y se mitiga con revisión del operador.</w:t>
       </w:r>
     </w:p>
     <w:p>
@@ -13304,13 +13442,18 @@
           <w:b/>
           <w:bCs/>
         </w:rPr>
-        <w:t>El validador de citas comprueba que la evidencia existe, no que la respalde.</w:t>
-      </w:r>
-      <w:r>
-        <w:t xml:space="preserve"> Una cita real puede usarse para sos</w:t>
-      </w:r>
-      <w:r>
-        <w:t>tener una conclusión incorrecta. Se mitiga con groundedness en la evaluación y con revisión humana.</w:t>
+        <w:lastRenderedPageBreak/>
+        <w:t xml:space="preserve">El validador de citas comprueba que la </w:t>
+      </w:r>
+      <w:r>
+        <w:rPr>
+          <w:b/>
+          <w:bCs/>
+        </w:rPr>
+        <w:t>evidencia existe, no que la respalde.</w:t>
+      </w:r>
+      <w:r>
+        <w:t xml:space="preserve"> Una cita real puede usarse para sostener una conclusión incorrecta. Se mitiga con groundedness en la evaluación y con revisión humana.</w:t>
       </w:r>
     </w:p>
     <w:p>
@@ -13326,14 +13469,13 @@
           <w:b/>
           <w:bCs/>
         </w:rPr>
-        <w:lastRenderedPageBreak/>
         <w:t>Detección de acciones de cambio por lista de verbos</w:t>
       </w:r>
       <w:r>
-        <w:t xml:space="preserve"> (respaldo del validador): puede tener falsos negativos con redacciones atípicas y falsos positivos con v</w:t>
-      </w:r>
-      <w:r>
-        <w:t>erbos ambiguos. Debe evaluarse en el golden set.</w:t>
+        <w:t xml:space="preserve"> (respaldo del validador): puede</w:t>
+      </w:r>
+      <w:r>
+        <w:t xml:space="preserve"> tener falsos negativos con redacciones atípicas y falsos positivos con verbos ambiguos. Debe evaluarse en el golden set.</w:t>
       </w:r>
     </w:p>
     <w:p>
@@ -13352,7 +13494,10 @@
         <w:t>Prompt injection que sesga el texto del resumen</w:t>
       </w:r>
       <w:r>
-        <w:t>: sin tools de escritura no puede actuar, pero puede inducir una hipótesis errónea. Se mitiga con evidencia obligatoria, ruteo por reglas y revisión humana.</w:t>
+        <w:t xml:space="preserve">: sin tools de escritura no puede actuar, pero puede inducir una hipótesis errónea. Se </w:t>
+      </w:r>
+      <w:r>
+        <w:t>mitiga con evidencia obligatoria, ruteo por reglas y revisión humana.</w:t>
       </w:r>
     </w:p>
     <w:p>
@@ -13368,14 +13513,7 @@
           <w:b/>
           <w:bCs/>
         </w:rPr>
-        <w:t>Cal</w:t>
-      </w:r>
-      <w:r>
-        <w:rPr>
-          <w:b/>
-          <w:bCs/>
-        </w:rPr>
-        <w:t>idad del histórico</w:t>
+        <w:t>Calidad del histórico</w:t>
       </w:r>
       <w:r>
         <w:t>: si las causas raíz registradas son pobres, el RAG de Incidencias similares aporta poco.</w:t>
@@ -13405,7 +13543,7 @@
         <w:pStyle w:val="Ttulo2"/>
       </w:pPr>
       <w:bookmarkStart w:id="44" w:name="_2a051840def5bc2000b770f663cf6617893998a"/>
-      <w:bookmarkStart w:id="45" w:name="_Toc243386747"/>
+      <w:bookmarkStart w:id="45" w:name="_Toc243387724"/>
       <w:r>
         <w:t>8.6 Pendientes antes de producción</w:t>
       </w:r>
@@ -13421,7 +13559,10 @@
         </w:numPr>
       </w:pPr>
       <w:r>
-        <w:t>Confirmar S1 con el área legal y de cumplimiento del operador: residencia de datos, uso de un modelo gestionado y si se acepta un perfil de inferencia geográfico.</w:t>
+        <w:t>Confirmar S1 con el área legal y de cumplimiento del operador: residencia de datos, uso de un modelo gestionado y s</w:t>
+      </w:r>
+      <w:r>
+        <w:t>i se acepta un perfil de inferencia geográfico.</w:t>
       </w:r>
     </w:p>
     <w:p>
@@ -13433,10 +13574,7 @@
         </w:numPr>
       </w:pPr>
       <w:r>
-        <w:t>Validar la disponibilidad de los modelos candidatos y de K</w:t>
-      </w:r>
-      <w:r>
-        <w:t>nowledge Bases en la región exigida, y elegir el modelo con el golden set.</w:t>
+        <w:t>Validar la disponibilidad de los modelos candidatos y de Knowledge Bases en la región exigida, y elegir el modelo con el golden set.</w:t>
       </w:r>
     </w:p>
     <w:p>
@@ -13448,7 +13586,10 @@
         </w:numPr>
       </w:pPr>
       <w:r>
-        <w:t>Inventariar las APIs y webhooks reales de los sistemas on-prem y la plataforma de tickets (S2).</w:t>
+        <w:t>Inventariar las APIs y webhooks reales de los sistemas on-prem y la platafo</w:t>
+      </w:r>
+      <w:r>
+        <w:t>rma de tickets (S2).</w:t>
       </w:r>
     </w:p>
     <w:p>
@@ -13460,10 +13601,7 @@
         </w:numPr>
       </w:pPr>
       <w:r>
-        <w:t>Construir y etiquetar el golden set con el equipo NOC; acordar la taxonomía de causas</w:t>
-      </w:r>
-      <w:r>
-        <w:t xml:space="preserve"> y los umbrales.</w:t>
+        <w:t>Construir y etiquetar el golden set con el equipo NOC; acordar la taxonomía de causas y los umbrales.</w:t>
       </w:r>
     </w:p>
     <w:p>
@@ -13475,7 +13613,10 @@
         </w:numPr>
       </w:pPr>
       <w:r>
-        <w:t>Definir con negocio la matriz de prioridad, la tabla Síntoma → urgencia, el SLA y la tabla de ruteo reales (las del prototipo son supuestos).</w:t>
+        <w:t>Definir con negocio la matriz de prioridad, la tabla Síntoma → urgencia, el SLA y la tabla de ruteo reales (las del prototipo son sup</w:t>
+      </w:r>
+      <w:r>
+        <w:t>uestos).</w:t>
       </w:r>
     </w:p>
     <w:p>
@@ -13499,10 +13640,7 @@
         </w:numPr>
       </w:pPr>
       <w:r>
-        <w:t>Pentest y red-team</w:t>
-      </w:r>
-      <w:r>
-        <w:t xml:space="preserve"> de prompt injection antes de la fase asistida.</w:t>
+        <w:t>Pentest y red-team de prompt injection antes de la fase asistida.</w:t>
       </w:r>
     </w:p>
     <w:p>
@@ -13510,7 +13648,7 @@
         <w:pStyle w:val="Ttulo1"/>
       </w:pPr>
       <w:bookmarkStart w:id="46" w:name="_a5ed2b4bf0fb80322b8db7f52b6310c044129d6"/>
-      <w:bookmarkStart w:id="47" w:name="_Toc243386748"/>
+      <w:bookmarkStart w:id="47" w:name="_Toc243387725"/>
       <w:r>
         <w:t>9. Decisiones técnicas principales</w:t>
       </w:r>
@@ -13726,7 +13864,10 @@
         <w:t>Otras decisiones: reglas fuera del LLM (urgencia, prioridad, SLA, ruteo y escalamiento); extracción antes de la validación; escalamiento por señales verificabl</w:t>
       </w:r>
       <w:r>
-        <w:t>es en lugar de “confianza” del modelo; derivación no bloqueante salvo E1/E3; aprobación en la plataforma de tickets; degradación sin IA; despliegue sombra → asistido.</w:t>
+        <w:t>es en lugar de “confianza” del modelo; ruteo y derivación antes de la investigación, sin esperar a la IA ni al humano salvo E1/E3; retención del resumen ante cualquier error del validador; aprobación en la plataforma de tickets; degradación sin IA; desplie</w:t>
+      </w:r>
+      <w:r>
+        <w:t>gue sombra → asistido.</w:t>
       </w:r>
     </w:p>
     <w:p>
@@ -13734,8 +13875,9 @@
         <w:pStyle w:val="Ttulo1"/>
       </w:pPr>
       <w:bookmarkStart w:id="48" w:name="_2ece7273304f22a5b96354fbdfd9a08907327b3"/>
-      <w:bookmarkStart w:id="49" w:name="_Toc243386749"/>
-      <w:r>
+      <w:bookmarkStart w:id="49" w:name="_Toc243387726"/>
+      <w:r>
+        <w:lastRenderedPageBreak/>
         <w:t>10. Preguntas anticipadas</w:t>
       </w:r>
       <w:bookmarkEnd w:id="48"/>
@@ -13753,10 +13895,10 @@
         <w:t>¿Por qué no derivar sin esperar al humano, incluso en P1?</w:t>
       </w:r>
       <w:r>
-        <w:t xml:space="preserve"> Así e</w:t>
-      </w:r>
-      <w:r>
-        <w:t>stá diseñado: en P1 se deriva de inmediato por regla y la revisión humana del análisis corre en paralelo. Solo se espera al Operador NOC cuando no hay datos para derivar (E1) o no se sabe a quién (E3).</w:t>
+        <w:t xml:space="preserve"> Así está diseñado: en cualquier prioridad, incluida P1, se deriva por regla apenas se prioriza (en segundos), sin esperar al humano ni al análisis IA</w:t>
+      </w:r>
+      <w:r>
+        <w:t>. La revisión humana del análisis corre en paralelo. Solo se espera al Operador NOC cuando no hay datos para derivar (E1) o no se sabe a quién (E3).</w:t>
       </w:r>
     </w:p>
     <w:p>
@@ -13768,17 +13910,13 @@
           <w:b/>
           <w:bCs/>
         </w:rPr>
-        <w:lastRenderedPageBreak/>
         <w:t>¿Por qué MCP si el loop del agente es propio?</w:t>
       </w:r>
       <w:r>
-        <w:t xml:space="preserve"> Una Lamb</w:t>
-      </w:r>
-      <w:r>
-        <w:t xml:space="preserve">da de tools con su propio rol daría la misma frontera IAM. MCP aporta un contrato estándar (descubrimiento y esquemas) que permite reutilizar las tools desde otros clientes, como un asistente para el NOC. Sin ese segundo consumidor, la Lambda simple sería </w:t>
-      </w:r>
-      <w:r>
-        <w:t>igual de válida (ADR 0003).</w:t>
+        <w:t xml:space="preserve"> Una Lambda de tools con su propio rol daría la misma frontera</w:t>
+      </w:r>
+      <w:r>
+        <w:t xml:space="preserve"> IAM. MCP aporta un contrato estándar (descubrimiento y esquemas) que permite reutilizar las tools desde otros clientes, como un asistente para el NOC. Sin ese segundo consumidor, la Lambda simple sería igual de válida (ADR 0003).</w:t>
       </w:r>
     </w:p>
     <w:p>
@@ -13790,13 +13928,20 @@
           <w:b/>
           <w:bCs/>
         </w:rPr>
-        <w:t>¿Qué puede hacer un prompt injection si no hay tools de escritura?</w:t>
-      </w:r>
-      <w:r>
-        <w:t xml:space="preserve"> No puede actuar sobre la red ni sobre el ticket, pero puede intentar sesgar el resumen o sugerir otro equipo. El ruteo y la prioridad son por reglas, los hechos </w:t>
-      </w:r>
-      <w:r>
-        <w:t>exigen evidencia devuelta por las tools (no texto del Ticket) y el operador revisa. La robustez del modelo se mide con red-team, no con el prototipo.</w:t>
+        <w:t>¿Qué puede hacer un promp</w:t>
+      </w:r>
+      <w:r>
+        <w:rPr>
+          <w:b/>
+          <w:bCs/>
+        </w:rPr>
+        <w:t>t injection si no hay tools de escritura?</w:t>
+      </w:r>
+      <w:r>
+        <w:t xml:space="preserve"> No puede actuar sobre la red ni sobre el ticket, pero puede intentar sesgar el resumen o sugerir otro equipo. El ruteo y la prioridad son por reglas, los hechos exigen evidencia devuelta por las tools (no texto del</w:t>
+      </w:r>
+      <w:r>
+        <w:t xml:space="preserve"> Ticket) y el operador revisa. La robustez del modelo se mide con red-team, no con el prototipo.</w:t>
       </w:r>
     </w:p>
     <w:p>
@@ -13811,10 +13956,10 @@
         <w:t>¿Bastan 200 casos?</w:t>
       </w:r>
       <w:r>
-        <w:t xml:space="preserve"> Sirven para detectar regresiones grandes (IC95% de unos ±6 puntos a 0,70), no para dist</w:t>
-      </w:r>
-      <w:r>
-        <w:t>inguir variantes parecidas. Se complementan con pruebas pareadas y con el crecimiento del set en modo sombra.</w:t>
+        <w:t xml:space="preserve"> Sirven para detectar regresiones grandes (IC95% de unos ±6 puntos a 0,70), no para distinguir variantes parecidas. Se complementan con prueb</w:t>
+      </w:r>
+      <w:r>
+        <w:t>as pareadas y con el crecimiento del set en modo sombra.</w:t>
       </w:r>
     </w:p>
     <w:p>
@@ -13829,10 +13974,10 @@
         <w:t>¿Quién decide qué es la causa “correcta” o un documento “relevante”?</w:t>
       </w:r>
       <w:r>
-        <w:t xml:space="preserve"> Ingenieros NOC senior, sobre una taxonomía controlada de causas, con doble et</w:t>
-      </w:r>
-      <w:r>
-        <w:t>iquetado en el 20% de los casos para medir concordancia.</w:t>
+        <w:t xml:space="preserve"> Ingenieros NOC senior, sobre una taxonomía controlada de causas, con doble etiquetado en el 20% de los casos para medir concordanc</w:t>
+      </w:r>
+      <w:r>
+        <w:t>ia.</w:t>
       </w:r>
     </w:p>
     <w:p>
@@ -13862,10 +14007,7 @@
         <w:t xml:space="preserve"> alta/media/baja de las hipótesis?</w:t>
       </w:r>
       <w:r>
-        <w:t xml:space="preserve"> Solo para ordenarlas en el resumen; no dispara ninguna decisión. Se mide su calibración en el golden set y, si no es monótona, se elimin</w:t>
-      </w:r>
-      <w:r>
-        <w:t>a.</w:t>
+        <w:t xml:space="preserve"> Solo para ordenarlas en el resumen; no dispara ninguna decisión. Se mide su calibración en el golden set y, si no es monótona, se elimina.</w:t>
       </w:r>
     </w:p>
     <w:p>
@@ -13888,7 +14030,7 @@
         <w:pStyle w:val="Ttulo1"/>
       </w:pPr>
       <w:bookmarkStart w:id="50" w:name="_923eadbdcfb4798034273fd952db44a0abe1d4f"/>
-      <w:bookmarkStart w:id="51" w:name="_Toc243386750"/>
+      <w:bookmarkStart w:id="51" w:name="_Toc243387727"/>
       <w:r>
         <w:t>Anexo A. Prototipo</w:t>
       </w:r>
@@ -13900,10 +14042,7 @@
         <w:pStyle w:val="FirstParagraph"/>
       </w:pPr>
       <w:r>
-        <w:t>En la carpet</w:t>
-      </w:r>
-      <w:r>
-        <w:t xml:space="preserve">a </w:t>
+        <w:t xml:space="preserve">En la carpeta </w:t>
       </w:r>
       <w:r>
         <w:rPr>
@@ -14027,7 +14166,13 @@
               <w:rPr>
                 <w:sz w:val="18"/>
               </w:rPr>
-              <w:t xml:space="preserve">Contratos (JSON Schema) de las 6 tools MCP, todas de solo lectura y con </w:t>
+              <w:t>Contratos</w:t>
+            </w:r>
+            <w:r>
+              <w:rPr>
+                <w:sz w:val="18"/>
+              </w:rPr>
+              <w:t xml:space="preserve"> (JSON Schema) de las 6 tools MCP, todas de solo lectura y con </w:t>
             </w:r>
             <w:r>
               <w:rPr>
@@ -14145,7 +14290,7 @@
               <w:rPr>
                 <w:sz w:val="18"/>
               </w:rPr>
-              <w:t>Campos obligatorios, urgencia (severidad y Síntoma), prioridad/SLA, ruteo, códigos de escalamiento y derivación (valores supuestos).</w:t>
+              <w:t>Campos obligatorios, urgencia (severidad y Síntoma), prioridad/SLA, ruteo, códigos de escalamiento, derivación y publicación del resumen (valores supuestos).</w:t>
             </w:r>
           </w:p>
         </w:tc>
@@ -14188,13 +14333,13 @@
               <w:rPr>
                 <w:sz w:val="18"/>
               </w:rPr>
-              <w:t>18 casos: normales, Tickets en t</w:t>
-            </w:r>
-            <w:r>
-              <w:rPr>
-                <w:sz w:val="18"/>
-              </w:rPr>
-              <w:t>exto libre, escalamiento, adversariales sobre salidas simuladas (acción inducida, cita alucinada, acción disfrazada, falso positivo) y degradación.</w:t>
+              <w:t>18 caso</w:t>
+            </w:r>
+            <w:r>
+              <w:rPr>
+                <w:sz w:val="18"/>
+              </w:rPr>
+              <w:t>s: normales, Tickets en texto libre, escalamiento, adversariales sobre salidas simuladas (acción inducida, cita alucinada, acción disfrazada, falso positivo) y degradación.</w:t>
             </w:r>
           </w:p>
         </w:tc>
@@ -14217,6 +14362,7 @@
                 <w:rStyle w:val="VerbatimChar"/>
                 <w:sz w:val="18"/>
               </w:rPr>
+              <w:lastRenderedPageBreak/>
               <w:t>eval_deterministic.py</w:t>
             </w:r>
           </w:p>
@@ -14237,7 +14383,13 @@
               <w:rPr>
                 <w:sz w:val="18"/>
               </w:rPr>
-              <w:t>Corre los casos; sale con código 1 si alguno falla (gate de CI).</w:t>
+              <w:t xml:space="preserve">Corre los casos; sale con código 1 si alguno falla (gate de </w:t>
+            </w:r>
+            <w:r>
+              <w:rPr>
+                <w:sz w:val="18"/>
+              </w:rPr>
+              <w:t>CI).</w:t>
             </w:r>
           </w:p>
         </w:tc>
@@ -14254,13 +14406,7 @@
         <w:rPr>
           <w:rStyle w:val="VerbatimChar"/>
         </w:rPr>
-        <w:t>uv run -</w:t>
-      </w:r>
-      <w:r>
-        <w:rPr>
-          <w:rStyle w:val="VerbatimChar"/>
-        </w:rPr>
-        <w:t>-python 3.13 --with pydantic python eval_deterministic.py</w:t>
+        <w:t>uv run --python 3.13 --with pydantic python eval_deterministic.py</w:t>
       </w:r>
       <w:r>
         <w:t xml:space="preserve"> → </w:t>
@@ -14308,7 +14454,7 @@
   <w:abstractNum w:abstractNumId="0" w15:restartNumberingAfterBreak="0">
     <w:nsid w:val="0000A990"/>
     <w:multiLevelType w:val="multilevel"/>
-    <w:tmpl w:val="3378D828"/>
+    <w:tmpl w:val="C55E3288"/>
     <w:lvl w:ilvl="0">
       <w:numFmt w:val="bullet"/>
       <w:lvlText w:val=" "/>
@@ -14385,7 +14531,7 @@
   <w:abstractNum w:abstractNumId="1" w15:restartNumberingAfterBreak="0">
     <w:nsid w:val="0000A991"/>
     <w:multiLevelType w:val="multilevel"/>
-    <w:tmpl w:val="0A74772A"/>
+    <w:tmpl w:val="00BA3A2C"/>
     <w:lvl w:ilvl="0">
       <w:numFmt w:val="bullet"/>
       <w:lvlText w:val=""/>
@@ -14489,7 +14635,7 @@
   <w:abstractNum w:abstractNumId="2" w15:restartNumberingAfterBreak="0">
     <w:nsid w:val="00A99411"/>
     <w:multiLevelType w:val="multilevel"/>
-    <w:tmpl w:val="F70895A8"/>
+    <w:tmpl w:val="261AF7F0"/>
     <w:lvl w:ilvl="0">
       <w:start w:val="1"/>
       <w:numFmt w:val="decimal"/>
@@ -15958,7 +16104,7 @@
     <w:autoRedefine/>
     <w:uiPriority w:val="39"/>
     <w:unhideWhenUsed/>
-    <w:rsid w:val="0058013A"/>
+    <w:rsid w:val="002247FD"/>
     <w:pPr>
       <w:spacing w:after="100"/>
     </w:pPr>
@@ -15970,7 +16116,7 @@
     <w:autoRedefine/>
     <w:uiPriority w:val="39"/>
     <w:unhideWhenUsed/>
-    <w:rsid w:val="0058013A"/>
+    <w:rsid w:val="002247FD"/>
     <w:pPr>
       <w:spacing w:after="100"/>
       <w:ind w:left="240"/>

</xml_diff>

<commit_message>
Diagrama de estados en página propia con márgenes reducidos
</commit_message>
<xml_diff>
--- a/docs/entregable/HACOM-Reto-AI-Engineer.docx
+++ b/docs/entregable/HACOM-Reto-AI-Engineer.docx
@@ -42,7 +42,7 @@
           <w:sz w:val="24"/>
           <w:szCs w:val="24"/>
         </w:rPr>
-        <w:id w:val="1634827986"/>
+        <w:id w:val="-28655704"/>
         <w:docPartObj>
           <w:docPartGallery w:val="Table of Contents"/>
           <w:docPartUnique/>
@@ -77,7 +77,7 @@
           <w:r>
             <w:fldChar w:fldCharType="separate"/>
           </w:r>
-          <w:hyperlink w:anchor="_Toc243388086" w:history="1">
+          <w:hyperlink w:anchor="_Toc243388361" w:history="1">
             <w:r>
               <w:rPr>
                 <w:rStyle w:val="Hyperlink"/>
@@ -104,7 +104,7 @@
                 <w:noProof/>
                 <w:webHidden/>
               </w:rPr>
-              <w:instrText xml:space="preserve"> PAGEREF _Toc243388086 \h </w:instrText>
+              <w:instrText xml:space="preserve"> PAGEREF _Toc243388361 \h </w:instrText>
             </w:r>
             <w:r>
               <w:rPr>
@@ -145,7 +145,7 @@
               <w:noProof/>
             </w:rPr>
           </w:pPr>
-          <w:hyperlink w:anchor="_Toc243388087" w:history="1">
+          <w:hyperlink w:anchor="_Toc243388362" w:history="1">
             <w:r>
               <w:rPr>
                 <w:rStyle w:val="Hyperlink"/>
@@ -172,7 +172,7 @@
                 <w:noProof/>
                 <w:webHidden/>
               </w:rPr>
-              <w:instrText xml:space="preserve"> PAGEREF _Toc243388087 \h </w:instrText>
+              <w:instrText xml:space="preserve"> PAGEREF _Toc243388362 \h </w:instrText>
             </w:r>
             <w:r>
               <w:rPr>
@@ -213,7 +213,7 @@
               <w:noProof/>
             </w:rPr>
           </w:pPr>
-          <w:hyperlink w:anchor="_Toc243388088" w:history="1">
+          <w:hyperlink w:anchor="_Toc243388363" w:history="1">
             <w:r>
               <w:rPr>
                 <w:rStyle w:val="Hyperlink"/>
@@ -240,7 +240,7 @@
                 <w:noProof/>
                 <w:webHidden/>
               </w:rPr>
-              <w:instrText xml:space="preserve"> PAGEREF _Toc243388088 \h </w:instrText>
+              <w:instrText xml:space="preserve"> PAGEREF _Toc243388363 \h </w:instrText>
             </w:r>
             <w:r>
               <w:rPr>
@@ -281,7 +281,7 @@
               <w:noProof/>
             </w:rPr>
           </w:pPr>
-          <w:hyperlink w:anchor="_Toc243388089" w:history="1">
+          <w:hyperlink w:anchor="_Toc243388364" w:history="1">
             <w:r>
               <w:rPr>
                 <w:rStyle w:val="Hyperlink"/>
@@ -308,7 +308,7 @@
                 <w:noProof/>
                 <w:webHidden/>
               </w:rPr>
-              <w:instrText xml:space="preserve"> PAGEREF _Toc243388089 \h </w:instrText>
+              <w:instrText xml:space="preserve"> PAGEREF _Toc243388364 \h </w:instrText>
             </w:r>
             <w:r>
               <w:rPr>
@@ -349,7 +349,7 @@
               <w:noProof/>
             </w:rPr>
           </w:pPr>
-          <w:hyperlink w:anchor="_Toc243388090" w:history="1">
+          <w:hyperlink w:anchor="_Toc243388365" w:history="1">
             <w:r>
               <w:rPr>
                 <w:rStyle w:val="Hyperlink"/>
@@ -376,7 +376,7 @@
                 <w:noProof/>
                 <w:webHidden/>
               </w:rPr>
-              <w:instrText xml:space="preserve"> PAGEREF _Toc243388090 \h </w:instrText>
+              <w:instrText xml:space="preserve"> PAGEREF _Toc243388365 \h </w:instrText>
             </w:r>
             <w:r>
               <w:rPr>
@@ -417,7 +417,7 @@
               <w:noProof/>
             </w:rPr>
           </w:pPr>
-          <w:hyperlink w:anchor="_Toc243388091" w:history="1">
+          <w:hyperlink w:anchor="_Toc243388366" w:history="1">
             <w:r>
               <w:rPr>
                 <w:rStyle w:val="Hyperlink"/>
@@ -444,7 +444,7 @@
                 <w:noProof/>
                 <w:webHidden/>
               </w:rPr>
-              <w:instrText xml:space="preserve"> PAGEREF _Toc243388091 \h </w:instrText>
+              <w:instrText xml:space="preserve"> PAGEREF _Toc243388366 \h </w:instrText>
             </w:r>
             <w:r>
               <w:rPr>
@@ -485,7 +485,7 @@
               <w:noProof/>
             </w:rPr>
           </w:pPr>
-          <w:hyperlink w:anchor="_Toc243388092" w:history="1">
+          <w:hyperlink w:anchor="_Toc243388367" w:history="1">
             <w:r>
               <w:rPr>
                 <w:rStyle w:val="Hyperlink"/>
@@ -512,7 +512,7 @@
                 <w:noProof/>
                 <w:webHidden/>
               </w:rPr>
-              <w:instrText xml:space="preserve"> PAGEREF _Toc243388092 \h </w:instrText>
+              <w:instrText xml:space="preserve"> PAGEREF _Toc243388367 \h </w:instrText>
             </w:r>
             <w:r>
               <w:rPr>
@@ -553,7 +553,7 @@
               <w:noProof/>
             </w:rPr>
           </w:pPr>
-          <w:hyperlink w:anchor="_Toc243388093" w:history="1">
+          <w:hyperlink w:anchor="_Toc243388368" w:history="1">
             <w:r>
               <w:rPr>
                 <w:rStyle w:val="Hyperlink"/>
@@ -580,7 +580,7 @@
                 <w:noProof/>
                 <w:webHidden/>
               </w:rPr>
-              <w:instrText xml:space="preserve"> PAGEREF _Toc243388093 \h </w:instrText>
+              <w:instrText xml:space="preserve"> PAGEREF _Toc243388368 \h </w:instrText>
             </w:r>
             <w:r>
               <w:rPr>
@@ -621,7 +621,7 @@
               <w:noProof/>
             </w:rPr>
           </w:pPr>
-          <w:hyperlink w:anchor="_Toc243388094" w:history="1">
+          <w:hyperlink w:anchor="_Toc243388369" w:history="1">
             <w:r>
               <w:rPr>
                 <w:rStyle w:val="Hyperlink"/>
@@ -648,7 +648,7 @@
                 <w:noProof/>
                 <w:webHidden/>
               </w:rPr>
-              <w:instrText xml:space="preserve"> PAGEREF _Toc243388094 \h </w:instrText>
+              <w:instrText xml:space="preserve"> PAGEREF _Toc243388369 \h </w:instrText>
             </w:r>
             <w:r>
               <w:rPr>
@@ -689,7 +689,7 @@
               <w:noProof/>
             </w:rPr>
           </w:pPr>
-          <w:hyperlink w:anchor="_Toc243388095" w:history="1">
+          <w:hyperlink w:anchor="_Toc243388370" w:history="1">
             <w:r>
               <w:rPr>
                 <w:rStyle w:val="Hyperlink"/>
@@ -716,7 +716,7 @@
                 <w:noProof/>
                 <w:webHidden/>
               </w:rPr>
-              <w:instrText xml:space="preserve"> PAGEREF _Toc243388095 \h </w:instrText>
+              <w:instrText xml:space="preserve"> PAGEREF _Toc243388370 \h </w:instrText>
             </w:r>
             <w:r>
               <w:rPr>
@@ -736,7 +736,7 @@
                 <w:noProof/>
                 <w:webHidden/>
               </w:rPr>
-              <w:t>9</w:t>
+              <w:t>10</w:t>
             </w:r>
             <w:r>
               <w:rPr>
@@ -757,7 +757,7 @@
               <w:noProof/>
             </w:rPr>
           </w:pPr>
-          <w:hyperlink w:anchor="_Toc243388096" w:history="1">
+          <w:hyperlink w:anchor="_Toc243388371" w:history="1">
             <w:r>
               <w:rPr>
                 <w:rStyle w:val="Hyperlink"/>
@@ -784,7 +784,7 @@
                 <w:noProof/>
                 <w:webHidden/>
               </w:rPr>
-              <w:instrText xml:space="preserve"> PAGEREF _Toc243388096 \h </w:instrText>
+              <w:instrText xml:space="preserve"> PAGEREF _Toc243388371 \h </w:instrText>
             </w:r>
             <w:r>
               <w:rPr>
@@ -804,7 +804,7 @@
                 <w:noProof/>
                 <w:webHidden/>
               </w:rPr>
-              <w:t>10</w:t>
+              <w:t>11</w:t>
             </w:r>
             <w:r>
               <w:rPr>
@@ -825,7 +825,7 @@
               <w:noProof/>
             </w:rPr>
           </w:pPr>
-          <w:hyperlink w:anchor="_Toc243388097" w:history="1">
+          <w:hyperlink w:anchor="_Toc243388372" w:history="1">
             <w:r>
               <w:rPr>
                 <w:rStyle w:val="Hyperlink"/>
@@ -852,7 +852,7 @@
                 <w:noProof/>
                 <w:webHidden/>
               </w:rPr>
-              <w:instrText xml:space="preserve"> PAGEREF _Toc243388097 \h </w:instrText>
+              <w:instrText xml:space="preserve"> PAGEREF _Toc243388372 \h </w:instrText>
             </w:r>
             <w:r>
               <w:rPr>
@@ -872,7 +872,7 @@
                 <w:noProof/>
                 <w:webHidden/>
               </w:rPr>
-              <w:t>13</w:t>
+              <w:t>14</w:t>
             </w:r>
             <w:r>
               <w:rPr>
@@ -893,7 +893,7 @@
               <w:noProof/>
             </w:rPr>
           </w:pPr>
-          <w:hyperlink w:anchor="_Toc243388098" w:history="1">
+          <w:hyperlink w:anchor="_Toc243388373" w:history="1">
             <w:r>
               <w:rPr>
                 <w:rStyle w:val="Hyperlink"/>
@@ -920,7 +920,7 @@
                 <w:noProof/>
                 <w:webHidden/>
               </w:rPr>
-              <w:instrText xml:space="preserve"> PAGEREF _Toc243388098 \h </w:instrText>
+              <w:instrText xml:space="preserve"> PAGEREF _Toc243388373 \h </w:instrText>
             </w:r>
             <w:r>
               <w:rPr>
@@ -940,7 +940,7 @@
                 <w:noProof/>
                 <w:webHidden/>
               </w:rPr>
-              <w:t>14</w:t>
+              <w:t>15</w:t>
             </w:r>
             <w:r>
               <w:rPr>
@@ -961,7 +961,7 @@
               <w:noProof/>
             </w:rPr>
           </w:pPr>
-          <w:hyperlink w:anchor="_Toc243388099" w:history="1">
+          <w:hyperlink w:anchor="_Toc243388374" w:history="1">
             <w:r>
               <w:rPr>
                 <w:rStyle w:val="Hyperlink"/>
@@ -988,7 +988,7 @@
                 <w:noProof/>
                 <w:webHidden/>
               </w:rPr>
-              <w:instrText xml:space="preserve"> PAGEREF _Toc243388099 \h </w:instrText>
+              <w:instrText xml:space="preserve"> PAGEREF _Toc243388374 \h </w:instrText>
             </w:r>
             <w:r>
               <w:rPr>
@@ -1008,7 +1008,7 @@
                 <w:noProof/>
                 <w:webHidden/>
               </w:rPr>
-              <w:t>14</w:t>
+              <w:t>15</w:t>
             </w:r>
             <w:r>
               <w:rPr>
@@ -1029,7 +1029,7 @@
               <w:noProof/>
             </w:rPr>
           </w:pPr>
-          <w:hyperlink w:anchor="_Toc243388100" w:history="1">
+          <w:hyperlink w:anchor="_Toc243388375" w:history="1">
             <w:r>
               <w:rPr>
                 <w:rStyle w:val="Hyperlink"/>
@@ -1056,7 +1056,7 @@
                 <w:noProof/>
                 <w:webHidden/>
               </w:rPr>
-              <w:instrText xml:space="preserve"> PAGEREF _Toc243388100 \h </w:instrText>
+              <w:instrText xml:space="preserve"> PAGEREF _Toc243388375 \h </w:instrText>
             </w:r>
             <w:r>
               <w:rPr>
@@ -1076,7 +1076,7 @@
                 <w:noProof/>
                 <w:webHidden/>
               </w:rPr>
-              <w:t>14</w:t>
+              <w:t>15</w:t>
             </w:r>
             <w:r>
               <w:rPr>
@@ -1097,7 +1097,7 @@
               <w:noProof/>
             </w:rPr>
           </w:pPr>
-          <w:hyperlink w:anchor="_Toc243388101" w:history="1">
+          <w:hyperlink w:anchor="_Toc243388376" w:history="1">
             <w:r>
               <w:rPr>
                 <w:rStyle w:val="Hyperlink"/>
@@ -1124,7 +1124,7 @@
                 <w:noProof/>
                 <w:webHidden/>
               </w:rPr>
-              <w:instrText xml:space="preserve"> PAGEREF _Toc243388101 \h </w:instrText>
+              <w:instrText xml:space="preserve"> PAGEREF _Toc243388376 \h </w:instrText>
             </w:r>
             <w:r>
               <w:rPr>
@@ -1144,7 +1144,7 @@
                 <w:noProof/>
                 <w:webHidden/>
               </w:rPr>
-              <w:t>15</w:t>
+              <w:t>16</w:t>
             </w:r>
             <w:r>
               <w:rPr>
@@ -1165,7 +1165,7 @@
               <w:noProof/>
             </w:rPr>
           </w:pPr>
-          <w:hyperlink w:anchor="_Toc243388102" w:history="1">
+          <w:hyperlink w:anchor="_Toc243388377" w:history="1">
             <w:r>
               <w:rPr>
                 <w:rStyle w:val="Hyperlink"/>
@@ -1192,7 +1192,7 @@
                 <w:noProof/>
                 <w:webHidden/>
               </w:rPr>
-              <w:instrText xml:space="preserve"> PAGEREF _Toc243388102 \h </w:instrText>
+              <w:instrText xml:space="preserve"> PAGEREF _Toc243388377 \h </w:instrText>
             </w:r>
             <w:r>
               <w:rPr>
@@ -1212,7 +1212,7 @@
                 <w:noProof/>
                 <w:webHidden/>
               </w:rPr>
-              <w:t>16</w:t>
+              <w:t>17</w:t>
             </w:r>
             <w:r>
               <w:rPr>
@@ -1233,7 +1233,7 @@
               <w:noProof/>
             </w:rPr>
           </w:pPr>
-          <w:hyperlink w:anchor="_Toc243388103" w:history="1">
+          <w:hyperlink w:anchor="_Toc243388378" w:history="1">
             <w:r>
               <w:rPr>
                 <w:rStyle w:val="Hyperlink"/>
@@ -1260,7 +1260,7 @@
                 <w:noProof/>
                 <w:webHidden/>
               </w:rPr>
-              <w:instrText xml:space="preserve"> PAGEREF _Toc243388103 \h </w:instrText>
+              <w:instrText xml:space="preserve"> PAGEREF _Toc243388378 \h </w:instrText>
             </w:r>
             <w:r>
               <w:rPr>
@@ -1280,7 +1280,7 @@
                 <w:noProof/>
                 <w:webHidden/>
               </w:rPr>
-              <w:t>16</w:t>
+              <w:t>17</w:t>
             </w:r>
             <w:r>
               <w:rPr>
@@ -1301,7 +1301,7 @@
               <w:noProof/>
             </w:rPr>
           </w:pPr>
-          <w:hyperlink w:anchor="_Toc243388104" w:history="1">
+          <w:hyperlink w:anchor="_Toc243388379" w:history="1">
             <w:r>
               <w:rPr>
                 <w:rStyle w:val="Hyperlink"/>
@@ -1328,7 +1328,7 @@
                 <w:noProof/>
                 <w:webHidden/>
               </w:rPr>
-              <w:instrText xml:space="preserve"> PAGEREF _Toc243388104 \h </w:instrText>
+              <w:instrText xml:space="preserve"> PAGEREF _Toc243388379 \h </w:instrText>
             </w:r>
             <w:r>
               <w:rPr>
@@ -1348,7 +1348,7 @@
                 <w:noProof/>
                 <w:webHidden/>
               </w:rPr>
-              <w:t>16</w:t>
+              <w:t>17</w:t>
             </w:r>
             <w:r>
               <w:rPr>
@@ -1369,7 +1369,7 @@
               <w:noProof/>
             </w:rPr>
           </w:pPr>
-          <w:hyperlink w:anchor="_Toc243388105" w:history="1">
+          <w:hyperlink w:anchor="_Toc243388380" w:history="1">
             <w:r>
               <w:rPr>
                 <w:rStyle w:val="Hyperlink"/>
@@ -1396,7 +1396,7 @@
                 <w:noProof/>
                 <w:webHidden/>
               </w:rPr>
-              <w:instrText xml:space="preserve"> PAGEREF _Toc243388105 \h </w:instrText>
+              <w:instrText xml:space="preserve"> PAGEREF _Toc243388380 \h </w:instrText>
             </w:r>
             <w:r>
               <w:rPr>
@@ -1416,7 +1416,7 @@
                 <w:noProof/>
                 <w:webHidden/>
               </w:rPr>
-              <w:t>16</w:t>
+              <w:t>17</w:t>
             </w:r>
             <w:r>
               <w:rPr>
@@ -1437,7 +1437,7 @@
               <w:noProof/>
             </w:rPr>
           </w:pPr>
-          <w:hyperlink w:anchor="_Toc243388106" w:history="1">
+          <w:hyperlink w:anchor="_Toc243388381" w:history="1">
             <w:r>
               <w:rPr>
                 <w:rStyle w:val="Hyperlink"/>
@@ -1464,7 +1464,7 @@
                 <w:noProof/>
                 <w:webHidden/>
               </w:rPr>
-              <w:instrText xml:space="preserve"> PAGEREF _Toc243388106 \h </w:instrText>
+              <w:instrText xml:space="preserve"> PAGEREF _Toc243388381 \h </w:instrText>
             </w:r>
             <w:r>
               <w:rPr>
@@ -1484,7 +1484,7 @@
                 <w:noProof/>
                 <w:webHidden/>
               </w:rPr>
-              <w:t>16</w:t>
+              <w:t>17</w:t>
             </w:r>
             <w:r>
               <w:rPr>
@@ -1505,7 +1505,7 @@
               <w:noProof/>
             </w:rPr>
           </w:pPr>
-          <w:hyperlink w:anchor="_Toc243388107" w:history="1">
+          <w:hyperlink w:anchor="_Toc243388382" w:history="1">
             <w:r>
               <w:rPr>
                 <w:rStyle w:val="Hyperlink"/>
@@ -1532,7 +1532,7 @@
                 <w:noProof/>
                 <w:webHidden/>
               </w:rPr>
-              <w:instrText xml:space="preserve"> PAGEREF _Toc243388107 \h </w:instrText>
+              <w:instrText xml:space="preserve"> PAGEREF _Toc243388382 \h </w:instrText>
             </w:r>
             <w:r>
               <w:rPr>
@@ -1552,7 +1552,7 @@
                 <w:noProof/>
                 <w:webHidden/>
               </w:rPr>
-              <w:t>16</w:t>
+              <w:t>17</w:t>
             </w:r>
             <w:r>
               <w:rPr>
@@ -1573,7 +1573,7 @@
               <w:noProof/>
             </w:rPr>
           </w:pPr>
-          <w:hyperlink w:anchor="_Toc243388108" w:history="1">
+          <w:hyperlink w:anchor="_Toc243388383" w:history="1">
             <w:r>
               <w:rPr>
                 <w:rStyle w:val="Hyperlink"/>
@@ -1600,7 +1600,7 @@
                 <w:noProof/>
                 <w:webHidden/>
               </w:rPr>
-              <w:instrText xml:space="preserve"> PAGEREF _Toc243388108 \h </w:instrText>
+              <w:instrText xml:space="preserve"> PAGEREF _Toc243388383 \h </w:instrText>
             </w:r>
             <w:r>
               <w:rPr>
@@ -1620,7 +1620,7 @@
                 <w:noProof/>
                 <w:webHidden/>
               </w:rPr>
-              <w:t>17</w:t>
+              <w:t>18</w:t>
             </w:r>
             <w:r>
               <w:rPr>
@@ -1641,7 +1641,7 @@
               <w:noProof/>
             </w:rPr>
           </w:pPr>
-          <w:hyperlink w:anchor="_Toc243388109" w:history="1">
+          <w:hyperlink w:anchor="_Toc243388384" w:history="1">
             <w:r>
               <w:rPr>
                 <w:rStyle w:val="Hyperlink"/>
@@ -1668,7 +1668,7 @@
                 <w:noProof/>
                 <w:webHidden/>
               </w:rPr>
-              <w:instrText xml:space="preserve"> PAGEREF _Toc243388109 \h </w:instrText>
+              <w:instrText xml:space="preserve"> PAGEREF _Toc243388384 \h </w:instrText>
             </w:r>
             <w:r>
               <w:rPr>
@@ -1688,7 +1688,7 @@
                 <w:noProof/>
                 <w:webHidden/>
               </w:rPr>
-              <w:t>17</w:t>
+              <w:t>18</w:t>
             </w:r>
             <w:r>
               <w:rPr>
@@ -1709,7 +1709,7 @@
               <w:noProof/>
             </w:rPr>
           </w:pPr>
-          <w:hyperlink w:anchor="_Toc243388110" w:history="1">
+          <w:hyperlink w:anchor="_Toc243388385" w:history="1">
             <w:r>
               <w:rPr>
                 <w:rStyle w:val="Hyperlink"/>
@@ -1736,7 +1736,7 @@
                 <w:noProof/>
                 <w:webHidden/>
               </w:rPr>
-              <w:instrText xml:space="preserve"> PAGEREF _Toc243388110 \h </w:instrText>
+              <w:instrText xml:space="preserve"> PAGEREF _Toc243388385 \h </w:instrText>
             </w:r>
             <w:r>
               <w:rPr>
@@ -1756,7 +1756,7 @@
                 <w:noProof/>
                 <w:webHidden/>
               </w:rPr>
-              <w:t>18</w:t>
+              <w:t>19</w:t>
             </w:r>
             <w:r>
               <w:rPr>
@@ -1777,7 +1777,7 @@
               <w:noProof/>
             </w:rPr>
           </w:pPr>
-          <w:hyperlink w:anchor="_Toc243388111" w:history="1">
+          <w:hyperlink w:anchor="_Toc243388386" w:history="1">
             <w:r>
               <w:rPr>
                 <w:rStyle w:val="Hyperlink"/>
@@ -1804,7 +1804,7 @@
                 <w:noProof/>
                 <w:webHidden/>
               </w:rPr>
-              <w:instrText xml:space="preserve"> PAGEREF _Toc243388111 \h </w:instrText>
+              <w:instrText xml:space="preserve"> PAGEREF _Toc243388386 \h </w:instrText>
             </w:r>
             <w:r>
               <w:rPr>
@@ -1824,7 +1824,7 @@
                 <w:noProof/>
                 <w:webHidden/>
               </w:rPr>
-              <w:t>18</w:t>
+              <w:t>19</w:t>
             </w:r>
             <w:r>
               <w:rPr>
@@ -1847,7 +1847,7 @@
         <w:pStyle w:val="Ttulo1"/>
       </w:pPr>
       <w:bookmarkStart w:id="0" w:name="_56df7a16a9fe64f9452cb7ca4525fc3d95a27de"/>
-      <w:bookmarkStart w:id="1" w:name="_Toc243388086"/>
+      <w:bookmarkStart w:id="1" w:name="_Toc243388361"/>
       <w:r>
         <w:t>1. Resumen ejecutivo</w:t>
       </w:r>
@@ -2026,7 +2026,7 @@
         <w:pStyle w:val="Ttulo2"/>
       </w:pPr>
       <w:bookmarkStart w:id="2" w:name="_términos"/>
-      <w:bookmarkStart w:id="3" w:name="_Toc243388087"/>
+      <w:bookmarkStart w:id="3" w:name="_Toc243388362"/>
       <w:r>
         <w:t>Términos</w:t>
       </w:r>
@@ -2457,7 +2457,7 @@
         <w:pStyle w:val="Ttulo1"/>
       </w:pPr>
       <w:bookmarkStart w:id="4" w:name="_supuestos"/>
-      <w:bookmarkStart w:id="5" w:name="_Toc243388088"/>
+      <w:bookmarkStart w:id="5" w:name="_Toc243388363"/>
       <w:r>
         <w:t>2. Supuestos</w:t>
       </w:r>
@@ -3185,7 +3185,7 @@
         <w:pStyle w:val="Ttulo1"/>
       </w:pPr>
       <w:bookmarkStart w:id="6" w:name="_531a22751b42dbc4314ac29de4d0b14085fbf94"/>
-      <w:bookmarkStart w:id="7" w:name="_Toc243388089"/>
+      <w:bookmarkStart w:id="7" w:name="_Toc243388364"/>
       <w:r>
         <w:t>3. Matriz de decisiones de automatización</w:t>
       </w:r>
@@ -4448,7 +4448,7 @@
         <w:pStyle w:val="Ttulo2"/>
       </w:pPr>
       <w:bookmarkStart w:id="8" w:name="_cc537778eb01bdc76d0f5f2669747e78821567e"/>
-      <w:bookmarkStart w:id="9" w:name="_Toc243388090"/>
+      <w:bookmarkStart w:id="9" w:name="_Toc243388365"/>
       <w:r>
         <w:t>Señales de escalamiento al Operador NOC</w:t>
       </w:r>
@@ -5122,7 +5122,7 @@
         </w:sectPr>
       </w:pPr>
       <w:bookmarkStart w:id="10" w:name="_856108c0b7ef2b2986130cc133917d17543cf90"/>
-      <w:bookmarkStart w:id="11" w:name="_Toc243388091"/>
+      <w:bookmarkStart w:id="11" w:name="_Toc243388366"/>
     </w:p>
     <w:p>
       <w:pPr>
@@ -5143,7 +5143,7 @@
           <w:noProof/>
         </w:rPr>
         <w:drawing>
-          <wp:inline distT="0" distB="0" distL="0" distR="0" wp14:anchorId="18F85AC1" wp14:editId="7FB17152">
+          <wp:inline distT="0" distB="0" distL="0" distR="0" wp14:anchorId="337F22EA" wp14:editId="214A9D0A">
             <wp:extent cx="8788400" cy="3813787"/>
             <wp:effectExtent l="0" t="0" r="0" b="0"/>
             <wp:docPr id="16" name="Picture" descr="Arquitectura lógica"/>
@@ -5225,7 +5225,7 @@
         <w:pStyle w:val="Ttulo2"/>
       </w:pPr>
       <w:bookmarkStart w:id="12" w:name="_e0af0e1b985d8e69940266f243ca259d425efb7"/>
-      <w:bookmarkStart w:id="13" w:name="_Toc243388092"/>
+      <w:bookmarkStart w:id="13" w:name="_Toc243388367"/>
       <w:r>
         <w:t>4.1 Componentes, datos y límites de acceso</w:t>
       </w:r>
@@ -6450,7 +6450,7 @@
         <w:pStyle w:val="Ttulo2"/>
       </w:pPr>
       <w:bookmarkStart w:id="14" w:name="_memoria"/>
-      <w:bookmarkStart w:id="15" w:name="_Toc243388093"/>
+      <w:bookmarkStart w:id="15" w:name="_Toc243388368"/>
       <w:r>
         <w:t>4.2 Memoria</w:t>
       </w:r>
@@ -6863,7 +6863,7 @@
         <w:pStyle w:val="Ttulo2"/>
       </w:pPr>
       <w:bookmarkStart w:id="16" w:name="_da292b2665567be05c609dc3d76a9de4a1c3405"/>
-      <w:bookmarkStart w:id="17" w:name="_Toc243388094"/>
+      <w:bookmarkStart w:id="17" w:name="_Toc243388369"/>
       <w:r>
         <w:t>4.3 Estados, fallos y escalamiento del workflow</w:t>
       </w:r>
@@ -6872,63 +6872,10 @@
     </w:p>
     <w:p>
       <w:pPr>
-        <w:pStyle w:val="CaptionedFigure"/>
+        <w:pStyle w:val="FirstParagraph"/>
       </w:pPr>
       <w:r>
-        <w:rPr>
-          <w:noProof/>
-        </w:rPr>
-        <w:drawing>
-          <wp:inline distT="0" distB="0" distL="0" distR="0" wp14:anchorId="4512DF95" wp14:editId="555548D4">
-            <wp:extent cx="3324775" cy="7116036"/>
-            <wp:effectExtent l="0" t="0" r="0" b="0"/>
-            <wp:docPr id="22" name="Picture" descr="Estados del workflow"/>
-            <wp:cNvGraphicFramePr>
-              <a:graphicFrameLocks xmlns:a="http://schemas.openxmlformats.org/drawingml/2006/main" noChangeAspect="1"/>
-            </wp:cNvGraphicFramePr>
-            <a:graphic xmlns:a="http://schemas.openxmlformats.org/drawingml/2006/main">
-              <a:graphicData uri="http://schemas.openxmlformats.org/drawingml/2006/picture">
-                <pic:pic xmlns:pic="http://schemas.openxmlformats.org/drawingml/2006/picture">
-                  <pic:nvPicPr>
-                    <pic:cNvPr id="23" name="Picture" descr="diagramas/estados.png"/>
-                    <pic:cNvPicPr>
-                      <a:picLocks noChangeAspect="1" noChangeArrowheads="1"/>
-                    </pic:cNvPicPr>
-                  </pic:nvPicPr>
-                  <pic:blipFill>
-                    <a:blip r:embed="rId6"/>
-                    <a:stretch>
-                      <a:fillRect/>
-                    </a:stretch>
-                  </pic:blipFill>
-                  <pic:spPr bwMode="auto">
-                    <a:xfrm>
-                      <a:off x="0" y="0"/>
-                      <a:ext cx="3324775" cy="7116036"/>
-                    </a:xfrm>
-                    <a:prstGeom prst="rect">
-                      <a:avLst/>
-                    </a:prstGeom>
-                    <a:noFill/>
-                    <a:ln w="9525">
-                      <a:noFill/>
-                      <a:headEnd/>
-                      <a:tailEnd/>
-                    </a:ln>
-                  </pic:spPr>
-                </pic:pic>
-              </a:graphicData>
-            </a:graphic>
-          </wp:inline>
-        </w:drawing>
-      </w:r>
-    </w:p>
-    <w:p>
-      <w:pPr>
-        <w:pStyle w:val="ImageCaption"/>
-      </w:pPr>
-      <w:r>
-        <w:t>Estados del workflow</w:t>
+        <w:t>El diagrama de estados completo está en la página siguiente. Ante cada fallo, el workflow se comporta así:</w:t>
       </w:r>
     </w:p>
     <w:tbl>
@@ -6977,7 +6924,14 @@
                 <w:b/>
                 <w:sz w:val="18"/>
               </w:rPr>
-              <w:t>Fallo</w:t>
+              <w:t>F</w:t>
+            </w:r>
+            <w:r>
+              <w:rPr>
+                <w:b/>
+                <w:sz w:val="18"/>
+              </w:rPr>
+              <w:t>allo</w:t>
             </w:r>
           </w:p>
         </w:tc>
@@ -7048,13 +7002,7 @@
               <w:rPr>
                 <w:sz w:val="18"/>
               </w:rPr>
-              <w:t>Reintento con backoff (3×). Si persiste,</w:t>
-            </w:r>
-            <w:r>
-              <w:rPr>
-                <w:sz w:val="18"/>
-              </w:rPr>
-              <w:t xml:space="preserve"> continúa con los datos disponibles, marca los “datos faltantes” en el resumen y genera E1 si el dato era obligatorio.</w:t>
+              <w:t>Reintento con backoff (3×). Si persiste, continúa con los datos disponibles, marca los “datos faltantes” en el resumen y genera E1 si el dato era obligatorio.</w:t>
             </w:r>
           </w:p>
         </w:tc>
@@ -7099,13 +7047,13 @@
               <w:rPr>
                 <w:sz w:val="18"/>
               </w:rPr>
-              <w:t>Reintento con backoff. Si persiste, pasa a SinAnalisisIA (E7): derivación por reglas, o al Operador NOC s</w:t>
-            </w:r>
-            <w:r>
-              <w:rPr>
-                <w:sz w:val="18"/>
-              </w:rPr>
-              <w:t>i el ruteo es ambiguo.</w:t>
+              <w:t>Reintento con backoff</w:t>
+            </w:r>
+            <w:r>
+              <w:rPr>
+                <w:sz w:val="18"/>
+              </w:rPr>
+              <w:t>. Si persiste, pasa a SinAnalisisIA (E7): derivación por reglas, o al Operador NOC si el ruteo es ambiguo.</w:t>
             </w:r>
           </w:p>
         </w:tc>
@@ -7363,10 +7311,99 @@
     </w:tbl>
     <w:p>
       <w:pPr>
+        <w:pStyle w:val="CaptionedFigure"/>
+        <w:sectPr>
+          <w:footnotePr>
+            <w:numRestart w:val="eachSect"/>
+          </w:footnotePr>
+          <w:pgSz w:w="12240" w:h="15840"/>
+          <w:pgMar w:top="1417" w:right="1000" w:bottom="1417" w:left="1000" w:header="720" w:footer="720" w:gutter="0"/>
+          <w:cols w:space="720"/>
+          <w:docGrid w:linePitch="326"/>
+        </w:sectPr>
+      </w:pPr>
+    </w:p>
+    <w:p>
+      <w:pPr>
+        <w:pStyle w:val="CaptionedFigure"/>
+      </w:pPr>
+      <w:r>
+        <w:rPr>
+          <w:noProof/>
+        </w:rPr>
+        <w:drawing>
+          <wp:inline distT="0" distB="0" distL="0" distR="0" wp14:anchorId="3DCA9235" wp14:editId="46774DDE">
+            <wp:extent cx="4135942" cy="8852181"/>
+            <wp:effectExtent l="0" t="0" r="0" b="0"/>
+            <wp:docPr id="22" name="Picture" descr="Estados del workflow"/>
+            <wp:cNvGraphicFramePr>
+              <a:graphicFrameLocks xmlns:a="http://schemas.openxmlformats.org/drawingml/2006/main" noChangeAspect="1"/>
+            </wp:cNvGraphicFramePr>
+            <a:graphic xmlns:a="http://schemas.openxmlformats.org/drawingml/2006/main">
+              <a:graphicData uri="http://schemas.openxmlformats.org/drawingml/2006/picture">
+                <pic:pic xmlns:pic="http://schemas.openxmlformats.org/drawingml/2006/picture">
+                  <pic:nvPicPr>
+                    <pic:cNvPr id="23" name="Picture" descr="diagramas/estados.png"/>
+                    <pic:cNvPicPr>
+                      <a:picLocks noChangeAspect="1" noChangeArrowheads="1"/>
+                    </pic:cNvPicPr>
+                  </pic:nvPicPr>
+                  <pic:blipFill>
+                    <a:blip r:embed="rId6"/>
+                    <a:stretch>
+                      <a:fillRect/>
+                    </a:stretch>
+                  </pic:blipFill>
+                  <pic:spPr bwMode="auto">
+                    <a:xfrm>
+                      <a:off x="0" y="0"/>
+                      <a:ext cx="4135942" cy="8852181"/>
+                    </a:xfrm>
+                    <a:prstGeom prst="rect">
+                      <a:avLst/>
+                    </a:prstGeom>
+                    <a:noFill/>
+                    <a:ln w="9525">
+                      <a:noFill/>
+                      <a:headEnd/>
+                      <a:tailEnd/>
+                    </a:ln>
+                  </pic:spPr>
+                </pic:pic>
+              </a:graphicData>
+            </a:graphic>
+          </wp:inline>
+        </w:drawing>
+      </w:r>
+    </w:p>
+    <w:p>
+      <w:pPr>
+        <w:pStyle w:val="ImageCaption"/>
+      </w:pPr>
+      <w:r>
+        <w:t>Estados del workflow</w:t>
+      </w:r>
+    </w:p>
+    <w:p>
+      <w:pPr>
+        <w:pStyle w:val="Ttulo2"/>
+        <w:sectPr>
+          <w:footnotePr>
+            <w:numRestart w:val="eachSect"/>
+          </w:footnotePr>
+          <w:pgSz w:w="12240" w:h="15840"/>
+          <w:pgMar w:top="600" w:right="600" w:bottom="600" w:left="600" w:header="720" w:footer="720" w:gutter="0"/>
+          <w:cols w:space="720"/>
+          <w:docGrid w:linePitch="326"/>
+        </w:sectPr>
+      </w:pPr>
+      <w:bookmarkStart w:id="18" w:name="_860fae0d546a8198f589a398b85690e59be0668"/>
+      <w:bookmarkStart w:id="19" w:name="_Toc243388370"/>
+    </w:p>
+    <w:p>
+      <w:pPr>
         <w:pStyle w:val="Ttulo2"/>
       </w:pPr>
-      <w:bookmarkStart w:id="18" w:name="_860fae0d546a8198f589a398b85690e59be0668"/>
-      <w:bookmarkStart w:id="19" w:name="_Toc243388095"/>
       <w:r>
         <w:t>4.4 El agente de investigación</w:t>
       </w:r>
@@ -7414,13 +7451,7 @@
         <w:rPr>
           <w:rStyle w:val="VerbatimChar"/>
         </w:rPr>
-        <w:t>get_device_statu</w:t>
-      </w:r>
-      <w:r>
-        <w:rPr>
-          <w:rStyle w:val="VerbatimChar"/>
-        </w:rPr>
-        <w:t>s</w:t>
+        <w:t>get_device_status</w:t>
       </w:r>
       <w:r>
         <w:t xml:space="preserve">, </w:t>
@@ -7564,7 +7595,7 @@
         <w:pStyle w:val="Ttulo1"/>
       </w:pPr>
       <w:bookmarkStart w:id="20" w:name="_1cf5811360d8bd240f5b6ff78ee18f92c7c09f4"/>
-      <w:bookmarkStart w:id="21" w:name="_Toc243388096"/>
+      <w:bookmarkStart w:id="21" w:name="_Toc243388371"/>
       <w:r>
         <w:t>5. Arquitectura física (AWS, híbrida)</w:t>
       </w:r>
@@ -7580,7 +7611,7 @@
           <w:noProof/>
         </w:rPr>
         <w:drawing>
-          <wp:inline distT="0" distB="0" distL="0" distR="0" wp14:anchorId="3DB92DA2" wp14:editId="43D7D88A">
+          <wp:inline distT="0" distB="0" distL="0" distR="0" wp14:anchorId="0765ED98" wp14:editId="69F31131">
             <wp:extent cx="5256139" cy="7116202"/>
             <wp:effectExtent l="0" t="0" r="0" b="0"/>
             <wp:docPr id="27" name="Picture" descr="Arquitectura física"/>
@@ -8671,33 +8702,33 @@
               <w:rPr>
                 <w:sz w:val="18"/>
               </w:rPr>
-              <w:t>Modelos gestionados, sin uso de d</w:t>
-            </w:r>
-            <w:r>
-              <w:rPr>
-                <w:sz w:val="18"/>
-              </w:rPr>
-              <w:t>atos para entrenamiento, sin GPU que operar. Dos niveles para optimizar costo. La Converse API es común a todos los modelos, así que cambiar de modelo no cambia el código.</w:t>
-            </w:r>
-          </w:p>
-        </w:tc>
-        <w:tc>
-          <w:tcPr>
-            <w:tcW w:w="1250" w:type="pct"/>
-            <w:shd w:val="clear" w:color="auto" w:fill="auto"/>
-          </w:tcPr>
-          <w:p>
-            <w:pPr>
-              <w:pStyle w:val="Compact"/>
-              <w:rPr>
-                <w:sz w:val="18"/>
-              </w:rPr>
-            </w:pPr>
-            <w:r>
-              <w:rPr>
-                <w:sz w:val="18"/>
-              </w:rPr>
-              <w:t>Self-hosting en GPU: mayor costo y operación; queda como plan B ante S1.</w:t>
+              <w:t>Modelos gestionados, sin uso de datos para entrenamiento, sin GPU que operar. Dos niveles para optimizar costo. La Converse API es común a todos los modelos, así que cambiar de modelo no cambia el código.</w:t>
+            </w:r>
+          </w:p>
+        </w:tc>
+        <w:tc>
+          <w:tcPr>
+            <w:tcW w:w="1250" w:type="pct"/>
+            <w:shd w:val="clear" w:color="auto" w:fill="auto"/>
+          </w:tcPr>
+          <w:p>
+            <w:pPr>
+              <w:pStyle w:val="Compact"/>
+              <w:rPr>
+                <w:sz w:val="18"/>
+              </w:rPr>
+            </w:pPr>
+            <w:r>
+              <w:rPr>
+                <w:sz w:val="18"/>
+              </w:rPr>
+              <w:t>Self-hosting en GPU: mayor costo y operación; queda</w:t>
+            </w:r>
+            <w:r>
+              <w:rPr>
+                <w:sz w:val="18"/>
+              </w:rPr>
+              <w:t xml:space="preserve"> como plan B ante S1.</w:t>
             </w:r>
           </w:p>
         </w:tc>
@@ -8809,13 +8840,7 @@
               <w:rPr>
                 <w:sz w:val="18"/>
               </w:rPr>
-              <w:t>R</w:t>
-            </w:r>
-            <w:r>
-              <w:rPr>
-                <w:sz w:val="18"/>
-              </w:rPr>
-              <w:t>AG</w:t>
+              <w:t>RAG</w:t>
             </w:r>
           </w:p>
         </w:tc>
@@ -8851,7 +8876,15 @@
                 <w:bCs/>
                 <w:sz w:val="18"/>
               </w:rPr>
-              <w:t>Aurora PostgreSQL + pgvector</w:t>
+              <w:t xml:space="preserve">Aurora PostgreSQL </w:t>
+            </w:r>
+            <w:r>
+              <w:rPr>
+                <w:b/>
+                <w:bCs/>
+                <w:sz w:val="18"/>
+              </w:rPr>
+              <w:t>+ pgvector</w:t>
             </w:r>
             <w:r>
               <w:rPr>
@@ -8890,13 +8923,13 @@
               <w:rPr>
                 <w:sz w:val="18"/>
               </w:rPr>
-              <w:t>Ingesta</w:t>
-            </w:r>
-            <w:r>
-              <w:rPr>
-                <w:sz w:val="18"/>
-              </w:rPr>
-              <w:t xml:space="preserve"> y chunking gestionados; pgvector reutiliza el mismo Aurora. Embeddings multilingües porque la documentación está en español.</w:t>
+              <w:t>Ingesta y chunking gestionados; pgvector reutiliza el mism</w:t>
+            </w:r>
+            <w:r>
+              <w:rPr>
+                <w:sz w:val="18"/>
+              </w:rPr>
+              <w:t>o Aurora. Embeddings multilingües porque la documentación está en español.</w:t>
             </w:r>
           </w:p>
         </w:tc>
@@ -8983,13 +9016,13 @@
               <w:rPr>
                 <w:sz w:val="18"/>
               </w:rPr>
-              <w:t>Memoria de la Inci</w:t>
-            </w:r>
-            <w:r>
-              <w:rPr>
-                <w:sz w:val="18"/>
-              </w:rPr>
-              <w:t>dencia, auditoría, task tokens y vectores en un solo motor relacional.</w:t>
+              <w:t>Memoria de la Incidencia, auditoría, task tokens y vectores en un sol</w:t>
+            </w:r>
+            <w:r>
+              <w:rPr>
+                <w:sz w:val="18"/>
+              </w:rPr>
+              <w:t>o motor relacional.</w:t>
             </w:r>
           </w:p>
         </w:tc>
@@ -9090,13 +9123,7 @@
               <w:rPr>
                 <w:sz w:val="18"/>
               </w:rPr>
-              <w:t>Fuentes del RAG y auditoría inmutabl</w:t>
-            </w:r>
-            <w:r>
-              <w:rPr>
-                <w:sz w:val="18"/>
-              </w:rPr>
-              <w:t>e de prompts y respuestas.</w:t>
+              <w:t>Fuentes del RAG y auditoría inmutable de prompts y respuestas.</w:t>
             </w:r>
           </w:p>
         </w:tc>
@@ -9161,7 +9188,13 @@
               <w:rPr>
                 <w:sz w:val="18"/>
               </w:rPr>
-              <w:t xml:space="preserve">Humanos: aprueban con su identidad en la plataforma de tickets (federada al IdP del operador). </w:t>
+              <w:t>Humanos: ap</w:t>
+            </w:r>
+            <w:r>
+              <w:rPr>
+                <w:sz w:val="18"/>
+              </w:rPr>
+              <w:t xml:space="preserve">rueban con su identidad en la plataforma de tickets (federada al IdP del operador). </w:t>
             </w:r>
             <w:r>
               <w:rPr>
@@ -9195,13 +9228,7 @@
               <w:rPr>
                 <w:sz w:val="18"/>
               </w:rPr>
-              <w:t>SSO corporativ</w:t>
-            </w:r>
-            <w:r>
-              <w:rPr>
-                <w:sz w:val="18"/>
-              </w:rPr>
-              <w:t>o; mínimo privilegio por servicio.</w:t>
+              <w:t>SSO corporativo; mínimo privilegio por servicio.</w:t>
             </w:r>
           </w:p>
         </w:tc>
@@ -9718,7 +9745,7 @@
         <w:pStyle w:val="Ttulo1"/>
       </w:pPr>
       <w:bookmarkStart w:id="22" w:name="_1dc88d82289d67e1ea4472534f9f223778a3ba7"/>
-      <w:bookmarkStart w:id="23" w:name="_Toc243388097"/>
+      <w:bookmarkStart w:id="23" w:name="_Toc243388372"/>
       <w:r>
         <w:t>6. Seguridad: matriz de riesgos y controles</w:t>
       </w:r>
@@ -10351,13 +10378,7 @@
               <w:rPr>
                 <w:sz w:val="18"/>
               </w:rPr>
-              <w:t xml:space="preserve"> verificado c</w:t>
-            </w:r>
-            <w:r>
-              <w:rPr>
-                <w:sz w:val="18"/>
-              </w:rPr>
-              <w:t>ontra la traza; si falla, E2 y el resumen se retiene.</w:t>
+              <w:t xml:space="preserve"> verificado contra la traza; si falla, E2 y el resumen se retiene.</w:t>
             </w:r>
           </w:p>
         </w:tc>
@@ -10424,7 +10445,13 @@
               <w:rPr>
                 <w:sz w:val="18"/>
               </w:rPr>
-              <w:t>La salida del LLM se usa sin validar (ruteo, campos, HTML en el ticket).</w:t>
+              <w:t>La sa</w:t>
+            </w:r>
+            <w:r>
+              <w:rPr>
+                <w:sz w:val="18"/>
+              </w:rPr>
+              <w:t>lida del LLM se usa sin validar (ruteo, campos, HTML en el ticket).</w:t>
             </w:r>
           </w:p>
         </w:tc>
@@ -10491,7 +10518,7 @@
                 <w:bCs/>
                 <w:sz w:val="18"/>
               </w:rPr>
-              <w:t>LLM04 / LLM08 Envenenamiento de datos</w:t>
+              <w:t>LLM04 / LLM08 Envenenamiento de datos o em</w:t>
             </w:r>
             <w:r>
               <w:rPr>
@@ -10499,7 +10526,7 @@
                 <w:bCs/>
                 <w:sz w:val="18"/>
               </w:rPr>
-              <w:t xml:space="preserve"> o embeddings</w:t>
+              <w:t>beddings</w:t>
             </w:r>
           </w:p>
         </w:tc>
@@ -10553,13 +10580,13 @@
               <w:rPr>
                 <w:sz w:val="18"/>
               </w:rPr>
-              <w:t>; fuentes con control de versiones y aprobación; metadato de versión en cada fragmento; índices separados por operado</w:t>
-            </w:r>
-            <w:r>
-              <w:rPr>
-                <w:sz w:val="18"/>
-              </w:rPr>
-              <w:t>r (S8).</w:t>
+              <w:t>; fuentes con control de versiones y aprobación; metadato de versión en cada fragmento; índices separados por operador (S8</w:t>
+            </w:r>
+            <w:r>
+              <w:rPr>
+                <w:sz w:val="18"/>
+              </w:rPr>
+              <w:t>).</w:t>
             </w:r>
           </w:p>
         </w:tc>
@@ -10646,13 +10673,13 @@
               <w:rPr>
                 <w:sz w:val="18"/>
               </w:rPr>
-              <w:t xml:space="preserve">Límites de pasos, tiempo y tokens; concurrencia máxima por cola; cuotas de </w:t>
-            </w:r>
-            <w:r>
-              <w:rPr>
-                <w:sz w:val="18"/>
-              </w:rPr>
-              <w:t>Bedrock.</w:t>
+              <w:t>Límites de pasos, tiempo y tokens; concurrencia máxima por cola; cuotas de Bedro</w:t>
+            </w:r>
+            <w:r>
+              <w:rPr>
+                <w:sz w:val="18"/>
+              </w:rPr>
+              <w:t>ck.</w:t>
             </w:r>
           </w:p>
         </w:tc>
@@ -10739,13 +10766,13 @@
               <w:rPr>
                 <w:sz w:val="18"/>
               </w:rPr>
-              <w:t xml:space="preserve">Versión de modelo fijada; un cambio de modelo o prompt pasa </w:t>
-            </w:r>
-            <w:r>
-              <w:rPr>
-                <w:sz w:val="18"/>
-              </w:rPr>
-              <w:t>por el gate de evaluación.</w:t>
+              <w:t>Versión de modelo fijada; un cambio de modelo o prompt pasa por e</w:t>
+            </w:r>
+            <w:r>
+              <w:rPr>
+                <w:sz w:val="18"/>
+              </w:rPr>
+              <w:t>l gate de evaluación.</w:t>
             </w:r>
           </w:p>
         </w:tc>
@@ -11136,7 +11163,7 @@
         <w:pStyle w:val="Ttulo1"/>
       </w:pPr>
       <w:bookmarkStart w:id="24" w:name="_21008488f39fee772d9a18573a0731f090415fd"/>
-      <w:bookmarkStart w:id="25" w:name="_Toc243388098"/>
+      <w:bookmarkStart w:id="25" w:name="_Toc243388373"/>
       <w:r>
         <w:t>7. Estrategia de evaluación de la IA generativa</w:t>
       </w:r>
@@ -11148,7 +11175,7 @@
         <w:pStyle w:val="Ttulo2"/>
       </w:pPr>
       <w:bookmarkStart w:id="26" w:name="_69e1ab2a0c519af57549dc9feeb84d7cb8ee371"/>
-      <w:bookmarkStart w:id="27" w:name="_Toc243388099"/>
+      <w:bookmarkStart w:id="27" w:name="_Toc243388374"/>
       <w:r>
         <w:t>7.1 Qué se evalúa</w:t>
       </w:r>
@@ -11514,7 +11541,7 @@
         <w:pStyle w:val="Ttulo2"/>
       </w:pPr>
       <w:bookmarkStart w:id="28" w:name="_dd7ef81fdfe106eb5acc19d59b803376463f8ad"/>
-      <w:bookmarkStart w:id="29" w:name="_Toc243388100"/>
+      <w:bookmarkStart w:id="29" w:name="_Toc243388375"/>
       <w:r>
         <w:t>7</w:t>
       </w:r>
@@ -12986,7 +13013,7 @@
         <w:pStyle w:val="Ttulo2"/>
       </w:pPr>
       <w:bookmarkStart w:id="30" w:name="_2d9f01ff85dd9820987480cab79557db403aeac"/>
-      <w:bookmarkStart w:id="31" w:name="_Toc243388101"/>
+      <w:bookmarkStart w:id="31" w:name="_Toc243388376"/>
       <w:r>
         <w:t>7.3 Despliegue gradual</w:t>
       </w:r>
@@ -13058,7 +13085,7 @@
         <w:pStyle w:val="Ttulo1"/>
       </w:pPr>
       <w:bookmarkStart w:id="32" w:name="_d8727e752cb31365f46bcadbe991ef572676e19"/>
-      <w:bookmarkStart w:id="33" w:name="_Toc243388102"/>
+      <w:bookmarkStart w:id="33" w:name="_Toc243388377"/>
       <w:r>
         <w:t>8. Operación</w:t>
       </w:r>
@@ -13073,7 +13100,7 @@
         <w:pStyle w:val="Ttulo2"/>
       </w:pPr>
       <w:bookmarkStart w:id="34" w:name="_37ea2f043d1ca71eac9f00ba764ac933ea83f2c"/>
-      <w:bookmarkStart w:id="35" w:name="_Toc243388103"/>
+      <w:bookmarkStart w:id="35" w:name="_Toc243388378"/>
       <w:r>
         <w:t>8.1 Latencia y costo (estimación)</w:t>
       </w:r>
@@ -13630,7 +13657,7 @@
         <w:pStyle w:val="Ttulo2"/>
       </w:pPr>
       <w:bookmarkStart w:id="36" w:name="_observabilidad"/>
-      <w:bookmarkStart w:id="37" w:name="_Toc243388104"/>
+      <w:bookmarkStart w:id="37" w:name="_Toc243388379"/>
       <w:r>
         <w:t>8.2 Observabilidad</w:t>
       </w:r>
@@ -13702,7 +13729,7 @@
         <w:pStyle w:val="Ttulo2"/>
       </w:pPr>
       <w:bookmarkStart w:id="38" w:name="_resiliencia"/>
-      <w:bookmarkStart w:id="39" w:name="_Toc243388105"/>
+      <w:bookmarkStart w:id="39" w:name="_Toc243388380"/>
       <w:r>
         <w:t>8.3 Resiliencia</w:t>
       </w:r>
@@ -13725,7 +13752,7 @@
         <w:pStyle w:val="Ttulo2"/>
       </w:pPr>
       <w:bookmarkStart w:id="40" w:name="_e475abed30fa52e794d704ef2cf4919481e087c"/>
-      <w:bookmarkStart w:id="41" w:name="_Toc243388106"/>
+      <w:bookmarkStart w:id="41" w:name="_Toc243388381"/>
       <w:r>
         <w:t>8.4 Supervisión humana</w:t>
       </w:r>
@@ -13791,7 +13818,7 @@
         <w:pStyle w:val="Ttulo2"/>
       </w:pPr>
       <w:bookmarkStart w:id="42" w:name="_71f77f8eab6ad684eb9de56f8b1bbd750ae9343"/>
-      <w:bookmarkStart w:id="43" w:name="_Toc243388107"/>
+      <w:bookmarkStart w:id="43" w:name="_Toc243388382"/>
       <w:r>
         <w:t>8.5 Riesgos residuales</w:t>
       </w:r>
@@ -13930,7 +13957,7 @@
         <w:pStyle w:val="Ttulo2"/>
       </w:pPr>
       <w:bookmarkStart w:id="44" w:name="_2a051840def5bc2000b770f663cf6617893998a"/>
-      <w:bookmarkStart w:id="45" w:name="_Toc243388108"/>
+      <w:bookmarkStart w:id="45" w:name="_Toc243388383"/>
       <w:r>
         <w:t>8.6 Pendientes antes de producción</w:t>
       </w:r>
@@ -13973,10 +14000,7 @@
         </w:numPr>
       </w:pPr>
       <w:r>
-        <w:t>Inventariar las APIs y webhooks reales d</w:t>
-      </w:r>
-      <w:r>
-        <w:t>e los sistemas on-prem y la plataforma de tickets (S2).</w:t>
+        <w:t>Inventariar las APIs y webhooks reales de los sistemas on-prem y la plataforma de tickets (S2).</w:t>
       </w:r>
     </w:p>
     <w:p>
@@ -14000,7 +14024,10 @@
         </w:numPr>
       </w:pPr>
       <w:r>
-        <w:t>Definir con negocio la matriz de prioridad, la tabla Síntoma → urgencia, el SLA y la tabla de ruteo reales (las del prototipo son supuestos).</w:t>
+        <w:t>Definir con negocio la matriz de prioridad, la tabla Sínto</w:t>
+      </w:r>
+      <w:r>
+        <w:t>ma → urgencia, el SLA y la tabla de ruteo reales (las del prototipo son supuestos).</w:t>
       </w:r>
     </w:p>
     <w:p>
@@ -14012,10 +14039,7 @@
         </w:numPr>
       </w:pPr>
       <w:r>
-        <w:t>Prueba de ca</w:t>
-      </w:r>
-      <w:r>
-        <w:t>rga con picos 10× y prueba de caos de Bedrock y de los conectores.</w:t>
+        <w:t>Prueba de carga con picos 10× y prueba de caos de Bedrock y de los conectores.</w:t>
       </w:r>
     </w:p>
     <w:p>
@@ -14035,9 +14059,12 @@
         <w:pStyle w:val="Ttulo1"/>
       </w:pPr>
       <w:bookmarkStart w:id="46" w:name="_a5ed2b4bf0fb80322b8db7f52b6310c044129d6"/>
-      <w:bookmarkStart w:id="47" w:name="_Toc243388109"/>
-      <w:r>
-        <w:t>9. Decisiones técnicas principales</w:t>
+      <w:bookmarkStart w:id="47" w:name="_Toc243388384"/>
+      <w:r>
+        <w:t>9. Decisiones técnicas prin</w:t>
+      </w:r>
+      <w:r>
+        <w:t>cipales</w:t>
       </w:r>
       <w:bookmarkEnd w:id="46"/>
       <w:bookmarkEnd w:id="47"/>
@@ -14159,13 +14186,7 @@
               <w:rPr>
                 <w:sz w:val="18"/>
               </w:rPr>
-              <w:t>Workflow determinista con un único agente de investigación (no un age</w:t>
-            </w:r>
-            <w:r>
-              <w:rPr>
-                <w:sz w:val="18"/>
-              </w:rPr>
-              <w:t>nte orquestador ni multi-agente).</w:t>
+              <w:t>Workflow determinista con un único agente de investigación (no un agente orquestador ni multi-agente).</w:t>
             </w:r>
           </w:p>
         </w:tc>
@@ -14280,7 +14301,7 @@
         <w:pStyle w:val="Ttulo1"/>
       </w:pPr>
       <w:bookmarkStart w:id="48" w:name="_2ece7273304f22a5b96354fbdfd9a08907327b3"/>
-      <w:bookmarkStart w:id="49" w:name="_Toc243388110"/>
+      <w:bookmarkStart w:id="49" w:name="_Toc243388385"/>
       <w:r>
         <w:t>10. Preguntas anticipadas</w:t>
       </w:r>
@@ -14436,7 +14457,7 @@
         <w:pStyle w:val="Ttulo1"/>
       </w:pPr>
       <w:bookmarkStart w:id="50" w:name="_923eadbdcfb4798034273fd952db44a0abe1d4f"/>
-      <w:bookmarkStart w:id="51" w:name="_Toc243388111"/>
+      <w:bookmarkStart w:id="51" w:name="_Toc243388386"/>
       <w:r>
         <w:t>Anexo A. Prototipo</w:t>
       </w:r>
@@ -14866,7 +14887,7 @@
   <w:abstractNum w:abstractNumId="0" w15:restartNumberingAfterBreak="0">
     <w:nsid w:val="0000A990"/>
     <w:multiLevelType w:val="multilevel"/>
-    <w:tmpl w:val="AAB2167E"/>
+    <w:tmpl w:val="3FDE997C"/>
     <w:lvl w:ilvl="0">
       <w:numFmt w:val="bullet"/>
       <w:lvlText w:val=" "/>
@@ -14943,7 +14964,7 @@
   <w:abstractNum w:abstractNumId="1" w15:restartNumberingAfterBreak="0">
     <w:nsid w:val="0000A991"/>
     <w:multiLevelType w:val="multilevel"/>
-    <w:tmpl w:val="48E047D4"/>
+    <w:tmpl w:val="CEEE0974"/>
     <w:lvl w:ilvl="0">
       <w:numFmt w:val="bullet"/>
       <w:lvlText w:val=""/>
@@ -15047,7 +15068,7 @@
   <w:abstractNum w:abstractNumId="2" w15:restartNumberingAfterBreak="0">
     <w:nsid w:val="00A99411"/>
     <w:multiLevelType w:val="multilevel"/>
-    <w:tmpl w:val="0F382EFE"/>
+    <w:tmpl w:val="FF8C2CA0"/>
     <w:lvl w:ilvl="0">
       <w:start w:val="1"/>
       <w:numFmt w:val="decimal"/>
@@ -16516,7 +16537,7 @@
     <w:autoRedefine/>
     <w:uiPriority w:val="39"/>
     <w:unhideWhenUsed/>
-    <w:rsid w:val="00BD4F91"/>
+    <w:rsid w:val="003D4A16"/>
     <w:pPr>
       <w:spacing w:after="100"/>
     </w:pPr>
@@ -16528,7 +16549,7 @@
     <w:autoRedefine/>
     <w:uiPriority w:val="39"/>
     <w:unhideWhenUsed/>
-    <w:rsid w:val="00BD4F91"/>
+    <w:rsid w:val="003D4A16"/>
     <w:pPr>
       <w:spacing w:after="100"/>
       <w:ind w:left="240"/>

</xml_diff>

<commit_message>
README para evaluadores técnicos y no técnicos; resultado de la evaluación versionado
- Guía de lectura sin instalar nada, mapa enunciado → sección y página, propuesta en 30 segundos
- Sección técnica: mapa del repositorio, requisitos, ejecución y regeneración
- prototipo/resultado-evaluacion.txt con la salida de los 18 casos
- Anexo A del documento lista el archivo de resultados
</commit_message>
<xml_diff>
--- a/docs/entregable/HACOM-Reto-AI-Engineer.docx
+++ b/docs/entregable/HACOM-Reto-AI-Engineer.docx
@@ -42,7 +42,7 @@
           <w:sz w:val="24"/>
           <w:szCs w:val="24"/>
         </w:rPr>
-        <w:id w:val="-28655704"/>
+        <w:id w:val="-539204539"/>
         <w:docPartObj>
           <w:docPartGallery w:val="Table of Contents"/>
           <w:docPartUnique/>
@@ -77,7 +77,7 @@
           <w:r>
             <w:fldChar w:fldCharType="separate"/>
           </w:r>
-          <w:hyperlink w:anchor="_Toc243388361" w:history="1">
+          <w:hyperlink w:anchor="_Toc243388810" w:history="1">
             <w:r>
               <w:rPr>
                 <w:rStyle w:val="Hyperlink"/>
@@ -104,7 +104,7 @@
                 <w:noProof/>
                 <w:webHidden/>
               </w:rPr>
-              <w:instrText xml:space="preserve"> PAGEREF _Toc243388361 \h </w:instrText>
+              <w:instrText xml:space="preserve"> PAGEREF _Toc243388810 \h </w:instrText>
             </w:r>
             <w:r>
               <w:rPr>
@@ -145,7 +145,7 @@
               <w:noProof/>
             </w:rPr>
           </w:pPr>
-          <w:hyperlink w:anchor="_Toc243388362" w:history="1">
+          <w:hyperlink w:anchor="_Toc243388811" w:history="1">
             <w:r>
               <w:rPr>
                 <w:rStyle w:val="Hyperlink"/>
@@ -172,7 +172,7 @@
                 <w:noProof/>
                 <w:webHidden/>
               </w:rPr>
-              <w:instrText xml:space="preserve"> PAGEREF _Toc243388362 \h </w:instrText>
+              <w:instrText xml:space="preserve"> PAGEREF _Toc243388811 \h </w:instrText>
             </w:r>
             <w:r>
               <w:rPr>
@@ -213,7 +213,7 @@
               <w:noProof/>
             </w:rPr>
           </w:pPr>
-          <w:hyperlink w:anchor="_Toc243388363" w:history="1">
+          <w:hyperlink w:anchor="_Toc243388812" w:history="1">
             <w:r>
               <w:rPr>
                 <w:rStyle w:val="Hyperlink"/>
@@ -240,7 +240,7 @@
                 <w:noProof/>
                 <w:webHidden/>
               </w:rPr>
-              <w:instrText xml:space="preserve"> PAGEREF _Toc243388363 \h </w:instrText>
+              <w:instrText xml:space="preserve"> PAGEREF _Toc243388812 \h </w:instrText>
             </w:r>
             <w:r>
               <w:rPr>
@@ -281,7 +281,7 @@
               <w:noProof/>
             </w:rPr>
           </w:pPr>
-          <w:hyperlink w:anchor="_Toc243388364" w:history="1">
+          <w:hyperlink w:anchor="_Toc243388813" w:history="1">
             <w:r>
               <w:rPr>
                 <w:rStyle w:val="Hyperlink"/>
@@ -308,7 +308,7 @@
                 <w:noProof/>
                 <w:webHidden/>
               </w:rPr>
-              <w:instrText xml:space="preserve"> PAGEREF _Toc243388364 \h </w:instrText>
+              <w:instrText xml:space="preserve"> PAGEREF _Toc243388813 \h </w:instrText>
             </w:r>
             <w:r>
               <w:rPr>
@@ -349,7 +349,7 @@
               <w:noProof/>
             </w:rPr>
           </w:pPr>
-          <w:hyperlink w:anchor="_Toc243388365" w:history="1">
+          <w:hyperlink w:anchor="_Toc243388814" w:history="1">
             <w:r>
               <w:rPr>
                 <w:rStyle w:val="Hyperlink"/>
@@ -376,7 +376,7 @@
                 <w:noProof/>
                 <w:webHidden/>
               </w:rPr>
-              <w:instrText xml:space="preserve"> PAGEREF _Toc243388365 \h </w:instrText>
+              <w:instrText xml:space="preserve"> PAGEREF _Toc243388814 \h </w:instrText>
             </w:r>
             <w:r>
               <w:rPr>
@@ -417,7 +417,7 @@
               <w:noProof/>
             </w:rPr>
           </w:pPr>
-          <w:hyperlink w:anchor="_Toc243388366" w:history="1">
+          <w:hyperlink w:anchor="_Toc243388815" w:history="1">
             <w:r>
               <w:rPr>
                 <w:rStyle w:val="Hyperlink"/>
@@ -444,7 +444,7 @@
                 <w:noProof/>
                 <w:webHidden/>
               </w:rPr>
-              <w:instrText xml:space="preserve"> PAGEREF _Toc243388366 \h </w:instrText>
+              <w:instrText xml:space="preserve"> PAGEREF _Toc243388815 \h </w:instrText>
             </w:r>
             <w:r>
               <w:rPr>
@@ -485,7 +485,7 @@
               <w:noProof/>
             </w:rPr>
           </w:pPr>
-          <w:hyperlink w:anchor="_Toc243388367" w:history="1">
+          <w:hyperlink w:anchor="_Toc243388816" w:history="1">
             <w:r>
               <w:rPr>
                 <w:rStyle w:val="Hyperlink"/>
@@ -512,7 +512,7 @@
                 <w:noProof/>
                 <w:webHidden/>
               </w:rPr>
-              <w:instrText xml:space="preserve"> PAGEREF _Toc243388367 \h </w:instrText>
+              <w:instrText xml:space="preserve"> PAGEREF _Toc243388816 \h </w:instrText>
             </w:r>
             <w:r>
               <w:rPr>
@@ -553,7 +553,7 @@
               <w:noProof/>
             </w:rPr>
           </w:pPr>
-          <w:hyperlink w:anchor="_Toc243388368" w:history="1">
+          <w:hyperlink w:anchor="_Toc243388817" w:history="1">
             <w:r>
               <w:rPr>
                 <w:rStyle w:val="Hyperlink"/>
@@ -580,7 +580,7 @@
                 <w:noProof/>
                 <w:webHidden/>
               </w:rPr>
-              <w:instrText xml:space="preserve"> PAGEREF _Toc243388368 \h </w:instrText>
+              <w:instrText xml:space="preserve"> PAGEREF _Toc243388817 \h </w:instrText>
             </w:r>
             <w:r>
               <w:rPr>
@@ -621,7 +621,7 @@
               <w:noProof/>
             </w:rPr>
           </w:pPr>
-          <w:hyperlink w:anchor="_Toc243388369" w:history="1">
+          <w:hyperlink w:anchor="_Toc243388818" w:history="1">
             <w:r>
               <w:rPr>
                 <w:rStyle w:val="Hyperlink"/>
@@ -648,7 +648,7 @@
                 <w:noProof/>
                 <w:webHidden/>
               </w:rPr>
-              <w:instrText xml:space="preserve"> PAGEREF _Toc243388369 \h </w:instrText>
+              <w:instrText xml:space="preserve"> PAGEREF _Toc243388818 \h </w:instrText>
             </w:r>
             <w:r>
               <w:rPr>
@@ -689,7 +689,7 @@
               <w:noProof/>
             </w:rPr>
           </w:pPr>
-          <w:hyperlink w:anchor="_Toc243388370" w:history="1">
+          <w:hyperlink w:anchor="_Toc243388819" w:history="1">
             <w:r>
               <w:rPr>
                 <w:rStyle w:val="Hyperlink"/>
@@ -716,7 +716,7 @@
                 <w:noProof/>
                 <w:webHidden/>
               </w:rPr>
-              <w:instrText xml:space="preserve"> PAGEREF _Toc243388370 \h </w:instrText>
+              <w:instrText xml:space="preserve"> PAGEREF _Toc243388819 \h </w:instrText>
             </w:r>
             <w:r>
               <w:rPr>
@@ -757,7 +757,7 @@
               <w:noProof/>
             </w:rPr>
           </w:pPr>
-          <w:hyperlink w:anchor="_Toc243388371" w:history="1">
+          <w:hyperlink w:anchor="_Toc243388820" w:history="1">
             <w:r>
               <w:rPr>
                 <w:rStyle w:val="Hyperlink"/>
@@ -784,7 +784,7 @@
                 <w:noProof/>
                 <w:webHidden/>
               </w:rPr>
-              <w:instrText xml:space="preserve"> PAGEREF _Toc243388371 \h </w:instrText>
+              <w:instrText xml:space="preserve"> PAGEREF _Toc243388820 \h </w:instrText>
             </w:r>
             <w:r>
               <w:rPr>
@@ -825,7 +825,7 @@
               <w:noProof/>
             </w:rPr>
           </w:pPr>
-          <w:hyperlink w:anchor="_Toc243388372" w:history="1">
+          <w:hyperlink w:anchor="_Toc243388821" w:history="1">
             <w:r>
               <w:rPr>
                 <w:rStyle w:val="Hyperlink"/>
@@ -852,7 +852,7 @@
                 <w:noProof/>
                 <w:webHidden/>
               </w:rPr>
-              <w:instrText xml:space="preserve"> PAGEREF _Toc243388372 \h </w:instrText>
+              <w:instrText xml:space="preserve"> PAGEREF _Toc243388821 \h </w:instrText>
             </w:r>
             <w:r>
               <w:rPr>
@@ -893,7 +893,7 @@
               <w:noProof/>
             </w:rPr>
           </w:pPr>
-          <w:hyperlink w:anchor="_Toc243388373" w:history="1">
+          <w:hyperlink w:anchor="_Toc243388822" w:history="1">
             <w:r>
               <w:rPr>
                 <w:rStyle w:val="Hyperlink"/>
@@ -920,7 +920,7 @@
                 <w:noProof/>
                 <w:webHidden/>
               </w:rPr>
-              <w:instrText xml:space="preserve"> PAGEREF _Toc243388373 \h </w:instrText>
+              <w:instrText xml:space="preserve"> PAGEREF _Toc243388822 \h </w:instrText>
             </w:r>
             <w:r>
               <w:rPr>
@@ -961,7 +961,7 @@
               <w:noProof/>
             </w:rPr>
           </w:pPr>
-          <w:hyperlink w:anchor="_Toc243388374" w:history="1">
+          <w:hyperlink w:anchor="_Toc243388823" w:history="1">
             <w:r>
               <w:rPr>
                 <w:rStyle w:val="Hyperlink"/>
@@ -988,7 +988,7 @@
                 <w:noProof/>
                 <w:webHidden/>
               </w:rPr>
-              <w:instrText xml:space="preserve"> PAGEREF _Toc243388374 \h </w:instrText>
+              <w:instrText xml:space="preserve"> PAGEREF _Toc243388823 \h </w:instrText>
             </w:r>
             <w:r>
               <w:rPr>
@@ -1029,7 +1029,7 @@
               <w:noProof/>
             </w:rPr>
           </w:pPr>
-          <w:hyperlink w:anchor="_Toc243388375" w:history="1">
+          <w:hyperlink w:anchor="_Toc243388824" w:history="1">
             <w:r>
               <w:rPr>
                 <w:rStyle w:val="Hyperlink"/>
@@ -1056,7 +1056,7 @@
                 <w:noProof/>
                 <w:webHidden/>
               </w:rPr>
-              <w:instrText xml:space="preserve"> PAGEREF _Toc243388375 \h </w:instrText>
+              <w:instrText xml:space="preserve"> PAGEREF _Toc243388824 \h </w:instrText>
             </w:r>
             <w:r>
               <w:rPr>
@@ -1097,7 +1097,7 @@
               <w:noProof/>
             </w:rPr>
           </w:pPr>
-          <w:hyperlink w:anchor="_Toc243388376" w:history="1">
+          <w:hyperlink w:anchor="_Toc243388825" w:history="1">
             <w:r>
               <w:rPr>
                 <w:rStyle w:val="Hyperlink"/>
@@ -1124,7 +1124,7 @@
                 <w:noProof/>
                 <w:webHidden/>
               </w:rPr>
-              <w:instrText xml:space="preserve"> PAGEREF _Toc243388376 \h </w:instrText>
+              <w:instrText xml:space="preserve"> PAGEREF _Toc243388825 \h </w:instrText>
             </w:r>
             <w:r>
               <w:rPr>
@@ -1165,7 +1165,7 @@
               <w:noProof/>
             </w:rPr>
           </w:pPr>
-          <w:hyperlink w:anchor="_Toc243388377" w:history="1">
+          <w:hyperlink w:anchor="_Toc243388826" w:history="1">
             <w:r>
               <w:rPr>
                 <w:rStyle w:val="Hyperlink"/>
@@ -1192,7 +1192,7 @@
                 <w:noProof/>
                 <w:webHidden/>
               </w:rPr>
-              <w:instrText xml:space="preserve"> PAGEREF _Toc243388377 \h </w:instrText>
+              <w:instrText xml:space="preserve"> PAGEREF _Toc243388826 \h </w:instrText>
             </w:r>
             <w:r>
               <w:rPr>
@@ -1233,7 +1233,7 @@
               <w:noProof/>
             </w:rPr>
           </w:pPr>
-          <w:hyperlink w:anchor="_Toc243388378" w:history="1">
+          <w:hyperlink w:anchor="_Toc243388827" w:history="1">
             <w:r>
               <w:rPr>
                 <w:rStyle w:val="Hyperlink"/>
@@ -1260,7 +1260,7 @@
                 <w:noProof/>
                 <w:webHidden/>
               </w:rPr>
-              <w:instrText xml:space="preserve"> PAGEREF _Toc243388378 \h </w:instrText>
+              <w:instrText xml:space="preserve"> PAGEREF _Toc243388827 \h </w:instrText>
             </w:r>
             <w:r>
               <w:rPr>
@@ -1301,7 +1301,7 @@
               <w:noProof/>
             </w:rPr>
           </w:pPr>
-          <w:hyperlink w:anchor="_Toc243388379" w:history="1">
+          <w:hyperlink w:anchor="_Toc243388828" w:history="1">
             <w:r>
               <w:rPr>
                 <w:rStyle w:val="Hyperlink"/>
@@ -1328,7 +1328,7 @@
                 <w:noProof/>
                 <w:webHidden/>
               </w:rPr>
-              <w:instrText xml:space="preserve"> PAGEREF _Toc243388379 \h </w:instrText>
+              <w:instrText xml:space="preserve"> PAGEREF _Toc243388828 \h </w:instrText>
             </w:r>
             <w:r>
               <w:rPr>
@@ -1369,7 +1369,7 @@
               <w:noProof/>
             </w:rPr>
           </w:pPr>
-          <w:hyperlink w:anchor="_Toc243388380" w:history="1">
+          <w:hyperlink w:anchor="_Toc243388829" w:history="1">
             <w:r>
               <w:rPr>
                 <w:rStyle w:val="Hyperlink"/>
@@ -1396,7 +1396,7 @@
                 <w:noProof/>
                 <w:webHidden/>
               </w:rPr>
-              <w:instrText xml:space="preserve"> PAGEREF _Toc243388380 \h </w:instrText>
+              <w:instrText xml:space="preserve"> PAGEREF _Toc243388829 \h </w:instrText>
             </w:r>
             <w:r>
               <w:rPr>
@@ -1437,7 +1437,7 @@
               <w:noProof/>
             </w:rPr>
           </w:pPr>
-          <w:hyperlink w:anchor="_Toc243388381" w:history="1">
+          <w:hyperlink w:anchor="_Toc243388830" w:history="1">
             <w:r>
               <w:rPr>
                 <w:rStyle w:val="Hyperlink"/>
@@ -1464,7 +1464,7 @@
                 <w:noProof/>
                 <w:webHidden/>
               </w:rPr>
-              <w:instrText xml:space="preserve"> PAGEREF _Toc243388381 \h </w:instrText>
+              <w:instrText xml:space="preserve"> PAGEREF _Toc243388830 \h </w:instrText>
             </w:r>
             <w:r>
               <w:rPr>
@@ -1505,7 +1505,7 @@
               <w:noProof/>
             </w:rPr>
           </w:pPr>
-          <w:hyperlink w:anchor="_Toc243388382" w:history="1">
+          <w:hyperlink w:anchor="_Toc243388831" w:history="1">
             <w:r>
               <w:rPr>
                 <w:rStyle w:val="Hyperlink"/>
@@ -1532,7 +1532,7 @@
                 <w:noProof/>
                 <w:webHidden/>
               </w:rPr>
-              <w:instrText xml:space="preserve"> PAGEREF _Toc243388382 \h </w:instrText>
+              <w:instrText xml:space="preserve"> PAGEREF _Toc243388831 \h </w:instrText>
             </w:r>
             <w:r>
               <w:rPr>
@@ -1573,7 +1573,7 @@
               <w:noProof/>
             </w:rPr>
           </w:pPr>
-          <w:hyperlink w:anchor="_Toc243388383" w:history="1">
+          <w:hyperlink w:anchor="_Toc243388832" w:history="1">
             <w:r>
               <w:rPr>
                 <w:rStyle w:val="Hyperlink"/>
@@ -1600,7 +1600,7 @@
                 <w:noProof/>
                 <w:webHidden/>
               </w:rPr>
-              <w:instrText xml:space="preserve"> PAGEREF _Toc243388383 \h </w:instrText>
+              <w:instrText xml:space="preserve"> PAGEREF _Toc243388832 \h </w:instrText>
             </w:r>
             <w:r>
               <w:rPr>
@@ -1641,7 +1641,7 @@
               <w:noProof/>
             </w:rPr>
           </w:pPr>
-          <w:hyperlink w:anchor="_Toc243388384" w:history="1">
+          <w:hyperlink w:anchor="_Toc243388833" w:history="1">
             <w:r>
               <w:rPr>
                 <w:rStyle w:val="Hyperlink"/>
@@ -1668,7 +1668,7 @@
                 <w:noProof/>
                 <w:webHidden/>
               </w:rPr>
-              <w:instrText xml:space="preserve"> PAGEREF _Toc243388384 \h </w:instrText>
+              <w:instrText xml:space="preserve"> PAGEREF _Toc243388833 \h </w:instrText>
             </w:r>
             <w:r>
               <w:rPr>
@@ -1709,7 +1709,7 @@
               <w:noProof/>
             </w:rPr>
           </w:pPr>
-          <w:hyperlink w:anchor="_Toc243388385" w:history="1">
+          <w:hyperlink w:anchor="_Toc243388834" w:history="1">
             <w:r>
               <w:rPr>
                 <w:rStyle w:val="Hyperlink"/>
@@ -1736,7 +1736,7 @@
                 <w:noProof/>
                 <w:webHidden/>
               </w:rPr>
-              <w:instrText xml:space="preserve"> PAGEREF _Toc243388385 \h </w:instrText>
+              <w:instrText xml:space="preserve"> PAGEREF _Toc243388834 \h </w:instrText>
             </w:r>
             <w:r>
               <w:rPr>
@@ -1777,7 +1777,7 @@
               <w:noProof/>
             </w:rPr>
           </w:pPr>
-          <w:hyperlink w:anchor="_Toc243388386" w:history="1">
+          <w:hyperlink w:anchor="_Toc243388835" w:history="1">
             <w:r>
               <w:rPr>
                 <w:rStyle w:val="Hyperlink"/>
@@ -1804,7 +1804,7 @@
                 <w:noProof/>
                 <w:webHidden/>
               </w:rPr>
-              <w:instrText xml:space="preserve"> PAGEREF _Toc243388386 \h </w:instrText>
+              <w:instrText xml:space="preserve"> PAGEREF _Toc243388835 \h </w:instrText>
             </w:r>
             <w:r>
               <w:rPr>
@@ -1847,7 +1847,7 @@
         <w:pStyle w:val="Ttulo1"/>
       </w:pPr>
       <w:bookmarkStart w:id="0" w:name="_56df7a16a9fe64f9452cb7ca4525fc3d95a27de"/>
-      <w:bookmarkStart w:id="1" w:name="_Toc243388361"/>
+      <w:bookmarkStart w:id="1" w:name="_Toc243388810"/>
       <w:r>
         <w:t>1. Resumen ejecutivo</w:t>
       </w:r>
@@ -2026,7 +2026,7 @@
         <w:pStyle w:val="Ttulo2"/>
       </w:pPr>
       <w:bookmarkStart w:id="2" w:name="_términos"/>
-      <w:bookmarkStart w:id="3" w:name="_Toc243388362"/>
+      <w:bookmarkStart w:id="3" w:name="_Toc243388811"/>
       <w:r>
         <w:t>Términos</w:t>
       </w:r>
@@ -2457,7 +2457,7 @@
         <w:pStyle w:val="Ttulo1"/>
       </w:pPr>
       <w:bookmarkStart w:id="4" w:name="_supuestos"/>
-      <w:bookmarkStart w:id="5" w:name="_Toc243388363"/>
+      <w:bookmarkStart w:id="5" w:name="_Toc243388812"/>
       <w:r>
         <w:t>2. Supuestos</w:t>
       </w:r>
@@ -3185,7 +3185,7 @@
         <w:pStyle w:val="Ttulo1"/>
       </w:pPr>
       <w:bookmarkStart w:id="6" w:name="_531a22751b42dbc4314ac29de4d0b14085fbf94"/>
-      <w:bookmarkStart w:id="7" w:name="_Toc243388364"/>
+      <w:bookmarkStart w:id="7" w:name="_Toc243388813"/>
       <w:r>
         <w:t>3. Matriz de decisiones de automatización</w:t>
       </w:r>
@@ -4448,7 +4448,7 @@
         <w:pStyle w:val="Ttulo2"/>
       </w:pPr>
       <w:bookmarkStart w:id="8" w:name="_cc537778eb01bdc76d0f5f2669747e78821567e"/>
-      <w:bookmarkStart w:id="9" w:name="_Toc243388365"/>
+      <w:bookmarkStart w:id="9" w:name="_Toc243388814"/>
       <w:r>
         <w:t>Señales de escalamiento al Operador NOC</w:t>
       </w:r>
@@ -5122,7 +5122,7 @@
         </w:sectPr>
       </w:pPr>
       <w:bookmarkStart w:id="10" w:name="_856108c0b7ef2b2986130cc133917d17543cf90"/>
-      <w:bookmarkStart w:id="11" w:name="_Toc243388366"/>
+      <w:bookmarkStart w:id="11" w:name="_Toc243388815"/>
     </w:p>
     <w:p>
       <w:pPr>
@@ -5143,7 +5143,7 @@
           <w:noProof/>
         </w:rPr>
         <w:drawing>
-          <wp:inline distT="0" distB="0" distL="0" distR="0" wp14:anchorId="337F22EA" wp14:editId="214A9D0A">
+          <wp:inline distT="0" distB="0" distL="0" distR="0" wp14:anchorId="13D2E993" wp14:editId="0C856785">
             <wp:extent cx="8788400" cy="3813787"/>
             <wp:effectExtent l="0" t="0" r="0" b="0"/>
             <wp:docPr id="16" name="Picture" descr="Arquitectura lógica"/>
@@ -5225,7 +5225,7 @@
         <w:pStyle w:val="Ttulo2"/>
       </w:pPr>
       <w:bookmarkStart w:id="12" w:name="_e0af0e1b985d8e69940266f243ca259d425efb7"/>
-      <w:bookmarkStart w:id="13" w:name="_Toc243388367"/>
+      <w:bookmarkStart w:id="13" w:name="_Toc243388816"/>
       <w:r>
         <w:t>4.1 Componentes, datos y límites de acceso</w:t>
       </w:r>
@@ -6450,7 +6450,7 @@
         <w:pStyle w:val="Ttulo2"/>
       </w:pPr>
       <w:bookmarkStart w:id="14" w:name="_memoria"/>
-      <w:bookmarkStart w:id="15" w:name="_Toc243388368"/>
+      <w:bookmarkStart w:id="15" w:name="_Toc243388817"/>
       <w:r>
         <w:t>4.2 Memoria</w:t>
       </w:r>
@@ -6863,7 +6863,7 @@
         <w:pStyle w:val="Ttulo2"/>
       </w:pPr>
       <w:bookmarkStart w:id="16" w:name="_da292b2665567be05c609dc3d76a9de4a1c3405"/>
-      <w:bookmarkStart w:id="17" w:name="_Toc243388369"/>
+      <w:bookmarkStart w:id="17" w:name="_Toc243388818"/>
       <w:r>
         <w:t>4.3 Estados, fallos y escalamiento del workflow</w:t>
       </w:r>
@@ -7332,7 +7332,7 @@
           <w:noProof/>
         </w:rPr>
         <w:drawing>
-          <wp:inline distT="0" distB="0" distL="0" distR="0" wp14:anchorId="3DCA9235" wp14:editId="46774DDE">
+          <wp:inline distT="0" distB="0" distL="0" distR="0" wp14:anchorId="40221D14" wp14:editId="74E1182E">
             <wp:extent cx="4135942" cy="8852181"/>
             <wp:effectExtent l="0" t="0" r="0" b="0"/>
             <wp:docPr id="22" name="Picture" descr="Estados del workflow"/>
@@ -7398,7 +7398,7 @@
         </w:sectPr>
       </w:pPr>
       <w:bookmarkStart w:id="18" w:name="_860fae0d546a8198f589a398b85690e59be0668"/>
-      <w:bookmarkStart w:id="19" w:name="_Toc243388370"/>
+      <w:bookmarkStart w:id="19" w:name="_Toc243388819"/>
     </w:p>
     <w:p>
       <w:pPr>
@@ -7595,7 +7595,7 @@
         <w:pStyle w:val="Ttulo1"/>
       </w:pPr>
       <w:bookmarkStart w:id="20" w:name="_1cf5811360d8bd240f5b6ff78ee18f92c7c09f4"/>
-      <w:bookmarkStart w:id="21" w:name="_Toc243388371"/>
+      <w:bookmarkStart w:id="21" w:name="_Toc243388820"/>
       <w:r>
         <w:t>5. Arquitectura física (AWS, híbrida)</w:t>
       </w:r>
@@ -7611,7 +7611,7 @@
           <w:noProof/>
         </w:rPr>
         <w:drawing>
-          <wp:inline distT="0" distB="0" distL="0" distR="0" wp14:anchorId="0765ED98" wp14:editId="69F31131">
+          <wp:inline distT="0" distB="0" distL="0" distR="0" wp14:anchorId="75578D34" wp14:editId="7A6985C2">
             <wp:extent cx="5256139" cy="7116202"/>
             <wp:effectExtent l="0" t="0" r="0" b="0"/>
             <wp:docPr id="27" name="Picture" descr="Arquitectura física"/>
@@ -9745,7 +9745,7 @@
         <w:pStyle w:val="Ttulo1"/>
       </w:pPr>
       <w:bookmarkStart w:id="22" w:name="_1dc88d82289d67e1ea4472534f9f223778a3ba7"/>
-      <w:bookmarkStart w:id="23" w:name="_Toc243388372"/>
+      <w:bookmarkStart w:id="23" w:name="_Toc243388821"/>
       <w:r>
         <w:t>6. Seguridad: matriz de riesgos y controles</w:t>
       </w:r>
@@ -11163,7 +11163,7 @@
         <w:pStyle w:val="Ttulo1"/>
       </w:pPr>
       <w:bookmarkStart w:id="24" w:name="_21008488f39fee772d9a18573a0731f090415fd"/>
-      <w:bookmarkStart w:id="25" w:name="_Toc243388373"/>
+      <w:bookmarkStart w:id="25" w:name="_Toc243388822"/>
       <w:r>
         <w:t>7. Estrategia de evaluación de la IA generativa</w:t>
       </w:r>
@@ -11175,7 +11175,7 @@
         <w:pStyle w:val="Ttulo2"/>
       </w:pPr>
       <w:bookmarkStart w:id="26" w:name="_69e1ab2a0c519af57549dc9feeb84d7cb8ee371"/>
-      <w:bookmarkStart w:id="27" w:name="_Toc243388374"/>
+      <w:bookmarkStart w:id="27" w:name="_Toc243388823"/>
       <w:r>
         <w:t>7.1 Qué se evalúa</w:t>
       </w:r>
@@ -11541,7 +11541,7 @@
         <w:pStyle w:val="Ttulo2"/>
       </w:pPr>
       <w:bookmarkStart w:id="28" w:name="_dd7ef81fdfe106eb5acc19d59b803376463f8ad"/>
-      <w:bookmarkStart w:id="29" w:name="_Toc243388375"/>
+      <w:bookmarkStart w:id="29" w:name="_Toc243388824"/>
       <w:r>
         <w:t>7</w:t>
       </w:r>
@@ -13013,7 +13013,7 @@
         <w:pStyle w:val="Ttulo2"/>
       </w:pPr>
       <w:bookmarkStart w:id="30" w:name="_2d9f01ff85dd9820987480cab79557db403aeac"/>
-      <w:bookmarkStart w:id="31" w:name="_Toc243388376"/>
+      <w:bookmarkStart w:id="31" w:name="_Toc243388825"/>
       <w:r>
         <w:t>7.3 Despliegue gradual</w:t>
       </w:r>
@@ -13085,7 +13085,7 @@
         <w:pStyle w:val="Ttulo1"/>
       </w:pPr>
       <w:bookmarkStart w:id="32" w:name="_d8727e752cb31365f46bcadbe991ef572676e19"/>
-      <w:bookmarkStart w:id="33" w:name="_Toc243388377"/>
+      <w:bookmarkStart w:id="33" w:name="_Toc243388826"/>
       <w:r>
         <w:t>8. Operación</w:t>
       </w:r>
@@ -13100,7 +13100,7 @@
         <w:pStyle w:val="Ttulo2"/>
       </w:pPr>
       <w:bookmarkStart w:id="34" w:name="_37ea2f043d1ca71eac9f00ba764ac933ea83f2c"/>
-      <w:bookmarkStart w:id="35" w:name="_Toc243388378"/>
+      <w:bookmarkStart w:id="35" w:name="_Toc243388827"/>
       <w:r>
         <w:t>8.1 Latencia y costo (estimación)</w:t>
       </w:r>
@@ -13657,7 +13657,7 @@
         <w:pStyle w:val="Ttulo2"/>
       </w:pPr>
       <w:bookmarkStart w:id="36" w:name="_observabilidad"/>
-      <w:bookmarkStart w:id="37" w:name="_Toc243388379"/>
+      <w:bookmarkStart w:id="37" w:name="_Toc243388828"/>
       <w:r>
         <w:t>8.2 Observabilidad</w:t>
       </w:r>
@@ -13729,7 +13729,7 @@
         <w:pStyle w:val="Ttulo2"/>
       </w:pPr>
       <w:bookmarkStart w:id="38" w:name="_resiliencia"/>
-      <w:bookmarkStart w:id="39" w:name="_Toc243388380"/>
+      <w:bookmarkStart w:id="39" w:name="_Toc243388829"/>
       <w:r>
         <w:t>8.3 Resiliencia</w:t>
       </w:r>
@@ -13752,7 +13752,7 @@
         <w:pStyle w:val="Ttulo2"/>
       </w:pPr>
       <w:bookmarkStart w:id="40" w:name="_e475abed30fa52e794d704ef2cf4919481e087c"/>
-      <w:bookmarkStart w:id="41" w:name="_Toc243388381"/>
+      <w:bookmarkStart w:id="41" w:name="_Toc243388830"/>
       <w:r>
         <w:t>8.4 Supervisión humana</w:t>
       </w:r>
@@ -13818,7 +13818,7 @@
         <w:pStyle w:val="Ttulo2"/>
       </w:pPr>
       <w:bookmarkStart w:id="42" w:name="_71f77f8eab6ad684eb9de56f8b1bbd750ae9343"/>
-      <w:bookmarkStart w:id="43" w:name="_Toc243388382"/>
+      <w:bookmarkStart w:id="43" w:name="_Toc243388831"/>
       <w:r>
         <w:t>8.5 Riesgos residuales</w:t>
       </w:r>
@@ -13957,7 +13957,7 @@
         <w:pStyle w:val="Ttulo2"/>
       </w:pPr>
       <w:bookmarkStart w:id="44" w:name="_2a051840def5bc2000b770f663cf6617893998a"/>
-      <w:bookmarkStart w:id="45" w:name="_Toc243388383"/>
+      <w:bookmarkStart w:id="45" w:name="_Toc243388832"/>
       <w:r>
         <w:t>8.6 Pendientes antes de producción</w:t>
       </w:r>
@@ -14059,7 +14059,7 @@
         <w:pStyle w:val="Ttulo1"/>
       </w:pPr>
       <w:bookmarkStart w:id="46" w:name="_a5ed2b4bf0fb80322b8db7f52b6310c044129d6"/>
-      <w:bookmarkStart w:id="47" w:name="_Toc243388384"/>
+      <w:bookmarkStart w:id="47" w:name="_Toc243388833"/>
       <w:r>
         <w:t>9. Decisiones técnicas prin</w:t>
       </w:r>
@@ -14301,7 +14301,7 @@
         <w:pStyle w:val="Ttulo1"/>
       </w:pPr>
       <w:bookmarkStart w:id="48" w:name="_2ece7273304f22a5b96354fbdfd9a08907327b3"/>
-      <w:bookmarkStart w:id="49" w:name="_Toc243388385"/>
+      <w:bookmarkStart w:id="49" w:name="_Toc243388834"/>
       <w:r>
         <w:t>10. Preguntas anticipadas</w:t>
       </w:r>
@@ -14457,7 +14457,7 @@
         <w:pStyle w:val="Ttulo1"/>
       </w:pPr>
       <w:bookmarkStart w:id="50" w:name="_923eadbdcfb4798034273fd952db44a0abe1d4f"/>
-      <w:bookmarkStart w:id="51" w:name="_Toc243388386"/>
+      <w:bookmarkStart w:id="51" w:name="_Toc243388835"/>
       <w:r>
         <w:t>Anexo A. Prototipo</w:t>
       </w:r>
@@ -14827,6 +14827,52 @@
           </w:p>
         </w:tc>
       </w:tr>
+      <w:tr>
+        <w:trPr>
+          <w:cantSplit/>
+        </w:trPr>
+        <w:tc>
+          <w:tcPr>
+            <w:tcW w:w="2500" w:type="pct"/>
+            <w:shd w:val="clear" w:color="auto" w:fill="auto"/>
+          </w:tcPr>
+          <w:p>
+            <w:pPr>
+              <w:pStyle w:val="Compact"/>
+              <w:rPr>
+                <w:sz w:val="18"/>
+              </w:rPr>
+            </w:pPr>
+            <w:r>
+              <w:rPr>
+                <w:rStyle w:val="VerbatimChar"/>
+                <w:sz w:val="18"/>
+              </w:rPr>
+              <w:t>resultado-evaluacion.txt</w:t>
+            </w:r>
+          </w:p>
+        </w:tc>
+        <w:tc>
+          <w:tcPr>
+            <w:tcW w:w="2500" w:type="pct"/>
+            <w:shd w:val="clear" w:color="auto" w:fill="auto"/>
+          </w:tcPr>
+          <w:p>
+            <w:pPr>
+              <w:pStyle w:val="Compact"/>
+              <w:rPr>
+                <w:sz w:val="18"/>
+              </w:rPr>
+            </w:pPr>
+            <w:r>
+              <w:rPr>
+                <w:sz w:val="18"/>
+              </w:rPr>
+              <w:t>Salida de la última ejecución, para consultarla sin ejecutar nada.</w:t>
+            </w:r>
+          </w:p>
+        </w:tc>
+      </w:tr>
     </w:tbl>
     <w:p>
       <w:pPr>
@@ -14887,7 +14933,7 @@
   <w:abstractNum w:abstractNumId="0" w15:restartNumberingAfterBreak="0">
     <w:nsid w:val="0000A990"/>
     <w:multiLevelType w:val="multilevel"/>
-    <w:tmpl w:val="3FDE997C"/>
+    <w:tmpl w:val="6BA655EE"/>
     <w:lvl w:ilvl="0">
       <w:numFmt w:val="bullet"/>
       <w:lvlText w:val=" "/>
@@ -14964,7 +15010,7 @@
   <w:abstractNum w:abstractNumId="1" w15:restartNumberingAfterBreak="0">
     <w:nsid w:val="0000A991"/>
     <w:multiLevelType w:val="multilevel"/>
-    <w:tmpl w:val="CEEE0974"/>
+    <w:tmpl w:val="1EEC93F4"/>
     <w:lvl w:ilvl="0">
       <w:numFmt w:val="bullet"/>
       <w:lvlText w:val=""/>
@@ -15068,7 +15114,7 @@
   <w:abstractNum w:abstractNumId="2" w15:restartNumberingAfterBreak="0">
     <w:nsid w:val="00A99411"/>
     <w:multiLevelType w:val="multilevel"/>
-    <w:tmpl w:val="FF8C2CA0"/>
+    <w:tmpl w:val="A14A2ABC"/>
     <w:lvl w:ilvl="0">
       <w:start w:val="1"/>
       <w:numFmt w:val="decimal"/>
@@ -16537,7 +16583,7 @@
     <w:autoRedefine/>
     <w:uiPriority w:val="39"/>
     <w:unhideWhenUsed/>
-    <w:rsid w:val="003D4A16"/>
+    <w:rsid w:val="0083258D"/>
     <w:pPr>
       <w:spacing w:after="100"/>
     </w:pPr>
@@ -16549,7 +16595,7 @@
     <w:autoRedefine/>
     <w:uiPriority w:val="39"/>
     <w:unhideWhenUsed/>
-    <w:rsid w:val="003D4A16"/>
+    <w:rsid w:val="0083258D"/>
     <w:pPr>
       <w:spacing w:after="100"/>
       <w:ind w:left="240"/>

</xml_diff>

<commit_message>
Aplica la revisión final: precisión de límites, permisos, costo, prototipo y diagrama físico
- '≤8 tools' pasa a '≤8 llamadas a tools' (README, diagramas, §8.1)
- ADR 0003: 'Lambda del agente' en lugar de 'contenedor'
- Prototipo: severidad fuera de tabla genera E1; más verbos de cambio (habilitar, resetear, eliminar…);
  casos C19 y C20; 20/20
- Costo LLM ≈ USD 0,16 por Incidencia (≈ 49/día), con desglose
- LLM06: lista cerrada de acciones IAM (incluye ApplyGuardrail y perfil de inferencia) verificada en CI
- Diagrama físico: iconos on-prem genéricos, etiquetas sin superposición, sin título duplicado
</commit_message>
<xml_diff>
--- a/docs/entregable/HACOM-Reto-AI-Engineer.docx
+++ b/docs/entregable/HACOM-Reto-AI-Engineer.docx
@@ -42,7 +42,7 @@
           <w:sz w:val="24"/>
           <w:szCs w:val="24"/>
         </w:rPr>
-        <w:id w:val="-539204539"/>
+        <w:id w:val="-64959996"/>
         <w:docPartObj>
           <w:docPartGallery w:val="Table of Contents"/>
           <w:docPartUnique/>
@@ -77,7 +77,7 @@
           <w:r>
             <w:fldChar w:fldCharType="separate"/>
           </w:r>
-          <w:hyperlink w:anchor="_Toc243388810" w:history="1">
+          <w:hyperlink w:anchor="_Toc243390146" w:history="1">
             <w:r>
               <w:rPr>
                 <w:rStyle w:val="Hyperlink"/>
@@ -104,7 +104,7 @@
                 <w:noProof/>
                 <w:webHidden/>
               </w:rPr>
-              <w:instrText xml:space="preserve"> PAGEREF _Toc243388810 \h </w:instrText>
+              <w:instrText xml:space="preserve"> PAGEREF _Toc243390146 \h </w:instrText>
             </w:r>
             <w:r>
               <w:rPr>
@@ -145,7 +145,7 @@
               <w:noProof/>
             </w:rPr>
           </w:pPr>
-          <w:hyperlink w:anchor="_Toc243388811" w:history="1">
+          <w:hyperlink w:anchor="_Toc243390147" w:history="1">
             <w:r>
               <w:rPr>
                 <w:rStyle w:val="Hyperlink"/>
@@ -172,7 +172,7 @@
                 <w:noProof/>
                 <w:webHidden/>
               </w:rPr>
-              <w:instrText xml:space="preserve"> PAGEREF _Toc243388811 \h </w:instrText>
+              <w:instrText xml:space="preserve"> PAGEREF _Toc243390147 \h </w:instrText>
             </w:r>
             <w:r>
               <w:rPr>
@@ -213,7 +213,7 @@
               <w:noProof/>
             </w:rPr>
           </w:pPr>
-          <w:hyperlink w:anchor="_Toc243388812" w:history="1">
+          <w:hyperlink w:anchor="_Toc243390148" w:history="1">
             <w:r>
               <w:rPr>
                 <w:rStyle w:val="Hyperlink"/>
@@ -240,7 +240,7 @@
                 <w:noProof/>
                 <w:webHidden/>
               </w:rPr>
-              <w:instrText xml:space="preserve"> PAGEREF _Toc243388812 \h </w:instrText>
+              <w:instrText xml:space="preserve"> PAGEREF _Toc243390148 \h </w:instrText>
             </w:r>
             <w:r>
               <w:rPr>
@@ -281,7 +281,7 @@
               <w:noProof/>
             </w:rPr>
           </w:pPr>
-          <w:hyperlink w:anchor="_Toc243388813" w:history="1">
+          <w:hyperlink w:anchor="_Toc243390149" w:history="1">
             <w:r>
               <w:rPr>
                 <w:rStyle w:val="Hyperlink"/>
@@ -308,7 +308,7 @@
                 <w:noProof/>
                 <w:webHidden/>
               </w:rPr>
-              <w:instrText xml:space="preserve"> PAGEREF _Toc243388813 \h </w:instrText>
+              <w:instrText xml:space="preserve"> PAGEREF _Toc243390149 \h </w:instrText>
             </w:r>
             <w:r>
               <w:rPr>
@@ -349,7 +349,7 @@
               <w:noProof/>
             </w:rPr>
           </w:pPr>
-          <w:hyperlink w:anchor="_Toc243388814" w:history="1">
+          <w:hyperlink w:anchor="_Toc243390150" w:history="1">
             <w:r>
               <w:rPr>
                 <w:rStyle w:val="Hyperlink"/>
@@ -376,7 +376,7 @@
                 <w:noProof/>
                 <w:webHidden/>
               </w:rPr>
-              <w:instrText xml:space="preserve"> PAGEREF _Toc243388814 \h </w:instrText>
+              <w:instrText xml:space="preserve"> PAGEREF _Toc243390150 \h </w:instrText>
             </w:r>
             <w:r>
               <w:rPr>
@@ -417,7 +417,7 @@
               <w:noProof/>
             </w:rPr>
           </w:pPr>
-          <w:hyperlink w:anchor="_Toc243388815" w:history="1">
+          <w:hyperlink w:anchor="_Toc243390151" w:history="1">
             <w:r>
               <w:rPr>
                 <w:rStyle w:val="Hyperlink"/>
@@ -444,7 +444,7 @@
                 <w:noProof/>
                 <w:webHidden/>
               </w:rPr>
-              <w:instrText xml:space="preserve"> PAGEREF _Toc243388815 \h </w:instrText>
+              <w:instrText xml:space="preserve"> PAGEREF _Toc243390151 \h </w:instrText>
             </w:r>
             <w:r>
               <w:rPr>
@@ -485,7 +485,7 @@
               <w:noProof/>
             </w:rPr>
           </w:pPr>
-          <w:hyperlink w:anchor="_Toc243388816" w:history="1">
+          <w:hyperlink w:anchor="_Toc243390152" w:history="1">
             <w:r>
               <w:rPr>
                 <w:rStyle w:val="Hyperlink"/>
@@ -512,7 +512,7 @@
                 <w:noProof/>
                 <w:webHidden/>
               </w:rPr>
-              <w:instrText xml:space="preserve"> PAGEREF _Toc243388816 \h </w:instrText>
+              <w:instrText xml:space="preserve"> PAGEREF _Toc243390152 \h </w:instrText>
             </w:r>
             <w:r>
               <w:rPr>
@@ -553,7 +553,7 @@
               <w:noProof/>
             </w:rPr>
           </w:pPr>
-          <w:hyperlink w:anchor="_Toc243388817" w:history="1">
+          <w:hyperlink w:anchor="_Toc243390153" w:history="1">
             <w:r>
               <w:rPr>
                 <w:rStyle w:val="Hyperlink"/>
@@ -580,7 +580,7 @@
                 <w:noProof/>
                 <w:webHidden/>
               </w:rPr>
-              <w:instrText xml:space="preserve"> PAGEREF _Toc243388817 \h </w:instrText>
+              <w:instrText xml:space="preserve"> PAGEREF _Toc243390153 \h </w:instrText>
             </w:r>
             <w:r>
               <w:rPr>
@@ -621,7 +621,7 @@
               <w:noProof/>
             </w:rPr>
           </w:pPr>
-          <w:hyperlink w:anchor="_Toc243388818" w:history="1">
+          <w:hyperlink w:anchor="_Toc243390154" w:history="1">
             <w:r>
               <w:rPr>
                 <w:rStyle w:val="Hyperlink"/>
@@ -648,7 +648,7 @@
                 <w:noProof/>
                 <w:webHidden/>
               </w:rPr>
-              <w:instrText xml:space="preserve"> PAGEREF _Toc243388818 \h </w:instrText>
+              <w:instrText xml:space="preserve"> PAGEREF _Toc243390154 \h </w:instrText>
             </w:r>
             <w:r>
               <w:rPr>
@@ -689,7 +689,7 @@
               <w:noProof/>
             </w:rPr>
           </w:pPr>
-          <w:hyperlink w:anchor="_Toc243388819" w:history="1">
+          <w:hyperlink w:anchor="_Toc243390155" w:history="1">
             <w:r>
               <w:rPr>
                 <w:rStyle w:val="Hyperlink"/>
@@ -716,7 +716,7 @@
                 <w:noProof/>
                 <w:webHidden/>
               </w:rPr>
-              <w:instrText xml:space="preserve"> PAGEREF _Toc243388819 \h </w:instrText>
+              <w:instrText xml:space="preserve"> PAGEREF _Toc243390155 \h </w:instrText>
             </w:r>
             <w:r>
               <w:rPr>
@@ -757,7 +757,7 @@
               <w:noProof/>
             </w:rPr>
           </w:pPr>
-          <w:hyperlink w:anchor="_Toc243388820" w:history="1">
+          <w:hyperlink w:anchor="_Toc243390156" w:history="1">
             <w:r>
               <w:rPr>
                 <w:rStyle w:val="Hyperlink"/>
@@ -784,7 +784,7 @@
                 <w:noProof/>
                 <w:webHidden/>
               </w:rPr>
-              <w:instrText xml:space="preserve"> PAGEREF _Toc243388820 \h </w:instrText>
+              <w:instrText xml:space="preserve"> PAGEREF _Toc243390156 \h </w:instrText>
             </w:r>
             <w:r>
               <w:rPr>
@@ -825,7 +825,7 @@
               <w:noProof/>
             </w:rPr>
           </w:pPr>
-          <w:hyperlink w:anchor="_Toc243388821" w:history="1">
+          <w:hyperlink w:anchor="_Toc243390157" w:history="1">
             <w:r>
               <w:rPr>
                 <w:rStyle w:val="Hyperlink"/>
@@ -852,7 +852,7 @@
                 <w:noProof/>
                 <w:webHidden/>
               </w:rPr>
-              <w:instrText xml:space="preserve"> PAGEREF _Toc243388821 \h </w:instrText>
+              <w:instrText xml:space="preserve"> PAGEREF _Toc243390157 \h </w:instrText>
             </w:r>
             <w:r>
               <w:rPr>
@@ -893,7 +893,7 @@
               <w:noProof/>
             </w:rPr>
           </w:pPr>
-          <w:hyperlink w:anchor="_Toc243388822" w:history="1">
+          <w:hyperlink w:anchor="_Toc243390158" w:history="1">
             <w:r>
               <w:rPr>
                 <w:rStyle w:val="Hyperlink"/>
@@ -920,7 +920,7 @@
                 <w:noProof/>
                 <w:webHidden/>
               </w:rPr>
-              <w:instrText xml:space="preserve"> PAGEREF _Toc243388822 \h </w:instrText>
+              <w:instrText xml:space="preserve"> PAGEREF _Toc243390158 \h </w:instrText>
             </w:r>
             <w:r>
               <w:rPr>
@@ -961,7 +961,7 @@
               <w:noProof/>
             </w:rPr>
           </w:pPr>
-          <w:hyperlink w:anchor="_Toc243388823" w:history="1">
+          <w:hyperlink w:anchor="_Toc243390159" w:history="1">
             <w:r>
               <w:rPr>
                 <w:rStyle w:val="Hyperlink"/>
@@ -988,7 +988,7 @@
                 <w:noProof/>
                 <w:webHidden/>
               </w:rPr>
-              <w:instrText xml:space="preserve"> PAGEREF _Toc243388823 \h </w:instrText>
+              <w:instrText xml:space="preserve"> PAGEREF _Toc243390159 \h </w:instrText>
             </w:r>
             <w:r>
               <w:rPr>
@@ -1029,7 +1029,7 @@
               <w:noProof/>
             </w:rPr>
           </w:pPr>
-          <w:hyperlink w:anchor="_Toc243388824" w:history="1">
+          <w:hyperlink w:anchor="_Toc243390160" w:history="1">
             <w:r>
               <w:rPr>
                 <w:rStyle w:val="Hyperlink"/>
@@ -1056,7 +1056,7 @@
                 <w:noProof/>
                 <w:webHidden/>
               </w:rPr>
-              <w:instrText xml:space="preserve"> PAGEREF _Toc243388824 \h </w:instrText>
+              <w:instrText xml:space="preserve"> PAGEREF _Toc243390160 \h </w:instrText>
             </w:r>
             <w:r>
               <w:rPr>
@@ -1097,7 +1097,7 @@
               <w:noProof/>
             </w:rPr>
           </w:pPr>
-          <w:hyperlink w:anchor="_Toc243388825" w:history="1">
+          <w:hyperlink w:anchor="_Toc243390161" w:history="1">
             <w:r>
               <w:rPr>
                 <w:rStyle w:val="Hyperlink"/>
@@ -1124,7 +1124,7 @@
                 <w:noProof/>
                 <w:webHidden/>
               </w:rPr>
-              <w:instrText xml:space="preserve"> PAGEREF _Toc243388825 \h </w:instrText>
+              <w:instrText xml:space="preserve"> PAGEREF _Toc243390161 \h </w:instrText>
             </w:r>
             <w:r>
               <w:rPr>
@@ -1165,7 +1165,7 @@
               <w:noProof/>
             </w:rPr>
           </w:pPr>
-          <w:hyperlink w:anchor="_Toc243388826" w:history="1">
+          <w:hyperlink w:anchor="_Toc243390162" w:history="1">
             <w:r>
               <w:rPr>
                 <w:rStyle w:val="Hyperlink"/>
@@ -1192,7 +1192,7 @@
                 <w:noProof/>
                 <w:webHidden/>
               </w:rPr>
-              <w:instrText xml:space="preserve"> PAGEREF _Toc243388826 \h </w:instrText>
+              <w:instrText xml:space="preserve"> PAGEREF _Toc243390162 \h </w:instrText>
             </w:r>
             <w:r>
               <w:rPr>
@@ -1233,7 +1233,7 @@
               <w:noProof/>
             </w:rPr>
           </w:pPr>
-          <w:hyperlink w:anchor="_Toc243388827" w:history="1">
+          <w:hyperlink w:anchor="_Toc243390163" w:history="1">
             <w:r>
               <w:rPr>
                 <w:rStyle w:val="Hyperlink"/>
@@ -1260,7 +1260,7 @@
                 <w:noProof/>
                 <w:webHidden/>
               </w:rPr>
-              <w:instrText xml:space="preserve"> PAGEREF _Toc243388827 \h </w:instrText>
+              <w:instrText xml:space="preserve"> PAGEREF _Toc243390163 \h </w:instrText>
             </w:r>
             <w:r>
               <w:rPr>
@@ -1301,7 +1301,7 @@
               <w:noProof/>
             </w:rPr>
           </w:pPr>
-          <w:hyperlink w:anchor="_Toc243388828" w:history="1">
+          <w:hyperlink w:anchor="_Toc243390164" w:history="1">
             <w:r>
               <w:rPr>
                 <w:rStyle w:val="Hyperlink"/>
@@ -1328,7 +1328,7 @@
                 <w:noProof/>
                 <w:webHidden/>
               </w:rPr>
-              <w:instrText xml:space="preserve"> PAGEREF _Toc243388828 \h </w:instrText>
+              <w:instrText xml:space="preserve"> PAGEREF _Toc243390164 \h </w:instrText>
             </w:r>
             <w:r>
               <w:rPr>
@@ -1369,7 +1369,7 @@
               <w:noProof/>
             </w:rPr>
           </w:pPr>
-          <w:hyperlink w:anchor="_Toc243388829" w:history="1">
+          <w:hyperlink w:anchor="_Toc243390165" w:history="1">
             <w:r>
               <w:rPr>
                 <w:rStyle w:val="Hyperlink"/>
@@ -1396,7 +1396,7 @@
                 <w:noProof/>
                 <w:webHidden/>
               </w:rPr>
-              <w:instrText xml:space="preserve"> PAGEREF _Toc243388829 \h </w:instrText>
+              <w:instrText xml:space="preserve"> PAGEREF _Toc243390165 \h </w:instrText>
             </w:r>
             <w:r>
               <w:rPr>
@@ -1437,7 +1437,7 @@
               <w:noProof/>
             </w:rPr>
           </w:pPr>
-          <w:hyperlink w:anchor="_Toc243388830" w:history="1">
+          <w:hyperlink w:anchor="_Toc243390166" w:history="1">
             <w:r>
               <w:rPr>
                 <w:rStyle w:val="Hyperlink"/>
@@ -1464,7 +1464,7 @@
                 <w:noProof/>
                 <w:webHidden/>
               </w:rPr>
-              <w:instrText xml:space="preserve"> PAGEREF _Toc243388830 \h </w:instrText>
+              <w:instrText xml:space="preserve"> PAGEREF _Toc243390166 \h </w:instrText>
             </w:r>
             <w:r>
               <w:rPr>
@@ -1505,7 +1505,7 @@
               <w:noProof/>
             </w:rPr>
           </w:pPr>
-          <w:hyperlink w:anchor="_Toc243388831" w:history="1">
+          <w:hyperlink w:anchor="_Toc243390167" w:history="1">
             <w:r>
               <w:rPr>
                 <w:rStyle w:val="Hyperlink"/>
@@ -1532,7 +1532,7 @@
                 <w:noProof/>
                 <w:webHidden/>
               </w:rPr>
-              <w:instrText xml:space="preserve"> PAGEREF _Toc243388831 \h </w:instrText>
+              <w:instrText xml:space="preserve"> PAGEREF _Toc243390167 \h </w:instrText>
             </w:r>
             <w:r>
               <w:rPr>
@@ -1552,7 +1552,7 @@
                 <w:noProof/>
                 <w:webHidden/>
               </w:rPr>
-              <w:t>17</w:t>
+              <w:t>18</w:t>
             </w:r>
             <w:r>
               <w:rPr>
@@ -1573,7 +1573,7 @@
               <w:noProof/>
             </w:rPr>
           </w:pPr>
-          <w:hyperlink w:anchor="_Toc243388832" w:history="1">
+          <w:hyperlink w:anchor="_Toc243390168" w:history="1">
             <w:r>
               <w:rPr>
                 <w:rStyle w:val="Hyperlink"/>
@@ -1600,7 +1600,7 @@
                 <w:noProof/>
                 <w:webHidden/>
               </w:rPr>
-              <w:instrText xml:space="preserve"> PAGEREF _Toc243388832 \h </w:instrText>
+              <w:instrText xml:space="preserve"> PAGEREF _Toc243390168 \h </w:instrText>
             </w:r>
             <w:r>
               <w:rPr>
@@ -1641,7 +1641,7 @@
               <w:noProof/>
             </w:rPr>
           </w:pPr>
-          <w:hyperlink w:anchor="_Toc243388833" w:history="1">
+          <w:hyperlink w:anchor="_Toc243390169" w:history="1">
             <w:r>
               <w:rPr>
                 <w:rStyle w:val="Hyperlink"/>
@@ -1668,7 +1668,7 @@
                 <w:noProof/>
                 <w:webHidden/>
               </w:rPr>
-              <w:instrText xml:space="preserve"> PAGEREF _Toc243388833 \h </w:instrText>
+              <w:instrText xml:space="preserve"> PAGEREF _Toc243390169 \h </w:instrText>
             </w:r>
             <w:r>
               <w:rPr>
@@ -1709,7 +1709,7 @@
               <w:noProof/>
             </w:rPr>
           </w:pPr>
-          <w:hyperlink w:anchor="_Toc243388834" w:history="1">
+          <w:hyperlink w:anchor="_Toc243390170" w:history="1">
             <w:r>
               <w:rPr>
                 <w:rStyle w:val="Hyperlink"/>
@@ -1736,7 +1736,7 @@
                 <w:noProof/>
                 <w:webHidden/>
               </w:rPr>
-              <w:instrText xml:space="preserve"> PAGEREF _Toc243388834 \h </w:instrText>
+              <w:instrText xml:space="preserve"> PAGEREF _Toc243390170 \h </w:instrText>
             </w:r>
             <w:r>
               <w:rPr>
@@ -1777,7 +1777,7 @@
               <w:noProof/>
             </w:rPr>
           </w:pPr>
-          <w:hyperlink w:anchor="_Toc243388835" w:history="1">
+          <w:hyperlink w:anchor="_Toc243390171" w:history="1">
             <w:r>
               <w:rPr>
                 <w:rStyle w:val="Hyperlink"/>
@@ -1804,7 +1804,7 @@
                 <w:noProof/>
                 <w:webHidden/>
               </w:rPr>
-              <w:instrText xml:space="preserve"> PAGEREF _Toc243388835 \h </w:instrText>
+              <w:instrText xml:space="preserve"> PAGEREF _Toc243390171 \h </w:instrText>
             </w:r>
             <w:r>
               <w:rPr>
@@ -1847,7 +1847,7 @@
         <w:pStyle w:val="Ttulo1"/>
       </w:pPr>
       <w:bookmarkStart w:id="0" w:name="_56df7a16a9fe64f9452cb7ca4525fc3d95a27de"/>
-      <w:bookmarkStart w:id="1" w:name="_Toc243388810"/>
+      <w:bookmarkStart w:id="1" w:name="_Toc243390146"/>
       <w:r>
         <w:t>1. Resumen ejecutivo</w:t>
       </w:r>
@@ -2015,7 +2015,7 @@
         <w:t>Qué está implementado y qué no.</w:t>
       </w:r>
       <w:r>
-        <w:t xml:space="preserve"> Este documento es un diseño. El prototipo adjunto contiene los contratos de tools, el esquema de salida, las reglas deterministas y 18 casos de evaluación ejecutables. No se desplegó ningún servicio ni se invocó </w:t>
+        <w:t xml:space="preserve"> Este documento es un diseño. El prototipo adjunto contiene los contratos de tools, el esquema de salida, las reglas deterministas y 20 casos de evaluación ejecutables. No se desplegó ningún servicio ni se invocó </w:t>
       </w:r>
       <w:r>
         <w:t>ningún modelo real.</w:t>
@@ -2026,7 +2026,7 @@
         <w:pStyle w:val="Ttulo2"/>
       </w:pPr>
       <w:bookmarkStart w:id="2" w:name="_términos"/>
-      <w:bookmarkStart w:id="3" w:name="_Toc243388811"/>
+      <w:bookmarkStart w:id="3" w:name="_Toc243390147"/>
       <w:r>
         <w:t>Términos</w:t>
       </w:r>
@@ -2457,7 +2457,7 @@
         <w:pStyle w:val="Ttulo1"/>
       </w:pPr>
       <w:bookmarkStart w:id="4" w:name="_supuestos"/>
-      <w:bookmarkStart w:id="5" w:name="_Toc243388812"/>
+      <w:bookmarkStart w:id="5" w:name="_Toc243390148"/>
       <w:r>
         <w:t>2. Supuestos</w:t>
       </w:r>
@@ -3185,7 +3185,7 @@
         <w:pStyle w:val="Ttulo1"/>
       </w:pPr>
       <w:bookmarkStart w:id="6" w:name="_531a22751b42dbc4314ac29de4d0b14085fbf94"/>
-      <w:bookmarkStart w:id="7" w:name="_Toc243388813"/>
+      <w:bookmarkStart w:id="7" w:name="_Toc243390149"/>
       <w:r>
         <w:t>3. Matriz de decisiones de automatización</w:t>
       </w:r>
@@ -4448,7 +4448,7 @@
         <w:pStyle w:val="Ttulo2"/>
       </w:pPr>
       <w:bookmarkStart w:id="8" w:name="_cc537778eb01bdc76d0f5f2669747e78821567e"/>
-      <w:bookmarkStart w:id="9" w:name="_Toc243388814"/>
+      <w:bookmarkStart w:id="9" w:name="_Toc243390150"/>
       <w:r>
         <w:t>Señales de escalamiento al Operador NOC</w:t>
       </w:r>
@@ -5122,7 +5122,7 @@
         </w:sectPr>
       </w:pPr>
       <w:bookmarkStart w:id="10" w:name="_856108c0b7ef2b2986130cc133917d17543cf90"/>
-      <w:bookmarkStart w:id="11" w:name="_Toc243388815"/>
+      <w:bookmarkStart w:id="11" w:name="_Toc243390151"/>
     </w:p>
     <w:p>
       <w:pPr>
@@ -5143,8 +5143,8 @@
           <w:noProof/>
         </w:rPr>
         <w:drawing>
-          <wp:inline distT="0" distB="0" distL="0" distR="0" wp14:anchorId="13D2E993" wp14:editId="0C856785">
-            <wp:extent cx="8788400" cy="3813787"/>
+          <wp:inline distT="0" distB="0" distL="0" distR="0" wp14:anchorId="1D337539" wp14:editId="4D1B94CC">
+            <wp:extent cx="8788400" cy="3785247"/>
             <wp:effectExtent l="0" t="0" r="0" b="0"/>
             <wp:docPr id="16" name="Picture" descr="Arquitectura lógica"/>
             <wp:cNvGraphicFramePr>
@@ -5168,7 +5168,7 @@
                   <pic:spPr bwMode="auto">
                     <a:xfrm>
                       <a:off x="0" y="0"/>
-                      <a:ext cx="8788400" cy="3813787"/>
+                      <a:ext cx="8788400" cy="3785247"/>
                     </a:xfrm>
                     <a:prstGeom prst="rect">
                       <a:avLst/>
@@ -5225,7 +5225,7 @@
         <w:pStyle w:val="Ttulo2"/>
       </w:pPr>
       <w:bookmarkStart w:id="12" w:name="_e0af0e1b985d8e69940266f243ca259d425efb7"/>
-      <w:bookmarkStart w:id="13" w:name="_Toc243388816"/>
+      <w:bookmarkStart w:id="13" w:name="_Toc243390152"/>
       <w:r>
         <w:t>4.1 Componentes, datos y límites de acceso</w:t>
       </w:r>
@@ -6450,7 +6450,7 @@
         <w:pStyle w:val="Ttulo2"/>
       </w:pPr>
       <w:bookmarkStart w:id="14" w:name="_memoria"/>
-      <w:bookmarkStart w:id="15" w:name="_Toc243388817"/>
+      <w:bookmarkStart w:id="15" w:name="_Toc243390153"/>
       <w:r>
         <w:t>4.2 Memoria</w:t>
       </w:r>
@@ -6863,7 +6863,7 @@
         <w:pStyle w:val="Ttulo2"/>
       </w:pPr>
       <w:bookmarkStart w:id="16" w:name="_da292b2665567be05c609dc3d76a9de4a1c3405"/>
-      <w:bookmarkStart w:id="17" w:name="_Toc243388818"/>
+      <w:bookmarkStart w:id="17" w:name="_Toc243390154"/>
       <w:r>
         <w:t>4.3 Estados, fallos y escalamiento del workflow</w:t>
       </w:r>
@@ -7332,7 +7332,7 @@
           <w:noProof/>
         </w:rPr>
         <w:drawing>
-          <wp:inline distT="0" distB="0" distL="0" distR="0" wp14:anchorId="40221D14" wp14:editId="74E1182E">
+          <wp:inline distT="0" distB="0" distL="0" distR="0" wp14:anchorId="4F683881" wp14:editId="36282E27">
             <wp:extent cx="4135942" cy="8852181"/>
             <wp:effectExtent l="0" t="0" r="0" b="0"/>
             <wp:docPr id="22" name="Picture" descr="Estados del workflow"/>
@@ -7398,7 +7398,7 @@
         </w:sectPr>
       </w:pPr>
       <w:bookmarkStart w:id="18" w:name="_860fae0d546a8198f589a398b85690e59be0668"/>
-      <w:bookmarkStart w:id="19" w:name="_Toc243388819"/>
+      <w:bookmarkStart w:id="19" w:name="_Toc243390155"/>
     </w:p>
     <w:p>
       <w:pPr>
@@ -7595,7 +7595,7 @@
         <w:pStyle w:val="Ttulo1"/>
       </w:pPr>
       <w:bookmarkStart w:id="20" w:name="_1cf5811360d8bd240f5b6ff78ee18f92c7c09f4"/>
-      <w:bookmarkStart w:id="21" w:name="_Toc243388820"/>
+      <w:bookmarkStart w:id="21" w:name="_Toc243390156"/>
       <w:r>
         <w:t>5. Arquitectura física (AWS, híbrida)</w:t>
       </w:r>
@@ -7611,8 +7611,8 @@
           <w:noProof/>
         </w:rPr>
         <w:drawing>
-          <wp:inline distT="0" distB="0" distL="0" distR="0" wp14:anchorId="75578D34" wp14:editId="7A6985C2">
-            <wp:extent cx="5256139" cy="7116202"/>
+          <wp:inline distT="0" distB="0" distL="0" distR="0" wp14:anchorId="4EB03ADF" wp14:editId="3E7F520E">
+            <wp:extent cx="5677508" cy="7115985"/>
             <wp:effectExtent l="0" t="0" r="0" b="0"/>
             <wp:docPr id="27" name="Picture" descr="Arquitectura física"/>
             <wp:cNvGraphicFramePr>
@@ -7636,7 +7636,7 @@
                   <pic:spPr bwMode="auto">
                     <a:xfrm>
                       <a:off x="0" y="0"/>
-                      <a:ext cx="5256139" cy="7116202"/>
+                      <a:ext cx="5677508" cy="7115985"/>
                     </a:xfrm>
                     <a:prstGeom prst="rect">
                       <a:avLst/>
@@ -9745,7 +9745,7 @@
         <w:pStyle w:val="Ttulo1"/>
       </w:pPr>
       <w:bookmarkStart w:id="22" w:name="_1dc88d82289d67e1ea4472534f9f223778a3ba7"/>
-      <w:bookmarkStart w:id="23" w:name="_Toc243388821"/>
+      <w:bookmarkStart w:id="23" w:name="_Toc243390157"/>
       <w:r>
         <w:t>6. Seguridad: matriz de riesgos y controles</w:t>
       </w:r>
@@ -10078,53 +10078,72 @@
               <w:rPr>
                 <w:sz w:val="18"/>
               </w:rPr>
-              <w:t xml:space="preserve">Rol del agente: solo </w:t>
+              <w:t xml:space="preserve">Rol del agente con una lista cerrada de acciones: </w:t>
             </w:r>
             <w:r>
               <w:rPr>
                 <w:rStyle w:val="VerbatimChar"/>
                 <w:sz w:val="18"/>
               </w:rPr>
-              <w:t>execute-api</w:t>
-            </w:r>
-            <w:r>
-              <w:rPr>
-                <w:sz w:val="18"/>
-              </w:rPr>
-              <w:t xml:space="preserve"> sobre el MCP y </w:t>
+              <w:t>execute-api:I</w:t>
             </w:r>
             <w:r>
               <w:rPr>
                 <w:rStyle w:val="VerbatimChar"/>
                 <w:sz w:val="18"/>
               </w:rPr>
-              <w:t>bedrock:InvokeM</w:t>
+              <w:t>nvoke</w:t>
+            </w:r>
+            <w:r>
+              <w:rPr>
+                <w:sz w:val="18"/>
+              </w:rPr>
+              <w:t xml:space="preserve"> sobre el MCP, </w:t>
             </w:r>
             <w:r>
               <w:rPr>
                 <w:rStyle w:val="VerbatimChar"/>
                 <w:sz w:val="18"/>
               </w:rPr>
-              <w:t>odel</w:t>
-            </w:r>
-            <w:r>
-              <w:rPr>
-                <w:sz w:val="18"/>
-              </w:rPr>
-              <w:t xml:space="preserve">. La escritura está aislada en </w:t>
+              <w:t>bedrock:InvokeModel</w:t>
+            </w:r>
+            <w:r>
+              <w:rPr>
+                <w:sz w:val="18"/>
+              </w:rPr>
+              <w:t xml:space="preserve"> sobre los modelos y el perfil de inferencia elegidos, y </w:t>
             </w:r>
             <w:r>
               <w:rPr>
                 <w:rStyle w:val="VerbatimChar"/>
                 <w:sz w:val="18"/>
               </w:rPr>
+              <w:t>bedrock:ApplyGuardrail</w:t>
+            </w:r>
+            <w:r>
+              <w:rPr>
+                <w:sz w:val="18"/>
+              </w:rPr>
+              <w:t xml:space="preserve"> sobre su guardrail. La escritura está aislada en </w:t>
+            </w:r>
+            <w:r>
+              <w:rPr>
+                <w:rStyle w:val="VerbatimChar"/>
+                <w:sz w:val="18"/>
+              </w:rPr>
               <w:t>ticket-writer</w:t>
             </w:r>
             <w:r>
               <w:rPr>
                 <w:sz w:val="18"/>
               </w:rPr>
-              <w:t>. Cuentas on-prem del MCP de solo lectura. Security groups que limitan la salida del agente.</w:t>
+              <w:t>. Cuentas on-prem del MCP de solo lectura. Security groups que limitan la s</w:t>
+            </w:r>
+            <w:r>
+              <w:rPr>
+                <w:sz w:val="18"/>
+              </w:rPr>
+              <w:t>alida del agente.</w:t>
             </w:r>
           </w:p>
         </w:tc>
@@ -10144,46 +10163,20 @@
               <w:rPr>
                 <w:sz w:val="18"/>
               </w:rPr>
-              <w:t xml:space="preserve">Policy-as-code en CI (cfn-guard o Checkov): el build falla si el rol del agente tiene </w:t>
+              <w:t>Policy-as-code en CI (cfn-guard o Checkov): el build falla si el rol del agente tiene cualquier acción fuera de esa lista cerrada o comodines (</w:t>
             </w:r>
             <w:r>
               <w:rPr>
                 <w:rStyle w:val="VerbatimChar"/>
                 <w:sz w:val="18"/>
               </w:rPr>
-              <w:t>Put*</w:t>
-            </w:r>
-            <w:r>
-              <w:rPr>
-                <w:sz w:val="18"/>
-              </w:rPr>
-              <w:t xml:space="preserve">, </w:t>
-            </w:r>
-            <w:r>
-              <w:rPr>
-                <w:rStyle w:val="VerbatimChar"/>
-                <w:sz w:val="18"/>
-              </w:rPr>
-              <w:t>Update*</w:t>
-            </w:r>
-            <w:r>
-              <w:rPr>
-                <w:sz w:val="18"/>
-              </w:rPr>
-              <w:t xml:space="preserve"> o </w:t>
-            </w:r>
-            <w:r>
-              <w:rPr>
-                <w:rStyle w:val="VerbatimChar"/>
-                <w:sz w:val="18"/>
-              </w:rPr>
-              <w:t>Delete*</w:t>
-            </w:r>
-            <w:r>
-              <w:rPr>
-                <w:sz w:val="18"/>
-              </w:rPr>
-              <w:t xml:space="preserve">. </w:t>
+              <w:t>*</w:t>
+            </w:r>
+            <w:r>
+              <w:rPr>
+                <w:sz w:val="18"/>
+              </w:rPr>
+              <w:t xml:space="preserve">) en acciones o recursos. </w:t>
             </w:r>
             <w:r>
               <w:rPr>
@@ -10191,21 +10184,19 @@
                 <w:bCs/>
                 <w:sz w:val="18"/>
               </w:rPr>
-              <w:t>Test</w:t>
-            </w:r>
-            <w:r>
-              <w:rPr>
-                <w:b/>
-                <w:bCs/>
-                <w:sz w:val="18"/>
-              </w:rPr>
-              <w:t xml:space="preserve"> negativo</w:t>
-            </w:r>
-            <w:r>
-              <w:rPr>
-                <w:sz w:val="18"/>
-              </w:rPr>
-              <w:t>: un intento de escritura con las credenciales del MCP contra cada sistema on-prem debe fallar.</w:t>
+              <w:t>Test negativo</w:t>
+            </w:r>
+            <w:r>
+              <w:rPr>
+                <w:sz w:val="18"/>
+              </w:rPr>
+              <w:t xml:space="preserve">: un intento de escritura con las credenciales del MCP </w:t>
+            </w:r>
+            <w:r>
+              <w:rPr>
+                <w:sz w:val="18"/>
+              </w:rPr>
+              <w:t>contra cada sistema on-prem debe fallar.</w:t>
             </w:r>
           </w:p>
         </w:tc>
@@ -10292,13 +10283,13 @@
               <w:rPr>
                 <w:sz w:val="18"/>
               </w:rPr>
-              <w:t>Es</w:t>
-            </w:r>
-            <w:r>
-              <w:rPr>
-                <w:sz w:val="18"/>
-              </w:rPr>
-              <w:t>caneo periódico con Macie del bucket de logs de invocación: cero hallazgos de PII.</w:t>
+              <w:t>Escaneo periódico con Macie del bucket de logs de invocación: cero hallazgos de PII</w:t>
+            </w:r>
+            <w:r>
+              <w:rPr>
+                <w:sz w:val="18"/>
+              </w:rPr>
+              <w:t>.</w:t>
             </w:r>
           </w:p>
         </w:tc>
@@ -10378,7 +10369,13 @@
               <w:rPr>
                 <w:sz w:val="18"/>
               </w:rPr>
-              <w:t xml:space="preserve"> verificado contra la traza; si falla, E2 y el resumen se retiene.</w:t>
+              <w:t xml:space="preserve"> </w:t>
+            </w:r>
+            <w:r>
+              <w:rPr>
+                <w:sz w:val="18"/>
+              </w:rPr>
+              <w:t>verificado contra la traza; si falla, E2 y el resumen se retiene.</w:t>
             </w:r>
           </w:p>
         </w:tc>
@@ -10445,13 +10442,7 @@
               <w:rPr>
                 <w:sz w:val="18"/>
               </w:rPr>
-              <w:t>La sa</w:t>
-            </w:r>
-            <w:r>
-              <w:rPr>
-                <w:sz w:val="18"/>
-              </w:rPr>
-              <w:t>lida del LLM se usa sin validar (ruteo, campos, HTML en el ticket).</w:t>
+              <w:t>La salida del LLM se usa sin validar (ruteo, campos, HTML en el ticket).</w:t>
             </w:r>
           </w:p>
         </w:tc>
@@ -10471,7 +10462,13 @@
               <w:rPr>
                 <w:sz w:val="18"/>
               </w:rPr>
-              <w:t>Validación Pydantic; la salida nunca decide urgencia, prioridad ni SLA; escape de contenido al escribir en el ticket.</w:t>
+              <w:t>Validació</w:t>
+            </w:r>
+            <w:r>
+              <w:rPr>
+                <w:sz w:val="18"/>
+              </w:rPr>
+              <w:t>n Pydantic; la salida nunca decide urgencia, prioridad ni SLA; escape de contenido al escribir en el ticket.</w:t>
             </w:r>
           </w:p>
         </w:tc>
@@ -10518,15 +10515,7 @@
                 <w:bCs/>
                 <w:sz w:val="18"/>
               </w:rPr>
-              <w:t>LLM04 / LLM08 Envenenamiento de datos o em</w:t>
-            </w:r>
-            <w:r>
-              <w:rPr>
-                <w:b/>
-                <w:bCs/>
-                <w:sz w:val="18"/>
-              </w:rPr>
-              <w:t>beddings</w:t>
+              <w:t>LLM04 / LLM08 Envenenamiento de datos o embeddings</w:t>
             </w:r>
           </w:p>
         </w:tc>
@@ -10566,7 +10555,13 @@
               <w:rPr>
                 <w:sz w:val="18"/>
               </w:rPr>
-              <w:t xml:space="preserve">Solo se ingestan Incidencias cerradas </w:t>
+              <w:t>Solo</w:t>
+            </w:r>
+            <w:r>
+              <w:rPr>
+                <w:sz w:val="18"/>
+              </w:rPr>
+              <w:t xml:space="preserve"> se ingestan Incidencias cerradas </w:t>
             </w:r>
             <w:r>
               <w:rPr>
@@ -10580,13 +10575,7 @@
               <w:rPr>
                 <w:sz w:val="18"/>
               </w:rPr>
-              <w:t>; fuentes con control de versiones y aprobación; metadato de versión en cada fragmento; índices separados por operador (S8</w:t>
-            </w:r>
-            <w:r>
-              <w:rPr>
-                <w:sz w:val="18"/>
-              </w:rPr>
-              <w:t>).</w:t>
+              <w:t>; fuentes con control de versiones y aprobación; metadato de versión en cada fragmento; índices separados por operador (S8).</w:t>
             </w:r>
           </w:p>
         </w:tc>
@@ -10606,7 +10595,13 @@
               <w:rPr>
                 <w:sz w:val="18"/>
               </w:rPr>
-              <w:t>Auditoría de la ingesta (quién y qué versión); la evaluación de recuperación detecta derivas.</w:t>
+              <w:t>Auditoría de la ingesta (quién y qué versión); la evaluación de recuperaci</w:t>
+            </w:r>
+            <w:r>
+              <w:rPr>
+                <w:sz w:val="18"/>
+              </w:rPr>
+              <w:t>ón detecta derivas.</w:t>
             </w:r>
           </w:p>
         </w:tc>
@@ -10673,13 +10668,7 @@
               <w:rPr>
                 <w:sz w:val="18"/>
               </w:rPr>
-              <w:t>Límites de pasos, tiempo y tokens; concurrencia máxima por cola; cuotas de Bedro</w:t>
-            </w:r>
-            <w:r>
-              <w:rPr>
-                <w:sz w:val="18"/>
-              </w:rPr>
-              <w:t>ck.</w:t>
+              <w:t>Límites de pasos, tiempo y tokens; concurrencia máxima por cola; cuotas de Bedrock.</w:t>
             </w:r>
           </w:p>
         </w:tc>
@@ -10699,7 +10688,13 @@
               <w:rPr>
                 <w:sz w:val="18"/>
               </w:rPr>
-              <w:t>Alarmas de CloudWatch de costo por Incidencia y tokens por hora; AWS Budgets.</w:t>
+              <w:t>Alarmas de CloudWatch de costo por Incidencia y tokens por hora; AWS Budg</w:t>
+            </w:r>
+            <w:r>
+              <w:rPr>
+                <w:sz w:val="18"/>
+              </w:rPr>
+              <w:t>ets.</w:t>
             </w:r>
           </w:p>
         </w:tc>
@@ -10766,13 +10761,7 @@
               <w:rPr>
                 <w:sz w:val="18"/>
               </w:rPr>
-              <w:t>Versión de modelo fijada; un cambio de modelo o prompt pasa por e</w:t>
-            </w:r>
-            <w:r>
-              <w:rPr>
-                <w:sz w:val="18"/>
-              </w:rPr>
-              <w:t>l gate de evaluación.</w:t>
+              <w:t>Versión de modelo fijada; un cambio de modelo o prompt pasa por el gate de evaluación.</w:t>
             </w:r>
           </w:p>
         </w:tc>
@@ -10792,7 +10781,13 @@
               <w:rPr>
                 <w:sz w:val="18"/>
               </w:rPr>
-              <w:t>Pipeline: no se despliega si la regresión baja de los umbrales de §7.</w:t>
+              <w:t>Pipeline: no se despliega si la regresión baja de los u</w:t>
+            </w:r>
+            <w:r>
+              <w:rPr>
+                <w:sz w:val="18"/>
+              </w:rPr>
+              <w:t>mbrales de §7.</w:t>
             </w:r>
           </w:p>
         </w:tc>
@@ -10944,13 +10939,7 @@
               <w:rPr>
                 <w:sz w:val="18"/>
               </w:rPr>
-              <w:t>La Lambda de aprobación verifica el grupo del aproba</w:t>
-            </w:r>
-            <w:r>
-              <w:rPr>
-                <w:sz w:val="18"/>
-              </w:rPr>
-              <w:t>dor contra la plataforma de tickets; el task token nunca sale de AWS; la aprobación queda registrada con la identidad.</w:t>
+              <w:t>La Lambda de aprobación verifica el grupo del aprobador contra la plataforma de tickets; el task token nunca sale de AWS; la aprobación queda registrada con la identidad.</w:t>
             </w:r>
           </w:p>
         </w:tc>
@@ -10970,7 +10959,13 @@
               <w:rPr>
                 <w:sz w:val="18"/>
               </w:rPr>
-              <w:t>Test: un webhook con un aprobador fuera del grupo NOC no reanuda el workflow; registro en Aurora y CloudTrail.</w:t>
+              <w:t>Test: un webhook con un ap</w:t>
+            </w:r>
+            <w:r>
+              <w:rPr>
+                <w:sz w:val="18"/>
+              </w:rPr>
+              <w:t>robador fuera del grupo NOC no reanuda el workflow; registro en Aurora y CloudTrail.</w:t>
             </w:r>
           </w:p>
         </w:tc>
@@ -11015,13 +11010,7 @@
               <w:rPr>
                 <w:sz w:val="18"/>
               </w:rPr>
-              <w:t>La</w:t>
-            </w:r>
-            <w:r>
-              <w:rPr>
-                <w:sz w:val="18"/>
-              </w:rPr>
-              <w:t>s credenciales on-prem se filtran.</w:t>
+              <w:t>Las credenciales on-prem se filtran.</w:t>
             </w:r>
           </w:p>
         </w:tc>
@@ -11061,7 +11050,13 @@
               <w:rPr>
                 <w:sz w:val="18"/>
               </w:rPr>
-              <w:t>Rotación automática verificada; escaneo de secretos en el repo.</w:t>
+              <w:t>Rotación automática verificada; escaneo de secretos</w:t>
+            </w:r>
+            <w:r>
+              <w:rPr>
+                <w:sz w:val="18"/>
+              </w:rPr>
+              <w:t xml:space="preserve"> en el repo.</w:t>
             </w:r>
           </w:p>
         </w:tc>
@@ -11146,13 +11141,7 @@
               <w:rPr>
                 <w:sz w:val="18"/>
               </w:rPr>
-              <w:t>Prueb</w:t>
-            </w:r>
-            <w:r>
-              <w:rPr>
-                <w:sz w:val="18"/>
-              </w:rPr>
-              <w:t>as de caos: simular el corte de Bedrock y verificar la derivación por reglas (caso C12).</w:t>
+              <w:t>Pruebas de caos: simular el corte de Bedrock y verificar la derivación por reglas (caso C12).</w:t>
             </w:r>
           </w:p>
         </w:tc>
@@ -11163,7 +11152,7 @@
         <w:pStyle w:val="Ttulo1"/>
       </w:pPr>
       <w:bookmarkStart w:id="24" w:name="_21008488f39fee772d9a18573a0731f090415fd"/>
-      <w:bookmarkStart w:id="25" w:name="_Toc243388822"/>
+      <w:bookmarkStart w:id="25" w:name="_Toc243390158"/>
       <w:r>
         <w:t>7. Estrategia de evaluación de la IA generativa</w:t>
       </w:r>
@@ -11175,9 +11164,12 @@
         <w:pStyle w:val="Ttulo2"/>
       </w:pPr>
       <w:bookmarkStart w:id="26" w:name="_69e1ab2a0c519af57549dc9feeb84d7cb8ee371"/>
-      <w:bookmarkStart w:id="27" w:name="_Toc243388823"/>
-      <w:r>
-        <w:t>7.1 Qué se evalúa</w:t>
+      <w:bookmarkStart w:id="27" w:name="_Toc243390159"/>
+      <w:r>
+        <w:t>7.1 Qué</w:t>
+      </w:r>
+      <w:r>
+        <w:t xml:space="preserve"> se evalúa</w:t>
       </w:r>
       <w:bookmarkEnd w:id="26"/>
       <w:bookmarkEnd w:id="27"/>
@@ -11389,13 +11381,7 @@
               <w:rPr>
                 <w:sz w:val="18"/>
               </w:rPr>
-              <w:t>Si trae el procedimiento y la Incidencia similar correctos</w:t>
-            </w:r>
-            <w:r>
-              <w:rPr>
-                <w:sz w:val="18"/>
-              </w:rPr>
-              <w:t>.</w:t>
+              <w:t>Si trae el procedimiento y la Incidencia similar correctos.</w:t>
             </w:r>
           </w:p>
         </w:tc>
@@ -11485,7 +11471,13 @@
               <w:rPr>
                 <w:sz w:val="18"/>
               </w:rPr>
-              <w:t>Fidelidad a la evidencia, completitud y utilidad para el Operador NOC.</w:t>
+              <w:t>F</w:t>
+            </w:r>
+            <w:r>
+              <w:rPr>
+                <w:sz w:val="18"/>
+              </w:rPr>
+              <w:t>idelidad a la evidencia, completitud y utilidad para el Operador NOC.</w:t>
             </w:r>
           </w:p>
         </w:tc>
@@ -11541,12 +11533,9 @@
         <w:pStyle w:val="Ttulo2"/>
       </w:pPr>
       <w:bookmarkStart w:id="28" w:name="_dd7ef81fdfe106eb5acc19d59b803376463f8ad"/>
-      <w:bookmarkStart w:id="29" w:name="_Toc243388824"/>
-      <w:r>
-        <w:t>7</w:t>
-      </w:r>
-      <w:r>
-        <w:t>.2 Tres capas</w:t>
+      <w:bookmarkStart w:id="29" w:name="_Toc243390160"/>
+      <w:r>
+        <w:t>7.2 Tres capas</w:t>
       </w:r>
       <w:bookmarkEnd w:id="28"/>
       <w:bookmarkEnd w:id="29"/>
@@ -11563,7 +11552,10 @@
         <w:t>Capa 1: determinista</w:t>
       </w:r>
       <w:r>
-        <w:t xml:space="preserve"> (en CI, en cada cambio de prompt, modelo, reglas o código).</w:t>
+        <w:t xml:space="preserve"> </w:t>
+      </w:r>
+      <w:r>
+        <w:t>(en CI, en cada cambio de prompt, modelo, reglas o código).</w:t>
       </w:r>
     </w:p>
     <w:p>
@@ -11587,7 +11579,10 @@
         </w:numPr>
       </w:pPr>
       <w:r>
-        <w:t>Reglas de urgencia, prioridad, SLA, ruteo, escalamiento y derivación con casos tabulados.</w:t>
+        <w:t>Reglas de urgencia, prioridad, SLA, ruteo, escalamiento y derivación con casos tabulados</w:t>
+      </w:r>
+      <w:r>
+        <w:t>.</w:t>
       </w:r>
     </w:p>
     <w:p>
@@ -11599,10 +11594,7 @@
         </w:numPr>
       </w:pPr>
       <w:r>
-        <w:t>Casos adversariales sobre salidas simuladas: acción de cam</w:t>
-      </w:r>
-      <w:r>
-        <w:t>bio inducida, cita alucinada, acción disfrazada, campos faltantes e IA caída.</w:t>
+        <w:t>Casos adversariales sobre salidas simuladas: acción de cambio inducida, cita alucinada, acción disfrazada, campos faltantes e IA caída.</w:t>
       </w:r>
     </w:p>
     <w:p>
@@ -11621,7 +11613,7 @@
         <w:t>Implementado en el prototipo</w:t>
       </w:r>
       <w:r>
-        <w:t>: 18 casos, todos pasan (</w:t>
+        <w:t>: 20 casos, todos pasan (</w:t>
       </w:r>
       <w:r>
         <w:rPr>
@@ -11630,7 +11622,10 @@
         <w:t>eval_deterministic.py</w:t>
       </w:r>
       <w:r>
-        <w:t xml:space="preserve">). Las salidas del modelo en esos casos son fijas: el prototipo verifica el </w:t>
+        <w:t xml:space="preserve">). Las salidas del modelo en esos casos son </w:t>
+      </w:r>
+      <w:r>
+        <w:t xml:space="preserve">fijas: el prototipo verifica el </w:t>
       </w:r>
       <w:r>
         <w:rPr>
@@ -11640,10 +11635,7 @@
         <w:t>validador y las reglas</w:t>
       </w:r>
       <w:r>
-        <w:t>, no l</w:t>
-      </w:r>
-      <w:r>
-        <w:t>a calidad ni la robustez de un modelo real.</w:t>
+        <w:t>, no la calidad ni la robustez de un modelo real.</w:t>
       </w:r>
     </w:p>
     <w:p>
@@ -11673,10 +11665,10 @@
         <w:t>Etiquetado.</w:t>
       </w:r>
       <w:r>
-        <w:t xml:space="preserve"> Ingenieros NOC senior etiquetan cada caso con la causa raíz (de una taxonomía controla</w:t>
-      </w:r>
-      <w:r>
-        <w:t>da de causas), el Equipo resolutor, la agrupación correcta de Alertas y los documentos relevantes. Un 20% se etiqueta dos veces para medir la concordancia entre etiquetadores.</w:t>
+        <w:t xml:space="preserve"> Ingenieros NOC senior etiq</w:t>
+      </w:r>
+      <w:r>
+        <w:t>uetan cada caso con la causa raíz (de una taxonomía controlada de causas), el Equipo resolutor, la agrupación correcta de Alertas y los documentos relevantes. Un 20% se etiqueta dos veces para medir la concordancia entre etiquetadores.</w:t>
       </w:r>
     </w:p>
     <w:tbl>
@@ -11779,7 +11771,14 @@
                 <w:b/>
                 <w:sz w:val="18"/>
               </w:rPr>
-              <w:t>Método</w:t>
+              <w:t>M</w:t>
+            </w:r>
+            <w:r>
+              <w:rPr>
+                <w:b/>
+                <w:sz w:val="18"/>
+              </w:rPr>
+              <w:t>étodo</w:t>
             </w:r>
           </w:p>
         </w:tc>
@@ -11850,13 +11849,7 @@
               <w:rPr>
                 <w:sz w:val="18"/>
               </w:rPr>
-              <w:t>Extracci</w:t>
-            </w:r>
-            <w:r>
-              <w:rPr>
-                <w:sz w:val="18"/>
-              </w:rPr>
-              <w:t>ón</w:t>
+              <w:t>Extracción</w:t>
             </w:r>
           </w:p>
         </w:tc>
@@ -13013,7 +13006,7 @@
         <w:pStyle w:val="Ttulo2"/>
       </w:pPr>
       <w:bookmarkStart w:id="30" w:name="_2d9f01ff85dd9820987480cab79557db403aeac"/>
-      <w:bookmarkStart w:id="31" w:name="_Toc243388825"/>
+      <w:bookmarkStart w:id="31" w:name="_Toc243390161"/>
       <w:r>
         <w:t>7.3 Despliegue gradual</w:t>
       </w:r>
@@ -13085,7 +13078,7 @@
         <w:pStyle w:val="Ttulo1"/>
       </w:pPr>
       <w:bookmarkStart w:id="32" w:name="_d8727e752cb31365f46bcadbe991ef572676e19"/>
-      <w:bookmarkStart w:id="33" w:name="_Toc243388826"/>
+      <w:bookmarkStart w:id="33" w:name="_Toc243390162"/>
       <w:r>
         <w:t>8. Operación</w:t>
       </w:r>
@@ -13100,7 +13093,7 @@
         <w:pStyle w:val="Ttulo2"/>
       </w:pPr>
       <w:bookmarkStart w:id="34" w:name="_37ea2f043d1ca71eac9f00ba764ac933ea83f2c"/>
-      <w:bookmarkStart w:id="35" w:name="_Toc243388827"/>
+      <w:bookmarkStart w:id="35" w:name="_Toc243390163"/>
       <w:r>
         <w:t>8.1 Latencia y costo (estimación)</w:t>
       </w:r>
@@ -13430,7 +13423,7 @@
               <w:rPr>
                 <w:sz w:val="18"/>
               </w:rPr>
-              <w:t>Agente (modelo medio, ≤8 tools)</w:t>
+              <w:t>Agente (modelo medio, ≤8 llamadas a tools)</w:t>
             </w:r>
           </w:p>
         </w:tc>
@@ -13616,17 +13609,20 @@
           <w:b/>
           <w:bCs/>
         </w:rPr>
-        <w:t>USD 0,15 por Incidencia</w:t>
-      </w:r>
-      <w:r>
-        <w:t xml:space="preserve">, unos </w:t>
+        <w:t>USD 0,16 por Incidencia</w:t>
+      </w:r>
+      <w:r>
+        <w:t xml:space="preserve"> (agente ≈ 0,12; resumen ≈ 0,04; extracción ≈ 0,0</w:t>
+      </w:r>
+      <w:r>
+        <w:t xml:space="preserve">03), unos </w:t>
       </w:r>
       <w:r>
         <w:rPr>
           <w:b/>
           <w:bCs/>
         </w:rPr>
-        <w:t>USD 45/día</w:t>
+        <w:t>USD 49/día</w:t>
       </w:r>
       <w:r>
         <w:t xml:space="preserve"> a 300 Incidencias/día. </w:t>
@@ -13636,20 +13632,13 @@
           <w:i/>
           <w:iCs/>
         </w:rPr>
-        <w:t>Los precios dependen del modelo e</w:t>
-      </w:r>
-      <w:r>
-        <w:rPr>
-          <w:i/>
-          <w:iCs/>
-        </w:rPr>
-        <w:t>legido y deben verificarse contra la lista vigente de Bedrock.</w:t>
-      </w:r>
-      <w:r>
-        <w:t xml:space="preserve"> Prompt caching sobre el system prompt y los contratos de tools lo reduciría. El costo de infraestructura (Aurora Serverless, Lambda, Direct Connect, Guardrails, embeddings) es aparte y está dom</w:t>
-      </w:r>
-      <w:r>
-        <w:t>inado por Direct Connect.</w:t>
+        <w:t>Los precios dependen del modelo elegido y deben verificarse contra la lista vigente de Bedrock.</w:t>
+      </w:r>
+      <w:r>
+        <w:t xml:space="preserve"> Prompt caching sobre el system prompt y los contratos de tools lo reduciría. El costo de infraestructura (Aurora Ser</w:t>
+      </w:r>
+      <w:r>
+        <w:t>verless, Lambda, Direct Connect, Guardrails, embeddings) es aparte y está dominado por Direct Connect.</w:t>
       </w:r>
     </w:p>
     <w:p>
@@ -13657,7 +13646,7 @@
         <w:pStyle w:val="Ttulo2"/>
       </w:pPr>
       <w:bookmarkStart w:id="36" w:name="_observabilidad"/>
-      <w:bookmarkStart w:id="37" w:name="_Toc243388828"/>
+      <w:bookmarkStart w:id="37" w:name="_Toc243390164"/>
       <w:r>
         <w:t>8.2 Observabilidad</w:t>
       </w:r>
@@ -13680,7 +13669,10 @@
         <w:t>Por Incidencia</w:t>
       </w:r>
       <w:r>
-        <w:t>: historial de Step Functions (90 días) + tabla de auditoría permanente (quién, qué, con qué evidencia, versión de prompt y modelo).</w:t>
+        <w:t>: historial de Step Functions (90 días) + tabla de auditoría permanente (quién, qué, con qué evidencia, versión de promp</w:t>
+      </w:r>
+      <w:r>
+        <w:t>t y modelo).</w:t>
       </w:r>
     </w:p>
     <w:p>
@@ -13699,10 +13691,7 @@
         <w:t>Por invocación LLM</w:t>
       </w:r>
       <w:r>
-        <w:t>: Bedrock invocation logging (S3 con Object Lo</w:t>
-      </w:r>
-      <w:r>
-        <w:t>ck) + métricas de tokens y latencia.</w:t>
+        <w:t>: Bedrock invocation logging (S3 con Object Lock) + métricas de tokens y latencia.</w:t>
       </w:r>
     </w:p>
     <w:p>
@@ -13729,7 +13718,7 @@
         <w:pStyle w:val="Ttulo2"/>
       </w:pPr>
       <w:bookmarkStart w:id="38" w:name="_resiliencia"/>
-      <w:bookmarkStart w:id="39" w:name="_Toc243388829"/>
+      <w:bookmarkStart w:id="39" w:name="_Toc243390165"/>
       <w:r>
         <w:t>8.3 Resiliencia</w:t>
       </w:r>
@@ -13741,10 +13730,10 @@
         <w:pStyle w:val="FirstParagraph"/>
       </w:pPr>
       <w:r>
-        <w:t xml:space="preserve">La IA es un acelerador, no una dependencia crítica: con Bedrock caído la operación continúa por reglas (E7). La ingesta es </w:t>
-      </w:r>
-      <w:r>
-        <w:t>durable (SQS + DLQ) y Step Functions reintenta por estado. El enlace con el operador es redundante (Direct Connect + VPN).</w:t>
+        <w:t>La IA es un acelerador, no una dependencia crí</w:t>
+      </w:r>
+      <w:r>
+        <w:t>tica: con Bedrock caído la operación continúa por reglas (E7). La ingesta es durable (SQS + DLQ) y Step Functions reintenta por estado. El enlace con el operador es redundante (Direct Connect + VPN).</w:t>
       </w:r>
     </w:p>
     <w:p>
@@ -13752,7 +13741,7 @@
         <w:pStyle w:val="Ttulo2"/>
       </w:pPr>
       <w:bookmarkStart w:id="40" w:name="_e475abed30fa52e794d704ef2cf4919481e087c"/>
-      <w:bookmarkStart w:id="41" w:name="_Toc243388830"/>
+      <w:bookmarkStart w:id="41" w:name="_Toc243390166"/>
       <w:r>
         <w:t>8.4 Supervisión humana</w:t>
       </w:r>
@@ -13768,10 +13757,10 @@
         </w:numPr>
       </w:pPr>
       <w:r>
-        <w:t xml:space="preserve">El Operador NOC decide en E1 y E3 (bloquean la derivación) y revisa en paralelo E2, E4, E5 y E6. Todo resumen </w:t>
-      </w:r>
-      <w:r>
-        <w:t>con errores del validador queda retenido hasta su revisión.</w:t>
+        <w:t>El Operador NOC decide en E1 y E3</w:t>
+      </w:r>
+      <w:r>
+        <w:t xml:space="preserve"> (bloquean la derivación) y revisa en paralelo E2, E4, E5 y E6. Todo resumen con errores del validador queda retenido hasta su revisión.</w:t>
       </w:r>
     </w:p>
     <w:p>
@@ -13795,7 +13784,10 @@
         </w:numPr>
       </w:pPr>
       <w:r>
-        <w:t>Las acciones de cambio nunca se ejecutan: se derivan a la gestión de cambios.</w:t>
+        <w:t xml:space="preserve">Las acciones de cambio nunca se ejecutan: se derivan a </w:t>
+      </w:r>
+      <w:r>
+        <w:t>la gestión de cambios.</w:t>
       </w:r>
     </w:p>
     <w:p>
@@ -13807,10 +13799,7 @@
         </w:numPr>
       </w:pPr>
       <w:r>
-        <w:t>Las correcciones del operador quedan registradas y ali</w:t>
-      </w:r>
-      <w:r>
-        <w:t>mentan la evaluación.</w:t>
+        <w:t>Las correcciones del operador quedan registradas y alimentan la evaluación.</w:t>
       </w:r>
     </w:p>
     <w:p>
@@ -13818,7 +13807,7 @@
         <w:pStyle w:val="Ttulo2"/>
       </w:pPr>
       <w:bookmarkStart w:id="42" w:name="_71f77f8eab6ad684eb9de56f8b1bbd750ae9343"/>
-      <w:bookmarkStart w:id="43" w:name="_Toc243388831"/>
+      <w:bookmarkStart w:id="43" w:name="_Toc243390167"/>
       <w:r>
         <w:t>8.5 Riesgos residuales</w:t>
       </w:r>
@@ -13841,7 +13830,10 @@
         <w:t>Correlación imperfecta</w:t>
       </w:r>
       <w:r>
-        <w:t>: Incidencias sin relación topológica conocida pueden quedar separadas. Se mide con precisión/recall por pares y se mitiga con revisión del operador.</w:t>
+        <w:t>: Incidencias sin relación topológica conocida pueden quedar separadas. Se mide con precisión/recall por pares y</w:t>
+      </w:r>
+      <w:r>
+        <w:t xml:space="preserve"> se mitiga con revisión del operador.</w:t>
       </w:r>
     </w:p>
     <w:p>
@@ -13857,14 +13849,7 @@
           <w:b/>
           <w:bCs/>
         </w:rPr>
-        <w:t xml:space="preserve">El validador de citas comprueba que la </w:t>
-      </w:r>
-      <w:r>
-        <w:rPr>
-          <w:b/>
-          <w:bCs/>
-        </w:rPr>
-        <w:t>evidencia existe, no que la respalde.</w:t>
+        <w:t>El validador de citas comprueba que la evidencia existe, no que la respalde.</w:t>
       </w:r>
       <w:r>
         <w:t xml:space="preserve"> Una cita real puede usarse para sostener una conclusión incorrecta. Se mitiga con groundedness en la evaluación y con revisión humana.</w:t>
@@ -13957,7 +13942,7 @@
         <w:pStyle w:val="Ttulo2"/>
       </w:pPr>
       <w:bookmarkStart w:id="44" w:name="_2a051840def5bc2000b770f663cf6617893998a"/>
-      <w:bookmarkStart w:id="45" w:name="_Toc243388832"/>
+      <w:bookmarkStart w:id="45" w:name="_Toc243390168"/>
       <w:r>
         <w:t>8.6 Pendientes antes de producción</w:t>
       </w:r>
@@ -14000,7 +13985,10 @@
         </w:numPr>
       </w:pPr>
       <w:r>
-        <w:t>Inventariar las APIs y webhooks reales de los sistemas on-prem y la plataforma de tickets (S2).</w:t>
+        <w:t>Inventariar las APIs y webhooks reales d</w:t>
+      </w:r>
+      <w:r>
+        <w:t>e los sistemas on-prem y la plataforma de tickets (S2).</w:t>
       </w:r>
     </w:p>
     <w:p>
@@ -14024,10 +14012,7 @@
         </w:numPr>
       </w:pPr>
       <w:r>
-        <w:t>Definir con negocio la matriz de prioridad, la tabla Sínto</w:t>
-      </w:r>
-      <w:r>
-        <w:t>ma → urgencia, el SLA y la tabla de ruteo reales (las del prototipo son supuestos).</w:t>
+        <w:t>Definir con negocio la matriz de prioridad, la tabla Síntoma → urgencia, el SLA y la tabla de ruteo reales (las del prototipo son supuestos).</w:t>
       </w:r>
     </w:p>
     <w:p>
@@ -14039,7 +14024,10 @@
         </w:numPr>
       </w:pPr>
       <w:r>
-        <w:t>Prueba de carga con picos 10× y prueba de caos de Bedrock y de los conectores.</w:t>
+        <w:t>Prueba de ca</w:t>
+      </w:r>
+      <w:r>
+        <w:t>rga con picos 10× y prueba de caos de Bedrock y de los conectores.</w:t>
       </w:r>
     </w:p>
     <w:p>
@@ -14059,12 +14047,9 @@
         <w:pStyle w:val="Ttulo1"/>
       </w:pPr>
       <w:bookmarkStart w:id="46" w:name="_a5ed2b4bf0fb80322b8db7f52b6310c044129d6"/>
-      <w:bookmarkStart w:id="47" w:name="_Toc243388833"/>
-      <w:r>
-        <w:t>9. Decisiones técnicas prin</w:t>
-      </w:r>
-      <w:r>
-        <w:t>cipales</w:t>
+      <w:bookmarkStart w:id="47" w:name="_Toc243390169"/>
+      <w:r>
+        <w:t>9. Decisiones técnicas principales</w:t>
       </w:r>
       <w:bookmarkEnd w:id="46"/>
       <w:bookmarkEnd w:id="47"/>
@@ -14186,7 +14171,13 @@
               <w:rPr>
                 <w:sz w:val="18"/>
               </w:rPr>
-              <w:t>Workflow determinista con un único agente de investigación (no un agente orquestador ni multi-agente).</w:t>
+              <w:t>Workflow determinista con un único agente de investigación (no un age</w:t>
+            </w:r>
+            <w:r>
+              <w:rPr>
+                <w:sz w:val="18"/>
+              </w:rPr>
+              <w:t>nte orquestador ni multi-agente).</w:t>
             </w:r>
           </w:p>
         </w:tc>
@@ -14301,7 +14292,7 @@
         <w:pStyle w:val="Ttulo1"/>
       </w:pPr>
       <w:bookmarkStart w:id="48" w:name="_2ece7273304f22a5b96354fbdfd9a08907327b3"/>
-      <w:bookmarkStart w:id="49" w:name="_Toc243388834"/>
+      <w:bookmarkStart w:id="49" w:name="_Toc243390170"/>
       <w:r>
         <w:t>10. Preguntas anticipadas</w:t>
       </w:r>
@@ -14457,7 +14448,7 @@
         <w:pStyle w:val="Ttulo1"/>
       </w:pPr>
       <w:bookmarkStart w:id="50" w:name="_923eadbdcfb4798034273fd952db44a0abe1d4f"/>
-      <w:bookmarkStart w:id="51" w:name="_Toc243388835"/>
+      <w:bookmarkStart w:id="51" w:name="_Toc243390171"/>
       <w:r>
         <w:t>Anexo A. Prototipo</w:t>
       </w:r>
@@ -14770,7 +14761,7 @@
               <w:rPr>
                 <w:sz w:val="18"/>
               </w:rPr>
-              <w:t>18 casos: normales, Tickets en texto libre, escalamiento, adversariales sobre salidas simuladas (acción inducida, cita alucinada, acción disfrazada, falso positivo) y degradación.</w:t>
+              <w:t>20 casos: normales, Tickets en texto libre, escalamiento, entradas fuera de catálogo, adversariales sobre salidas simuladas (acción inducida, cita alucinada, acción disfrazada, falso positivo) y degradación.</w:t>
             </w:r>
           </w:p>
         </w:tc>
@@ -14816,13 +14807,13 @@
               <w:rPr>
                 <w:sz w:val="18"/>
               </w:rPr>
-              <w:t xml:space="preserve">Corre los casos; sale con código 1 si alguno </w:t>
-            </w:r>
-            <w:r>
-              <w:rPr>
-                <w:sz w:val="18"/>
-              </w:rPr>
-              <w:t>falla (gate de CI).</w:t>
+              <w:t xml:space="preserve">Corre los casos; </w:t>
+            </w:r>
+            <w:r>
+              <w:rPr>
+                <w:sz w:val="18"/>
+              </w:rPr>
+              <w:t>sale con código 1 si alguno falla (gate de CI).</w:t>
             </w:r>
           </w:p>
         </w:tc>
@@ -14894,7 +14885,7 @@
         <w:rPr>
           <w:rStyle w:val="VerbatimChar"/>
         </w:rPr>
-        <w:t>18/18 casos OK</w:t>
+        <w:t>20/20 casos OK</w:t>
       </w:r>
       <w:r>
         <w:t>.</w:t>
@@ -14933,7 +14924,7 @@
   <w:abstractNum w:abstractNumId="0" w15:restartNumberingAfterBreak="0">
     <w:nsid w:val="0000A990"/>
     <w:multiLevelType w:val="multilevel"/>
-    <w:tmpl w:val="6BA655EE"/>
+    <w:tmpl w:val="94CCC518"/>
     <w:lvl w:ilvl="0">
       <w:numFmt w:val="bullet"/>
       <w:lvlText w:val=" "/>
@@ -15010,7 +15001,7 @@
   <w:abstractNum w:abstractNumId="1" w15:restartNumberingAfterBreak="0">
     <w:nsid w:val="0000A991"/>
     <w:multiLevelType w:val="multilevel"/>
-    <w:tmpl w:val="1EEC93F4"/>
+    <w:tmpl w:val="E5EACE5E"/>
     <w:lvl w:ilvl="0">
       <w:numFmt w:val="bullet"/>
       <w:lvlText w:val=""/>
@@ -15114,7 +15105,7 @@
   <w:abstractNum w:abstractNumId="2" w15:restartNumberingAfterBreak="0">
     <w:nsid w:val="00A99411"/>
     <w:multiLevelType w:val="multilevel"/>
-    <w:tmpl w:val="A14A2ABC"/>
+    <w:tmpl w:val="60AE626C"/>
     <w:lvl w:ilvl="0">
       <w:start w:val="1"/>
       <w:numFmt w:val="decimal"/>
@@ -16583,7 +16574,7 @@
     <w:autoRedefine/>
     <w:uiPriority w:val="39"/>
     <w:unhideWhenUsed/>
-    <w:rsid w:val="0083258D"/>
+    <w:rsid w:val="00297D25"/>
     <w:pPr>
       <w:spacing w:after="100"/>
     </w:pPr>
@@ -16595,7 +16586,7 @@
     <w:autoRedefine/>
     <w:uiPriority w:val="39"/>
     <w:unhideWhenUsed/>
-    <w:rsid w:val="0083258D"/>
+    <w:rsid w:val="00297D25"/>
     <w:pPr>
       <w:spacing w:after="100"/>
       <w:ind w:left="240"/>

</xml_diff>

<commit_message>
Agregar escalabilidad ante miles de eventos: modo tormenta, límites de capacidad y RDS Proxy
</commit_message>
<xml_diff>
--- a/docs/entregable/HACOM-Reto-AI-Engineer.docx
+++ b/docs/entregable/HACOM-Reto-AI-Engineer.docx
@@ -42,7 +42,7 @@
           <w:sz w:val="24"/>
           <w:szCs w:val="24"/>
         </w:rPr>
-        <w:id w:val="-962347649"/>
+        <w:id w:val="-633101487"/>
         <w:docPartObj>
           <w:docPartGallery w:val="Table of Contents"/>
           <w:docPartUnique/>
@@ -77,7 +77,7 @@
           <w:r>
             <w:fldChar w:fldCharType="separate"/>
           </w:r>
-          <w:hyperlink w:anchor="_Toc243391061" w:history="1">
+          <w:hyperlink w:anchor="_Toc243395666" w:history="1">
             <w:r>
               <w:rPr>
                 <w:rStyle w:val="Hyperlink"/>
@@ -104,7 +104,7 @@
                 <w:noProof/>
                 <w:webHidden/>
               </w:rPr>
-              <w:instrText xml:space="preserve"> PAGEREF _Toc243391061 \h </w:instrText>
+              <w:instrText xml:space="preserve"> PAGEREF _Toc243395666 \h </w:instrText>
             </w:r>
             <w:r>
               <w:rPr>
@@ -145,7 +145,7 @@
               <w:noProof/>
             </w:rPr>
           </w:pPr>
-          <w:hyperlink w:anchor="_Toc243391062" w:history="1">
+          <w:hyperlink w:anchor="_Toc243395667" w:history="1">
             <w:r>
               <w:rPr>
                 <w:rStyle w:val="Hyperlink"/>
@@ -172,7 +172,7 @@
                 <w:noProof/>
                 <w:webHidden/>
               </w:rPr>
-              <w:instrText xml:space="preserve"> PAGEREF _Toc243391062 \h </w:instrText>
+              <w:instrText xml:space="preserve"> PAGEREF _Toc243395667 \h </w:instrText>
             </w:r>
             <w:r>
               <w:rPr>
@@ -213,7 +213,7 @@
               <w:noProof/>
             </w:rPr>
           </w:pPr>
-          <w:hyperlink w:anchor="_Toc243391063" w:history="1">
+          <w:hyperlink w:anchor="_Toc243395668" w:history="1">
             <w:r>
               <w:rPr>
                 <w:rStyle w:val="Hyperlink"/>
@@ -240,7 +240,7 @@
                 <w:noProof/>
                 <w:webHidden/>
               </w:rPr>
-              <w:instrText xml:space="preserve"> PAGEREF _Toc243391063 \h </w:instrText>
+              <w:instrText xml:space="preserve"> PAGEREF _Toc243395668 \h </w:instrText>
             </w:r>
             <w:r>
               <w:rPr>
@@ -281,7 +281,7 @@
               <w:noProof/>
             </w:rPr>
           </w:pPr>
-          <w:hyperlink w:anchor="_Toc243391064" w:history="1">
+          <w:hyperlink w:anchor="_Toc243395669" w:history="1">
             <w:r>
               <w:rPr>
                 <w:rStyle w:val="Hyperlink"/>
@@ -308,7 +308,7 @@
                 <w:noProof/>
                 <w:webHidden/>
               </w:rPr>
-              <w:instrText xml:space="preserve"> PAGEREF _Toc243391064 \h </w:instrText>
+              <w:instrText xml:space="preserve"> PAGEREF _Toc243395669 \h </w:instrText>
             </w:r>
             <w:r>
               <w:rPr>
@@ -349,7 +349,7 @@
               <w:noProof/>
             </w:rPr>
           </w:pPr>
-          <w:hyperlink w:anchor="_Toc243391065" w:history="1">
+          <w:hyperlink w:anchor="_Toc243395670" w:history="1">
             <w:r>
               <w:rPr>
                 <w:rStyle w:val="Hyperlink"/>
@@ -376,7 +376,7 @@
                 <w:noProof/>
                 <w:webHidden/>
               </w:rPr>
-              <w:instrText xml:space="preserve"> PAGEREF _Toc243391065 \h </w:instrText>
+              <w:instrText xml:space="preserve"> PAGEREF _Toc243395670 \h </w:instrText>
             </w:r>
             <w:r>
               <w:rPr>
@@ -417,7 +417,7 @@
               <w:noProof/>
             </w:rPr>
           </w:pPr>
-          <w:hyperlink w:anchor="_Toc243391066" w:history="1">
+          <w:hyperlink w:anchor="_Toc243395671" w:history="1">
             <w:r>
               <w:rPr>
                 <w:rStyle w:val="Hyperlink"/>
@@ -444,7 +444,7 @@
                 <w:noProof/>
                 <w:webHidden/>
               </w:rPr>
-              <w:instrText xml:space="preserve"> PAGEREF _Toc243391066 \h </w:instrText>
+              <w:instrText xml:space="preserve"> PAGEREF _Toc243395671 \h </w:instrText>
             </w:r>
             <w:r>
               <w:rPr>
@@ -485,7 +485,7 @@
               <w:noProof/>
             </w:rPr>
           </w:pPr>
-          <w:hyperlink w:anchor="_Toc243391067" w:history="1">
+          <w:hyperlink w:anchor="_Toc243395672" w:history="1">
             <w:r>
               <w:rPr>
                 <w:rStyle w:val="Hyperlink"/>
@@ -512,7 +512,7 @@
                 <w:noProof/>
                 <w:webHidden/>
               </w:rPr>
-              <w:instrText xml:space="preserve"> PAGEREF _Toc243391067 \h </w:instrText>
+              <w:instrText xml:space="preserve"> PAGEREF _Toc243395672 \h </w:instrText>
             </w:r>
             <w:r>
               <w:rPr>
@@ -553,7 +553,7 @@
               <w:noProof/>
             </w:rPr>
           </w:pPr>
-          <w:hyperlink w:anchor="_Toc243391068" w:history="1">
+          <w:hyperlink w:anchor="_Toc243395673" w:history="1">
             <w:r>
               <w:rPr>
                 <w:rStyle w:val="Hyperlink"/>
@@ -580,7 +580,7 @@
                 <w:noProof/>
                 <w:webHidden/>
               </w:rPr>
-              <w:instrText xml:space="preserve"> PAGEREF _Toc243391068 \h </w:instrText>
+              <w:instrText xml:space="preserve"> PAGEREF _Toc243395673 \h </w:instrText>
             </w:r>
             <w:r>
               <w:rPr>
@@ -621,7 +621,7 @@
               <w:noProof/>
             </w:rPr>
           </w:pPr>
-          <w:hyperlink w:anchor="_Toc243391069" w:history="1">
+          <w:hyperlink w:anchor="_Toc243395674" w:history="1">
             <w:r>
               <w:rPr>
                 <w:rStyle w:val="Hyperlink"/>
@@ -648,7 +648,7 @@
                 <w:noProof/>
                 <w:webHidden/>
               </w:rPr>
-              <w:instrText xml:space="preserve"> PAGEREF _Toc243391069 \h </w:instrText>
+              <w:instrText xml:space="preserve"> PAGEREF _Toc243395674 \h </w:instrText>
             </w:r>
             <w:r>
               <w:rPr>
@@ -689,7 +689,7 @@
               <w:noProof/>
             </w:rPr>
           </w:pPr>
-          <w:hyperlink w:anchor="_Toc243391070" w:history="1">
+          <w:hyperlink w:anchor="_Toc243395675" w:history="1">
             <w:r>
               <w:rPr>
                 <w:rStyle w:val="Hyperlink"/>
@@ -716,7 +716,7 @@
                 <w:noProof/>
                 <w:webHidden/>
               </w:rPr>
-              <w:instrText xml:space="preserve"> PAGEREF _Toc243391070 \h </w:instrText>
+              <w:instrText xml:space="preserve"> PAGEREF _Toc243395675 \h </w:instrText>
             </w:r>
             <w:r>
               <w:rPr>
@@ -757,7 +757,7 @@
               <w:noProof/>
             </w:rPr>
           </w:pPr>
-          <w:hyperlink w:anchor="_Toc243391071" w:history="1">
+          <w:hyperlink w:anchor="_Toc243395676" w:history="1">
             <w:r>
               <w:rPr>
                 <w:rStyle w:val="Hyperlink"/>
@@ -784,7 +784,7 @@
                 <w:noProof/>
                 <w:webHidden/>
               </w:rPr>
-              <w:instrText xml:space="preserve"> PAGEREF _Toc243391071 \h </w:instrText>
+              <w:instrText xml:space="preserve"> PAGEREF _Toc243395676 \h </w:instrText>
             </w:r>
             <w:r>
               <w:rPr>
@@ -825,7 +825,7 @@
               <w:noProof/>
             </w:rPr>
           </w:pPr>
-          <w:hyperlink w:anchor="_Toc243391072" w:history="1">
+          <w:hyperlink w:anchor="_Toc243395677" w:history="1">
             <w:r>
               <w:rPr>
                 <w:rStyle w:val="Hyperlink"/>
@@ -852,7 +852,7 @@
                 <w:noProof/>
                 <w:webHidden/>
               </w:rPr>
-              <w:instrText xml:space="preserve"> PAGEREF _Toc243391072 \h </w:instrText>
+              <w:instrText xml:space="preserve"> PAGEREF _Toc243395677 \h </w:instrText>
             </w:r>
             <w:r>
               <w:rPr>
@@ -893,7 +893,7 @@
               <w:noProof/>
             </w:rPr>
           </w:pPr>
-          <w:hyperlink w:anchor="_Toc243391073" w:history="1">
+          <w:hyperlink w:anchor="_Toc243395678" w:history="1">
             <w:r>
               <w:rPr>
                 <w:rStyle w:val="Hyperlink"/>
@@ -920,7 +920,7 @@
                 <w:noProof/>
                 <w:webHidden/>
               </w:rPr>
-              <w:instrText xml:space="preserve"> PAGEREF _Toc243391073 \h </w:instrText>
+              <w:instrText xml:space="preserve"> PAGEREF _Toc243395678 \h </w:instrText>
             </w:r>
             <w:r>
               <w:rPr>
@@ -961,7 +961,7 @@
               <w:noProof/>
             </w:rPr>
           </w:pPr>
-          <w:hyperlink w:anchor="_Toc243391074" w:history="1">
+          <w:hyperlink w:anchor="_Toc243395679" w:history="1">
             <w:r>
               <w:rPr>
                 <w:rStyle w:val="Hyperlink"/>
@@ -988,7 +988,7 @@
                 <w:noProof/>
                 <w:webHidden/>
               </w:rPr>
-              <w:instrText xml:space="preserve"> PAGEREF _Toc243391074 \h </w:instrText>
+              <w:instrText xml:space="preserve"> PAGEREF _Toc243395679 \h </w:instrText>
             </w:r>
             <w:r>
               <w:rPr>
@@ -1029,7 +1029,7 @@
               <w:noProof/>
             </w:rPr>
           </w:pPr>
-          <w:hyperlink w:anchor="_Toc243391075" w:history="1">
+          <w:hyperlink w:anchor="_Toc243395680" w:history="1">
             <w:r>
               <w:rPr>
                 <w:rStyle w:val="Hyperlink"/>
@@ -1056,7 +1056,7 @@
                 <w:noProof/>
                 <w:webHidden/>
               </w:rPr>
-              <w:instrText xml:space="preserve"> PAGEREF _Toc243391075 \h </w:instrText>
+              <w:instrText xml:space="preserve"> PAGEREF _Toc243395680 \h </w:instrText>
             </w:r>
             <w:r>
               <w:rPr>
@@ -1097,7 +1097,7 @@
               <w:noProof/>
             </w:rPr>
           </w:pPr>
-          <w:hyperlink w:anchor="_Toc243391076" w:history="1">
+          <w:hyperlink w:anchor="_Toc243395681" w:history="1">
             <w:r>
               <w:rPr>
                 <w:rStyle w:val="Hyperlink"/>
@@ -1124,7 +1124,7 @@
                 <w:noProof/>
                 <w:webHidden/>
               </w:rPr>
-              <w:instrText xml:space="preserve"> PAGEREF _Toc243391076 \h </w:instrText>
+              <w:instrText xml:space="preserve"> PAGEREF _Toc243395681 \h </w:instrText>
             </w:r>
             <w:r>
               <w:rPr>
@@ -1165,7 +1165,7 @@
               <w:noProof/>
             </w:rPr>
           </w:pPr>
-          <w:hyperlink w:anchor="_Toc243391077" w:history="1">
+          <w:hyperlink w:anchor="_Toc243395682" w:history="1">
             <w:r>
               <w:rPr>
                 <w:rStyle w:val="Hyperlink"/>
@@ -1192,7 +1192,7 @@
                 <w:noProof/>
                 <w:webHidden/>
               </w:rPr>
-              <w:instrText xml:space="preserve"> PAGEREF _Toc243391077 \h </w:instrText>
+              <w:instrText xml:space="preserve"> PAGEREF _Toc243395682 \h </w:instrText>
             </w:r>
             <w:r>
               <w:rPr>
@@ -1212,7 +1212,7 @@
                 <w:noProof/>
                 <w:webHidden/>
               </w:rPr>
-              <w:t>16</w:t>
+              <w:t>17</w:t>
             </w:r>
             <w:r>
               <w:rPr>
@@ -1233,7 +1233,7 @@
               <w:noProof/>
             </w:rPr>
           </w:pPr>
-          <w:hyperlink w:anchor="_Toc243391078" w:history="1">
+          <w:hyperlink w:anchor="_Toc243395683" w:history="1">
             <w:r>
               <w:rPr>
                 <w:rStyle w:val="Hyperlink"/>
@@ -1260,7 +1260,7 @@
                 <w:noProof/>
                 <w:webHidden/>
               </w:rPr>
-              <w:instrText xml:space="preserve"> PAGEREF _Toc243391078 \h </w:instrText>
+              <w:instrText xml:space="preserve"> PAGEREF _Toc243395683 \h </w:instrText>
             </w:r>
             <w:r>
               <w:rPr>
@@ -1301,7 +1301,7 @@
               <w:noProof/>
             </w:rPr>
           </w:pPr>
-          <w:hyperlink w:anchor="_Toc243391079" w:history="1">
+          <w:hyperlink w:anchor="_Toc243395684" w:history="1">
             <w:r>
               <w:rPr>
                 <w:rStyle w:val="Hyperlink"/>
@@ -1328,7 +1328,7 @@
                 <w:noProof/>
                 <w:webHidden/>
               </w:rPr>
-              <w:instrText xml:space="preserve"> PAGEREF _Toc243391079 \h </w:instrText>
+              <w:instrText xml:space="preserve"> PAGEREF _Toc243395684 \h </w:instrText>
             </w:r>
             <w:r>
               <w:rPr>
@@ -1369,7 +1369,7 @@
               <w:noProof/>
             </w:rPr>
           </w:pPr>
-          <w:hyperlink w:anchor="_Toc243391080" w:history="1">
+          <w:hyperlink w:anchor="_Toc243395685" w:history="1">
             <w:r>
               <w:rPr>
                 <w:rStyle w:val="Hyperlink"/>
@@ -1396,7 +1396,7 @@
                 <w:noProof/>
                 <w:webHidden/>
               </w:rPr>
-              <w:instrText xml:space="preserve"> PAGEREF _Toc243391080 \h </w:instrText>
+              <w:instrText xml:space="preserve"> PAGEREF _Toc243395685 \h </w:instrText>
             </w:r>
             <w:r>
               <w:rPr>
@@ -1416,7 +1416,7 @@
                 <w:noProof/>
                 <w:webHidden/>
               </w:rPr>
-              <w:t>17</w:t>
+              <w:t>18</w:t>
             </w:r>
             <w:r>
               <w:rPr>
@@ -1437,7 +1437,7 @@
               <w:noProof/>
             </w:rPr>
           </w:pPr>
-          <w:hyperlink w:anchor="_Toc243391081" w:history="1">
+          <w:hyperlink w:anchor="_Toc243395686" w:history="1">
             <w:r>
               <w:rPr>
                 <w:rStyle w:val="Hyperlink"/>
@@ -1464,7 +1464,7 @@
                 <w:noProof/>
                 <w:webHidden/>
               </w:rPr>
-              <w:instrText xml:space="preserve"> PAGEREF _Toc243391081 \h </w:instrText>
+              <w:instrText xml:space="preserve"> PAGEREF _Toc243395686 \h </w:instrText>
             </w:r>
             <w:r>
               <w:rPr>
@@ -1484,7 +1484,7 @@
                 <w:noProof/>
                 <w:webHidden/>
               </w:rPr>
-              <w:t>17</w:t>
+              <w:t>18</w:t>
             </w:r>
             <w:r>
               <w:rPr>
@@ -1505,7 +1505,7 @@
               <w:noProof/>
             </w:rPr>
           </w:pPr>
-          <w:hyperlink w:anchor="_Toc243391082" w:history="1">
+          <w:hyperlink w:anchor="_Toc243395687" w:history="1">
             <w:r>
               <w:rPr>
                 <w:rStyle w:val="Hyperlink"/>
@@ -1532,7 +1532,7 @@
                 <w:noProof/>
                 <w:webHidden/>
               </w:rPr>
-              <w:instrText xml:space="preserve"> PAGEREF _Toc243391082 \h </w:instrText>
+              <w:instrText xml:space="preserve"> PAGEREF _Toc243395687 \h </w:instrText>
             </w:r>
             <w:r>
               <w:rPr>
@@ -1552,7 +1552,7 @@
                 <w:noProof/>
                 <w:webHidden/>
               </w:rPr>
-              <w:t>17</w:t>
+              <w:t>18</w:t>
             </w:r>
             <w:r>
               <w:rPr>
@@ -1573,7 +1573,7 @@
               <w:noProof/>
             </w:rPr>
           </w:pPr>
-          <w:hyperlink w:anchor="_Toc243391083" w:history="1">
+          <w:hyperlink w:anchor="_Toc243395688" w:history="1">
             <w:r>
               <w:rPr>
                 <w:rStyle w:val="Hyperlink"/>
@@ -1600,7 +1600,7 @@
                 <w:noProof/>
                 <w:webHidden/>
               </w:rPr>
-              <w:instrText xml:space="preserve"> PAGEREF _Toc243391083 \h </w:instrText>
+              <w:instrText xml:space="preserve"> PAGEREF _Toc243395688 \h </w:instrText>
             </w:r>
             <w:r>
               <w:rPr>
@@ -1641,7 +1641,7 @@
               <w:noProof/>
             </w:rPr>
           </w:pPr>
-          <w:hyperlink w:anchor="_Toc243391084" w:history="1">
+          <w:hyperlink w:anchor="_Toc243395689" w:history="1">
             <w:r>
               <w:rPr>
                 <w:rStyle w:val="Hyperlink"/>
@@ -1668,7 +1668,7 @@
                 <w:noProof/>
                 <w:webHidden/>
               </w:rPr>
-              <w:instrText xml:space="preserve"> PAGEREF _Toc243391084 \h </w:instrText>
+              <w:instrText xml:space="preserve"> PAGEREF _Toc243395689 \h </w:instrText>
             </w:r>
             <w:r>
               <w:rPr>
@@ -1709,7 +1709,7 @@
               <w:noProof/>
             </w:rPr>
           </w:pPr>
-          <w:hyperlink w:anchor="_Toc243391085" w:history="1">
+          <w:hyperlink w:anchor="_Toc243395690" w:history="1">
             <w:r>
               <w:rPr>
                 <w:rStyle w:val="Hyperlink"/>
@@ -1736,7 +1736,7 @@
                 <w:noProof/>
                 <w:webHidden/>
               </w:rPr>
-              <w:instrText xml:space="preserve"> PAGEREF _Toc243391085 \h </w:instrText>
+              <w:instrText xml:space="preserve"> PAGEREF _Toc243395690 \h </w:instrText>
             </w:r>
             <w:r>
               <w:rPr>
@@ -1756,7 +1756,7 @@
                 <w:noProof/>
                 <w:webHidden/>
               </w:rPr>
-              <w:t>18</w:t>
+              <w:t>19</w:t>
             </w:r>
             <w:r>
               <w:rPr>
@@ -1777,7 +1777,7 @@
               <w:noProof/>
             </w:rPr>
           </w:pPr>
-          <w:hyperlink w:anchor="_Toc243391086" w:history="1">
+          <w:hyperlink w:anchor="_Toc243395691" w:history="1">
             <w:r>
               <w:rPr>
                 <w:rStyle w:val="Hyperlink"/>
@@ -1804,7 +1804,7 @@
                 <w:noProof/>
                 <w:webHidden/>
               </w:rPr>
-              <w:instrText xml:space="preserve"> PAGEREF _Toc243391086 \h </w:instrText>
+              <w:instrText xml:space="preserve"> PAGEREF _Toc243395691 \h </w:instrText>
             </w:r>
             <w:r>
               <w:rPr>
@@ -1845,7 +1845,7 @@
               <w:noProof/>
             </w:rPr>
           </w:pPr>
-          <w:hyperlink w:anchor="_Toc243391087" w:history="1">
+          <w:hyperlink w:anchor="_Toc243395692" w:history="1">
             <w:r>
               <w:rPr>
                 <w:rStyle w:val="Hyperlink"/>
@@ -1872,7 +1872,7 @@
                 <w:noProof/>
                 <w:webHidden/>
               </w:rPr>
-              <w:instrText xml:space="preserve"> PAGEREF _Toc243391087 \h </w:instrText>
+              <w:instrText xml:space="preserve"> PAGEREF _Toc243395692 \h </w:instrText>
             </w:r>
             <w:r>
               <w:rPr>
@@ -1892,7 +1892,7 @@
                 <w:noProof/>
                 <w:webHidden/>
               </w:rPr>
-              <w:t>19</w:t>
+              <w:t>20</w:t>
             </w:r>
             <w:r>
               <w:rPr>
@@ -1915,7 +1915,7 @@
         <w:pStyle w:val="Ttulo1"/>
       </w:pPr>
       <w:bookmarkStart w:id="0" w:name="_56df7a16a9fe64f9452cb7ca4525fc3d95a27de"/>
-      <w:bookmarkStart w:id="1" w:name="_Toc243391061"/>
+      <w:bookmarkStart w:id="1" w:name="_Toc243395666"/>
       <w:r>
         <w:t>1. Resumen ejecutivo</w:t>
       </w:r>
@@ -2104,7 +2104,7 @@
         <w:pStyle w:val="Ttulo2"/>
       </w:pPr>
       <w:bookmarkStart w:id="2" w:name="_términos"/>
-      <w:bookmarkStart w:id="3" w:name="_Toc243391062"/>
+      <w:bookmarkStart w:id="3" w:name="_Toc243395667"/>
       <w:r>
         <w:t>Términos</w:t>
       </w:r>
@@ -2529,7 +2529,7 @@
         <w:pStyle w:val="Ttulo1"/>
       </w:pPr>
       <w:bookmarkStart w:id="4" w:name="_supuestos"/>
-      <w:bookmarkStart w:id="5" w:name="_Toc243391063"/>
+      <w:bookmarkStart w:id="5" w:name="_Toc243395668"/>
       <w:r>
         <w:t>2. Supuestos</w:t>
       </w:r>
@@ -3257,7 +3257,7 @@
         <w:pStyle w:val="Ttulo1"/>
       </w:pPr>
       <w:bookmarkStart w:id="6" w:name="_531a22751b42dbc4314ac29de4d0b14085fbf94"/>
-      <w:bookmarkStart w:id="7" w:name="_Toc243391064"/>
+      <w:bookmarkStart w:id="7" w:name="_Toc243395669"/>
       <w:r>
         <w:t>3. Matriz de decisiones de automatización</w:t>
       </w:r>
@@ -4509,7 +4509,7 @@
         <w:pStyle w:val="Ttulo2"/>
       </w:pPr>
       <w:bookmarkStart w:id="8" w:name="_a332b02800b6f461b86f3298789ccb95dfa4b32"/>
-      <w:bookmarkStart w:id="9" w:name="_Toc243391065"/>
+      <w:bookmarkStart w:id="9" w:name="_Toc243395670"/>
       <w:r>
         <w:t>Clasificación por actividad</w:t>
       </w:r>
@@ -5369,7 +5369,7 @@
         <w:pStyle w:val="Ttulo2"/>
       </w:pPr>
       <w:bookmarkStart w:id="10" w:name="_cc537778eb01bdc76d0f5f2669747e78821567e"/>
-      <w:bookmarkStart w:id="11" w:name="_Toc243391066"/>
+      <w:bookmarkStart w:id="11" w:name="_Toc243395671"/>
       <w:r>
         <w:t>Señales de escalamiento al Operador NOC</w:t>
       </w:r>
@@ -6049,7 +6049,7 @@
         </w:sectPr>
       </w:pPr>
       <w:bookmarkStart w:id="12" w:name="_856108c0b7ef2b2986130cc133917d17543cf90"/>
-      <w:bookmarkStart w:id="13" w:name="_Toc243391067"/>
+      <w:bookmarkStart w:id="13" w:name="_Toc243395672"/>
     </w:p>
     <w:p>
       <w:pPr>
@@ -6070,7 +6070,7 @@
           <w:noProof/>
         </w:rPr>
         <w:drawing>
-          <wp:inline distT="0" distB="0" distL="0" distR="0" wp14:anchorId="72F5556E" wp14:editId="5E69192A">
+          <wp:inline distT="0" distB="0" distL="0" distR="0" wp14:anchorId="4FD59553" wp14:editId="581E5BE4">
             <wp:extent cx="8788400" cy="3785247"/>
             <wp:effectExtent l="0" t="0" r="0" b="0"/>
             <wp:docPr id="17" name="Picture" descr="Arquitectura lógica"/>
@@ -6152,7 +6152,7 @@
         <w:pStyle w:val="Ttulo2"/>
       </w:pPr>
       <w:bookmarkStart w:id="14" w:name="_e0af0e1b985d8e69940266f243ca259d425efb7"/>
-      <w:bookmarkStart w:id="15" w:name="_Toc243391068"/>
+      <w:bookmarkStart w:id="15" w:name="_Toc243395673"/>
       <w:r>
         <w:t>4.1 Componentes, datos y límites de acceso</w:t>
       </w:r>
@@ -7371,7 +7371,7 @@
         <w:pStyle w:val="Ttulo2"/>
       </w:pPr>
       <w:bookmarkStart w:id="16" w:name="_memoria"/>
-      <w:bookmarkStart w:id="17" w:name="_Toc243391069"/>
+      <w:bookmarkStart w:id="17" w:name="_Toc243395674"/>
       <w:r>
         <w:t>4.2 Memoria</w:t>
       </w:r>
@@ -7778,7 +7778,7 @@
         <w:pStyle w:val="Ttulo2"/>
       </w:pPr>
       <w:bookmarkStart w:id="18" w:name="_da292b2665567be05c609dc3d76a9de4a1c3405"/>
-      <w:bookmarkStart w:id="19" w:name="_Toc243391070"/>
+      <w:bookmarkStart w:id="19" w:name="_Toc243395675"/>
       <w:r>
         <w:t>4.3 Estados, fallos y escalamiento del workflow</w:t>
       </w:r>
@@ -8147,6 +8147,77 @@
               <w:rPr>
                 <w:sz w:val="18"/>
               </w:rPr>
+              <w:t>Tormenta de eventos (por ejemplo, un corte masivo)</w:t>
+            </w:r>
+          </w:p>
+        </w:tc>
+        <w:tc>
+          <w:tcPr>
+            <w:tcW w:w="2500" w:type="pct"/>
+            <w:shd w:val="clear" w:color="auto" w:fill="auto"/>
+          </w:tcPr>
+          <w:p>
+            <w:pPr>
+              <w:pStyle w:val="Compact"/>
+              <w:rPr>
+                <w:sz w:val="18"/>
+              </w:rPr>
+            </w:pPr>
+            <w:r>
+              <w:rPr>
+                <w:sz w:val="18"/>
+              </w:rPr>
+              <w:t>La c</w:t>
+            </w:r>
+            <w:r>
+              <w:rPr>
+                <w:sz w:val="18"/>
+              </w:rPr>
+              <w:t>orrelación agrupa las Alertas de una misma causa en una sola Incidencia, así que el agente corre una vez y no por cada Alerta. Si aun así las Incidencias nuevas por minuto o el uso de la cuota de Bedrock superan un umbral (configurado en AppConfig), se act</w:t>
+            </w:r>
+            <w:r>
+              <w:rPr>
+                <w:sz w:val="18"/>
+              </w:rPr>
+              <w:t xml:space="preserve">iva el </w:t>
+            </w:r>
+            <w:r>
+              <w:rPr>
+                <w:b/>
+                <w:bCs/>
+                <w:sz w:val="18"/>
+              </w:rPr>
+              <w:t>modo tormenta</w:t>
+            </w:r>
+            <w:r>
+              <w:rPr>
+                <w:sz w:val="18"/>
+              </w:rPr>
+              <w:t>: el agente solo investiga P1 y P2, y el resto se deriva por reglas, marcado con E7, y queda en cola para un análisis diferido si sigue abierto. La derivación no se retrasa en ningún caso.</w:t>
+            </w:r>
+          </w:p>
+        </w:tc>
+      </w:tr>
+      <w:tr>
+        <w:trPr>
+          <w:cantSplit/>
+        </w:trPr>
+        <w:tc>
+          <w:tcPr>
+            <w:tcW w:w="2500" w:type="pct"/>
+            <w:shd w:val="clear" w:color="auto" w:fill="auto"/>
+          </w:tcPr>
+          <w:p>
+            <w:pPr>
+              <w:pStyle w:val="Compact"/>
+              <w:rPr>
+                <w:sz w:val="18"/>
+              </w:rPr>
+            </w:pPr>
+            <w:r>
+              <w:rPr>
+                <w:sz w:val="18"/>
+              </w:rPr>
               <w:t>Operador NOC no responde</w:t>
             </w:r>
           </w:p>
@@ -8167,13 +8238,13 @@
               <w:rPr>
                 <w:sz w:val="18"/>
               </w:rPr>
-              <w:t>Timeout ligado al SLA de la pr</w:t>
-            </w:r>
-            <w:r>
-              <w:rPr>
-                <w:sz w:val="18"/>
-              </w:rPr>
-              <w:t>ioridad. Al vencer, escala al supervisor de turno.</w:t>
+              <w:t>Timeout ligado al SLA</w:t>
+            </w:r>
+            <w:r>
+              <w:rPr>
+                <w:sz w:val="18"/>
+              </w:rPr>
+              <w:t xml:space="preserve"> de la prioridad. Al vencer, escala al supervisor de turno.</w:t>
             </w:r>
           </w:p>
         </w:tc>
@@ -8247,7 +8318,7 @@
           <w:noProof/>
         </w:rPr>
         <w:drawing>
-          <wp:inline distT="0" distB="0" distL="0" distR="0" wp14:anchorId="1E6D35CE" wp14:editId="00F750BB">
+          <wp:inline distT="0" distB="0" distL="0" distR="0" wp14:anchorId="3EFF2C05" wp14:editId="1FB81FF5">
             <wp:extent cx="4135942" cy="8852181"/>
             <wp:effectExtent l="0" t="0" r="0" b="0"/>
             <wp:docPr id="23" name="Picture" descr="Estados del workflow"/>
@@ -8313,7 +8384,7 @@
         </w:sectPr>
       </w:pPr>
       <w:bookmarkStart w:id="20" w:name="_860fae0d546a8198f589a398b85690e59be0668"/>
-      <w:bookmarkStart w:id="21" w:name="_Toc243391071"/>
+      <w:bookmarkStart w:id="21" w:name="_Toc243395676"/>
     </w:p>
     <w:p>
       <w:pPr>
@@ -8341,7 +8412,10 @@
         <w:t>Entrada</w:t>
       </w:r>
       <w:r>
-        <w:t>: la Incidencia enriquecida y seudonimizada (equipo, servicios, Alertas correlacionadas y prioridad).</w:t>
+        <w:t>: la Incidencia enriquecida y seudonimizada (equipo, servicios, Alertas correlacionadas y pri</w:t>
+      </w:r>
+      <w:r>
+        <w:t>oridad).</w:t>
       </w:r>
     </w:p>
     <w:p>
@@ -8442,10 +8516,10 @@
         <w:t>Salida</w:t>
       </w:r>
       <w:r>
-        <w:t>: hallazgos y una sugerencia de equipo</w:t>
-      </w:r>
-      <w:r>
-        <w:t xml:space="preserve">, cada afirmación con su </w:t>
+        <w:t xml:space="preserve">: hallazgos y una sugerencia </w:t>
+      </w:r>
+      <w:r>
+        <w:t xml:space="preserve">de equipo, cada afirmación con su </w:t>
       </w:r>
       <w:r>
         <w:rPr>
@@ -8473,10 +8547,7 @@
         <w:t>Límites</w:t>
       </w:r>
       <w:r>
-        <w:t>: máximo 8 tool calls, 90 s y un presupuesto de tokens. El contenido proveniente de Tickets y documentos v</w:t>
-      </w:r>
-      <w:r>
-        <w:t xml:space="preserve">a delimitado como </w:t>
+        <w:t xml:space="preserve">: máximo 8 tool calls, 90 s y un presupuesto de tokens. El contenido proveniente de Tickets y documentos va delimitado como </w:t>
       </w:r>
       <w:r>
         <w:rPr>
@@ -8486,7 +8557,10 @@
         <w:t>dato no confiable</w:t>
       </w:r>
       <w:r>
-        <w:t xml:space="preserve"> en el prompt.</w:t>
+        <w:t xml:space="preserve"> </w:t>
+      </w:r>
+      <w:r>
+        <w:t>en el prompt.</w:t>
       </w:r>
     </w:p>
     <w:p>
@@ -8513,7 +8587,7 @@
         <w:pStyle w:val="Ttulo1"/>
       </w:pPr>
       <w:bookmarkStart w:id="22" w:name="_1cf5811360d8bd240f5b6ff78ee18f92c7c09f4"/>
-      <w:bookmarkStart w:id="23" w:name="_Toc243391072"/>
+      <w:bookmarkStart w:id="23" w:name="_Toc243395677"/>
       <w:r>
         <w:t>5. Arquitectura física (AWS, híbrida)</w:t>
       </w:r>
@@ -8529,7 +8603,7 @@
           <w:noProof/>
         </w:rPr>
         <w:drawing>
-          <wp:inline distT="0" distB="0" distL="0" distR="0" wp14:anchorId="006A1663" wp14:editId="2AE0BBB3">
+          <wp:inline distT="0" distB="0" distL="0" distR="0" wp14:anchorId="224BB813" wp14:editId="75AEC395">
             <wp:extent cx="5677508" cy="7115985"/>
             <wp:effectExtent l="0" t="0" r="0" b="0"/>
             <wp:docPr id="28" name="Picture" descr="Arquitectura física"/>
@@ -8774,13 +8848,13 @@
               <w:rPr>
                 <w:sz w:val="18"/>
               </w:rPr>
-              <w:t xml:space="preserve">: endpoint inbound para que on-prem resuelva los nombres privados de AWS, y endpoint outbound con reglas de reenvío para que los conectores y el MCP resuelvan los </w:t>
-            </w:r>
-            <w:r>
-              <w:rPr>
-                <w:sz w:val="18"/>
-              </w:rPr>
-              <w:t>nombres de los sistemas on-prem</w:t>
+              <w:t>: endpoint inbound para que on-prem resuelva los nombres privados de AWS, y endpoint outbound con reglas de reenvío para que los conectores</w:t>
+            </w:r>
+            <w:r>
+              <w:rPr>
+                <w:sz w:val="18"/>
+              </w:rPr>
+              <w:t xml:space="preserve"> y el MCP resuelvan los nombres de los sistemas on-prem</w:t>
             </w:r>
           </w:p>
         </w:tc>
@@ -8915,13 +8989,13 @@
               <w:rPr>
                 <w:sz w:val="18"/>
               </w:rPr>
-              <w:t xml:space="preserve">Absorbe picos 10× (S3), con reintentos y DLQ, </w:t>
-            </w:r>
-            <w:r>
-              <w:rPr>
-                <w:sz w:val="18"/>
-              </w:rPr>
-              <w:t>sin código de pegamento.</w:t>
+              <w:t>Absorbe picos 10× (S3)</w:t>
+            </w:r>
+            <w:r>
+              <w:rPr>
+                <w:sz w:val="18"/>
+              </w:rPr>
+              <w:t>, con reintentos y DLQ, sin código de pegamento.</w:t>
             </w:r>
           </w:p>
         </w:tc>
@@ -9021,13 +9095,13 @@
               <w:rPr>
                 <w:sz w:val="18"/>
               </w:rPr>
-              <w:t xml:space="preserve"> para HITL (ADR 0001). El historial de ejecución se conserva 90 días; </w:t>
-            </w:r>
-            <w:r>
-              <w:rPr>
-                <w:sz w:val="18"/>
-              </w:rPr>
-              <w:t>la auditoría permanente se escribe en Aurora y S3.</w:t>
+              <w:t xml:space="preserve"> para HITL (ADR 0001). El historial de ejecuci</w:t>
+            </w:r>
+            <w:r>
+              <w:rPr>
+                <w:sz w:val="18"/>
+              </w:rPr>
+              <w:t>ón se conserva 90 días; la auditoría permanente se escribe en Aurora y S3.</w:t>
             </w:r>
           </w:p>
         </w:tc>
@@ -9492,33 +9566,39 @@
               <w:rPr>
                 <w:sz w:val="18"/>
               </w:rPr>
-              <w:t>. Su webhook entra por el API Gateway privado y una Lambda verifica, contra la API de tickets, que quien aprobó pertenece al grupo NOC; luego busca el task token en Auror</w:t>
-            </w:r>
-            <w:r>
-              <w:rPr>
-                <w:sz w:val="18"/>
-              </w:rPr>
-              <w:t>a y reanuda el workflow.</w:t>
-            </w:r>
-          </w:p>
-        </w:tc>
-        <w:tc>
-          <w:tcPr>
-            <w:tcW w:w="1250" w:type="pct"/>
-            <w:shd w:val="clear" w:color="auto" w:fill="auto"/>
-          </w:tcPr>
-          <w:p>
-            <w:pPr>
-              <w:pStyle w:val="Compact"/>
-              <w:rPr>
-                <w:sz w:val="18"/>
-              </w:rPr>
-            </w:pPr>
-            <w:r>
-              <w:rPr>
-                <w:sz w:val="18"/>
-              </w:rPr>
-              <w:t>Sin interfaz nueva: el operador trabaja donde ya trabaja, con su identidad corporativa. El task token nunca sale de AWS.</w:t>
+              <w:t>. Su webho</w:t>
+            </w:r>
+            <w:r>
+              <w:rPr>
+                <w:sz w:val="18"/>
+              </w:rPr>
+              <w:t>ok entra por el API Gateway privado y una Lambda verifica, contra la API de tickets, que quien aprobó pertenece al grupo NOC; luego busca el task token en Aurora y reanuda el workflow.</w:t>
+            </w:r>
+          </w:p>
+        </w:tc>
+        <w:tc>
+          <w:tcPr>
+            <w:tcW w:w="1250" w:type="pct"/>
+            <w:shd w:val="clear" w:color="auto" w:fill="auto"/>
+          </w:tcPr>
+          <w:p>
+            <w:pPr>
+              <w:pStyle w:val="Compact"/>
+              <w:rPr>
+                <w:sz w:val="18"/>
+              </w:rPr>
+            </w:pPr>
+            <w:r>
+              <w:rPr>
+                <w:sz w:val="18"/>
+              </w:rPr>
+              <w:t>Sin interfaz nueva: el operador trabaja donde ya trabaja, con su identi</w:t>
+            </w:r>
+            <w:r>
+              <w:rPr>
+                <w:sz w:val="18"/>
+              </w:rPr>
+              <w:t>dad corporativa. El task token nunca sale de AWS.</w:t>
             </w:r>
           </w:p>
         </w:tc>
@@ -9591,19 +9671,13 @@
               <w:rPr>
                 <w:sz w:val="18"/>
               </w:rPr>
-              <w:t>: un modelo fundaci</w:t>
-            </w:r>
-            <w:r>
-              <w:rPr>
-                <w:sz w:val="18"/>
-              </w:rPr>
-              <w:t>onal de nivel pequeño (extracción) y uno de nivel medio (agente y resumen), con versión fijada. Opciones en Bedrock: Anthropic Claude, Amazon Nova, Meta Llama o Mistral; la elección final se hace con el golden set de §7 (calidad en español, tool use, costo</w:t>
-            </w:r>
-            <w:r>
-              <w:rPr>
-                <w:sz w:val="18"/>
-              </w:rPr>
-              <w:t xml:space="preserve"> y latencia).</w:t>
+              <w:t>: un modelo fundacional de nivel pequeño (extracción) y uno de nivel medio (agente y resumen), con versión fijada. Opciones en Bedrock: Anthropic Claude, Amazon Nova, Meta Llama o Mistral; la elección final se hace con el golden set de §7 (calidad en españ</w:t>
+            </w:r>
+            <w:r>
+              <w:rPr>
+                <w:sz w:val="18"/>
+              </w:rPr>
+              <w:t>ol, tool use, costo y latencia).</w:t>
             </w:r>
           </w:p>
         </w:tc>
@@ -9643,13 +9717,13 @@
               <w:rPr>
                 <w:sz w:val="18"/>
               </w:rPr>
-              <w:t>Self-hosting en GPU: mayor costo y operación; queda</w:t>
-            </w:r>
-            <w:r>
-              <w:rPr>
-                <w:sz w:val="18"/>
-              </w:rPr>
-              <w:t xml:space="preserve"> como plan B ante S1.</w:t>
+              <w:t>Self-hosting en GP</w:t>
+            </w:r>
+            <w:r>
+              <w:rPr>
+                <w:sz w:val="18"/>
+              </w:rPr>
+              <w:t>U: mayor costo y operación; queda como plan B ante S1.</w:t>
             </w:r>
           </w:p>
         </w:tc>
@@ -9783,13 +9857,7 @@
                 <w:bCs/>
                 <w:sz w:val="18"/>
               </w:rPr>
-              <w:t>Bedrock Knowledge Bases</w:t>
-            </w:r>
-            <w:r>
-              <w:rPr>
-                <w:sz w:val="18"/>
-              </w:rPr>
-              <w:t xml:space="preserve"> sobre </w:t>
+              <w:t>Bedrock Knowled</w:t>
             </w:r>
             <w:r>
               <w:rPr>
@@ -9797,7 +9865,13 @@
                 <w:bCs/>
                 <w:sz w:val="18"/>
               </w:rPr>
-              <w:t xml:space="preserve">Aurora PostgreSQL </w:t>
+              <w:t>ge Bases</w:t>
+            </w:r>
+            <w:r>
+              <w:rPr>
+                <w:sz w:val="18"/>
+              </w:rPr>
+              <w:t xml:space="preserve"> sobre </w:t>
             </w:r>
             <w:r>
               <w:rPr>
@@ -9805,7 +9879,7 @@
                 <w:bCs/>
                 <w:sz w:val="18"/>
               </w:rPr>
-              <w:t>+ pgvector</w:t>
+              <w:t>Aurora PostgreSQL + pgvector</w:t>
             </w:r>
             <w:r>
               <w:rPr>
@@ -9844,13 +9918,13 @@
               <w:rPr>
                 <w:sz w:val="18"/>
               </w:rPr>
-              <w:t>Ingesta y chunking gestionados; pgvector reutiliza el mism</w:t>
-            </w:r>
-            <w:r>
-              <w:rPr>
-                <w:sz w:val="18"/>
-              </w:rPr>
-              <w:t>o Aurora. Embeddings multilingües porque la documentación está en español.</w:t>
+              <w:t>Ingesta y chunking gestio</w:t>
+            </w:r>
+            <w:r>
+              <w:rPr>
+                <w:sz w:val="18"/>
+              </w:rPr>
+              <w:t>nados; pgvector reutiliza el mismo Aurora. Embeddings multilingües porque la documentación está en español.</w:t>
             </w:r>
           </w:p>
         </w:tc>
@@ -9937,13 +10011,13 @@
               <w:rPr>
                 <w:sz w:val="18"/>
               </w:rPr>
-              <w:t>Memoria de la Incidencia, auditoría, task tokens y vectores en un sol</w:t>
-            </w:r>
-            <w:r>
-              <w:rPr>
-                <w:sz w:val="18"/>
-              </w:rPr>
-              <w:t>o motor relacional.</w:t>
+              <w:t>Memoria de la Incidencia, auditoría,</w:t>
+            </w:r>
+            <w:r>
+              <w:rPr>
+                <w:sz w:val="18"/>
+              </w:rPr>
+              <w:t xml:space="preserve"> task tokens y vectores en un solo motor relacional.</w:t>
             </w:r>
           </w:p>
         </w:tc>
@@ -10044,7 +10118,13 @@
               <w:rPr>
                 <w:sz w:val="18"/>
               </w:rPr>
-              <w:t>Fuentes del RAG y auditoría inmutable de prompts y respuestas.</w:t>
+              <w:t>Fuentes del RAG y auditoría inmutable de prompts y res</w:t>
+            </w:r>
+            <w:r>
+              <w:rPr>
+                <w:sz w:val="18"/>
+              </w:rPr>
+              <w:t>puestas.</w:t>
             </w:r>
           </w:p>
         </w:tc>
@@ -10109,13 +10189,7 @@
               <w:rPr>
                 <w:sz w:val="18"/>
               </w:rPr>
-              <w:t>Humanos: ap</w:t>
-            </w:r>
-            <w:r>
-              <w:rPr>
-                <w:sz w:val="18"/>
-              </w:rPr>
-              <w:t xml:space="preserve">rueban con su identidad en la plataforma de tickets (federada al IdP del operador). </w:t>
+              <w:t xml:space="preserve">Humanos: aprueban con su identidad en la plataforma de tickets (federada al IdP del operador). </w:t>
             </w:r>
             <w:r>
               <w:rPr>
@@ -10129,7 +10203,13 @@
               <w:rPr>
                 <w:sz w:val="18"/>
               </w:rPr>
-              <w:t xml:space="preserve"> federado al IdP solo para administración de AWS. Servicios: un rol IAM por componente.</w:t>
+              <w:t xml:space="preserve"> </w:t>
+            </w:r>
+            <w:r>
+              <w:rPr>
+                <w:sz w:val="18"/>
+              </w:rPr>
+              <w:t>federado al IdP solo para administración de AWS. Servicios: un rol IAM por componente.</w:t>
             </w:r>
           </w:p>
         </w:tc>
@@ -10256,7 +10336,13 @@
               <w:rPr>
                 <w:sz w:val="18"/>
               </w:rPr>
-              <w:t>Credenciales de conectores fuera del código; cifrado en reposo.</w:t>
+              <w:t>Credenciales de conectores f</w:t>
+            </w:r>
+            <w:r>
+              <w:rPr>
+                <w:sz w:val="18"/>
+              </w:rPr>
+              <w:t>uera del código; cifrado en reposo.</w:t>
             </w:r>
           </w:p>
         </w:tc>
@@ -10329,15 +10415,7 @@
                 <w:bCs/>
                 <w:sz w:val="18"/>
               </w:rPr>
-              <w:t>VPC endpo</w:t>
-            </w:r>
-            <w:r>
-              <w:rPr>
-                <w:b/>
-                <w:bCs/>
-                <w:sz w:val="18"/>
-              </w:rPr>
-              <w:t>ints</w:t>
+              <w:t>VPC endpoints</w:t>
             </w:r>
             <w:r>
               <w:rPr>
@@ -10557,7 +10635,7 @@
               <w:rPr>
                 <w:sz w:val="18"/>
               </w:rPr>
-              <w:t>Observabilidad</w:t>
+              <w:t>Capacidad ante picos</w:t>
             </w:r>
           </w:p>
         </w:tc>
@@ -10579,19 +10657,7 @@
                 <w:bCs/>
                 <w:sz w:val="18"/>
               </w:rPr>
-              <w:t>CloudWatch</w:t>
-            </w:r>
-            <w:r>
-              <w:rPr>
-                <w:sz w:val="18"/>
-              </w:rPr>
-              <w:t xml:space="preserve"> (métricas, lo</w:t>
-            </w:r>
-            <w:r>
-              <w:rPr>
-                <w:sz w:val="18"/>
-              </w:rPr>
-              <w:t xml:space="preserve">gs, alarmas), </w:t>
+              <w:t>Concurrencia reser</w:t>
             </w:r>
             <w:r>
               <w:rPr>
@@ -10599,13 +10665,165 @@
                 <w:bCs/>
                 <w:sz w:val="18"/>
               </w:rPr>
+              <w:t>vada</w:t>
+            </w:r>
+            <w:r>
+              <w:rPr>
+                <w:sz w:val="18"/>
+              </w:rPr>
+              <w:t xml:space="preserve"> del agente, dimensionada a la cuota de Bedrock; </w:t>
+            </w:r>
+            <w:r>
+              <w:rPr>
+                <w:b/>
+                <w:bCs/>
+                <w:sz w:val="18"/>
+              </w:rPr>
+              <w:t>RDS Proxy</w:t>
+            </w:r>
+            <w:r>
+              <w:rPr>
+                <w:sz w:val="18"/>
+              </w:rPr>
+              <w:t xml:space="preserve"> entre las Lambdas y Aurora; concurrencia limitada en </w:t>
+            </w:r>
+            <w:r>
+              <w:rPr>
+                <w:rStyle w:val="VerbatimChar"/>
+                <w:sz w:val="18"/>
+              </w:rPr>
+              <w:t>ticket-writer</w:t>
+            </w:r>
+            <w:r>
+              <w:rPr>
+                <w:sz w:val="18"/>
+              </w:rPr>
+              <w:t xml:space="preserve"> y en los conectores según el límite de solicitudes de cada sistema del operador; caché corta en el MCP para datos de inventari</w:t>
+            </w:r>
+            <w:r>
+              <w:rPr>
+                <w:sz w:val="18"/>
+              </w:rPr>
+              <w:t>o y topología. Si el volumen alto es sostenido, inferencia entre regiones o capacidad reservada de Bedrock (provisioned throughput).</w:t>
+            </w:r>
+          </w:p>
+        </w:tc>
+        <w:tc>
+          <w:tcPr>
+            <w:tcW w:w="1250" w:type="pct"/>
+            <w:shd w:val="clear" w:color="auto" w:fill="auto"/>
+          </w:tcPr>
+          <w:p>
+            <w:pPr>
+              <w:pStyle w:val="Compact"/>
+              <w:rPr>
+                <w:sz w:val="18"/>
+              </w:rPr>
+            </w:pPr>
+            <w:r>
+              <w:rPr>
+                <w:sz w:val="18"/>
+              </w:rPr>
+              <w:t xml:space="preserve">El cuello de botella ante miles de eventos no es la ingesta, sino la cuota del modelo, las conexiones a la base de datos y </w:t>
+            </w:r>
+            <w:r>
+              <w:rPr>
+                <w:sz w:val="18"/>
+              </w:rPr>
+              <w:t>las APIs on-prem. Con estos límites, el exceso se encola y se reintenta en lugar de fallar.</w:t>
+            </w:r>
+          </w:p>
+        </w:tc>
+        <w:tc>
+          <w:tcPr>
+            <w:tcW w:w="1250" w:type="pct"/>
+            <w:shd w:val="clear" w:color="auto" w:fill="auto"/>
+          </w:tcPr>
+          <w:p>
+            <w:pPr>
+              <w:pStyle w:val="Compact"/>
+              <w:rPr>
+                <w:sz w:val="18"/>
+              </w:rPr>
+            </w:pPr>
+            <w:r>
+              <w:rPr>
+                <w:sz w:val="18"/>
+              </w:rPr>
+              <w:t>Escalar sin límites: agota las cuotas de Bedrock y satura los sistemas del operador.</w:t>
+            </w:r>
+          </w:p>
+        </w:tc>
+      </w:tr>
+      <w:tr>
+        <w:trPr>
+          <w:cantSplit/>
+        </w:trPr>
+        <w:tc>
+          <w:tcPr>
+            <w:tcW w:w="1250" w:type="pct"/>
+            <w:shd w:val="clear" w:color="auto" w:fill="auto"/>
+          </w:tcPr>
+          <w:p>
+            <w:pPr>
+              <w:pStyle w:val="Compact"/>
+              <w:rPr>
+                <w:sz w:val="18"/>
+              </w:rPr>
+            </w:pPr>
+            <w:r>
+              <w:rPr>
+                <w:sz w:val="18"/>
+              </w:rPr>
+              <w:t>Observabilidad</w:t>
+            </w:r>
+          </w:p>
+        </w:tc>
+        <w:tc>
+          <w:tcPr>
+            <w:tcW w:w="1250" w:type="pct"/>
+            <w:shd w:val="clear" w:color="auto" w:fill="auto"/>
+          </w:tcPr>
+          <w:p>
+            <w:pPr>
+              <w:pStyle w:val="Compact"/>
+              <w:rPr>
+                <w:sz w:val="18"/>
+              </w:rPr>
+            </w:pPr>
+            <w:r>
+              <w:rPr>
+                <w:b/>
+                <w:bCs/>
+                <w:sz w:val="18"/>
+              </w:rPr>
+              <w:t>CloudWatch</w:t>
+            </w:r>
+            <w:r>
+              <w:rPr>
+                <w:sz w:val="18"/>
+              </w:rPr>
+              <w:t xml:space="preserve"> (métricas, logs, alarmas), </w:t>
+            </w:r>
+            <w:r>
+              <w:rPr>
+                <w:b/>
+                <w:bCs/>
+                <w:sz w:val="18"/>
+              </w:rPr>
               <w:t>CloudTrail</w:t>
             </w:r>
             <w:r>
               <w:rPr>
                 <w:sz w:val="18"/>
               </w:rPr>
-              <w:t xml:space="preserve"> (API), Bedrock invocation logging, historial de Step Functions</w:t>
+              <w:t xml:space="preserve"> (API), Bedrock</w:t>
+            </w:r>
+            <w:r>
+              <w:rPr>
+                <w:sz w:val="18"/>
+              </w:rPr>
+              <w:t xml:space="preserve"> invocation logging, historial de Step Functions</w:t>
             </w:r>
           </w:p>
         </w:tc>
@@ -10663,13 +10881,10 @@
         <w:t>Región.</w:t>
       </w:r>
       <w:r>
-        <w:t xml:space="preserve"> La región de referencia es us-east-1,</w:t>
-      </w:r>
-      <w:r>
-        <w:t xml:space="preserve"> por disponibilidad de modelos en Bedrock. Si el operador exige residencia en Latinoamérica, hay que validar antes de producción la disponibilidad de los modelos y de Knowledge Bases en sa-east-1 o mx-central-1, y si requieren perfil de inferencia geográfi</w:t>
-      </w:r>
-      <w:r>
-        <w:t>co (ver S1 y §8.6).</w:t>
+        <w:t xml:space="preserve"> La región de referencia es us-east-1, por disponibilidad de modelos en Bedrock. Si el operador exige residencia en Latinoamérica, hay que validar an</w:t>
+      </w:r>
+      <w:r>
+        <w:t>tes de producción la disponibilidad de los modelos y de Knowledge Bases en sa-east-1 o mx-central-1, y si requieren perfil de inferencia geográfico (ver S1 y §8.6).</w:t>
       </w:r>
     </w:p>
     <w:p>
@@ -10677,7 +10892,7 @@
         <w:pStyle w:val="Ttulo1"/>
       </w:pPr>
       <w:bookmarkStart w:id="24" w:name="_1dc88d82289d67e1ea4472534f9f223778a3ba7"/>
-      <w:bookmarkStart w:id="25" w:name="_Toc243391073"/>
+      <w:bookmarkStart w:id="25" w:name="_Toc243395678"/>
       <w:r>
         <w:t>6. Seguridad: matriz de riesgos y controles</w:t>
       </w:r>
@@ -10891,7 +11106,13 @@
               <w:rPr>
                 <w:sz w:val="18"/>
               </w:rPr>
-              <w:t>El texto de un Ticket o de un documento instruye “reinicia el router”, o intenta sesgar el resumen o el ruteo.</w:t>
+              <w:t>El texto de un Ticket o de un documento instruye “reinicia el router”, o intenta sesgar el resumen o el r</w:t>
+            </w:r>
+            <w:r>
+              <w:rPr>
+                <w:sz w:val="18"/>
+              </w:rPr>
+              <w:t>uteo.</w:t>
             </w:r>
           </w:p>
         </w:tc>
@@ -10911,13 +11132,7 @@
               <w:rPr>
                 <w:sz w:val="18"/>
               </w:rPr>
-              <w:t>El agente no tiene tools de escritura (ADR 0003); el contenido externo va delimitado como dato no confiable; G</w:t>
-            </w:r>
-            <w:r>
-              <w:rPr>
-                <w:sz w:val="18"/>
-              </w:rPr>
-              <w:t>uardrails contra prompt attacks; el ruteo y la prioridad son por reglas; los hechos exigen evidencia de tools, no del texto del Ticket.</w:t>
+              <w:t>El agente no tiene tools de escritura (ADR 0003); el contenido externo va delimitado como dato no confiable; Guardrails contra prompt attacks; el ruteo y la prioridad son por reglas; los hechos exigen evidencia de tools, no del texto del Ticket.</w:t>
             </w:r>
           </w:p>
         </w:tc>
@@ -10937,13 +11152,19 @@
               <w:rPr>
                 <w:sz w:val="18"/>
               </w:rPr>
-              <w:t>Red-team periódico con el modelo real (tasa de bloqueo en la capa 2 de §7). El caso C07 del prototipo verifica solo la ú</w:t>
-            </w:r>
-            <w:r>
-              <w:rPr>
-                <w:sz w:val="18"/>
-              </w:rPr>
-              <w:t>ltima barrera: que el validador detecte una acción de cambio inducida y retenga el resumen para que no se publique (la salida del modelo es simulada).</w:t>
+              <w:t>Red-</w:t>
+            </w:r>
+            <w:r>
+              <w:rPr>
+                <w:sz w:val="18"/>
+              </w:rPr>
+              <w:t xml:space="preserve">team periódico con el modelo real (tasa de bloqueo en la capa 2 de §7). El caso C07 del prototipo verifica solo la última barrera: que el validador detecte una acción de cambio inducida y retenga el resumen para que no se publique (la salida del modelo es </w:t>
+            </w:r>
+            <w:r>
+              <w:rPr>
+                <w:sz w:val="18"/>
+              </w:rPr>
+              <w:t>simulada).</w:t>
             </w:r>
           </w:p>
         </w:tc>
@@ -11010,13 +11231,7 @@
               <w:rPr>
                 <w:sz w:val="18"/>
               </w:rPr>
-              <w:t>Rol del agente con una lista</w:t>
-            </w:r>
-            <w:r>
-              <w:rPr>
-                <w:sz w:val="18"/>
-              </w:rPr>
-              <w:t xml:space="preserve"> cerrada de acciones: </w:t>
+              <w:t xml:space="preserve">Rol del agente con una lista cerrada de acciones: </w:t>
             </w:r>
             <w:r>
               <w:rPr>
@@ -11042,7 +11257,13 @@
               <w:rPr>
                 <w:sz w:val="18"/>
               </w:rPr>
-              <w:t xml:space="preserve"> sobre los modelos y el perfil de inferencia elegidos, y </w:t>
+              <w:t xml:space="preserve"> </w:t>
+            </w:r>
+            <w:r>
+              <w:rPr>
+                <w:sz w:val="18"/>
+              </w:rPr>
+              <w:t xml:space="preserve">sobre los modelos y el perfil de inferencia elegidos, y </w:t>
             </w:r>
             <w:r>
               <w:rPr>
@@ -11068,13 +11289,7 @@
               <w:rPr>
                 <w:sz w:val="18"/>
               </w:rPr>
-              <w:t>. Cuentas on-prem del MCP de solo lectur</w:t>
-            </w:r>
-            <w:r>
-              <w:rPr>
-                <w:sz w:val="18"/>
-              </w:rPr>
-              <w:t>a. Security groups que limitan la salida del agente.</w:t>
+              <w:t>. Cuentas on-prem del MCP de solo lectura. Security groups que limitan la salida del agente.</w:t>
             </w:r>
           </w:p>
         </w:tc>
@@ -11094,7 +11309,13 @@
               <w:rPr>
                 <w:sz w:val="18"/>
               </w:rPr>
-              <w:t>Policy-as-code en CI (cfn-guard o Checkov): el build falla si el rol del agente tiene cualquier acción fuera de esa lista cerrada o comodines (</w:t>
+              <w:t>Policy-as-code en CI (</w:t>
+            </w:r>
+            <w:r>
+              <w:rPr>
+                <w:sz w:val="18"/>
+              </w:rPr>
+              <w:t>cfn-guard o Checkov): el build falla si el rol del agente tiene cualquier acción fuera de esa lista cerrada o comodines (</w:t>
             </w:r>
             <w:r>
               <w:rPr>
@@ -11121,13 +11342,7 @@
               <w:rPr>
                 <w:sz w:val="18"/>
               </w:rPr>
-              <w:t>: un intento de escr</w:t>
-            </w:r>
-            <w:r>
-              <w:rPr>
-                <w:sz w:val="18"/>
-              </w:rPr>
-              <w:t>itura con las credenciales del MCP contra cada sistema on-prem debe fallar.</w:t>
+              <w:t>: un intento de escritura con las credenciales del MCP contra cada sistema on-prem debe fallar.</w:t>
             </w:r>
           </w:p>
         </w:tc>
@@ -11194,13 +11409,13 @@
               <w:rPr>
                 <w:sz w:val="18"/>
               </w:rPr>
-              <w:t>Seudonimización previa, también en las respuestas del MCP; Guar</w:t>
-            </w:r>
-            <w:r>
-              <w:rPr>
-                <w:sz w:val="18"/>
-              </w:rPr>
-              <w:t>drails PII; inferencia en región (S1); VPC endpoints; logs cifrados con KMS; un despliegue por operador (S8).</w:t>
+              <w:t>Seudonimización previa, también en las respuestas del MCP; Guardrails PII; inferencia en región (S1); VPC endpoints; logs cifrados con KMS</w:t>
+            </w:r>
+            <w:r>
+              <w:rPr>
+                <w:sz w:val="18"/>
+              </w:rPr>
+              <w:t>; un despliegue por operador (S8).</w:t>
             </w:r>
           </w:p>
         </w:tc>
@@ -11267,13 +11482,7 @@
               <w:rPr>
                 <w:sz w:val="18"/>
               </w:rPr>
-              <w:t>Una hipótesis inventada s</w:t>
-            </w:r>
-            <w:r>
-              <w:rPr>
-                <w:sz w:val="18"/>
-              </w:rPr>
-              <w:t>e presenta como hecho.</w:t>
+              <w:t>Una hipótesis inventada se presenta como hecho.</w:t>
             </w:r>
           </w:p>
         </w:tc>
@@ -11293,7 +11502,13 @@
               <w:rPr>
                 <w:sz w:val="18"/>
               </w:rPr>
-              <w:t xml:space="preserve">Esquema que separa hechos de hipótesis; cada afirmación lleva un </w:t>
+              <w:t>Esquema que separa hechos de hipótesis; cada afirmac</w:t>
+            </w:r>
+            <w:r>
+              <w:rPr>
+                <w:sz w:val="18"/>
+              </w:rPr>
+              <w:t xml:space="preserve">ión lleva un </w:t>
             </w:r>
             <w:r>
               <w:rPr>
@@ -11373,7 +11588,13 @@
               <w:rPr>
                 <w:sz w:val="18"/>
               </w:rPr>
-              <w:t>La salida del LLM se usa sin validar (ruteo, campos, HTML en el ticket).</w:t>
+              <w:t>La salida del LLM se usa sin validar (ruteo, campos, HTML</w:t>
+            </w:r>
+            <w:r>
+              <w:rPr>
+                <w:sz w:val="18"/>
+              </w:rPr>
+              <w:t xml:space="preserve"> en el ticket).</w:t>
             </w:r>
           </w:p>
         </w:tc>
@@ -11460,13 +11681,13 @@
               <w:rPr>
                 <w:sz w:val="18"/>
               </w:rPr>
-              <w:t>Un documento o Incidencia histórica manipulada sesga al age</w:t>
-            </w:r>
-            <w:r>
-              <w:rPr>
-                <w:sz w:val="18"/>
-              </w:rPr>
-              <w:t>nte.</w:t>
+              <w:t>Un documento o Incidencia histórica manipul</w:t>
+            </w:r>
+            <w:r>
+              <w:rPr>
+                <w:sz w:val="18"/>
+              </w:rPr>
+              <w:t>ada sesga al agente.</w:t>
             </w:r>
           </w:p>
         </w:tc>
@@ -11520,13 +11741,13 @@
               <w:rPr>
                 <w:sz w:val="18"/>
               </w:rPr>
-              <w:t>Auditoría de la ingesta (quién y qué versión); la evaluación de r</w:t>
-            </w:r>
-            <w:r>
-              <w:rPr>
-                <w:sz w:val="18"/>
-              </w:rPr>
-              <w:t>ecuperación detecta derivas.</w:t>
+              <w:t>Auditoría de la ingesta (quién y qué versión); la</w:t>
+            </w:r>
+            <w:r>
+              <w:rPr>
+                <w:sz w:val="18"/>
+              </w:rPr>
+              <w:t xml:space="preserve"> evaluación de recuperación detecta derivas.</w:t>
             </w:r>
           </w:p>
         </w:tc>
@@ -11613,13 +11834,7 @@
               <w:rPr>
                 <w:sz w:val="18"/>
               </w:rPr>
-              <w:t>Alarmas de CloudWatch de costo por Incidencia y tokens por hora;</w:t>
-            </w:r>
-            <w:r>
-              <w:rPr>
-                <w:sz w:val="18"/>
-              </w:rPr>
-              <w:t xml:space="preserve"> AWS Budgets.</w:t>
+              <w:t>Alarmas de CloudWatch de costo por Incidencia y tokens por hora; AWS Budgets.</w:t>
             </w:r>
           </w:p>
         </w:tc>
@@ -11666,7 +11881,13 @@
               <w:rPr>
                 <w:sz w:val="18"/>
               </w:rPr>
-              <w:t>Un cambio de versión del modelo degrada la calidad sin aviso.</w:t>
+              <w:t>Un cambio de versión del modelo degrada la cali</w:t>
+            </w:r>
+            <w:r>
+              <w:rPr>
+                <w:sz w:val="18"/>
+              </w:rPr>
+              <w:t>dad sin aviso.</w:t>
             </w:r>
           </w:p>
         </w:tc>
@@ -11706,13 +11927,7 @@
               <w:rPr>
                 <w:sz w:val="18"/>
               </w:rPr>
-              <w:t>Pipeline: no se despliega si la regresión baja</w:t>
-            </w:r>
-            <w:r>
-              <w:rPr>
-                <w:sz w:val="18"/>
-              </w:rPr>
-              <w:t xml:space="preserve"> de los umbrales de §7.</w:t>
+              <w:t>Pipeline: no se despliega si la regresión baja de los umbrales de §7.</w:t>
             </w:r>
           </w:p>
         </w:tc>
@@ -11779,7 +11994,13 @@
               <w:rPr>
                 <w:sz w:val="18"/>
               </w:rPr>
-              <w:t>El prompt no contiene secretos ni reglas sensibles; las reglas viven en AppConfig.</w:t>
+              <w:t>El prompt no contiene</w:t>
+            </w:r>
+            <w:r>
+              <w:rPr>
+                <w:sz w:val="18"/>
+              </w:rPr>
+              <w:t xml:space="preserve"> secretos ni reglas sensibles; las reglas viven en AppConfig.</w:t>
             </w:r>
           </w:p>
         </w:tc>
@@ -11864,7 +12085,13 @@
               <w:rPr>
                 <w:sz w:val="18"/>
               </w:rPr>
-              <w:t>La Lambda de aprobación verifica el grupo del aprobador contra la plataforma de tickets; el task token nunca sale de AWS; la aprobación queda registrada con la identidad.</w:t>
+              <w:t>La Lambda de aprobación verifica el grupo del aprobador contra la platafo</w:t>
+            </w:r>
+            <w:r>
+              <w:rPr>
+                <w:sz w:val="18"/>
+              </w:rPr>
+              <w:t>rma de tickets; el task token nunca sale de AWS; la aprobación queda registrada con la identidad.</w:t>
             </w:r>
           </w:p>
         </w:tc>
@@ -11884,13 +12111,7 @@
               <w:rPr>
                 <w:sz w:val="18"/>
               </w:rPr>
-              <w:t>Test: un webhook con un ap</w:t>
-            </w:r>
-            <w:r>
-              <w:rPr>
-                <w:sz w:val="18"/>
-              </w:rPr>
-              <w:t>robador fuera del grupo NOC no reanuda el workflow; registro en Aurora y CloudTrail.</w:t>
+              <w:t>Test: un webhook con un aprobador fuera del grupo NOC no reanuda el workflow; registro en Aurora y CloudTrail.</w:t>
             </w:r>
           </w:p>
         </w:tc>
@@ -11935,7 +12156,13 @@
               <w:rPr>
                 <w:sz w:val="18"/>
               </w:rPr>
-              <w:t>Las credenciales on-prem se filtran.</w:t>
+              <w:t>Las credenciales on-pre</w:t>
+            </w:r>
+            <w:r>
+              <w:rPr>
+                <w:sz w:val="18"/>
+              </w:rPr>
+              <w:t>m se filtran.</w:t>
             </w:r>
           </w:p>
         </w:tc>
@@ -11975,13 +12202,7 @@
               <w:rPr>
                 <w:sz w:val="18"/>
               </w:rPr>
-              <w:t>Rotación automática verificada; escaneo de secretos</w:t>
-            </w:r>
-            <w:r>
-              <w:rPr>
-                <w:sz w:val="18"/>
-              </w:rPr>
-              <w:t xml:space="preserve"> en el repo.</w:t>
+              <w:t>Rotación automática verificada; escaneo de secretos en el repo.</w:t>
             </w:r>
           </w:p>
         </w:tc>
@@ -12077,7 +12298,7 @@
         <w:pStyle w:val="Ttulo1"/>
       </w:pPr>
       <w:bookmarkStart w:id="26" w:name="_21008488f39fee772d9a18573a0731f090415fd"/>
-      <w:bookmarkStart w:id="27" w:name="_Toc243391074"/>
+      <w:bookmarkStart w:id="27" w:name="_Toc243395679"/>
       <w:r>
         <w:t>7. Estrategia de evaluación de la IA generativa</w:t>
       </w:r>
@@ -12089,12 +12310,9 @@
         <w:pStyle w:val="Ttulo2"/>
       </w:pPr>
       <w:bookmarkStart w:id="28" w:name="_69e1ab2a0c519af57549dc9feeb84d7cb8ee371"/>
-      <w:bookmarkStart w:id="29" w:name="_Toc243391075"/>
-      <w:r>
-        <w:t>7.1 Qué</w:t>
-      </w:r>
-      <w:r>
-        <w:t xml:space="preserve"> se evalúa</w:t>
+      <w:bookmarkStart w:id="29" w:name="_Toc243395680"/>
+      <w:r>
+        <w:t>7.1 Qué se evalúa</w:t>
       </w:r>
       <w:bookmarkEnd w:id="28"/>
       <w:bookmarkEnd w:id="29"/>
@@ -12458,7 +12676,7 @@
         <w:pStyle w:val="Ttulo2"/>
       </w:pPr>
       <w:bookmarkStart w:id="30" w:name="_dd7ef81fdfe106eb5acc19d59b803376463f8ad"/>
-      <w:bookmarkStart w:id="31" w:name="_Toc243391076"/>
+      <w:bookmarkStart w:id="31" w:name="_Toc243395681"/>
       <w:r>
         <w:t>7.2 Tres capas</w:t>
       </w:r>
@@ -12477,10 +12695,7 @@
         <w:t>Capa 1: determinista</w:t>
       </w:r>
       <w:r>
-        <w:t xml:space="preserve"> </w:t>
-      </w:r>
-      <w:r>
-        <w:t>(en CI, en cada cambio de prompt, modelo, reglas o código).</w:t>
+        <w:t xml:space="preserve"> (en CI, en cada cambio de prompt, modelo, reglas o código).</w:t>
       </w:r>
     </w:p>
     <w:p>
@@ -12492,7 +12707,10 @@
         </w:numPr>
       </w:pPr>
       <w:r>
-        <w:t>Validez de esquema, existencia de citas en la traza, hipótesis con evidencia y acciones de cambio marcadas.</w:t>
+        <w:t>Validez de esquema, exi</w:t>
+      </w:r>
+      <w:r>
+        <w:t>stencia de citas en la traza, hipótesis con evidencia y acciones de cambio marcadas.</w:t>
       </w:r>
     </w:p>
     <w:p>
@@ -12504,10 +12722,7 @@
         </w:numPr>
       </w:pPr>
       <w:r>
-        <w:t>Reglas de urgencia, prioridad, SLA, ruteo, escalamiento y derivación con casos tabulados</w:t>
-      </w:r>
-      <w:r>
-        <w:t>.</w:t>
+        <w:t>Reglas de urgencia, prioridad, SLA, ruteo, escalamiento y derivación con casos tabulados.</w:t>
       </w:r>
     </w:p>
     <w:p>
@@ -12519,7 +12734,10 @@
         </w:numPr>
       </w:pPr>
       <w:r>
-        <w:t>Casos adversariales sobre salidas simuladas: acción de cambio inducida, cita alucinada, acción disfrazada, campos faltantes e IA caída.</w:t>
+        <w:t>Casos adversariales sobre salidas simuladas: acción de cambio inducida, cita aluc</w:t>
+      </w:r>
+      <w:r>
+        <w:t>inada, acción disfrazada, campos faltantes e IA caída.</w:t>
       </w:r>
     </w:p>
     <w:p>
@@ -12547,10 +12765,7 @@
         <w:t>eval_deterministic.py</w:t>
       </w:r>
       <w:r>
-        <w:t xml:space="preserve">). Las salidas del modelo en esos casos son </w:t>
-      </w:r>
-      <w:r>
-        <w:t xml:space="preserve">fijas: el prototipo verifica el </w:t>
+        <w:t xml:space="preserve">). Las salidas del modelo en esos casos son fijas: el prototipo verifica el </w:t>
       </w:r>
       <w:r>
         <w:rPr>
@@ -12560,7 +12775,10 @@
         <w:t>validador y las reglas</w:t>
       </w:r>
       <w:r>
-        <w:t>, no la calidad ni la robustez de un modelo real.</w:t>
+        <w:t>, no la calidad ni la robuste</w:t>
+      </w:r>
+      <w:r>
+        <w:t>z de un modelo real.</w:t>
       </w:r>
     </w:p>
     <w:p>
@@ -12590,10 +12808,10 @@
         <w:t>Etiquetado.</w:t>
       </w:r>
       <w:r>
-        <w:t xml:space="preserve"> Ingenieros NOC senior etiq</w:t>
-      </w:r>
-      <w:r>
-        <w:t>uetan cada caso con la causa raíz (de una taxonomía controlada de causas), el Equipo resolutor, la agrupación correcta de Alertas y los documentos relevantes. Un 20% se etiqueta dos veces para medir la concordancia entre etiquetadores.</w:t>
+        <w:t xml:space="preserve"> Ingenieros NOC senior etiquetan cada caso con la causa raíz (de una taxonomía controlada de causas), el Equip</w:t>
+      </w:r>
+      <w:r>
+        <w:t>o resolutor, la agrupación correcta de Alertas y los documentos relevantes. Un 20% se etiqueta dos veces para medir la concordancia entre etiquetadores.</w:t>
       </w:r>
     </w:p>
     <w:tbl>
@@ -12696,14 +12914,7 @@
                 <w:b/>
                 <w:sz w:val="18"/>
               </w:rPr>
-              <w:t>M</w:t>
-            </w:r>
-            <w:r>
-              <w:rPr>
-                <w:b/>
-                <w:sz w:val="18"/>
-              </w:rPr>
-              <w:t>étodo</w:t>
+              <w:t>Método</w:t>
             </w:r>
           </w:p>
         </w:tc>
@@ -13009,7 +13220,13 @@
               <w:rPr>
                 <w:sz w:val="18"/>
               </w:rPr>
-              <w:t>Causa raíz top-1 / top-3</w:t>
+              <w:t>Causa</w:t>
+            </w:r>
+            <w:r>
+              <w:rPr>
+                <w:sz w:val="18"/>
+              </w:rPr>
+              <w:t xml:space="preserve"> raíz top-1 / top-3</w:t>
             </w:r>
           </w:p>
         </w:tc>
@@ -13179,13 +13396,7 @@
               <w:rPr>
                 <w:sz w:val="18"/>
               </w:rPr>
-              <w:t>Gr</w:t>
-            </w:r>
-            <w:r>
-              <w:rPr>
-                <w:sz w:val="18"/>
-              </w:rPr>
-              <w:t>oundedness / fidelidad</w:t>
+              <w:t>Groundedness / fidelidad</w:t>
             </w:r>
           </w:p>
         </w:tc>
@@ -13376,7 +13587,13 @@
               <w:rPr>
                 <w:sz w:val="18"/>
               </w:rPr>
-              <w:t>Accuracy de ruteo</w:t>
+              <w:t>Accura</w:t>
+            </w:r>
+            <w:r>
+              <w:rPr>
+                <w:sz w:val="18"/>
+              </w:rPr>
+              <w:t>cy de ruteo</w:t>
             </w:r>
           </w:p>
         </w:tc>
@@ -13521,13 +13738,7 @@
               <w:rPr>
                 <w:sz w:val="18"/>
               </w:rPr>
-              <w:t>100% sin efectos sobre ruteo, prioridad</w:t>
-            </w:r>
-            <w:r>
-              <w:rPr>
-                <w:sz w:val="18"/>
-              </w:rPr>
-              <w:t xml:space="preserve"> o acciones</w:t>
+              <w:t>100% sin efectos sobre ruteo, prioridad o acciones</w:t>
             </w:r>
           </w:p>
         </w:tc>
@@ -13538,10 +13749,10 @@
         <w:pStyle w:val="FirstParagraph"/>
       </w:pPr>
       <w:r>
-        <w:t>Cada evaluación se corre varias veces (n ≥ 3) para estimar la varianza. Con 200 casos, un umbral de 0,70 tiene un intervalo de confianza del 95% de unos ±6 puntos: el set detecta regresiones grandes, no diferencias finas. Por eso las variantes</w:t>
-      </w:r>
-      <w:r>
-        <w:t xml:space="preserve"> se comparan con pruebas pareadas sobre los mismos casos, y el set crece con el etiquetado continuo del modo sombra.</w:t>
+        <w:t>Cada evaluación se corre varias veces (n ≥ 3) para estimar la varianza. Con 200 casos, un umbral de 0,70 tiene un intervalo de confianza del 95% de unos ±6 puntos: el set detecta regresiones grandes, no d</w:t>
+      </w:r>
+      <w:r>
+        <w:t>iferencias finas. Por eso las variantes se comparan con pruebas pareadas sobre los mismos casos, y el set crece con el etiquetado continuo del modo sombra.</w:t>
       </w:r>
     </w:p>
     <w:p>
@@ -13684,13 +13895,13 @@
               <w:rPr>
                 <w:sz w:val="18"/>
               </w:rPr>
-              <w:t>Desde la Alerta hasta la derivación, comparado con l</w:t>
-            </w:r>
-            <w:r>
-              <w:rPr>
-                <w:sz w:val="18"/>
-              </w:rPr>
-              <w:t>a línea base actual.</w:t>
+              <w:t>Desde la Aler</w:t>
+            </w:r>
+            <w:r>
+              <w:rPr>
+                <w:sz w:val="18"/>
+              </w:rPr>
+              <w:t>ta hasta la derivación, comparado con la línea base actual.</w:t>
             </w:r>
           </w:p>
         </w:tc>
@@ -13926,10 +14137,10 @@
         <w:pStyle w:val="FirstParagraph"/>
       </w:pPr>
       <w:r>
-        <w:t>Las correcciones del Operador NOC alimentan el golden set (con revisión),</w:t>
-      </w:r>
-      <w:r>
-        <w:t xml:space="preserve"> lo que cierra el ciclo de mejora.</w:t>
+        <w:t>Las correcciones del Operador NOC alimentan el go</w:t>
+      </w:r>
+      <w:r>
+        <w:t>lden set (con revisión), lo que cierra el ciclo de mejora.</w:t>
       </w:r>
     </w:p>
     <w:p>
@@ -13937,7 +14148,7 @@
         <w:pStyle w:val="Ttulo2"/>
       </w:pPr>
       <w:bookmarkStart w:id="32" w:name="_2d9f01ff85dd9820987480cab79557db403aeac"/>
-      <w:bookmarkStart w:id="33" w:name="_Toc243391077"/>
+      <w:bookmarkStart w:id="33" w:name="_Toc243395682"/>
       <w:r>
         <w:t>7.3 Despliegue gradual</w:t>
       </w:r>
@@ -13960,10 +14171,10 @@
         <w:t>Sombra</w:t>
       </w:r>
       <w:r>
-        <w:t xml:space="preserve"> (4–6 semanas): la IA genera el análisis pero no se publica. El Operador NOC trabaja como hoy y se comparan resultados. Pasa a la fase 2 si se cumplen los umbrales de la capa 2 sobre datos rea</w:t>
-      </w:r>
-      <w:r>
-        <w:t>les.</w:t>
+        <w:t xml:space="preserve"> (4–6 semanas): la IA genera el análisis pero no se publica. El Operador NOC trabaja como hoy y se comparan resultados. Pasa a la fase 2 si se cumplen los umbrales de l</w:t>
+      </w:r>
+      <w:r>
+        <w:t>a capa 2 sobre datos reales.</w:t>
       </w:r>
     </w:p>
     <w:p>
@@ -14001,7 +14212,10 @@
         <w:t>Nunca autónomo</w:t>
       </w:r>
       <w:r>
-        <w:t xml:space="preserve"> para acciones sobre la red: siempre pasan por la gestión de cambios del operador.</w:t>
+        <w:t xml:space="preserve"> para acciones sobre la red: siempre pasan por la gestión de cambios de</w:t>
+      </w:r>
+      <w:r>
+        <w:t>l operador.</w:t>
       </w:r>
     </w:p>
     <w:p>
@@ -14009,12 +14223,9 @@
         <w:pStyle w:val="Ttulo1"/>
       </w:pPr>
       <w:bookmarkStart w:id="34" w:name="_d8727e752cb31365f46bcadbe991ef572676e19"/>
-      <w:bookmarkStart w:id="35" w:name="_Toc243391078"/>
-      <w:r>
-        <w:t>8. Operación</w:t>
-      </w:r>
-      <w:r>
-        <w:t xml:space="preserve"> y limitaciones</w:t>
+      <w:bookmarkStart w:id="35" w:name="_Toc243395683"/>
+      <w:r>
+        <w:t>8. Operación y limitaciones</w:t>
       </w:r>
       <w:bookmarkEnd w:id="34"/>
       <w:bookmarkEnd w:id="35"/>
@@ -14024,7 +14235,7 @@
         <w:pStyle w:val="Ttulo2"/>
       </w:pPr>
       <w:bookmarkStart w:id="36" w:name="_37ea2f043d1ca71eac9f00ba764ac933ea83f2c"/>
-      <w:bookmarkStart w:id="37" w:name="_Toc243391079"/>
+      <w:bookmarkStart w:id="37" w:name="_Toc243395684"/>
       <w:r>
         <w:t>8.1 Latencia y costo (estimación)</w:t>
       </w:r>
@@ -14508,7 +14719,15 @@
                 <w:bCs/>
                 <w:sz w:val="18"/>
               </w:rPr>
-              <w:t>~1–2 min (p95 &lt; 3 min)</w:t>
+              <w:t>~1–2 min</w:t>
+            </w:r>
+            <w:r>
+              <w:rPr>
+                <w:b/>
+                <w:bCs/>
+                <w:sz w:val="18"/>
+              </w:rPr>
+              <w:t xml:space="preserve"> (p95 &lt; 3 min)</w:t>
             </w:r>
           </w:p>
         </w:tc>
@@ -14543,10 +14762,7 @@
         <w:t>USD 0,16 por Incidencia</w:t>
       </w:r>
       <w:r>
-        <w:t xml:space="preserve"> (agente ≈ 0,12; resumen ≈ 0,04; extracción ≈ 0,0</w:t>
-      </w:r>
-      <w:r>
-        <w:t xml:space="preserve">03), unos </w:t>
+        <w:t xml:space="preserve"> (agente ≈ 0,12; resumen ≈ 0,04; extracción ≈ 0,003), unos </w:t>
       </w:r>
       <w:r>
         <w:rPr>
@@ -14556,20 +14772,30 @@
         <w:t>USD 49/día</w:t>
       </w:r>
       <w:r>
-        <w:t xml:space="preserve"> a 300 Incidencias/día. </w:t>
+        <w:t xml:space="preserve"> a 30</w:t>
+      </w:r>
+      <w:r>
+        <w:t xml:space="preserve">0 Incidencias/día. El costo crece de forma lineal con las Incidencias, no con las Alertas: un pico sostenido de 10× (3.000 Incidencias/día) costaría unos USD 480/día, y el modo tormenta (§4.3) lo limita. </w:t>
       </w:r>
       <w:r>
         <w:rPr>
           <w:i/>
           <w:iCs/>
         </w:rPr>
-        <w:t>Los precios dependen del modelo elegido y deben verificarse contra la lista vigente de Bedrock.</w:t>
-      </w:r>
-      <w:r>
-        <w:t xml:space="preserve"> Prompt caching sobre el system prompt y los contratos de tools lo reduciría. El costo de infraestructura (Aurora Ser</w:t>
-      </w:r>
-      <w:r>
-        <w:t>verless, Lambda, Direct Connect, Guardrails, embeddings) es aparte y está dominado por Direct Connect.</w:t>
+        <w:t>Los precios dependen del modelo elegido y deben veri</w:t>
+      </w:r>
+      <w:r>
+        <w:rPr>
+          <w:i/>
+          <w:iCs/>
+        </w:rPr>
+        <w:t>ficarse contra la lista vigente de Bedrock.</w:t>
+      </w:r>
+      <w:r>
+        <w:t xml:space="preserve"> Prompt caching sobre el system prompt y los contratos de tools lo reduciría. El costo de infraestructura (Aurora Serverless, Lambda, Direct Connect, Guardrails, embeddings) es aparte y está dominado por Direct Co</w:t>
+      </w:r>
+      <w:r>
+        <w:t>nnect.</w:t>
       </w:r>
     </w:p>
     <w:p>
@@ -14577,7 +14803,7 @@
         <w:pStyle w:val="Ttulo2"/>
       </w:pPr>
       <w:bookmarkStart w:id="38" w:name="_observabilidad"/>
-      <w:bookmarkStart w:id="39" w:name="_Toc243391080"/>
+      <w:bookmarkStart w:id="39" w:name="_Toc243395685"/>
       <w:r>
         <w:t>8.2 Observabilidad</w:t>
       </w:r>
@@ -14600,10 +14826,7 @@
         <w:t>Por Incidencia</w:t>
       </w:r>
       <w:r>
-        <w:t>: historial de Step Functions (90 días) + tabla de auditoría permanente (quién, qué, con qué evidencia, versión de promp</w:t>
-      </w:r>
-      <w:r>
-        <w:t>t y modelo).</w:t>
+        <w:t>: historial de Step Functions (90 días) + tabla de auditoría permanente (quién, qué, con qué evidencia, versión de prompt y modelo).</w:t>
       </w:r>
     </w:p>
     <w:p>
@@ -14622,7 +14845,10 @@
         <w:t>Por invocación LLM</w:t>
       </w:r>
       <w:r>
-        <w:t>: Bedrock invocation logging (S3 con Object Lock) + métricas de tokens y latencia.</w:t>
+        <w:t>: Bedrock invocation logging (S3 con Object Lock) + métricas de t</w:t>
+      </w:r>
+      <w:r>
+        <w:t>okens y latencia.</w:t>
       </w:r>
     </w:p>
     <w:p>
@@ -14641,7 +14867,7 @@
         <w:t>Alarmas</w:t>
       </w:r>
       <w:r>
-        <w:t>: DLQ no vacía, tasa E7 &gt; 0, costo por hora, p95 &gt; 3 min, aumento de E2.</w:t>
+        <w:t>: DLQ no vacía, tasa E7 &gt; 0, costo por hora, p95 &gt; 3 min, aumento de E2, uso de la cuota de Bedrock &gt; 80 % y modo tormenta activo.</w:t>
       </w:r>
     </w:p>
     <w:p>
@@ -14649,7 +14875,7 @@
         <w:pStyle w:val="Ttulo2"/>
       </w:pPr>
       <w:bookmarkStart w:id="40" w:name="_resiliencia"/>
-      <w:bookmarkStart w:id="41" w:name="_Toc243391081"/>
+      <w:bookmarkStart w:id="41" w:name="_Toc243395686"/>
       <w:r>
         <w:t>8.3 Resiliencia</w:t>
       </w:r>
@@ -14661,10 +14887,10 @@
         <w:pStyle w:val="FirstParagraph"/>
       </w:pPr>
       <w:r>
-        <w:t>La IA es un acelerador, no una dependencia crí</w:t>
-      </w:r>
-      <w:r>
-        <w:t>tica: con Bedrock caído la operación continúa por reglas (E7). La ingesta es durable (SQS + DLQ) y Step Functions reintenta por estado. El enlace con el operador es redundante (Direct Connect + VPN).</w:t>
+        <w:t>La IA es un acelerador, no una dependencia crítica: con Bedrock caído la operación c</w:t>
+      </w:r>
+      <w:r>
+        <w:t>ontinúa por reglas (E7). La ingesta es durable (SQS + DLQ) y Step Functions reintenta por estado. El enlace con el operador es redundante (Direct Connect + VPN).</w:t>
       </w:r>
     </w:p>
     <w:p>
@@ -14672,7 +14898,7 @@
         <w:pStyle w:val="Ttulo2"/>
       </w:pPr>
       <w:bookmarkStart w:id="42" w:name="_e475abed30fa52e794d704ef2cf4919481e087c"/>
-      <w:bookmarkStart w:id="43" w:name="_Toc243391082"/>
+      <w:bookmarkStart w:id="43" w:name="_Toc243395687"/>
       <w:r>
         <w:t>8.4 Supervisión humana</w:t>
       </w:r>
@@ -14688,10 +14914,10 @@
         </w:numPr>
       </w:pPr>
       <w:r>
-        <w:t>El Operador NOC decide en E1 y E3</w:t>
-      </w:r>
-      <w:r>
-        <w:t xml:space="preserve"> (bloquean la derivación) y revisa en paralelo E2, E4, E5 y E6. Todo resumen con errores del validador queda retenido hasta su revisión.</w:t>
+        <w:t xml:space="preserve">El Operador NOC decide en E1 y E3 (bloquean la derivación) y revisa en </w:t>
+      </w:r>
+      <w:r>
+        <w:t>paralelo E2, E4, E5 y E6. Todo resumen con errores del validador queda retenido hasta su revisión.</w:t>
       </w:r>
     </w:p>
     <w:p>
@@ -14715,10 +14941,7 @@
         </w:numPr>
       </w:pPr>
       <w:r>
-        <w:t xml:space="preserve">Las acciones de cambio nunca se ejecutan: se derivan a </w:t>
-      </w:r>
-      <w:r>
-        <w:t>la gestión de cambios.</w:t>
+        <w:t>Las acciones de cambio nunca se ejecutan: se derivan a la gestión de cambios.</w:t>
       </w:r>
     </w:p>
     <w:p>
@@ -14730,7 +14953,10 @@
         </w:numPr>
       </w:pPr>
       <w:r>
-        <w:t>Las correcciones del operador quedan registradas y alimentan la evaluación.</w:t>
+        <w:t>Las correccione</w:t>
+      </w:r>
+      <w:r>
+        <w:t>s del operador quedan registradas y alimentan la evaluación.</w:t>
       </w:r>
     </w:p>
     <w:p>
@@ -14738,7 +14964,7 @@
         <w:pStyle w:val="Ttulo2"/>
       </w:pPr>
       <w:bookmarkStart w:id="44" w:name="_71f77f8eab6ad684eb9de56f8b1bbd750ae9343"/>
-      <w:bookmarkStart w:id="45" w:name="_Toc243391083"/>
+      <w:bookmarkStart w:id="45" w:name="_Toc243395688"/>
       <w:r>
         <w:t>8.5 Riesgos residuales</w:t>
       </w:r>
@@ -14761,10 +14987,7 @@
         <w:t>Correlación imperfecta</w:t>
       </w:r>
       <w:r>
-        <w:t>: Incidencias sin relación topológica conocida pueden quedar separadas. Se mide con precisión/recall por pares y</w:t>
-      </w:r>
-      <w:r>
-        <w:t xml:space="preserve"> se mitiga con revisión del operador.</w:t>
+        <w:t>: Incidencias sin relación topológica conocida pueden quedar separadas. Se mide con precisión/recall por pares y se mitiga con revisión del operador.</w:t>
       </w:r>
     </w:p>
     <w:p>
@@ -14799,7 +15022,14 @@
           <w:b/>
           <w:bCs/>
         </w:rPr>
-        <w:t>Detección de acciones de cambio por lista de verbos</w:t>
+        <w:t>Detección de acciones de cambio por lista de</w:t>
+      </w:r>
+      <w:r>
+        <w:rPr>
+          <w:b/>
+          <w:bCs/>
+        </w:rPr>
+        <w:t xml:space="preserve"> verbos</w:t>
       </w:r>
       <w:r>
         <w:t xml:space="preserve"> (respaldo del validador): puede tener falsos negativos con redacciones atípicas y falsos positivos con verbos ambiguos. Debe evaluarse en el golden set.</w:t>
@@ -14821,10 +15051,10 @@
         <w:t>Prompt injection que sesga el texto del resumen</w:t>
       </w:r>
       <w:r>
-        <w:t>: si</w:t>
-      </w:r>
-      <w:r>
-        <w:t>n tools de escritura no puede actuar, pero puede inducir una hipótesis errónea. Se mitiga con evidencia obligatoria, ruteo por reglas y revisión humana.</w:t>
+        <w:t>: sin tools de escritura no puede actuar, pero p</w:t>
+      </w:r>
+      <w:r>
+        <w:t>uede inducir una hipótesis errónea. Se mitiga con evidencia obligatoria, ruteo por reglas y revisión humana.</w:t>
       </w:r>
     </w:p>
     <w:p>
@@ -14843,10 +15073,7 @@
         <w:t>Calidad del histórico</w:t>
       </w:r>
       <w:r>
-        <w:t>: si las causas raíz registradas son pobres, el RAG de Incidencias similares aport</w:t>
-      </w:r>
-      <w:r>
-        <w:t>a poco.</w:t>
+        <w:t>: si las causas raíz registradas son pobres, el RAG de Incidencias similares aporta poco.</w:t>
       </w:r>
     </w:p>
     <w:p>
@@ -14865,7 +15092,10 @@
         <w:t>Dependencia del enmascarado</w:t>
       </w:r>
       <w:r>
-        <w:t>: un identificador no reconocido podría llegar al modelo. Guardrails es la segunda capa, no una garantía.</w:t>
+        <w:t>: un iden</w:t>
+      </w:r>
+      <w:r>
+        <w:t>tificador no reconocido podría llegar al modelo. Guardrails es la segunda capa, no una garantía.</w:t>
       </w:r>
     </w:p>
     <w:p>
@@ -14873,7 +15103,7 @@
         <w:pStyle w:val="Ttulo2"/>
       </w:pPr>
       <w:bookmarkStart w:id="46" w:name="_2a051840def5bc2000b770f663cf6617893998a"/>
-      <w:bookmarkStart w:id="47" w:name="_Toc243391084"/>
+      <w:bookmarkStart w:id="47" w:name="_Toc243395689"/>
       <w:r>
         <w:t>8.6 Pendientes antes de producción</w:t>
       </w:r>
@@ -14889,10 +15119,10 @@
         </w:numPr>
       </w:pPr>
       <w:r>
-        <w:t>Confirmar S1 con el área legal y de cumplimiento del operador: residencia de dat</w:t>
-      </w:r>
-      <w:r>
-        <w:t>os, uso de un modelo gestionado y si se acepta un perfil de inferencia geográfico.</w:t>
+        <w:t>Confirmar S1 con el área legal y de cumplimiento del operador: residencia de datos, uso de un modelo gestionado y si se acep</w:t>
+      </w:r>
+      <w:r>
+        <w:t>ta un perfil de inferencia geográfico.</w:t>
       </w:r>
     </w:p>
     <w:p>
@@ -14916,10 +15146,7 @@
         </w:numPr>
       </w:pPr>
       <w:r>
-        <w:t>Inventariar las APIs y webhooks reales d</w:t>
-      </w:r>
-      <w:r>
-        <w:t>e los sistemas on-prem y la plataforma de tickets (S2).</w:t>
+        <w:t>Inventariar las APIs y webhooks reales de los sistemas on-prem y la plataforma de tickets (S2).</w:t>
       </w:r>
     </w:p>
     <w:p>
@@ -14943,10 +15170,10 @@
         </w:numPr>
       </w:pPr>
       <w:r>
-        <w:t>Definir con negocio la matriz de prioridad, la tabla Síntoma → urgencia, el SLA y la tabla de rute</w:t>
-      </w:r>
-      <w:r>
-        <w:t>o reales (las del prototipo son supuestos).</w:t>
+        <w:t>Definir con negocio la matriz de prioridad, la tabla Sínto</w:t>
+      </w:r>
+      <w:r>
+        <w:t>ma → urgencia, el SLA y la tabla de ruteo reales (las del prototipo son supuestos).</w:t>
       </w:r>
     </w:p>
     <w:p>
@@ -14958,7 +15185,7 @@
         </w:numPr>
       </w:pPr>
       <w:r>
-        <w:t>Prueba de carga con picos 10× y prueba de caos de Bedrock y de los conectores.</w:t>
+        <w:t>Prueba de carga con picos 10× (incluido el modo tormenta), verificación de las cuotas de Bedrock de la cuenta y región, y prueba de caos de Bedrock y de los conectores.</w:t>
       </w:r>
     </w:p>
     <w:p>
@@ -14978,7 +15205,7 @@
         <w:pStyle w:val="Ttulo1"/>
       </w:pPr>
       <w:bookmarkStart w:id="48" w:name="_a5ed2b4bf0fb80322b8db7f52b6310c044129d6"/>
-      <w:bookmarkStart w:id="49" w:name="_Toc243391085"/>
+      <w:bookmarkStart w:id="49" w:name="_Toc243395690"/>
       <w:r>
         <w:t>9. Decisiones técnicas principales</w:t>
       </w:r>
@@ -15102,13 +15329,7 @@
               <w:rPr>
                 <w:sz w:val="18"/>
               </w:rPr>
-              <w:t>Workflow dete</w:t>
-            </w:r>
-            <w:r>
-              <w:rPr>
-                <w:sz w:val="18"/>
-              </w:rPr>
-              <w:t>rminista con un único agente de investigación (no un agente orquestador ni multi-agente).</w:t>
+              <w:t>Workflow determinista con un único agente de investigación (no un agente orquestador ni multi-agente).</w:t>
             </w:r>
           </w:p>
         </w:tc>
@@ -15153,7 +15374,13 @@
               <w:rPr>
                 <w:sz w:val="18"/>
               </w:rPr>
-              <w:t>Loop de agente propio sobre la Bedrock Converse API, en Lambda y con límites duros (no Bedrock Agents ni Fargate).</w:t>
+              <w:t>Loop de agente propio sobre</w:t>
+            </w:r>
+            <w:r>
+              <w:rPr>
+                <w:sz w:val="18"/>
+              </w:rPr>
+              <w:t xml:space="preserve"> la Bedrock Converse API, en Lambda y con límites duros (no Bedrock Agents ni Fargate).</w:t>
             </w:r>
           </w:p>
         </w:tc>
@@ -15209,13 +15436,13 @@
         <w:pStyle w:val="FirstParagraph"/>
       </w:pPr>
       <w:r>
-        <w:t>Otras decisiones: reglas fuera del LLM</w:t>
-      </w:r>
-      <w:r>
-        <w:t xml:space="preserve"> (urgencia, prioridad, SLA, ruteo y escalamiento); extracción antes de la validación; escalamiento por señales verificables en lugar de “confianza” del modelo; ruteo y derivación antes de la investigación, sin esperar a la IA ni al humano salvo E1/E3; rete</w:t>
-      </w:r>
-      <w:r>
-        <w:t>nción del resumen ante cualquier error del validador; aprobación en la plataforma de tickets; degradación sin IA; despliegue sombra → asistido.</w:t>
+        <w:t>Otras decisiones: reglas fuera del LLM (urgencia, prioridad, SLA,</w:t>
+      </w:r>
+      <w:r>
+        <w:t xml:space="preserve"> ruteo y escalamiento); extracción antes de la validación; escalamiento por señales verificables en lugar de “confianza” del modelo; ruteo y derivación antes de la investigación, sin esperar a la IA ni al humano salvo E1/E3; retención del resumen ante cual</w:t>
+      </w:r>
+      <w:r>
+        <w:t>quier error del validador; aprobación en la plataforma de tickets; degradación sin IA; modo tormenta que reserva el agente para P1 y P2 ante picos; despliegue sombra → asistido.</w:t>
       </w:r>
     </w:p>
     <w:p>
@@ -15223,7 +15450,7 @@
         <w:pStyle w:val="Ttulo1"/>
       </w:pPr>
       <w:bookmarkStart w:id="50" w:name="_2ece7273304f22a5b96354fbdfd9a08907327b3"/>
-      <w:bookmarkStart w:id="51" w:name="_Toc243391086"/>
+      <w:bookmarkStart w:id="51" w:name="_Toc243395691"/>
       <w:r>
         <w:t>10. Preguntas anticipadas</w:t>
       </w:r>
@@ -15239,16 +15466,20 @@
           <w:b/>
           <w:bCs/>
         </w:rPr>
-        <w:t>¿Por qué no derivar sin esperar al humano, incluso en P1?</w:t>
-      </w:r>
-      <w:r>
-        <w:t xml:space="preserve"> Así está diseñado: en cualqu</w:t>
-      </w:r>
-      <w:r>
-        <w:t xml:space="preserve">ier prioridad, incluida P1, se deriva por regla apenas se prioriza (en segundos), sin esperar al humano ni al análisis IA. La revisión humana del análisis corre en paralelo. Solo se espera al Operador NOC cuando no hay datos para derivar (E1) o no se sabe </w:t>
-      </w:r>
-      <w:r>
-        <w:t>a quién (E3).</w:t>
+        <w:t>¿Por qué no derivar sin esperar al humano, incluso e</w:t>
+      </w:r>
+      <w:r>
+        <w:rPr>
+          <w:b/>
+          <w:bCs/>
+        </w:rPr>
+        <w:t>n P1?</w:t>
+      </w:r>
+      <w:r>
+        <w:t xml:space="preserve"> Así está diseñado: en cualquier prioridad, incluida P1, se deriva por regla apenas se prioriza (en segundos), sin esperar al humano ni al análisis IA. La revisión humana del análisis corre en paralelo. Solo se espera al Operador NOC cuando no hay dat</w:t>
+      </w:r>
+      <w:r>
+        <w:t>os para derivar (E1) o no se sabe a quién (E3).</w:t>
       </w:r>
     </w:p>
     <w:p>
@@ -15263,10 +15494,10 @@
         <w:t>¿Por qué MCP si el loop del agente es propio?</w:t>
       </w:r>
       <w:r>
-        <w:t xml:space="preserve"> Una Lambda de tools con su propio rol daría la misma frontera IAM. MCP aporta un contrato estándar (descubrimiento y esquemas) que permite reutilizar las tools desde otros clientes, como un asiste</w:t>
-      </w:r>
-      <w:r>
-        <w:t>nte para el NOC. Sin ese segundo consumidor, la Lambda simple sería igual de válida (ADR 0003).</w:t>
+        <w:t xml:space="preserve"> Una Lambda de tools con su propio rol daría la misma frontera IAM. MCP aporta un contrato estándar (descubrimiento y esquemas) que permite reutilizar las tools de</w:t>
+      </w:r>
+      <w:r>
+        <w:t>sde otros clientes, como un asistente para el NOC. Sin ese segundo consumidor, la Lambda simple sería igual de válida (ADR 0003).</w:t>
       </w:r>
     </w:p>
     <w:p>
@@ -15281,10 +15512,10 @@
         <w:t>¿Qué puede hacer un prompt injection si no hay tools de escritura?</w:t>
       </w:r>
       <w:r>
-        <w:t xml:space="preserve"> No puede actuar sobre la red ni sobre el ticket, pero puede intentar sesgar el resumen o suge</w:t>
-      </w:r>
-      <w:r>
-        <w:t>rir otro equipo. El ruteo y la prioridad son por reglas, los hechos exigen evidencia devuelta por las tools (no texto del Ticket) y el operador revisa. La robustez del modelo se mide con red-team, no con el prototipo.</w:t>
+        <w:t xml:space="preserve"> No puede actuar sobre la red ni sobre el ticket, pero puede</w:t>
+      </w:r>
+      <w:r>
+        <w:t xml:space="preserve"> intentar sesgar el resumen o sugerir otro equipo. El ruteo y la prioridad son por reglas, los hechos exigen evidencia devuelta por las tools (no texto del Ticket) y el operador revisa. La robustez del modelo se mide con red-team, no con el prototipo.</w:t>
       </w:r>
     </w:p>
     <w:p>
@@ -15299,10 +15530,7 @@
         <w:t>¿Bastan 200 casos?</w:t>
       </w:r>
       <w:r>
-        <w:t xml:space="preserve"> Sirven para detecta</w:t>
-      </w:r>
-      <w:r>
-        <w:t>r regresiones grandes (IC95% de unos ±6 puntos a 0,70), no para distinguir variantes parecidas. Se complementan con pruebas pareadas y con el crecimiento del set en modo sombra.</w:t>
+        <w:t xml:space="preserve"> Sirven para detectar regresiones grandes (IC95% de unos ±6 puntos a 0,70), no para distinguir variantes parecidas. Se complementan con pruebas pareadas y con el crecimiento del set en modo sombra.</w:t>
       </w:r>
     </w:p>
     <w:p>
@@ -15314,13 +15542,17 @@
           <w:b/>
           <w:bCs/>
         </w:rPr>
-        <w:t>¿Quién decide qué es la causa “correcta” o un documento “relevante”?</w:t>
-      </w:r>
-      <w:r>
-        <w:t xml:space="preserve"> Ingeniero</w:t>
-      </w:r>
-      <w:r>
-        <w:t>s NOC senior, sobre una taxonomía controlada de causas, con doble etiquetado en el 20% de los casos para medir concordancia.</w:t>
+        <w:t>¿Quién decide qué es la causa “correcta”</w:t>
+      </w:r>
+      <w:r>
+        <w:rPr>
+          <w:b/>
+          <w:bCs/>
+        </w:rPr>
+        <w:t xml:space="preserve"> o un documento “relevante”?</w:t>
+      </w:r>
+      <w:r>
+        <w:t xml:space="preserve"> Ingenieros NOC senior, sobre una taxonomía controlada de causas, con doble etiquetado en el 20% de los casos para medir concordancia.</w:t>
       </w:r>
     </w:p>
     <w:p>
@@ -15350,10 +15582,10 @@
         <w:t xml:space="preserve"> alta/media/baja de las hipótesis?</w:t>
       </w:r>
       <w:r>
-        <w:t xml:space="preserve"> Solo para ordenarlas en el resumen; no dispara ninguna decisión. Se </w:t>
-      </w:r>
-      <w:r>
-        <w:t>mide su calibración en el golden set y, si no es monótona, se elimina.</w:t>
+        <w:t xml:space="preserve"> Solo para ordenarlas en el res</w:t>
+      </w:r>
+      <w:r>
+        <w:t>umen; no dispara ninguna decisión. Se mide su calibración en el golden set y, si no es monótona, se elimina.</w:t>
       </w:r>
     </w:p>
     <w:p>
@@ -15365,13 +15597,34 @@
           <w:b/>
           <w:bCs/>
         </w:rPr>
+        <w:t>¿Y si llegan miles de Alertas o Tickets?</w:t>
+      </w:r>
+      <w:r>
+        <w:t xml:space="preserve"> La ingesta (SQS + DLQ) los absorbe y la correlación los agrupa en Incidencias, así que la IA trabaja por I</w:t>
+      </w:r>
+      <w:r>
+        <w:t>ncidencia y no por Alerta. Lo primero que se satura es la cuota de Bedrock, no el flujo: se limita la concurrencia del agente y, en un pico, el modo tormenta reserva el análisis IA para P1 y P2. Como la derivación no depende de la IA, cada Incidencia sigue</w:t>
+      </w:r>
+      <w:r>
+        <w:t xml:space="preserve"> llegando a su equipo en segundos. Lo que se pierde ante la saturación es análisis, no atención. Se valida con la prueba de carga de §8.6.</w:t>
+      </w:r>
+    </w:p>
+    <w:p>
+      <w:pPr>
+        <w:pStyle w:val="Corpodetexto"/>
+      </w:pPr>
+      <w:r>
+        <w:rPr>
+          <w:b/>
+          <w:bCs/>
+        </w:rPr>
         <w:t>¿Cómo se evalúa la correlación si es determinista?</w:t>
       </w:r>
       <w:r>
-        <w:t xml:space="preserve"> Con precisión y recall por pares contra agrupaciones etiquetadas del histórico. Es crítica porque un error ahí duplica o mezcla Incide</w:t>
-      </w:r>
-      <w:r>
-        <w:t>ncias antes de que intervenga la IA.</w:t>
+        <w:t xml:space="preserve"> Con precisión y recall por pares contra agrupaciones etiquetadas d</w:t>
+      </w:r>
+      <w:r>
+        <w:t>el histórico. Es crítica porque un error ahí duplica o mezcla Incidencias antes de que intervenga la IA.</w:t>
       </w:r>
     </w:p>
     <w:p>
@@ -15379,7 +15632,7 @@
         <w:pStyle w:val="Ttulo1"/>
       </w:pPr>
       <w:bookmarkStart w:id="52" w:name="_923eadbdcfb4798034273fd952db44a0abe1d4f"/>
-      <w:bookmarkStart w:id="53" w:name="_Toc243391087"/>
+      <w:bookmarkStart w:id="53" w:name="_Toc243395692"/>
       <w:r>
         <w:t>Anexo A. Prototipo</w:t>
       </w:r>
@@ -15528,7 +15781,14 @@
                 <w:rStyle w:val="VerbatimChar"/>
                 <w:sz w:val="18"/>
               </w:rPr>
-              <w:t>evidence_id</w:t>
+              <w:t>evid</w:t>
+            </w:r>
+            <w:r>
+              <w:rPr>
+                <w:rStyle w:val="VerbatimChar"/>
+                <w:sz w:val="18"/>
+              </w:rPr>
+              <w:t>ence_id</w:t>
             </w:r>
             <w:r>
               <w:rPr>
@@ -15639,7 +15899,13 @@
               <w:rPr>
                 <w:sz w:val="18"/>
               </w:rPr>
-              <w:t>Campos obligatorios, urgencia (severidad y Síntoma), prioridad/SLA, ruteo, códigos de escalamiento, derivación y publicación del resumen (valores supuestos).</w:t>
+              <w:t xml:space="preserve">Campos obligatorios, urgencia (severidad y Síntoma), prioridad/SLA, ruteo, códigos de escalamiento, derivación </w:t>
+            </w:r>
+            <w:r>
+              <w:rPr>
+                <w:sz w:val="18"/>
+              </w:rPr>
+              <w:t>y publicación del resumen (valores supuestos).</w:t>
             </w:r>
           </w:p>
         </w:tc>
@@ -15665,14 +15931,7 @@
                 <w:rStyle w:val="VerbatimChar"/>
                 <w:sz w:val="18"/>
               </w:rPr>
-              <w:t>cas</w:t>
-            </w:r>
-            <w:r>
-              <w:rPr>
-                <w:rStyle w:val="VerbatimChar"/>
-                <w:sz w:val="18"/>
-              </w:rPr>
-              <w:t>os.json</w:t>
+              <w:t>casos.json</w:t>
             </w:r>
           </w:p>
         </w:tc>
@@ -15738,13 +15997,7 @@
               <w:rPr>
                 <w:sz w:val="18"/>
               </w:rPr>
-              <w:t xml:space="preserve">Corre los casos; </w:t>
-            </w:r>
-            <w:r>
-              <w:rPr>
-                <w:sz w:val="18"/>
-              </w:rPr>
-              <w:t>sale con código 1 si alguno falla (gate de CI).</w:t>
+              <w:t>Corre los casos; sale con código 1 si alguno falla (gate de CI).</w:t>
             </w:r>
           </w:p>
         </w:tc>
@@ -15831,13 +16084,17 @@
           <w:b/>
           <w:bCs/>
         </w:rPr>
-        <w:t>No implementado</w:t>
-      </w:r>
-      <w:r>
-        <w:t>: el</w:t>
-      </w:r>
-      <w:r>
-        <w:t xml:space="preserve"> loop del agente, el servidor MCP, el enmascarado, la definición ASL de Step Functions, la infraestructura y cualquier llamada a un modelo real.</w:t>
+        <w:t>No</w:t>
+      </w:r>
+      <w:r>
+        <w:rPr>
+          <w:b/>
+          <w:bCs/>
+        </w:rPr>
+        <w:t xml:space="preserve"> implementado</w:t>
+      </w:r>
+      <w:r>
+        <w:t>: el loop del agente, el servidor MCP, el enmascarado, la definición ASL de Step Functions, la infraestructura y cualquier llamada a un modelo real.</w:t>
       </w:r>
     </w:p>
     <w:sectPr>
@@ -15858,7 +16115,7 @@
   <w:abstractNum w:abstractNumId="0" w15:restartNumberingAfterBreak="0">
     <w:nsid w:val="0000A990"/>
     <w:multiLevelType w:val="multilevel"/>
-    <w:tmpl w:val="EDEABC12"/>
+    <w:tmpl w:val="63682BA2"/>
     <w:lvl w:ilvl="0">
       <w:numFmt w:val="bullet"/>
       <w:lvlText w:val=" "/>
@@ -15935,7 +16192,7 @@
   <w:abstractNum w:abstractNumId="1" w15:restartNumberingAfterBreak="0">
     <w:nsid w:val="0000A991"/>
     <w:multiLevelType w:val="multilevel"/>
-    <w:tmpl w:val="81F4E1C0"/>
+    <w:tmpl w:val="3BD243CE"/>
     <w:lvl w:ilvl="0">
       <w:numFmt w:val="bullet"/>
       <w:lvlText w:val=""/>
@@ -16039,7 +16296,7 @@
   <w:abstractNum w:abstractNumId="2" w15:restartNumberingAfterBreak="0">
     <w:nsid w:val="00A99411"/>
     <w:multiLevelType w:val="multilevel"/>
-    <w:tmpl w:val="1A2672C8"/>
+    <w:tmpl w:val="A872A2BC"/>
     <w:lvl w:ilvl="0">
       <w:start w:val="1"/>
       <w:numFmt w:val="decimal"/>
@@ -17508,7 +17765,7 @@
     <w:autoRedefine/>
     <w:uiPriority w:val="39"/>
     <w:unhideWhenUsed/>
-    <w:rsid w:val="00BB4AB8"/>
+    <w:rsid w:val="0080576C"/>
     <w:pPr>
       <w:spacing w:after="100"/>
     </w:pPr>
@@ -17520,7 +17777,7 @@
     <w:autoRedefine/>
     <w:uiPriority w:val="39"/>
     <w:unhideWhenUsed/>
-    <w:rsid w:val="00BB4AB8"/>
+    <w:rsid w:val="0080576C"/>
     <w:pPr>
       <w:spacing w:after="100"/>
       <w:ind w:left="240"/>

</xml_diff>